<commit_message>
Added hunza.html, ci-staging.yml and updated docx
</commit_message>
<xml_diff>
--- a/TermProject_Spring2026.docx
+++ b/TermProject_Spring2026.docx
@@ -1,6 +1,6 @@
 
 <file path=word/document.xml><?xml version="1.0" encoding="utf-8"?>
-<w:document xmlns:wpc="http://schemas.microsoft.com/office/word/2010/wordprocessingCanvas" xmlns:cx="http://schemas.microsoft.com/office/drawing/2014/chartex" xmlns:cx1="http://schemas.microsoft.com/office/drawing/2015/9/8/chartex" xmlns:cx2="http://schemas.microsoft.com/office/drawing/2015/10/21/chartex" xmlns:cx3="http://schemas.microsoft.com/office/drawing/2016/5/9/chartex" xmlns:cx4="http://schemas.microsoft.com/office/drawing/2016/5/10/chartex" xmlns:cx5="http://schemas.microsoft.com/office/drawing/2016/5/11/chartex" xmlns:cx6="http://schemas.microsoft.com/office/drawing/2016/5/12/chartex" xmlns:cx7="http://schemas.microsoft.com/office/drawing/2016/5/13/chartex" xmlns:cx8="http://schemas.microsoft.com/office/drawing/2016/5/14/chartex" xmlns:mc="http://schemas.openxmlformats.org/markup-compatibility/2006" xmlns:aink="http://schemas.microsoft.com/office/drawing/2016/ink" xmlns:am3d="http://schemas.microsoft.com/office/drawing/2017/model3d" xmlns:o="urn:schemas-microsoft-com:office:office" xmlns:oel="http://schemas.microsoft.com/office/2019/extlst" xmlns:r="http://schemas.openxmlformats.org/officeDocument/2006/relationships" xmlns:m="http://schemas.openxmlformats.org/officeDocument/2006/math" xmlns:v="urn:schemas-microsoft-com:vml" xmlns:wp14="http://schemas.microsoft.com/office/word/2010/wordprocessingDrawing" xmlns:wp="http://schemas.openxmlformats.org/drawingml/2006/wordprocessingDrawing" xmlns:w10="urn:schemas-microsoft-com:office:word" xmlns:w="http://schemas.openxmlformats.org/wordprocessingml/2006/main" xmlns:w14="http://schemas.microsoft.com/office/word/2010/wordml" xmlns:w15="http://schemas.microsoft.com/office/word/2012/wordml" xmlns:w16cex="http://schemas.microsoft.com/office/word/2018/wordml/cex" xmlns:w16cid="http://schemas.microsoft.com/office/word/2016/wordml/cid" xmlns:w16="http://schemas.microsoft.com/office/word/2018/wordml" xmlns:w16du="http://schemas.microsoft.com/office/word/2023/wordml/word16du" xmlns:w16sdtdh="http://schemas.microsoft.com/office/word/2020/wordml/sdtdatahash" xmlns:w16sdtfl="http://schemas.microsoft.com/office/word/2024/wordml/sdtformatlock" xmlns:w16se="http://schemas.microsoft.com/office/word/2015/wordml/symex" xmlns:wpg="http://schemas.microsoft.com/office/word/2010/wordprocessingGroup" xmlns:wpi="http://schemas.microsoft.com/office/word/2010/wordprocessingInk" xmlns:wne="http://schemas.microsoft.com/office/word/2006/wordml" xmlns:wps="http://schemas.microsoft.com/office/word/2010/wordprocessingShape" mc:Ignorable="w14 w15 w16se w16cid w16 w16cex w16sdtdh w16sdtfl w16du wp14">
+<w:document xmlns:wpc="http://schemas.microsoft.com/office/word/2010/wordprocessingCanvas" xmlns:cx="http://schemas.microsoft.com/office/drawing/2014/chartex" xmlns:cx1="http://schemas.microsoft.com/office/drawing/2015/9/8/chartex" xmlns:cx2="http://schemas.microsoft.com/office/drawing/2015/10/21/chartex" xmlns:cx3="http://schemas.microsoft.com/office/drawing/2016/5/9/chartex" xmlns:cx4="http://schemas.microsoft.com/office/drawing/2016/5/10/chartex" xmlns:cx5="http://schemas.microsoft.com/office/drawing/2016/5/11/chartex" xmlns:cx6="http://schemas.microsoft.com/office/drawing/2016/5/12/chartex" xmlns:cx7="http://schemas.microsoft.com/office/drawing/2016/5/13/chartex" xmlns:cx8="http://schemas.microsoft.com/office/drawing/2016/5/14/chartex" xmlns:mc="http://schemas.openxmlformats.org/markup-compatibility/2006" xmlns:aink="http://schemas.microsoft.com/office/drawing/2016/ink" xmlns:am3d="http://schemas.microsoft.com/office/drawing/2017/model3d" xmlns:o="urn:schemas-microsoft-com:office:office" xmlns:oel="http://schemas.microsoft.com/office/2019/extlst" xmlns:r="http://schemas.openxmlformats.org/officeDocument/2006/relationships" xmlns:m="http://schemas.openxmlformats.org/officeDocument/2006/math" xmlns:v="urn:schemas-microsoft-com:vml" xmlns:wp14="http://schemas.microsoft.com/office/word/2010/wordprocessingDrawing" xmlns:wp="http://schemas.openxmlformats.org/drawingml/2006/wordprocessingDrawing" xmlns:w10="urn:schemas-microsoft-com:office:word" xmlns:w="http://schemas.openxmlformats.org/wordprocessingml/2006/main" xmlns:w14="http://schemas.microsoft.com/office/word/2010/wordml" xmlns:w15="http://schemas.microsoft.com/office/word/2012/wordml" xmlns:w16cex="http://schemas.microsoft.com/office/word/2018/wordml/cex" xmlns:w16cid="http://schemas.microsoft.com/office/word/2016/wordml/cid" xmlns:w16="http://schemas.microsoft.com/office/word/2018/wordml" xmlns:w16sdtdh="http://schemas.microsoft.com/office/word/2020/wordml/sdtdatahash" xmlns:w16se="http://schemas.microsoft.com/office/word/2015/wordml/symex" xmlns:wpg="http://schemas.microsoft.com/office/word/2010/wordprocessingGroup" xmlns:wpi="http://schemas.microsoft.com/office/word/2010/wordprocessingInk" xmlns:wne="http://schemas.microsoft.com/office/word/2006/wordml" xmlns:wps="http://schemas.microsoft.com/office/word/2010/wordprocessingShape" mc:Ignorable="w14 w15 w16se w16cid w16 w16cex w16sdtdh wp14">
   <w:body>
     <w:p>
       <w:pPr>
@@ -428,7 +428,8 @@
     <w:p/>
     <w:tbl>
       <w:tblPr>
-        <w:tblW w:w="8900" w:type="dxa"/>
+        <w:tblW w:w="11619" w:type="dxa"/>
+        <w:tblInd w:w="-771" w:type="dxa"/>
         <w:tblBorders>
           <w:top w:val="single" w:sz="4" w:space="0" w:color="auto"/>
           <w:left w:val="single" w:sz="4" w:space="0" w:color="auto"/>
@@ -445,18 +446,21 @@
       </w:tblPr>
       <w:tblGrid>
         <w:gridCol w:w="452"/>
-        <w:gridCol w:w="985"/>
-        <w:gridCol w:w="1208"/>
+        <w:gridCol w:w="1072"/>
+        <w:gridCol w:w="1329"/>
         <w:gridCol w:w="1663"/>
-        <w:gridCol w:w="1141"/>
-        <w:gridCol w:w="1141"/>
-        <w:gridCol w:w="974"/>
+        <w:gridCol w:w="2221"/>
+        <w:gridCol w:w="1317"/>
+        <w:gridCol w:w="2124"/>
         <w:gridCol w:w="1441"/>
       </w:tblGrid>
       <w:tr>
-        <w:tc>
-          <w:tcPr>
-            <w:tcW w:w="500" w:type="dxa"/>
+        <w:trPr>
+          <w:trHeight w:val="796"/>
+        </w:trPr>
+        <w:tc>
+          <w:tcPr>
+            <w:tcW w:w="452" w:type="dxa"/>
             <w:tcBorders>
               <w:top w:val="single" w:sz="1" w:space="0" w:color="AAAAAA"/>
               <w:left w:val="single" w:sz="1" w:space="0" w:color="AAAAAA"/>
@@ -490,7 +494,7 @@
         </w:tc>
         <w:tc>
           <w:tcPr>
-            <w:tcW w:w="1400" w:type="dxa"/>
+            <w:tcW w:w="1072" w:type="dxa"/>
             <w:tcBorders>
               <w:top w:val="single" w:sz="1" w:space="0" w:color="AAAAAA"/>
               <w:left w:val="single" w:sz="1" w:space="0" w:color="AAAAAA"/>
@@ -524,7 +528,7 @@
         </w:tc>
         <w:tc>
           <w:tcPr>
-            <w:tcW w:w="1400" w:type="dxa"/>
+            <w:tcW w:w="1329" w:type="dxa"/>
             <w:tcBorders>
               <w:top w:val="single" w:sz="1" w:space="0" w:color="AAAAAA"/>
               <w:left w:val="single" w:sz="1" w:space="0" w:color="AAAAAA"/>
@@ -558,7 +562,7 @@
         </w:tc>
         <w:tc>
           <w:tcPr>
-            <w:tcW w:w="1100" w:type="dxa"/>
+            <w:tcW w:w="1663" w:type="dxa"/>
             <w:tcBorders>
               <w:top w:val="single" w:sz="1" w:space="0" w:color="AAAAAA"/>
               <w:left w:val="single" w:sz="1" w:space="0" w:color="AAAAAA"/>
@@ -592,7 +596,7 @@
         </w:tc>
         <w:tc>
           <w:tcPr>
-            <w:tcW w:w="1200" w:type="dxa"/>
+            <w:tcW w:w="2221" w:type="dxa"/>
             <w:tcBorders>
               <w:top w:val="single" w:sz="1" w:space="0" w:color="AAAAAA"/>
               <w:left w:val="single" w:sz="1" w:space="0" w:color="AAAAAA"/>
@@ -626,7 +630,7 @@
         </w:tc>
         <w:tc>
           <w:tcPr>
-            <w:tcW w:w="1200" w:type="dxa"/>
+            <w:tcW w:w="1317" w:type="dxa"/>
             <w:tcBorders>
               <w:top w:val="single" w:sz="1" w:space="0" w:color="AAAAAA"/>
               <w:left w:val="single" w:sz="1" w:space="0" w:color="AAAAAA"/>
@@ -660,7 +664,7 @@
         </w:tc>
         <w:tc>
           <w:tcPr>
-            <w:tcW w:w="1200" w:type="dxa"/>
+            <w:tcW w:w="2124" w:type="dxa"/>
             <w:tcBorders>
               <w:top w:val="single" w:sz="1" w:space="0" w:color="AAAAAA"/>
               <w:left w:val="single" w:sz="1" w:space="0" w:color="AAAAAA"/>
@@ -694,7 +698,7 @@
         </w:tc>
         <w:tc>
           <w:tcPr>
-            <w:tcW w:w="900" w:type="dxa"/>
+            <w:tcW w:w="1441" w:type="dxa"/>
             <w:tcBorders>
               <w:top w:val="single" w:sz="1" w:space="0" w:color="AAAAAA"/>
               <w:left w:val="single" w:sz="1" w:space="0" w:color="AAAAAA"/>
@@ -728,9 +732,12 @@
         </w:tc>
       </w:tr>
       <w:tr>
-        <w:tc>
-          <w:tcPr>
-            <w:tcW w:w="500" w:type="dxa"/>
+        <w:trPr>
+          <w:trHeight w:val="300"/>
+        </w:trPr>
+        <w:tc>
+          <w:tcPr>
+            <w:tcW w:w="452" w:type="dxa"/>
             <w:tcBorders>
               <w:top w:val="single" w:sz="1" w:space="0" w:color="AAAAAA"/>
               <w:left w:val="single" w:sz="1" w:space="0" w:color="AAAAAA"/>
@@ -750,7 +757,7 @@
         </w:tc>
         <w:tc>
           <w:tcPr>
-            <w:tcW w:w="1400" w:type="dxa"/>
+            <w:tcW w:w="1072" w:type="dxa"/>
             <w:tcBorders>
               <w:top w:val="single" w:sz="1" w:space="0" w:color="AAAAAA"/>
               <w:left w:val="single" w:sz="1" w:space="0" w:color="AAAAAA"/>
@@ -770,7 +777,7 @@
         </w:tc>
         <w:tc>
           <w:tcPr>
-            <w:tcW w:w="1400" w:type="dxa"/>
+            <w:tcW w:w="1329" w:type="dxa"/>
             <w:tcBorders>
               <w:top w:val="single" w:sz="1" w:space="0" w:color="AAAAAA"/>
               <w:left w:val="single" w:sz="1" w:space="0" w:color="AAAAAA"/>
@@ -790,7 +797,7 @@
         </w:tc>
         <w:tc>
           <w:tcPr>
-            <w:tcW w:w="1100" w:type="dxa"/>
+            <w:tcW w:w="1663" w:type="dxa"/>
             <w:tcBorders>
               <w:top w:val="single" w:sz="1" w:space="0" w:color="AAAAAA"/>
               <w:left w:val="single" w:sz="1" w:space="0" w:color="AAAAAA"/>
@@ -810,7 +817,7 @@
         </w:tc>
         <w:tc>
           <w:tcPr>
-            <w:tcW w:w="1200" w:type="dxa"/>
+            <w:tcW w:w="2221" w:type="dxa"/>
             <w:tcBorders>
               <w:top w:val="single" w:sz="1" w:space="0" w:color="AAAAAA"/>
               <w:left w:val="single" w:sz="1" w:space="0" w:color="AAAAAA"/>
@@ -830,7 +837,7 @@
         </w:tc>
         <w:tc>
           <w:tcPr>
-            <w:tcW w:w="1200" w:type="dxa"/>
+            <w:tcW w:w="1317" w:type="dxa"/>
             <w:tcBorders>
               <w:top w:val="single" w:sz="1" w:space="0" w:color="AAAAAA"/>
               <w:left w:val="single" w:sz="1" w:space="0" w:color="AAAAAA"/>
@@ -850,7 +857,7 @@
         </w:tc>
         <w:tc>
           <w:tcPr>
-            <w:tcW w:w="1200" w:type="dxa"/>
+            <w:tcW w:w="2124" w:type="dxa"/>
             <w:tcBorders>
               <w:top w:val="single" w:sz="1" w:space="0" w:color="AAAAAA"/>
               <w:left w:val="single" w:sz="1" w:space="0" w:color="AAAAAA"/>
@@ -870,7 +877,7 @@
         </w:tc>
         <w:tc>
           <w:tcPr>
-            <w:tcW w:w="900" w:type="dxa"/>
+            <w:tcW w:w="1441" w:type="dxa"/>
             <w:tcBorders>
               <w:top w:val="single" w:sz="1" w:space="0" w:color="AAAAAA"/>
               <w:left w:val="single" w:sz="1" w:space="0" w:color="AAAAAA"/>
@@ -890,9 +897,12 @@
         </w:tc>
       </w:tr>
       <w:tr>
-        <w:tc>
-          <w:tcPr>
-            <w:tcW w:w="500" w:type="dxa"/>
+        <w:trPr>
+          <w:trHeight w:val="288"/>
+        </w:trPr>
+        <w:tc>
+          <w:tcPr>
+            <w:tcW w:w="452" w:type="dxa"/>
             <w:tcBorders>
               <w:top w:val="single" w:sz="1" w:space="0" w:color="AAAAAA"/>
               <w:left w:val="single" w:sz="1" w:space="0" w:color="AAAAAA"/>
@@ -912,7 +922,7 @@
         </w:tc>
         <w:tc>
           <w:tcPr>
-            <w:tcW w:w="1400" w:type="dxa"/>
+            <w:tcW w:w="1072" w:type="dxa"/>
             <w:tcBorders>
               <w:top w:val="single" w:sz="1" w:space="0" w:color="AAAAAA"/>
               <w:left w:val="single" w:sz="1" w:space="0" w:color="AAAAAA"/>
@@ -932,7 +942,7 @@
         </w:tc>
         <w:tc>
           <w:tcPr>
-            <w:tcW w:w="1400" w:type="dxa"/>
+            <w:tcW w:w="1329" w:type="dxa"/>
             <w:tcBorders>
               <w:top w:val="single" w:sz="1" w:space="0" w:color="AAAAAA"/>
               <w:left w:val="single" w:sz="1" w:space="0" w:color="AAAAAA"/>
@@ -952,7 +962,7 @@
         </w:tc>
         <w:tc>
           <w:tcPr>
-            <w:tcW w:w="1100" w:type="dxa"/>
+            <w:tcW w:w="1663" w:type="dxa"/>
             <w:tcBorders>
               <w:top w:val="single" w:sz="1" w:space="0" w:color="AAAAAA"/>
               <w:left w:val="single" w:sz="1" w:space="0" w:color="AAAAAA"/>
@@ -972,7 +982,7 @@
         </w:tc>
         <w:tc>
           <w:tcPr>
-            <w:tcW w:w="1200" w:type="dxa"/>
+            <w:tcW w:w="2221" w:type="dxa"/>
             <w:tcBorders>
               <w:top w:val="single" w:sz="1" w:space="0" w:color="AAAAAA"/>
               <w:left w:val="single" w:sz="1" w:space="0" w:color="AAAAAA"/>
@@ -992,7 +1002,7 @@
         </w:tc>
         <w:tc>
           <w:tcPr>
-            <w:tcW w:w="1200" w:type="dxa"/>
+            <w:tcW w:w="1317" w:type="dxa"/>
             <w:tcBorders>
               <w:top w:val="single" w:sz="1" w:space="0" w:color="AAAAAA"/>
               <w:left w:val="single" w:sz="1" w:space="0" w:color="AAAAAA"/>
@@ -1012,7 +1022,7 @@
         </w:tc>
         <w:tc>
           <w:tcPr>
-            <w:tcW w:w="1200" w:type="dxa"/>
+            <w:tcW w:w="2124" w:type="dxa"/>
             <w:tcBorders>
               <w:top w:val="single" w:sz="1" w:space="0" w:color="AAAAAA"/>
               <w:left w:val="single" w:sz="1" w:space="0" w:color="AAAAAA"/>
@@ -1032,7 +1042,7 @@
         </w:tc>
         <w:tc>
           <w:tcPr>
-            <w:tcW w:w="900" w:type="dxa"/>
+            <w:tcW w:w="1441" w:type="dxa"/>
             <w:tcBorders>
               <w:top w:val="single" w:sz="1" w:space="0" w:color="AAAAAA"/>
               <w:left w:val="single" w:sz="1" w:space="0" w:color="AAAAAA"/>
@@ -1052,9 +1062,12 @@
         </w:tc>
       </w:tr>
       <w:tr>
-        <w:tc>
-          <w:tcPr>
-            <w:tcW w:w="500" w:type="dxa"/>
+        <w:trPr>
+          <w:trHeight w:val="877"/>
+        </w:trPr>
+        <w:tc>
+          <w:tcPr>
+            <w:tcW w:w="452" w:type="dxa"/>
             <w:tcBorders>
               <w:top w:val="single" w:sz="1" w:space="0" w:color="AAAAAA"/>
               <w:left w:val="single" w:sz="1" w:space="0" w:color="AAAAAA"/>
@@ -1070,11 +1083,15 @@
             </w:tcMar>
             <w:vAlign w:val="center"/>
           </w:tcPr>
-          <w:p/>
-        </w:tc>
-        <w:tc>
-          <w:tcPr>
-            <w:tcW w:w="1400" w:type="dxa"/>
+          <w:p>
+            <w:r>
+              <w:t>3</w:t>
+            </w:r>
+          </w:p>
+        </w:tc>
+        <w:tc>
+          <w:tcPr>
+            <w:tcW w:w="1072" w:type="dxa"/>
             <w:tcBorders>
               <w:top w:val="single" w:sz="1" w:space="0" w:color="AAAAAA"/>
               <w:left w:val="single" w:sz="1" w:space="0" w:color="AAAAAA"/>
@@ -1090,11 +1107,15 @@
             </w:tcMar>
             <w:vAlign w:val="center"/>
           </w:tcPr>
-          <w:p/>
-        </w:tc>
-        <w:tc>
-          <w:tcPr>
-            <w:tcW w:w="1400" w:type="dxa"/>
+          <w:p>
+            <w:r>
+              <w:t>Sana Nadeem</w:t>
+            </w:r>
+          </w:p>
+        </w:tc>
+        <w:tc>
+          <w:tcPr>
+            <w:tcW w:w="1329" w:type="dxa"/>
             <w:tcBorders>
               <w:top w:val="single" w:sz="1" w:space="0" w:color="AAAAAA"/>
               <w:left w:val="single" w:sz="1" w:space="0" w:color="AAAAAA"/>
@@ -1110,11 +1131,15 @@
             </w:tcMar>
             <w:vAlign w:val="center"/>
           </w:tcPr>
-          <w:p/>
-        </w:tc>
-        <w:tc>
-          <w:tcPr>
-            <w:tcW w:w="1100" w:type="dxa"/>
+          <w:p>
+            <w:r>
+              <w:t>sana05022</w:t>
+            </w:r>
+          </w:p>
+        </w:tc>
+        <w:tc>
+          <w:tcPr>
+            <w:tcW w:w="1663" w:type="dxa"/>
             <w:tcBorders>
               <w:top w:val="single" w:sz="1" w:space="0" w:color="AAAAAA"/>
               <w:left w:val="single" w:sz="1" w:space="0" w:color="AAAAAA"/>
@@ -1130,11 +1155,15 @@
             </w:tcMar>
             <w:vAlign w:val="center"/>
           </w:tcPr>
-          <w:p/>
-        </w:tc>
-        <w:tc>
-          <w:tcPr>
-            <w:tcW w:w="1200" w:type="dxa"/>
+          <w:p>
+            <w:r>
+              <w:t>Member</w:t>
+            </w:r>
+          </w:p>
+        </w:tc>
+        <w:tc>
+          <w:tcPr>
+            <w:tcW w:w="2221" w:type="dxa"/>
             <w:tcBorders>
               <w:top w:val="single" w:sz="1" w:space="0" w:color="AAAAAA"/>
               <w:left w:val="single" w:sz="1" w:space="0" w:color="AAAAAA"/>
@@ -1150,11 +1179,15 @@
             </w:tcMar>
             <w:vAlign w:val="center"/>
           </w:tcPr>
-          <w:p/>
-        </w:tc>
-        <w:tc>
-          <w:tcPr>
-            <w:tcW w:w="1200" w:type="dxa"/>
+          <w:p>
+            <w:r>
+              <w:t>.github/workflows/ci-staging.yml</w:t>
+            </w:r>
+          </w:p>
+        </w:tc>
+        <w:tc>
+          <w:tcPr>
+            <w:tcW w:w="1317" w:type="dxa"/>
             <w:tcBorders>
               <w:top w:val="single" w:sz="1" w:space="0" w:color="AAAAAA"/>
               <w:left w:val="single" w:sz="1" w:space="0" w:color="AAAAAA"/>
@@ -1170,11 +1203,15 @@
             </w:tcMar>
             <w:vAlign w:val="center"/>
           </w:tcPr>
-          <w:p/>
-        </w:tc>
-        <w:tc>
-          <w:tcPr>
-            <w:tcW w:w="1200" w:type="dxa"/>
+          <w:p>
+            <w:r>
+              <w:t>hunza.html</w:t>
+            </w:r>
+          </w:p>
+        </w:tc>
+        <w:tc>
+          <w:tcPr>
+            <w:tcW w:w="2124" w:type="dxa"/>
             <w:tcBorders>
               <w:top w:val="single" w:sz="1" w:space="0" w:color="AAAAAA"/>
               <w:left w:val="single" w:sz="1" w:space="0" w:color="AAAAAA"/>
@@ -1190,11 +1227,15 @@
             </w:tcMar>
             <w:vAlign w:val="center"/>
           </w:tcPr>
-          <w:p/>
-        </w:tc>
-        <w:tc>
-          <w:tcPr>
-            <w:tcW w:w="900" w:type="dxa"/>
+          <w:p>
+            <w:r>
+              <w:t>feature/sana/hunza</w:t>
+            </w:r>
+          </w:p>
+        </w:tc>
+        <w:tc>
+          <w:tcPr>
+            <w:tcW w:w="1441" w:type="dxa"/>
             <w:tcBorders>
               <w:top w:val="single" w:sz="1" w:space="0" w:color="AAAAAA"/>
               <w:left w:val="single" w:sz="1" w:space="0" w:color="AAAAAA"/>
@@ -1210,13 +1251,20 @@
             </w:tcMar>
             <w:vAlign w:val="center"/>
           </w:tcPr>
-          <w:p/>
+          <w:p>
+            <w:r>
+              <w:t>Yes</w:t>
+            </w:r>
+          </w:p>
         </w:tc>
       </w:tr>
       <w:tr>
-        <w:tc>
-          <w:tcPr>
-            <w:tcW w:w="500" w:type="dxa"/>
+        <w:trPr>
+          <w:trHeight w:val="300"/>
+        </w:trPr>
+        <w:tc>
+          <w:tcPr>
+            <w:tcW w:w="452" w:type="dxa"/>
             <w:tcBorders>
               <w:top w:val="single" w:sz="1" w:space="0" w:color="AAAAAA"/>
               <w:left w:val="single" w:sz="1" w:space="0" w:color="AAAAAA"/>
@@ -1236,7 +1284,7 @@
         </w:tc>
         <w:tc>
           <w:tcPr>
-            <w:tcW w:w="1400" w:type="dxa"/>
+            <w:tcW w:w="1072" w:type="dxa"/>
             <w:tcBorders>
               <w:top w:val="single" w:sz="1" w:space="0" w:color="AAAAAA"/>
               <w:left w:val="single" w:sz="1" w:space="0" w:color="AAAAAA"/>
@@ -1256,7 +1304,7 @@
         </w:tc>
         <w:tc>
           <w:tcPr>
-            <w:tcW w:w="1400" w:type="dxa"/>
+            <w:tcW w:w="1329" w:type="dxa"/>
             <w:tcBorders>
               <w:top w:val="single" w:sz="1" w:space="0" w:color="AAAAAA"/>
               <w:left w:val="single" w:sz="1" w:space="0" w:color="AAAAAA"/>
@@ -1276,7 +1324,7 @@
         </w:tc>
         <w:tc>
           <w:tcPr>
-            <w:tcW w:w="1100" w:type="dxa"/>
+            <w:tcW w:w="1663" w:type="dxa"/>
             <w:tcBorders>
               <w:top w:val="single" w:sz="1" w:space="0" w:color="AAAAAA"/>
               <w:left w:val="single" w:sz="1" w:space="0" w:color="AAAAAA"/>
@@ -1296,7 +1344,7 @@
         </w:tc>
         <w:tc>
           <w:tcPr>
-            <w:tcW w:w="1200" w:type="dxa"/>
+            <w:tcW w:w="2221" w:type="dxa"/>
             <w:tcBorders>
               <w:top w:val="single" w:sz="1" w:space="0" w:color="AAAAAA"/>
               <w:left w:val="single" w:sz="1" w:space="0" w:color="AAAAAA"/>
@@ -1316,7 +1364,7 @@
         </w:tc>
         <w:tc>
           <w:tcPr>
-            <w:tcW w:w="1200" w:type="dxa"/>
+            <w:tcW w:w="1317" w:type="dxa"/>
             <w:tcBorders>
               <w:top w:val="single" w:sz="1" w:space="0" w:color="AAAAAA"/>
               <w:left w:val="single" w:sz="1" w:space="0" w:color="AAAAAA"/>
@@ -1336,7 +1384,7 @@
         </w:tc>
         <w:tc>
           <w:tcPr>
-            <w:tcW w:w="1200" w:type="dxa"/>
+            <w:tcW w:w="2124" w:type="dxa"/>
             <w:tcBorders>
               <w:top w:val="single" w:sz="1" w:space="0" w:color="AAAAAA"/>
               <w:left w:val="single" w:sz="1" w:space="0" w:color="AAAAAA"/>
@@ -1356,7 +1404,7 @@
         </w:tc>
         <w:tc>
           <w:tcPr>
-            <w:tcW w:w="900" w:type="dxa"/>
+            <w:tcW w:w="1441" w:type="dxa"/>
             <w:tcBorders>
               <w:top w:val="single" w:sz="1" w:space="0" w:color="AAAAAA"/>
               <w:left w:val="single" w:sz="1" w:space="0" w:color="AAAAAA"/>
@@ -1376,9 +1424,12 @@
         </w:tc>
       </w:tr>
       <w:tr>
-        <w:tc>
-          <w:tcPr>
-            <w:tcW w:w="500" w:type="dxa"/>
+        <w:trPr>
+          <w:trHeight w:val="288"/>
+        </w:trPr>
+        <w:tc>
+          <w:tcPr>
+            <w:tcW w:w="452" w:type="dxa"/>
             <w:tcBorders>
               <w:top w:val="single" w:sz="1" w:space="0" w:color="AAAAAA"/>
               <w:left w:val="single" w:sz="1" w:space="0" w:color="AAAAAA"/>
@@ -1398,7 +1449,7 @@
         </w:tc>
         <w:tc>
           <w:tcPr>
-            <w:tcW w:w="1400" w:type="dxa"/>
+            <w:tcW w:w="1072" w:type="dxa"/>
             <w:tcBorders>
               <w:top w:val="single" w:sz="1" w:space="0" w:color="AAAAAA"/>
               <w:left w:val="single" w:sz="1" w:space="0" w:color="AAAAAA"/>
@@ -1418,7 +1469,7 @@
         </w:tc>
         <w:tc>
           <w:tcPr>
-            <w:tcW w:w="1400" w:type="dxa"/>
+            <w:tcW w:w="1329" w:type="dxa"/>
             <w:tcBorders>
               <w:top w:val="single" w:sz="1" w:space="0" w:color="AAAAAA"/>
               <w:left w:val="single" w:sz="1" w:space="0" w:color="AAAAAA"/>
@@ -1438,7 +1489,7 @@
         </w:tc>
         <w:tc>
           <w:tcPr>
-            <w:tcW w:w="1100" w:type="dxa"/>
+            <w:tcW w:w="1663" w:type="dxa"/>
             <w:tcBorders>
               <w:top w:val="single" w:sz="1" w:space="0" w:color="AAAAAA"/>
               <w:left w:val="single" w:sz="1" w:space="0" w:color="AAAAAA"/>
@@ -1458,7 +1509,7 @@
         </w:tc>
         <w:tc>
           <w:tcPr>
-            <w:tcW w:w="1200" w:type="dxa"/>
+            <w:tcW w:w="2221" w:type="dxa"/>
             <w:tcBorders>
               <w:top w:val="single" w:sz="1" w:space="0" w:color="AAAAAA"/>
               <w:left w:val="single" w:sz="1" w:space="0" w:color="AAAAAA"/>
@@ -1478,7 +1529,7 @@
         </w:tc>
         <w:tc>
           <w:tcPr>
-            <w:tcW w:w="1200" w:type="dxa"/>
+            <w:tcW w:w="1317" w:type="dxa"/>
             <w:tcBorders>
               <w:top w:val="single" w:sz="1" w:space="0" w:color="AAAAAA"/>
               <w:left w:val="single" w:sz="1" w:space="0" w:color="AAAAAA"/>
@@ -1498,7 +1549,7 @@
         </w:tc>
         <w:tc>
           <w:tcPr>
-            <w:tcW w:w="1200" w:type="dxa"/>
+            <w:tcW w:w="2124" w:type="dxa"/>
             <w:tcBorders>
               <w:top w:val="single" w:sz="1" w:space="0" w:color="AAAAAA"/>
               <w:left w:val="single" w:sz="1" w:space="0" w:color="AAAAAA"/>
@@ -1518,7 +1569,7 @@
         </w:tc>
         <w:tc>
           <w:tcPr>
-            <w:tcW w:w="900" w:type="dxa"/>
+            <w:tcW w:w="1441" w:type="dxa"/>
             <w:tcBorders>
               <w:top w:val="single" w:sz="1" w:space="0" w:color="AAAAAA"/>
               <w:left w:val="single" w:sz="1" w:space="0" w:color="AAAAAA"/>
@@ -1736,6 +1787,7 @@
                 <w:sz w:val="20"/>
                 <w:szCs w:val="20"/>
               </w:rPr>
+              <w:lastRenderedPageBreak/>
               <w:t>Environment</w:t>
             </w:r>
           </w:p>
@@ -1871,7 +1923,6 @@
                 <w:sz w:val="20"/>
                 <w:szCs w:val="20"/>
               </w:rPr>
-              <w:lastRenderedPageBreak/>
               <w:t>Development</w:t>
             </w:r>
           </w:p>
@@ -3261,6 +3312,7 @@
                 <w:sz w:val="20"/>
                 <w:szCs w:val="20"/>
               </w:rPr>
+              <w:lastRenderedPageBreak/>
               <w:t>1</w:t>
             </w:r>
           </w:p>
@@ -3387,16 +3439,7 @@
                 <w:sz w:val="20"/>
                 <w:szCs w:val="20"/>
               </w:rPr>
-              <w:t xml:space="preserve"> HTML &amp; CSS Linting, Building with </w:t>
-            </w:r>
-            <w:r>
-              <w:rPr>
-                <w:color w:val="000000"/>
-                <w:sz w:val="20"/>
-                <w:szCs w:val="20"/>
-              </w:rPr>
-              <w:lastRenderedPageBreak/>
-              <w:t>Parcel,</w:t>
+              <w:t xml:space="preserve"> HTML &amp; CSS Linting, Building with Parcel,</w:t>
             </w:r>
             <w:r>
               <w:rPr>
@@ -3440,7 +3483,6 @@
                 <w:sz w:val="20"/>
                 <w:szCs w:val="20"/>
               </w:rPr>
-              <w:lastRenderedPageBreak/>
               <w:t>2</w:t>
             </w:r>
           </w:p>
@@ -14870,7 +14912,7 @@
 </file>
 
 <file path=word/endnotes.xml><?xml version="1.0" encoding="utf-8"?>
-<w:endnotes xmlns:wpc="http://schemas.microsoft.com/office/word/2010/wordprocessingCanvas" xmlns:cx="http://schemas.microsoft.com/office/drawing/2014/chartex" xmlns:cx1="http://schemas.microsoft.com/office/drawing/2015/9/8/chartex" xmlns:cx2="http://schemas.microsoft.com/office/drawing/2015/10/21/chartex" xmlns:cx3="http://schemas.microsoft.com/office/drawing/2016/5/9/chartex" xmlns:cx4="http://schemas.microsoft.com/office/drawing/2016/5/10/chartex" xmlns:cx5="http://schemas.microsoft.com/office/drawing/2016/5/11/chartex" xmlns:cx6="http://schemas.microsoft.com/office/drawing/2016/5/12/chartex" xmlns:cx7="http://schemas.microsoft.com/office/drawing/2016/5/13/chartex" xmlns:cx8="http://schemas.microsoft.com/office/drawing/2016/5/14/chartex" xmlns:mc="http://schemas.openxmlformats.org/markup-compatibility/2006" xmlns:aink="http://schemas.microsoft.com/office/drawing/2016/ink" xmlns:am3d="http://schemas.microsoft.com/office/drawing/2017/model3d" xmlns:o="urn:schemas-microsoft-com:office:office" xmlns:oel="http://schemas.microsoft.com/office/2019/extlst" xmlns:r="http://schemas.openxmlformats.org/officeDocument/2006/relationships" xmlns:m="http://schemas.openxmlformats.org/officeDocument/2006/math" xmlns:v="urn:schemas-microsoft-com:vml" xmlns:wp14="http://schemas.microsoft.com/office/word/2010/wordprocessingDrawing" xmlns:wp="http://schemas.openxmlformats.org/drawingml/2006/wordprocessingDrawing" xmlns:w10="urn:schemas-microsoft-com:office:word" xmlns:w="http://schemas.openxmlformats.org/wordprocessingml/2006/main" xmlns:w14="http://schemas.microsoft.com/office/word/2010/wordml" xmlns:w15="http://schemas.microsoft.com/office/word/2012/wordml" xmlns:w16cex="http://schemas.microsoft.com/office/word/2018/wordml/cex" xmlns:w16cid="http://schemas.microsoft.com/office/word/2016/wordml/cid" xmlns:w16="http://schemas.microsoft.com/office/word/2018/wordml" xmlns:w16du="http://schemas.microsoft.com/office/word/2023/wordml/word16du" xmlns:w16sdtdh="http://schemas.microsoft.com/office/word/2020/wordml/sdtdatahash" xmlns:w16sdtfl="http://schemas.microsoft.com/office/word/2024/wordml/sdtformatlock" xmlns:w16se="http://schemas.microsoft.com/office/word/2015/wordml/symex" xmlns:wpg="http://schemas.microsoft.com/office/word/2010/wordprocessingGroup" xmlns:wpi="http://schemas.microsoft.com/office/word/2010/wordprocessingInk" xmlns:wne="http://schemas.microsoft.com/office/word/2006/wordml" xmlns:wps="http://schemas.microsoft.com/office/word/2010/wordprocessingShape" mc:Ignorable="w14 w15 w16se w16cid w16 w16cex w16sdtdh w16sdtfl w16du wp14">
+<w:endnotes xmlns:wpc="http://schemas.microsoft.com/office/word/2010/wordprocessingCanvas" xmlns:cx="http://schemas.microsoft.com/office/drawing/2014/chartex" xmlns:cx1="http://schemas.microsoft.com/office/drawing/2015/9/8/chartex" xmlns:cx2="http://schemas.microsoft.com/office/drawing/2015/10/21/chartex" xmlns:cx3="http://schemas.microsoft.com/office/drawing/2016/5/9/chartex" xmlns:cx4="http://schemas.microsoft.com/office/drawing/2016/5/10/chartex" xmlns:cx5="http://schemas.microsoft.com/office/drawing/2016/5/11/chartex" xmlns:cx6="http://schemas.microsoft.com/office/drawing/2016/5/12/chartex" xmlns:cx7="http://schemas.microsoft.com/office/drawing/2016/5/13/chartex" xmlns:cx8="http://schemas.microsoft.com/office/drawing/2016/5/14/chartex" xmlns:mc="http://schemas.openxmlformats.org/markup-compatibility/2006" xmlns:aink="http://schemas.microsoft.com/office/drawing/2016/ink" xmlns:am3d="http://schemas.microsoft.com/office/drawing/2017/model3d" xmlns:o="urn:schemas-microsoft-com:office:office" xmlns:oel="http://schemas.microsoft.com/office/2019/extlst" xmlns:r="http://schemas.openxmlformats.org/officeDocument/2006/relationships" xmlns:m="http://schemas.openxmlformats.org/officeDocument/2006/math" xmlns:v="urn:schemas-microsoft-com:vml" xmlns:wp14="http://schemas.microsoft.com/office/word/2010/wordprocessingDrawing" xmlns:wp="http://schemas.openxmlformats.org/drawingml/2006/wordprocessingDrawing" xmlns:w10="urn:schemas-microsoft-com:office:word" xmlns:w="http://schemas.openxmlformats.org/wordprocessingml/2006/main" xmlns:w14="http://schemas.microsoft.com/office/word/2010/wordml" xmlns:w15="http://schemas.microsoft.com/office/word/2012/wordml" xmlns:w16cex="http://schemas.microsoft.com/office/word/2018/wordml/cex" xmlns:w16cid="http://schemas.microsoft.com/office/word/2016/wordml/cid" xmlns:w16="http://schemas.microsoft.com/office/word/2018/wordml" xmlns:w16sdtdh="http://schemas.microsoft.com/office/word/2020/wordml/sdtdatahash" xmlns:w16se="http://schemas.microsoft.com/office/word/2015/wordml/symex" xmlns:wpg="http://schemas.microsoft.com/office/word/2010/wordprocessingGroup" xmlns:wpi="http://schemas.microsoft.com/office/word/2010/wordprocessingInk" xmlns:wne="http://schemas.microsoft.com/office/word/2006/wordml" xmlns:wps="http://schemas.microsoft.com/office/word/2010/wordprocessingShape" mc:Ignorable="w14 w15 w16se w16cid w16 w16cex w16sdtdh wp14">
   <w:endnote w:type="separator" w:id="-1">
     <w:p>
       <w:r>
@@ -14889,7 +14931,7 @@
 </file>
 
 <file path=word/footer1.xml><?xml version="1.0" encoding="utf-8"?>
-<w:ftr xmlns:wpc="http://schemas.microsoft.com/office/word/2010/wordprocessingCanvas" xmlns:cx="http://schemas.microsoft.com/office/drawing/2014/chartex" xmlns:cx1="http://schemas.microsoft.com/office/drawing/2015/9/8/chartex" xmlns:cx2="http://schemas.microsoft.com/office/drawing/2015/10/21/chartex" xmlns:cx3="http://schemas.microsoft.com/office/drawing/2016/5/9/chartex" xmlns:cx4="http://schemas.microsoft.com/office/drawing/2016/5/10/chartex" xmlns:cx5="http://schemas.microsoft.com/office/drawing/2016/5/11/chartex" xmlns:cx6="http://schemas.microsoft.com/office/drawing/2016/5/12/chartex" xmlns:cx7="http://schemas.microsoft.com/office/drawing/2016/5/13/chartex" xmlns:cx8="http://schemas.microsoft.com/office/drawing/2016/5/14/chartex" xmlns:mc="http://schemas.openxmlformats.org/markup-compatibility/2006" xmlns:aink="http://schemas.microsoft.com/office/drawing/2016/ink" xmlns:am3d="http://schemas.microsoft.com/office/drawing/2017/model3d" xmlns:o="urn:schemas-microsoft-com:office:office" xmlns:oel="http://schemas.microsoft.com/office/2019/extlst" xmlns:r="http://schemas.openxmlformats.org/officeDocument/2006/relationships" xmlns:m="http://schemas.openxmlformats.org/officeDocument/2006/math" xmlns:v="urn:schemas-microsoft-com:vml" xmlns:wp14="http://schemas.microsoft.com/office/word/2010/wordprocessingDrawing" xmlns:wp="http://schemas.openxmlformats.org/drawingml/2006/wordprocessingDrawing" xmlns:w10="urn:schemas-microsoft-com:office:word" xmlns:w="http://schemas.openxmlformats.org/wordprocessingml/2006/main" xmlns:w14="http://schemas.microsoft.com/office/word/2010/wordml" xmlns:w15="http://schemas.microsoft.com/office/word/2012/wordml" xmlns:w16cex="http://schemas.microsoft.com/office/word/2018/wordml/cex" xmlns:w16cid="http://schemas.microsoft.com/office/word/2016/wordml/cid" xmlns:w16="http://schemas.microsoft.com/office/word/2018/wordml" xmlns:w16du="http://schemas.microsoft.com/office/word/2023/wordml/word16du" xmlns:w16sdtdh="http://schemas.microsoft.com/office/word/2020/wordml/sdtdatahash" xmlns:w16sdtfl="http://schemas.microsoft.com/office/word/2024/wordml/sdtformatlock" xmlns:w16se="http://schemas.microsoft.com/office/word/2015/wordml/symex" xmlns:wpg="http://schemas.microsoft.com/office/word/2010/wordprocessingGroup" xmlns:wpi="http://schemas.microsoft.com/office/word/2010/wordprocessingInk" xmlns:wne="http://schemas.microsoft.com/office/word/2006/wordml" xmlns:wps="http://schemas.microsoft.com/office/word/2010/wordprocessingShape" mc:Ignorable="w14 w15 w16se w16cid w16 w16cex w16sdtdh w16sdtfl w16du wp14">
+<w:ftr xmlns:wpc="http://schemas.microsoft.com/office/word/2010/wordprocessingCanvas" xmlns:cx="http://schemas.microsoft.com/office/drawing/2014/chartex" xmlns:cx1="http://schemas.microsoft.com/office/drawing/2015/9/8/chartex" xmlns:cx2="http://schemas.microsoft.com/office/drawing/2015/10/21/chartex" xmlns:cx3="http://schemas.microsoft.com/office/drawing/2016/5/9/chartex" xmlns:cx4="http://schemas.microsoft.com/office/drawing/2016/5/10/chartex" xmlns:cx5="http://schemas.microsoft.com/office/drawing/2016/5/11/chartex" xmlns:cx6="http://schemas.microsoft.com/office/drawing/2016/5/12/chartex" xmlns:cx7="http://schemas.microsoft.com/office/drawing/2016/5/13/chartex" xmlns:cx8="http://schemas.microsoft.com/office/drawing/2016/5/14/chartex" xmlns:mc="http://schemas.openxmlformats.org/markup-compatibility/2006" xmlns:aink="http://schemas.microsoft.com/office/drawing/2016/ink" xmlns:am3d="http://schemas.microsoft.com/office/drawing/2017/model3d" xmlns:o="urn:schemas-microsoft-com:office:office" xmlns:oel="http://schemas.microsoft.com/office/2019/extlst" xmlns:r="http://schemas.openxmlformats.org/officeDocument/2006/relationships" xmlns:m="http://schemas.openxmlformats.org/officeDocument/2006/math" xmlns:v="urn:schemas-microsoft-com:vml" xmlns:wp14="http://schemas.microsoft.com/office/word/2010/wordprocessingDrawing" xmlns:wp="http://schemas.openxmlformats.org/drawingml/2006/wordprocessingDrawing" xmlns:w10="urn:schemas-microsoft-com:office:word" xmlns:w="http://schemas.openxmlformats.org/wordprocessingml/2006/main" xmlns:w14="http://schemas.microsoft.com/office/word/2010/wordml" xmlns:w15="http://schemas.microsoft.com/office/word/2012/wordml" xmlns:w16cex="http://schemas.microsoft.com/office/word/2018/wordml/cex" xmlns:w16cid="http://schemas.microsoft.com/office/word/2016/wordml/cid" xmlns:w16="http://schemas.microsoft.com/office/word/2018/wordml" xmlns:w16sdtdh="http://schemas.microsoft.com/office/word/2020/wordml/sdtdatahash" xmlns:w16se="http://schemas.microsoft.com/office/word/2015/wordml/symex" xmlns:wpg="http://schemas.microsoft.com/office/word/2010/wordprocessingGroup" xmlns:wpi="http://schemas.microsoft.com/office/word/2010/wordprocessingInk" xmlns:wne="http://schemas.microsoft.com/office/word/2006/wordml" xmlns:wps="http://schemas.microsoft.com/office/word/2010/wordprocessingShape" mc:Ignorable="w14 w15 w16se w16cid w16 w16cex w16sdtdh wp14">
   <w:p>
     <w:pPr>
       <w:pBdr>
@@ -15011,7 +15053,7 @@
 </file>
 
 <file path=word/footnotes.xml><?xml version="1.0" encoding="utf-8"?>
-<w:footnotes xmlns:wpc="http://schemas.microsoft.com/office/word/2010/wordprocessingCanvas" xmlns:cx="http://schemas.microsoft.com/office/drawing/2014/chartex" xmlns:cx1="http://schemas.microsoft.com/office/drawing/2015/9/8/chartex" xmlns:cx2="http://schemas.microsoft.com/office/drawing/2015/10/21/chartex" xmlns:cx3="http://schemas.microsoft.com/office/drawing/2016/5/9/chartex" xmlns:cx4="http://schemas.microsoft.com/office/drawing/2016/5/10/chartex" xmlns:cx5="http://schemas.microsoft.com/office/drawing/2016/5/11/chartex" xmlns:cx6="http://schemas.microsoft.com/office/drawing/2016/5/12/chartex" xmlns:cx7="http://schemas.microsoft.com/office/drawing/2016/5/13/chartex" xmlns:cx8="http://schemas.microsoft.com/office/drawing/2016/5/14/chartex" xmlns:mc="http://schemas.openxmlformats.org/markup-compatibility/2006" xmlns:aink="http://schemas.microsoft.com/office/drawing/2016/ink" xmlns:am3d="http://schemas.microsoft.com/office/drawing/2017/model3d" xmlns:o="urn:schemas-microsoft-com:office:office" xmlns:oel="http://schemas.microsoft.com/office/2019/extlst" xmlns:r="http://schemas.openxmlformats.org/officeDocument/2006/relationships" xmlns:m="http://schemas.openxmlformats.org/officeDocument/2006/math" xmlns:v="urn:schemas-microsoft-com:vml" xmlns:wp14="http://schemas.microsoft.com/office/word/2010/wordprocessingDrawing" xmlns:wp="http://schemas.openxmlformats.org/drawingml/2006/wordprocessingDrawing" xmlns:w10="urn:schemas-microsoft-com:office:word" xmlns:w="http://schemas.openxmlformats.org/wordprocessingml/2006/main" xmlns:w14="http://schemas.microsoft.com/office/word/2010/wordml" xmlns:w15="http://schemas.microsoft.com/office/word/2012/wordml" xmlns:w16cex="http://schemas.microsoft.com/office/word/2018/wordml/cex" xmlns:w16cid="http://schemas.microsoft.com/office/word/2016/wordml/cid" xmlns:w16="http://schemas.microsoft.com/office/word/2018/wordml" xmlns:w16du="http://schemas.microsoft.com/office/word/2023/wordml/word16du" xmlns:w16sdtdh="http://schemas.microsoft.com/office/word/2020/wordml/sdtdatahash" xmlns:w16sdtfl="http://schemas.microsoft.com/office/word/2024/wordml/sdtformatlock" xmlns:w16se="http://schemas.microsoft.com/office/word/2015/wordml/symex" xmlns:wpg="http://schemas.microsoft.com/office/word/2010/wordprocessingGroup" xmlns:wpi="http://schemas.microsoft.com/office/word/2010/wordprocessingInk" xmlns:wne="http://schemas.microsoft.com/office/word/2006/wordml" xmlns:wps="http://schemas.microsoft.com/office/word/2010/wordprocessingShape" mc:Ignorable="w14 w15 w16se w16cid w16 w16cex w16sdtdh w16sdtfl w16du wp14">
+<w:footnotes xmlns:wpc="http://schemas.microsoft.com/office/word/2010/wordprocessingCanvas" xmlns:cx="http://schemas.microsoft.com/office/drawing/2014/chartex" xmlns:cx1="http://schemas.microsoft.com/office/drawing/2015/9/8/chartex" xmlns:cx2="http://schemas.microsoft.com/office/drawing/2015/10/21/chartex" xmlns:cx3="http://schemas.microsoft.com/office/drawing/2016/5/9/chartex" xmlns:cx4="http://schemas.microsoft.com/office/drawing/2016/5/10/chartex" xmlns:cx5="http://schemas.microsoft.com/office/drawing/2016/5/11/chartex" xmlns:cx6="http://schemas.microsoft.com/office/drawing/2016/5/12/chartex" xmlns:cx7="http://schemas.microsoft.com/office/drawing/2016/5/13/chartex" xmlns:cx8="http://schemas.microsoft.com/office/drawing/2016/5/14/chartex" xmlns:mc="http://schemas.openxmlformats.org/markup-compatibility/2006" xmlns:aink="http://schemas.microsoft.com/office/drawing/2016/ink" xmlns:am3d="http://schemas.microsoft.com/office/drawing/2017/model3d" xmlns:o="urn:schemas-microsoft-com:office:office" xmlns:oel="http://schemas.microsoft.com/office/2019/extlst" xmlns:r="http://schemas.openxmlformats.org/officeDocument/2006/relationships" xmlns:m="http://schemas.openxmlformats.org/officeDocument/2006/math" xmlns:v="urn:schemas-microsoft-com:vml" xmlns:wp14="http://schemas.microsoft.com/office/word/2010/wordprocessingDrawing" xmlns:wp="http://schemas.openxmlformats.org/drawingml/2006/wordprocessingDrawing" xmlns:w10="urn:schemas-microsoft-com:office:word" xmlns:w="http://schemas.openxmlformats.org/wordprocessingml/2006/main" xmlns:w14="http://schemas.microsoft.com/office/word/2010/wordml" xmlns:w15="http://schemas.microsoft.com/office/word/2012/wordml" xmlns:w16cex="http://schemas.microsoft.com/office/word/2018/wordml/cex" xmlns:w16cid="http://schemas.microsoft.com/office/word/2016/wordml/cid" xmlns:w16="http://schemas.microsoft.com/office/word/2018/wordml" xmlns:w16sdtdh="http://schemas.microsoft.com/office/word/2020/wordml/sdtdatahash" xmlns:w16se="http://schemas.microsoft.com/office/word/2015/wordml/symex" xmlns:wpg="http://schemas.microsoft.com/office/word/2010/wordprocessingGroup" xmlns:wpi="http://schemas.microsoft.com/office/word/2010/wordprocessingInk" xmlns:wne="http://schemas.microsoft.com/office/word/2006/wordml" xmlns:wps="http://schemas.microsoft.com/office/word/2010/wordprocessingShape" mc:Ignorable="w14 w15 w16se w16cid w16 w16cex w16sdtdh wp14">
   <w:footnote w:type="separator" w:id="-1">
     <w:p>
       <w:r>
@@ -15030,7 +15072,7 @@
 </file>
 
 <file path=word/header1.xml><?xml version="1.0" encoding="utf-8"?>
-<w:hdr xmlns:wpc="http://schemas.microsoft.com/office/word/2010/wordprocessingCanvas" xmlns:cx="http://schemas.microsoft.com/office/drawing/2014/chartex" xmlns:cx1="http://schemas.microsoft.com/office/drawing/2015/9/8/chartex" xmlns:cx2="http://schemas.microsoft.com/office/drawing/2015/10/21/chartex" xmlns:cx3="http://schemas.microsoft.com/office/drawing/2016/5/9/chartex" xmlns:cx4="http://schemas.microsoft.com/office/drawing/2016/5/10/chartex" xmlns:cx5="http://schemas.microsoft.com/office/drawing/2016/5/11/chartex" xmlns:cx6="http://schemas.microsoft.com/office/drawing/2016/5/12/chartex" xmlns:cx7="http://schemas.microsoft.com/office/drawing/2016/5/13/chartex" xmlns:cx8="http://schemas.microsoft.com/office/drawing/2016/5/14/chartex" xmlns:mc="http://schemas.openxmlformats.org/markup-compatibility/2006" xmlns:aink="http://schemas.microsoft.com/office/drawing/2016/ink" xmlns:am3d="http://schemas.microsoft.com/office/drawing/2017/model3d" xmlns:o="urn:schemas-microsoft-com:office:office" xmlns:oel="http://schemas.microsoft.com/office/2019/extlst" xmlns:r="http://schemas.openxmlformats.org/officeDocument/2006/relationships" xmlns:m="http://schemas.openxmlformats.org/officeDocument/2006/math" xmlns:v="urn:schemas-microsoft-com:vml" xmlns:wp14="http://schemas.microsoft.com/office/word/2010/wordprocessingDrawing" xmlns:wp="http://schemas.openxmlformats.org/drawingml/2006/wordprocessingDrawing" xmlns:w10="urn:schemas-microsoft-com:office:word" xmlns:w="http://schemas.openxmlformats.org/wordprocessingml/2006/main" xmlns:w14="http://schemas.microsoft.com/office/word/2010/wordml" xmlns:w15="http://schemas.microsoft.com/office/word/2012/wordml" xmlns:w16cex="http://schemas.microsoft.com/office/word/2018/wordml/cex" xmlns:w16cid="http://schemas.microsoft.com/office/word/2016/wordml/cid" xmlns:w16="http://schemas.microsoft.com/office/word/2018/wordml" xmlns:w16du="http://schemas.microsoft.com/office/word/2023/wordml/word16du" xmlns:w16sdtdh="http://schemas.microsoft.com/office/word/2020/wordml/sdtdatahash" xmlns:w16sdtfl="http://schemas.microsoft.com/office/word/2024/wordml/sdtformatlock" xmlns:w16se="http://schemas.microsoft.com/office/word/2015/wordml/symex" xmlns:wpg="http://schemas.microsoft.com/office/word/2010/wordprocessingGroup" xmlns:wpi="http://schemas.microsoft.com/office/word/2010/wordprocessingInk" xmlns:wne="http://schemas.microsoft.com/office/word/2006/wordml" xmlns:wps="http://schemas.microsoft.com/office/word/2010/wordprocessingShape" mc:Ignorable="w14 w15 w16se w16cid w16 w16cex w16sdtdh w16sdtfl w16du wp14">
+<w:hdr xmlns:wpc="http://schemas.microsoft.com/office/word/2010/wordprocessingCanvas" xmlns:cx="http://schemas.microsoft.com/office/drawing/2014/chartex" xmlns:cx1="http://schemas.microsoft.com/office/drawing/2015/9/8/chartex" xmlns:cx2="http://schemas.microsoft.com/office/drawing/2015/10/21/chartex" xmlns:cx3="http://schemas.microsoft.com/office/drawing/2016/5/9/chartex" xmlns:cx4="http://schemas.microsoft.com/office/drawing/2016/5/10/chartex" xmlns:cx5="http://schemas.microsoft.com/office/drawing/2016/5/11/chartex" xmlns:cx6="http://schemas.microsoft.com/office/drawing/2016/5/12/chartex" xmlns:cx7="http://schemas.microsoft.com/office/drawing/2016/5/13/chartex" xmlns:cx8="http://schemas.microsoft.com/office/drawing/2016/5/14/chartex" xmlns:mc="http://schemas.openxmlformats.org/markup-compatibility/2006" xmlns:aink="http://schemas.microsoft.com/office/drawing/2016/ink" xmlns:am3d="http://schemas.microsoft.com/office/drawing/2017/model3d" xmlns:o="urn:schemas-microsoft-com:office:office" xmlns:oel="http://schemas.microsoft.com/office/2019/extlst" xmlns:r="http://schemas.openxmlformats.org/officeDocument/2006/relationships" xmlns:m="http://schemas.openxmlformats.org/officeDocument/2006/math" xmlns:v="urn:schemas-microsoft-com:vml" xmlns:wp14="http://schemas.microsoft.com/office/word/2010/wordprocessingDrawing" xmlns:wp="http://schemas.openxmlformats.org/drawingml/2006/wordprocessingDrawing" xmlns:w10="urn:schemas-microsoft-com:office:word" xmlns:w="http://schemas.openxmlformats.org/wordprocessingml/2006/main" xmlns:w14="http://schemas.microsoft.com/office/word/2010/wordml" xmlns:w15="http://schemas.microsoft.com/office/word/2012/wordml" xmlns:w16cex="http://schemas.microsoft.com/office/word/2018/wordml/cex" xmlns:w16cid="http://schemas.microsoft.com/office/word/2016/wordml/cid" xmlns:w16="http://schemas.microsoft.com/office/word/2018/wordml" xmlns:w16sdtdh="http://schemas.microsoft.com/office/word/2020/wordml/sdtdatahash" xmlns:w16se="http://schemas.microsoft.com/office/word/2015/wordml/symex" xmlns:wpg="http://schemas.microsoft.com/office/word/2010/wordprocessingGroup" xmlns:wpi="http://schemas.microsoft.com/office/word/2010/wordprocessingInk" xmlns:wne="http://schemas.microsoft.com/office/word/2006/wordml" xmlns:wps="http://schemas.microsoft.com/office/word/2010/wordprocessingShape" mc:Ignorable="w14 w15 w16se w16cid w16 w16cex w16sdtdh wp14">
   <w:p>
     <w:pPr>
       <w:pBdr>
@@ -15064,7 +15106,7 @@
 </file>
 
 <file path=word/numbering.xml><?xml version="1.0" encoding="utf-8"?>
-<w:numbering xmlns:wpc="http://schemas.microsoft.com/office/word/2010/wordprocessingCanvas" xmlns:cx="http://schemas.microsoft.com/office/drawing/2014/chartex" xmlns:cx1="http://schemas.microsoft.com/office/drawing/2015/9/8/chartex" xmlns:cx2="http://schemas.microsoft.com/office/drawing/2015/10/21/chartex" xmlns:cx3="http://schemas.microsoft.com/office/drawing/2016/5/9/chartex" xmlns:cx4="http://schemas.microsoft.com/office/drawing/2016/5/10/chartex" xmlns:cx5="http://schemas.microsoft.com/office/drawing/2016/5/11/chartex" xmlns:cx6="http://schemas.microsoft.com/office/drawing/2016/5/12/chartex" xmlns:cx7="http://schemas.microsoft.com/office/drawing/2016/5/13/chartex" xmlns:cx8="http://schemas.microsoft.com/office/drawing/2016/5/14/chartex" xmlns:mc="http://schemas.openxmlformats.org/markup-compatibility/2006" xmlns:aink="http://schemas.microsoft.com/office/drawing/2016/ink" xmlns:am3d="http://schemas.microsoft.com/office/drawing/2017/model3d" xmlns:o="urn:schemas-microsoft-com:office:office" xmlns:oel="http://schemas.microsoft.com/office/2019/extlst" xmlns:r="http://schemas.openxmlformats.org/officeDocument/2006/relationships" xmlns:m="http://schemas.openxmlformats.org/officeDocument/2006/math" xmlns:v="urn:schemas-microsoft-com:vml" xmlns:wp14="http://schemas.microsoft.com/office/word/2010/wordprocessingDrawing" xmlns:wp="http://schemas.openxmlformats.org/drawingml/2006/wordprocessingDrawing" xmlns:w10="urn:schemas-microsoft-com:office:word" xmlns:w="http://schemas.openxmlformats.org/wordprocessingml/2006/main" xmlns:w14="http://schemas.microsoft.com/office/word/2010/wordml" xmlns:w15="http://schemas.microsoft.com/office/word/2012/wordml" xmlns:w16cex="http://schemas.microsoft.com/office/word/2018/wordml/cex" xmlns:w16cid="http://schemas.microsoft.com/office/word/2016/wordml/cid" xmlns:w16="http://schemas.microsoft.com/office/word/2018/wordml" xmlns:w16du="http://schemas.microsoft.com/office/word/2023/wordml/word16du" xmlns:w16sdtdh="http://schemas.microsoft.com/office/word/2020/wordml/sdtdatahash" xmlns:w16sdtfl="http://schemas.microsoft.com/office/word/2024/wordml/sdtformatlock" xmlns:w16se="http://schemas.microsoft.com/office/word/2015/wordml/symex" xmlns:wpg="http://schemas.microsoft.com/office/word/2010/wordprocessingGroup" xmlns:wpi="http://schemas.microsoft.com/office/word/2010/wordprocessingInk" xmlns:wne="http://schemas.microsoft.com/office/word/2006/wordml" xmlns:wps="http://schemas.microsoft.com/office/word/2010/wordprocessingShape" mc:Ignorable="w14 w15 w16se w16cid w16 w16cex w16sdtdh w16sdtfl w16du wp14">
+<w:numbering xmlns:wpc="http://schemas.microsoft.com/office/word/2010/wordprocessingCanvas" xmlns:cx="http://schemas.microsoft.com/office/drawing/2014/chartex" xmlns:cx1="http://schemas.microsoft.com/office/drawing/2015/9/8/chartex" xmlns:cx2="http://schemas.microsoft.com/office/drawing/2015/10/21/chartex" xmlns:cx3="http://schemas.microsoft.com/office/drawing/2016/5/9/chartex" xmlns:cx4="http://schemas.microsoft.com/office/drawing/2016/5/10/chartex" xmlns:cx5="http://schemas.microsoft.com/office/drawing/2016/5/11/chartex" xmlns:cx6="http://schemas.microsoft.com/office/drawing/2016/5/12/chartex" xmlns:cx7="http://schemas.microsoft.com/office/drawing/2016/5/13/chartex" xmlns:cx8="http://schemas.microsoft.com/office/drawing/2016/5/14/chartex" xmlns:mc="http://schemas.openxmlformats.org/markup-compatibility/2006" xmlns:aink="http://schemas.microsoft.com/office/drawing/2016/ink" xmlns:am3d="http://schemas.microsoft.com/office/drawing/2017/model3d" xmlns:o="urn:schemas-microsoft-com:office:office" xmlns:oel="http://schemas.microsoft.com/office/2019/extlst" xmlns:r="http://schemas.openxmlformats.org/officeDocument/2006/relationships" xmlns:m="http://schemas.openxmlformats.org/officeDocument/2006/math" xmlns:v="urn:schemas-microsoft-com:vml" xmlns:wp14="http://schemas.microsoft.com/office/word/2010/wordprocessingDrawing" xmlns:wp="http://schemas.openxmlformats.org/drawingml/2006/wordprocessingDrawing" xmlns:w10="urn:schemas-microsoft-com:office:word" xmlns:w="http://schemas.openxmlformats.org/wordprocessingml/2006/main" xmlns:w14="http://schemas.microsoft.com/office/word/2010/wordml" xmlns:w15="http://schemas.microsoft.com/office/word/2012/wordml" xmlns:w16cex="http://schemas.microsoft.com/office/word/2018/wordml/cex" xmlns:w16cid="http://schemas.microsoft.com/office/word/2016/wordml/cid" xmlns:w16="http://schemas.microsoft.com/office/word/2018/wordml" xmlns:w16sdtdh="http://schemas.microsoft.com/office/word/2020/wordml/sdtdatahash" xmlns:w16se="http://schemas.microsoft.com/office/word/2015/wordml/symex" xmlns:wpg="http://schemas.microsoft.com/office/word/2010/wordprocessingGroup" xmlns:wpi="http://schemas.microsoft.com/office/word/2010/wordprocessingInk" xmlns:wne="http://schemas.microsoft.com/office/word/2006/wordml" xmlns:wps="http://schemas.microsoft.com/office/word/2010/wordprocessingShape" mc:Ignorable="w14 w15 w16se w16cid w16 w16cex w16sdtdh wp14">
   <w:abstractNum w:abstractNumId="0" w15:restartNumberingAfterBreak="0">
     <w:nsid w:val="0C5F5D60"/>
     <w:multiLevelType w:val="hybridMultilevel"/>
@@ -15532,7 +15574,7 @@
 </file>
 
 <file path=word/styles.xml><?xml version="1.0" encoding="utf-8"?>
-<w:styles xmlns:mc="http://schemas.openxmlformats.org/markup-compatibility/2006" xmlns:r="http://schemas.openxmlformats.org/officeDocument/2006/relationships" xmlns:w="http://schemas.openxmlformats.org/wordprocessingml/2006/main" xmlns:w14="http://schemas.microsoft.com/office/word/2010/wordml" xmlns:w15="http://schemas.microsoft.com/office/word/2012/wordml" xmlns:w16cex="http://schemas.microsoft.com/office/word/2018/wordml/cex" xmlns:w16cid="http://schemas.microsoft.com/office/word/2016/wordml/cid" xmlns:w16="http://schemas.microsoft.com/office/word/2018/wordml" xmlns:w16du="http://schemas.microsoft.com/office/word/2023/wordml/word16du" xmlns:w16sdtdh="http://schemas.microsoft.com/office/word/2020/wordml/sdtdatahash" xmlns:w16sdtfl="http://schemas.microsoft.com/office/word/2024/wordml/sdtformatlock" xmlns:w16se="http://schemas.microsoft.com/office/word/2015/wordml/symex" mc:Ignorable="w14 w15 w16se w16cid w16 w16cex w16sdtdh w16sdtfl w16du">
+<w:styles xmlns:mc="http://schemas.openxmlformats.org/markup-compatibility/2006" xmlns:r="http://schemas.openxmlformats.org/officeDocument/2006/relationships" xmlns:w="http://schemas.openxmlformats.org/wordprocessingml/2006/main" xmlns:w14="http://schemas.microsoft.com/office/word/2010/wordml" xmlns:w15="http://schemas.microsoft.com/office/word/2012/wordml" xmlns:w16cex="http://schemas.microsoft.com/office/word/2018/wordml/cex" xmlns:w16cid="http://schemas.microsoft.com/office/word/2016/wordml/cid" xmlns:w16="http://schemas.microsoft.com/office/word/2018/wordml" xmlns:w16sdtdh="http://schemas.microsoft.com/office/word/2020/wordml/sdtdatahash" xmlns:w16se="http://schemas.microsoft.com/office/word/2015/wordml/symex" mc:Ignorable="w14 w15 w16se w16cid w16 w16cex w16sdtdh">
   <w:docDefaults>
     <w:rPrDefault>
       <w:rPr>
@@ -16022,7 +16064,6 @@
   <w:style w:type="character" w:default="1" w:styleId="DefaultParagraphFont">
     <w:name w:val="Default Paragraph Font"/>
     <w:uiPriority w:val="1"/>
-    <w:semiHidden/>
     <w:unhideWhenUsed/>
   </w:style>
   <w:style w:type="table" w:default="1" w:styleId="TableNormal">

</xml_diff>

<commit_message>
added swat.html and ci-dev and modified TermProject_Spring2026.docx
</commit_message>
<xml_diff>
--- a/TermProject_Spring2026.docx
+++ b/TermProject_Spring2026.docx
@@ -1,6 +1,6 @@
 
 <file path=word/document.xml><?xml version="1.0" encoding="utf-8"?>
-<w:document xmlns:wpc="http://schemas.microsoft.com/office/word/2010/wordprocessingCanvas" xmlns:cx="http://schemas.microsoft.com/office/drawing/2014/chartex" xmlns:cx1="http://schemas.microsoft.com/office/drawing/2015/9/8/chartex" xmlns:cx2="http://schemas.microsoft.com/office/drawing/2015/10/21/chartex" xmlns:cx3="http://schemas.microsoft.com/office/drawing/2016/5/9/chartex" xmlns:cx4="http://schemas.microsoft.com/office/drawing/2016/5/10/chartex" xmlns:cx5="http://schemas.microsoft.com/office/drawing/2016/5/11/chartex" xmlns:cx6="http://schemas.microsoft.com/office/drawing/2016/5/12/chartex" xmlns:cx7="http://schemas.microsoft.com/office/drawing/2016/5/13/chartex" xmlns:cx8="http://schemas.microsoft.com/office/drawing/2016/5/14/chartex" xmlns:mc="http://schemas.openxmlformats.org/markup-compatibility/2006" xmlns:aink="http://schemas.microsoft.com/office/drawing/2016/ink" xmlns:am3d="http://schemas.microsoft.com/office/drawing/2017/model3d" xmlns:o="urn:schemas-microsoft-com:office:office" xmlns:oel="http://schemas.microsoft.com/office/2019/extlst" xmlns:r="http://schemas.openxmlformats.org/officeDocument/2006/relationships" xmlns:m="http://schemas.openxmlformats.org/officeDocument/2006/math" xmlns:v="urn:schemas-microsoft-com:vml" xmlns:wp14="http://schemas.microsoft.com/office/word/2010/wordprocessingDrawing" xmlns:wp="http://schemas.openxmlformats.org/drawingml/2006/wordprocessingDrawing" xmlns:w10="urn:schemas-microsoft-com:office:word" xmlns:w="http://schemas.openxmlformats.org/wordprocessingml/2006/main" xmlns:w14="http://schemas.microsoft.com/office/word/2010/wordml" xmlns:w15="http://schemas.microsoft.com/office/word/2012/wordml" xmlns:w16cex="http://schemas.microsoft.com/office/word/2018/wordml/cex" xmlns:w16cid="http://schemas.microsoft.com/office/word/2016/wordml/cid" xmlns:w16="http://schemas.microsoft.com/office/word/2018/wordml" xmlns:w16sdtdh="http://schemas.microsoft.com/office/word/2020/wordml/sdtdatahash" xmlns:w16se="http://schemas.microsoft.com/office/word/2015/wordml/symex" xmlns:wpg="http://schemas.microsoft.com/office/word/2010/wordprocessingGroup" xmlns:wpi="http://schemas.microsoft.com/office/word/2010/wordprocessingInk" xmlns:wne="http://schemas.microsoft.com/office/word/2006/wordml" xmlns:wps="http://schemas.microsoft.com/office/word/2010/wordprocessingShape" mc:Ignorable="w14 w15 w16se w16cid w16 w16cex w16sdtdh wp14">
+<w:document xmlns:wpc="http://schemas.microsoft.com/office/word/2010/wordprocessingCanvas" xmlns:cx="http://schemas.microsoft.com/office/drawing/2014/chartex" xmlns:cx1="http://schemas.microsoft.com/office/drawing/2015/9/8/chartex" xmlns:cx2="http://schemas.microsoft.com/office/drawing/2015/10/21/chartex" xmlns:cx3="http://schemas.microsoft.com/office/drawing/2016/5/9/chartex" xmlns:cx4="http://schemas.microsoft.com/office/drawing/2016/5/10/chartex" xmlns:cx5="http://schemas.microsoft.com/office/drawing/2016/5/11/chartex" xmlns:cx6="http://schemas.microsoft.com/office/drawing/2016/5/12/chartex" xmlns:cx7="http://schemas.microsoft.com/office/drawing/2016/5/13/chartex" xmlns:cx8="http://schemas.microsoft.com/office/drawing/2016/5/14/chartex" xmlns:mc="http://schemas.openxmlformats.org/markup-compatibility/2006" xmlns:aink="http://schemas.microsoft.com/office/drawing/2016/ink" xmlns:am3d="http://schemas.microsoft.com/office/drawing/2017/model3d" xmlns:o="urn:schemas-microsoft-com:office:office" xmlns:oel="http://schemas.microsoft.com/office/2019/extlst" xmlns:r="http://schemas.openxmlformats.org/officeDocument/2006/relationships" xmlns:m="http://schemas.openxmlformats.org/officeDocument/2006/math" xmlns:v="urn:schemas-microsoft-com:vml" xmlns:wp14="http://schemas.microsoft.com/office/word/2010/wordprocessingDrawing" xmlns:wp="http://schemas.openxmlformats.org/drawingml/2006/wordprocessingDrawing" xmlns:w10="urn:schemas-microsoft-com:office:word" xmlns:w="http://schemas.openxmlformats.org/wordprocessingml/2006/main" xmlns:w14="http://schemas.microsoft.com/office/word/2010/wordml" xmlns:w15="http://schemas.microsoft.com/office/word/2012/wordml" xmlns:w16cex="http://schemas.microsoft.com/office/word/2018/wordml/cex" xmlns:w16cid="http://schemas.microsoft.com/office/word/2016/wordml/cid" xmlns:w16="http://schemas.microsoft.com/office/word/2018/wordml" xmlns:w16du="http://schemas.microsoft.com/office/word/2023/wordml/word16du" xmlns:w16sdtdh="http://schemas.microsoft.com/office/word/2020/wordml/sdtdatahash" xmlns:w16sdtfl="http://schemas.microsoft.com/office/word/2024/wordml/sdtformatlock" xmlns:w16se="http://schemas.microsoft.com/office/word/2015/wordml/symex" xmlns:wpg="http://schemas.microsoft.com/office/word/2010/wordprocessingGroup" xmlns:wpi="http://schemas.microsoft.com/office/word/2010/wordprocessingInk" xmlns:wne="http://schemas.microsoft.com/office/word/2006/wordml" xmlns:wps="http://schemas.microsoft.com/office/word/2010/wordprocessingShape" mc:Ignorable="w14 w15 w16se w16cid w16 w16cex w16sdtdh w16sdtfl w16du wp14">
   <w:body>
     <w:p>
       <w:pPr>
@@ -156,7 +156,91 @@
         <w:rPr>
           <w:color w:val="000000"/>
         </w:rPr>
-        <w:t>Design and implement six GitHub Actions workflow files: ci-dev.yml, cd-dev.yml, ci-staging.yml, cd-staging.yml, ci-prod.yml, and cd-prod.yml.</w:t>
+        <w:t>Design and implement six GitHub Actions workflow files: ci-</w:t>
+      </w:r>
+      <w:proofErr w:type="spellStart"/>
+      <w:r>
+        <w:rPr>
+          <w:color w:val="000000"/>
+        </w:rPr>
+        <w:t>dev.yml</w:t>
+      </w:r>
+      <w:proofErr w:type="spellEnd"/>
+      <w:r>
+        <w:rPr>
+          <w:color w:val="000000"/>
+        </w:rPr>
+        <w:t>, cd-</w:t>
+      </w:r>
+      <w:proofErr w:type="spellStart"/>
+      <w:r>
+        <w:rPr>
+          <w:color w:val="000000"/>
+        </w:rPr>
+        <w:t>dev.yml</w:t>
+      </w:r>
+      <w:proofErr w:type="spellEnd"/>
+      <w:r>
+        <w:rPr>
+          <w:color w:val="000000"/>
+        </w:rPr>
+        <w:t>, ci-</w:t>
+      </w:r>
+      <w:proofErr w:type="spellStart"/>
+      <w:r>
+        <w:rPr>
+          <w:color w:val="000000"/>
+        </w:rPr>
+        <w:t>staging.yml</w:t>
+      </w:r>
+      <w:proofErr w:type="spellEnd"/>
+      <w:r>
+        <w:rPr>
+          <w:color w:val="000000"/>
+        </w:rPr>
+        <w:t>, cd-</w:t>
+      </w:r>
+      <w:proofErr w:type="spellStart"/>
+      <w:r>
+        <w:rPr>
+          <w:color w:val="000000"/>
+        </w:rPr>
+        <w:t>staging.yml</w:t>
+      </w:r>
+      <w:proofErr w:type="spellEnd"/>
+      <w:r>
+        <w:rPr>
+          <w:color w:val="000000"/>
+        </w:rPr>
+        <w:t>, ci-</w:t>
+      </w:r>
+      <w:proofErr w:type="spellStart"/>
+      <w:r>
+        <w:rPr>
+          <w:color w:val="000000"/>
+        </w:rPr>
+        <w:t>prod.yml</w:t>
+      </w:r>
+      <w:proofErr w:type="spellEnd"/>
+      <w:r>
+        <w:rPr>
+          <w:color w:val="000000"/>
+        </w:rPr>
+        <w:t>, and cd-</w:t>
+      </w:r>
+      <w:proofErr w:type="spellStart"/>
+      <w:r>
+        <w:rPr>
+          <w:color w:val="000000"/>
+        </w:rPr>
+        <w:t>prod.yml</w:t>
+      </w:r>
+      <w:proofErr w:type="spellEnd"/>
+      <w:r>
+        <w:rPr>
+          <w:color w:val="000000"/>
+        </w:rPr>
+        <w:t>.</w:t>
       </w:r>
     </w:p>
     <w:p>
@@ -420,7 +504,21 @@
         <w:rPr>
           <w:color w:val="000000"/>
         </w:rPr>
-        <w:t>No JavaScript of any kind is permitted. All pages must be built exclusively using HTML5 and CSS3. Forms must use HTML-only attributes (no JS event listeners, no fetch, no XMLHttpRequest).</w:t>
+        <w:t xml:space="preserve">No JavaScript of any kind is permitted. All pages must be built exclusively using HTML5 and CSS3. Forms must use HTML-only attributes (no JS event listeners, no fetch, no </w:t>
+      </w:r>
+      <w:proofErr w:type="spellStart"/>
+      <w:r>
+        <w:rPr>
+          <w:color w:val="000000"/>
+        </w:rPr>
+        <w:t>XMLHttpRequest</w:t>
+      </w:r>
+      <w:proofErr w:type="spellEnd"/>
+      <w:r>
+        <w:rPr>
+          <w:color w:val="000000"/>
+        </w:rPr>
+        <w:t>).</w:t>
       </w:r>
     </w:p>
     <w:p>
@@ -469,14 +567,14 @@
         <w:tblLook w:val="04A0" w:firstRow="1" w:lastRow="0" w:firstColumn="1" w:lastColumn="0" w:noHBand="0" w:noVBand="1"/>
       </w:tblPr>
       <w:tblGrid>
-        <w:gridCol w:w="404"/>
-        <w:gridCol w:w="891"/>
-        <w:gridCol w:w="1334"/>
-        <w:gridCol w:w="1337"/>
-        <w:gridCol w:w="1825"/>
-        <w:gridCol w:w="1155"/>
-        <w:gridCol w:w="2598"/>
-        <w:gridCol w:w="1166"/>
+        <w:gridCol w:w="416"/>
+        <w:gridCol w:w="943"/>
+        <w:gridCol w:w="1422"/>
+        <w:gridCol w:w="1425"/>
+        <w:gridCol w:w="1249"/>
+        <w:gridCol w:w="1228"/>
+        <w:gridCol w:w="2787"/>
+        <w:gridCol w:w="1240"/>
       </w:tblGrid>
       <w:tr>
         <w:tc>
@@ -870,8 +968,21 @@
           <w:p>
             <w:proofErr w:type="gramStart"/>
             <w:r>
-              <w:t>ci-prod.yml,cd-prod.yml</w:t>
-            </w:r>
+              <w:t>ci-</w:t>
+            </w:r>
+            <w:proofErr w:type="spellStart"/>
+            <w:r>
+              <w:t>prod.yml,cd</w:t>
+            </w:r>
+            <w:proofErr w:type="spellEnd"/>
+            <w:r>
+              <w:t>-</w:t>
+            </w:r>
+            <w:proofErr w:type="spellStart"/>
+            <w:r>
+              <w:t>prod.yml</w:t>
+            </w:r>
+            <w:proofErr w:type="spellEnd"/>
             <w:proofErr w:type="gramEnd"/>
           </w:p>
         </w:tc>
@@ -919,7 +1030,15 @@
           </w:tcPr>
           <w:p>
             <w:r>
-              <w:t>Feature/adnan/home</w:t>
+              <w:t>Feature/</w:t>
+            </w:r>
+            <w:proofErr w:type="spellStart"/>
+            <w:r>
+              <w:t>adnan</w:t>
+            </w:r>
+            <w:proofErr w:type="spellEnd"/>
+            <w:r>
+              <w:t>/home</w:t>
             </w:r>
           </w:p>
         </w:tc>
@@ -1316,8 +1435,13 @@
             <w:vAlign w:val="center"/>
           </w:tcPr>
           <w:p>
-            <w:r>
-              <w:t>M.Aliyan Hassan</w:t>
+            <w:proofErr w:type="spellStart"/>
+            <w:r>
+              <w:t>M.Aliyan</w:t>
+            </w:r>
+            <w:proofErr w:type="spellEnd"/>
+            <w:r>
+              <w:t xml:space="preserve"> Hassan</w:t>
             </w:r>
           </w:p>
         </w:tc>
@@ -1340,9 +1464,11 @@
             <w:vAlign w:val="center"/>
           </w:tcPr>
           <w:p>
+            <w:proofErr w:type="spellStart"/>
             <w:r>
               <w:t>thebatcreature</w:t>
             </w:r>
+            <w:proofErr w:type="spellEnd"/>
           </w:p>
         </w:tc>
         <w:tc>
@@ -1389,8 +1515,13 @@
           </w:tcPr>
           <w:p>
             <w:r>
-              <w:t>.github/workflows/cd-staging.yml</w:t>
-            </w:r>
+              <w:t>cd-</w:t>
+            </w:r>
+            <w:proofErr w:type="spellStart"/>
+            <w:r>
+              <w:t>staging.yml</w:t>
+            </w:r>
+            <w:proofErr w:type="spellEnd"/>
           </w:p>
         </w:tc>
         <w:tc>
@@ -1437,8 +1568,21 @@
           </w:tcPr>
           <w:p>
             <w:r>
-              <w:t>Feature/aliyan/karachi_develop</w:t>
-            </w:r>
+              <w:t>Feature/</w:t>
+            </w:r>
+            <w:proofErr w:type="spellStart"/>
+            <w:r>
+              <w:t>aliyan</w:t>
+            </w:r>
+            <w:proofErr w:type="spellEnd"/>
+            <w:r>
+              <w:t>/</w:t>
+            </w:r>
+            <w:proofErr w:type="spellStart"/>
+            <w:r>
+              <w:t>karachi_develop</w:t>
+            </w:r>
+            <w:proofErr w:type="spellEnd"/>
           </w:p>
         </w:tc>
         <w:tc>
@@ -1485,7 +1629,11 @@
             </w:tcMar>
             <w:vAlign w:val="center"/>
           </w:tcPr>
-          <w:p/>
+          <w:p>
+            <w:r>
+              <w:t>5</w:t>
+            </w:r>
+          </w:p>
         </w:tc>
         <w:tc>
           <w:tcPr>
@@ -1505,7 +1653,11 @@
             </w:tcMar>
             <w:vAlign w:val="center"/>
           </w:tcPr>
-          <w:p/>
+          <w:p>
+            <w:r>
+              <w:t>Owais Murtaza</w:t>
+            </w:r>
+          </w:p>
         </w:tc>
         <w:tc>
           <w:tcPr>
@@ -1525,7 +1677,13 @@
             </w:tcMar>
             <w:vAlign w:val="center"/>
           </w:tcPr>
-          <w:p/>
+          <w:p>
+            <w:proofErr w:type="spellStart"/>
+            <w:r>
+              <w:t>owaisMurtaza</w:t>
+            </w:r>
+            <w:proofErr w:type="spellEnd"/>
+          </w:p>
         </w:tc>
         <w:tc>
           <w:tcPr>
@@ -1545,7 +1703,11 @@
             </w:tcMar>
             <w:vAlign w:val="center"/>
           </w:tcPr>
-          <w:p/>
+          <w:p>
+            <w:r>
+              <w:t>Member</w:t>
+            </w:r>
+          </w:p>
         </w:tc>
         <w:tc>
           <w:tcPr>
@@ -1565,7 +1727,19 @@
             </w:tcMar>
             <w:vAlign w:val="center"/>
           </w:tcPr>
-          <w:p/>
+          <w:p>
+            <w:r>
+              <w:t>ci</w:t>
+            </w:r>
+            <w:r>
+              <w:t>-</w:t>
+            </w:r>
+            <w:proofErr w:type="spellStart"/>
+            <w:r>
+              <w:t>dev.yml</w:t>
+            </w:r>
+            <w:proofErr w:type="spellEnd"/>
+          </w:p>
         </w:tc>
         <w:tc>
           <w:tcPr>
@@ -1585,7 +1759,13 @@
             </w:tcMar>
             <w:vAlign w:val="center"/>
           </w:tcPr>
-          <w:p/>
+          <w:p>
+            <w:proofErr w:type="spellStart"/>
+            <w:r>
+              <w:t>Swat.htmml</w:t>
+            </w:r>
+            <w:proofErr w:type="spellEnd"/>
+          </w:p>
         </w:tc>
         <w:tc>
           <w:tcPr>
@@ -1605,7 +1785,24 @@
             </w:tcMar>
             <w:vAlign w:val="center"/>
           </w:tcPr>
-          <w:p/>
+          <w:p>
+            <w:r>
+              <w:t>Feature/</w:t>
+            </w:r>
+            <w:proofErr w:type="spellStart"/>
+            <w:r>
+              <w:t>owais</w:t>
+            </w:r>
+            <w:proofErr w:type="spellEnd"/>
+            <w:r>
+              <w:t>/</w:t>
+            </w:r>
+            <w:proofErr w:type="spellStart"/>
+            <w:r>
+              <w:t>swat_develop</w:t>
+            </w:r>
+            <w:proofErr w:type="spellEnd"/>
+          </w:p>
         </w:tc>
         <w:tc>
           <w:tcPr>
@@ -1625,7 +1822,11 @@
             </w:tcMar>
             <w:vAlign w:val="center"/>
           </w:tcPr>
-          <w:p/>
+          <w:p>
+            <w:r>
+              <w:t>Y</w:t>
+            </w:r>
+          </w:p>
         </w:tc>
       </w:tr>
     </w:tbl>
@@ -1741,6 +1942,7 @@
       <w:r>
         <w:t xml:space="preserve">Your team is the engineering crew for </w:t>
       </w:r>
+      <w:proofErr w:type="spellStart"/>
       <w:r>
         <w:rPr>
           <w:b/>
@@ -1749,6 +1951,7 @@
         </w:rPr>
         <w:t>PakVista</w:t>
       </w:r>
+      <w:proofErr w:type="spellEnd"/>
       <w:r>
         <w:t xml:space="preserve"> – a static informational website about Pakistan's top five tourist destinations. The site consists of five HTML pages, each dedicated to one destination, plus a shared stylesheet that enforces a consistent visual identity. The website must be built using </w:t>
       </w:r>
@@ -2030,7 +2233,25 @@
                 <w:sz w:val="20"/>
                 <w:szCs w:val="20"/>
               </w:rPr>
-              <w:t>-latest / :dev-&lt;sha&gt;</w:t>
+              <w:t xml:space="preserve">-latest </w:t>
+            </w:r>
+            <w:proofErr w:type="gramStart"/>
+            <w:r>
+              <w:rPr>
+                <w:color w:val="000000"/>
+                <w:sz w:val="20"/>
+                <w:szCs w:val="20"/>
+              </w:rPr>
+              <w:t>/ :dev</w:t>
+            </w:r>
+            <w:proofErr w:type="gramEnd"/>
+            <w:r>
+              <w:rPr>
+                <w:color w:val="000000"/>
+                <w:sz w:val="20"/>
+                <w:szCs w:val="20"/>
+              </w:rPr>
+              <w:t>-&lt;sha&gt;</w:t>
             </w:r>
           </w:p>
         </w:tc>
@@ -2053,13 +2274,23 @@
             <w:vAlign w:val="center"/>
           </w:tcPr>
           <w:p>
-            <w:r>
-              <w:rPr>
-                <w:color w:val="000000"/>
-                <w:sz w:val="20"/>
-                <w:szCs w:val="20"/>
-              </w:rPr>
-              <w:t>pakvista-dev (on Render)</w:t>
+            <w:proofErr w:type="spellStart"/>
+            <w:r>
+              <w:rPr>
+                <w:color w:val="000000"/>
+                <w:sz w:val="20"/>
+                <w:szCs w:val="20"/>
+              </w:rPr>
+              <w:t>pakvista</w:t>
+            </w:r>
+            <w:proofErr w:type="spellEnd"/>
+            <w:r>
+              <w:rPr>
+                <w:color w:val="000000"/>
+                <w:sz w:val="20"/>
+                <w:szCs w:val="20"/>
+              </w:rPr>
+              <w:t>-dev (on Render)</w:t>
             </w:r>
           </w:p>
         </w:tc>
@@ -2160,7 +2391,25 @@
                 <w:sz w:val="20"/>
                 <w:szCs w:val="20"/>
               </w:rPr>
-              <w:t>-latest / :staging-&lt;sha&gt;</w:t>
+              <w:t xml:space="preserve">-latest </w:t>
+            </w:r>
+            <w:proofErr w:type="gramStart"/>
+            <w:r>
+              <w:rPr>
+                <w:color w:val="000000"/>
+                <w:sz w:val="20"/>
+                <w:szCs w:val="20"/>
+              </w:rPr>
+              <w:t>/ :staging</w:t>
+            </w:r>
+            <w:proofErr w:type="gramEnd"/>
+            <w:r>
+              <w:rPr>
+                <w:color w:val="000000"/>
+                <w:sz w:val="20"/>
+                <w:szCs w:val="20"/>
+              </w:rPr>
+              <w:t>-&lt;sha&gt;</w:t>
             </w:r>
           </w:p>
         </w:tc>
@@ -2183,13 +2432,23 @@
             <w:vAlign w:val="center"/>
           </w:tcPr>
           <w:p>
-            <w:r>
-              <w:rPr>
-                <w:color w:val="000000"/>
-                <w:sz w:val="20"/>
-                <w:szCs w:val="20"/>
-              </w:rPr>
-              <w:t>pakvista-staging (on Render)</w:t>
+            <w:proofErr w:type="spellStart"/>
+            <w:r>
+              <w:rPr>
+                <w:color w:val="000000"/>
+                <w:sz w:val="20"/>
+                <w:szCs w:val="20"/>
+              </w:rPr>
+              <w:t>pakvista</w:t>
+            </w:r>
+            <w:proofErr w:type="spellEnd"/>
+            <w:r>
+              <w:rPr>
+                <w:color w:val="000000"/>
+                <w:sz w:val="20"/>
+                <w:szCs w:val="20"/>
+              </w:rPr>
+              <w:t>-staging (on Render)</w:t>
             </w:r>
           </w:p>
         </w:tc>
@@ -2290,7 +2549,25 @@
                 <w:sz w:val="20"/>
                 <w:szCs w:val="20"/>
               </w:rPr>
-              <w:t>-latest / :prod-&lt;sha&gt;</w:t>
+              <w:t xml:space="preserve">-latest </w:t>
+            </w:r>
+            <w:proofErr w:type="gramStart"/>
+            <w:r>
+              <w:rPr>
+                <w:color w:val="000000"/>
+                <w:sz w:val="20"/>
+                <w:szCs w:val="20"/>
+              </w:rPr>
+              <w:t>/ :prod</w:t>
+            </w:r>
+            <w:proofErr w:type="gramEnd"/>
+            <w:r>
+              <w:rPr>
+                <w:color w:val="000000"/>
+                <w:sz w:val="20"/>
+                <w:szCs w:val="20"/>
+              </w:rPr>
+              <w:t>-&lt;sha&gt;</w:t>
             </w:r>
           </w:p>
         </w:tc>
@@ -2313,13 +2590,23 @@
             <w:vAlign w:val="center"/>
           </w:tcPr>
           <w:p>
-            <w:r>
-              <w:rPr>
-                <w:color w:val="000000"/>
-                <w:sz w:val="20"/>
-                <w:szCs w:val="20"/>
-              </w:rPr>
-              <w:t>pakvista-prod (on Render)</w:t>
+            <w:proofErr w:type="spellStart"/>
+            <w:r>
+              <w:rPr>
+                <w:color w:val="000000"/>
+                <w:sz w:val="20"/>
+                <w:szCs w:val="20"/>
+              </w:rPr>
+              <w:t>pakvista</w:t>
+            </w:r>
+            <w:proofErr w:type="spellEnd"/>
+            <w:r>
+              <w:rPr>
+                <w:color w:val="000000"/>
+                <w:sz w:val="20"/>
+                <w:szCs w:val="20"/>
+              </w:rPr>
+              <w:t>-prod (on Render)</w:t>
             </w:r>
           </w:p>
         </w:tc>
@@ -2334,7 +2621,21 @@
         <w:rPr>
           <w:color w:val="000000"/>
         </w:rPr>
-        <w:t>The Team Lead sets up the repository, Dockerfile, shared stylesheet (style.css), and all six CI/CD workflow files. Each team member is individually responsible for building one destination page (HTML + CSS) and authoring one workflow file – either a CI or a CD workflow for any one environment.</w:t>
+        <w:t xml:space="preserve">The Team Lead sets up the repository, </w:t>
+      </w:r>
+      <w:proofErr w:type="spellStart"/>
+      <w:r>
+        <w:rPr>
+          <w:color w:val="000000"/>
+        </w:rPr>
+        <w:t>Dockerfile</w:t>
+      </w:r>
+      <w:proofErr w:type="spellEnd"/>
+      <w:r>
+        <w:rPr>
+          <w:color w:val="000000"/>
+        </w:rPr>
+        <w:t>, shared stylesheet (style.css), and all six CI/CD workflow files. Each team member is individually responsible for building one destination page (HTML + CSS) and authoring one workflow file – either a CI or a CD workflow for any one environment.</w:t>
       </w:r>
     </w:p>
     <w:p/>
@@ -2343,7 +2644,15 @@
         <w:pStyle w:val="Heading2"/>
       </w:pPr>
       <w:r>
-        <w:t>Table 2: PakVista Page Assignment</w:t>
+        <w:t xml:space="preserve">Table 2: </w:t>
+      </w:r>
+      <w:proofErr w:type="spellStart"/>
+      <w:r>
+        <w:t>PakVista</w:t>
+      </w:r>
+      <w:proofErr w:type="spellEnd"/>
+      <w:r>
+        <w:t xml:space="preserve"> Page Assignment</w:t>
       </w:r>
     </w:p>
     <w:tbl>
@@ -2627,7 +2936,25 @@
                 <w:sz w:val="20"/>
                 <w:szCs w:val="20"/>
               </w:rPr>
-              <w:t>A welcoming landing page introducing PakVista, with a hero section, a brief paragraph about Pakistan's tourism, and navigation links to all five destination pages.</w:t>
+              <w:t xml:space="preserve">A welcoming landing page introducing </w:t>
+            </w:r>
+            <w:proofErr w:type="spellStart"/>
+            <w:r>
+              <w:rPr>
+                <w:color w:val="000000"/>
+                <w:sz w:val="20"/>
+                <w:szCs w:val="20"/>
+              </w:rPr>
+              <w:t>PakVista</w:t>
+            </w:r>
+            <w:proofErr w:type="spellEnd"/>
+            <w:r>
+              <w:rPr>
+                <w:color w:val="000000"/>
+                <w:sz w:val="20"/>
+                <w:szCs w:val="20"/>
+              </w:rPr>
+              <w:t>, with a hero section, a brief paragraph about Pakistan's tourism, and navigation links to all five destination pages.</w:t>
             </w:r>
           </w:p>
         </w:tc>
@@ -2877,7 +3204,61 @@
                 <w:sz w:val="20"/>
                 <w:szCs w:val="20"/>
               </w:rPr>
-              <w:t>Dedicated page for Hunza Valley covering Rakaposhi viewpoint, Attabad Lake, and Baltit Fort, with descriptive paragraphs and an HTML-only image placeholder section.</w:t>
+              <w:t xml:space="preserve">Dedicated page for Hunza Valley covering </w:t>
+            </w:r>
+            <w:proofErr w:type="spellStart"/>
+            <w:r>
+              <w:rPr>
+                <w:color w:val="000000"/>
+                <w:sz w:val="20"/>
+                <w:szCs w:val="20"/>
+              </w:rPr>
+              <w:t>Rakaposhi</w:t>
+            </w:r>
+            <w:proofErr w:type="spellEnd"/>
+            <w:r>
+              <w:rPr>
+                <w:color w:val="000000"/>
+                <w:sz w:val="20"/>
+                <w:szCs w:val="20"/>
+              </w:rPr>
+              <w:t xml:space="preserve"> viewpoint, </w:t>
+            </w:r>
+            <w:proofErr w:type="spellStart"/>
+            <w:r>
+              <w:rPr>
+                <w:color w:val="000000"/>
+                <w:sz w:val="20"/>
+                <w:szCs w:val="20"/>
+              </w:rPr>
+              <w:t>Attabad</w:t>
+            </w:r>
+            <w:proofErr w:type="spellEnd"/>
+            <w:r>
+              <w:rPr>
+                <w:color w:val="000000"/>
+                <w:sz w:val="20"/>
+                <w:szCs w:val="20"/>
+              </w:rPr>
+              <w:t xml:space="preserve"> Lake, and </w:t>
+            </w:r>
+            <w:proofErr w:type="spellStart"/>
+            <w:r>
+              <w:rPr>
+                <w:color w:val="000000"/>
+                <w:sz w:val="20"/>
+                <w:szCs w:val="20"/>
+              </w:rPr>
+              <w:t>Baltit</w:t>
+            </w:r>
+            <w:proofErr w:type="spellEnd"/>
+            <w:r>
+              <w:rPr>
+                <w:color w:val="000000"/>
+                <w:sz w:val="20"/>
+                <w:szCs w:val="20"/>
+              </w:rPr>
+              <w:t xml:space="preserve"> Fort, with descriptive paragraphs and an HTML-only image placeholder section.</w:t>
             </w:r>
           </w:p>
         </w:tc>
@@ -3002,7 +3383,25 @@
                 <w:sz w:val="20"/>
                 <w:szCs w:val="20"/>
               </w:rPr>
-              <w:t>Dedicated page for Karachi covering Clifton Beach, Mohatta Palace, and the Pakistan Maritime Museum, with descriptive paragraphs and an HTML-only image placeholder section.</w:t>
+              <w:t xml:space="preserve">Dedicated page for Karachi covering Clifton Beach, </w:t>
+            </w:r>
+            <w:proofErr w:type="spellStart"/>
+            <w:r>
+              <w:rPr>
+                <w:color w:val="000000"/>
+                <w:sz w:val="20"/>
+                <w:szCs w:val="20"/>
+              </w:rPr>
+              <w:t>Mohatta</w:t>
+            </w:r>
+            <w:proofErr w:type="spellEnd"/>
+            <w:r>
+              <w:rPr>
+                <w:color w:val="000000"/>
+                <w:sz w:val="20"/>
+                <w:szCs w:val="20"/>
+              </w:rPr>
+              <w:t xml:space="preserve"> Palace, and the Pakistan Maritime Museum, with descriptive paragraphs and an HTML-only image placeholder section.</w:t>
             </w:r>
           </w:p>
         </w:tc>
@@ -3381,7 +3780,6 @@
                 <w:sz w:val="20"/>
                 <w:szCs w:val="20"/>
               </w:rPr>
-              <w:lastRenderedPageBreak/>
               <w:t>1</w:t>
             </w:r>
           </w:p>
@@ -3413,8 +3811,42 @@
                 <w:sz w:val="20"/>
                 <w:szCs w:val="20"/>
               </w:rPr>
-              <w:t>.github/workflows/ci-dev.yml</w:t>
-            </w:r>
+              <w:t>.</w:t>
+            </w:r>
+            <w:proofErr w:type="spellStart"/>
+            <w:r>
+              <w:rPr>
+                <w:b/>
+                <w:bCs/>
+                <w:color w:val="000000"/>
+                <w:sz w:val="20"/>
+                <w:szCs w:val="20"/>
+              </w:rPr>
+              <w:t>github</w:t>
+            </w:r>
+            <w:proofErr w:type="spellEnd"/>
+            <w:r>
+              <w:rPr>
+                <w:b/>
+                <w:bCs/>
+                <w:color w:val="000000"/>
+                <w:sz w:val="20"/>
+                <w:szCs w:val="20"/>
+              </w:rPr>
+              <w:t>/workflows/ci-</w:t>
+            </w:r>
+            <w:proofErr w:type="spellStart"/>
+            <w:r>
+              <w:rPr>
+                <w:b/>
+                <w:bCs/>
+                <w:color w:val="000000"/>
+                <w:sz w:val="20"/>
+                <w:szCs w:val="20"/>
+              </w:rPr>
+              <w:t>dev.yml</w:t>
+            </w:r>
+            <w:proofErr w:type="spellEnd"/>
           </w:p>
         </w:tc>
         <w:tc>
@@ -3465,13 +3897,23 @@
             <w:vAlign w:val="center"/>
           </w:tcPr>
           <w:p>
-            <w:r>
-              <w:rPr>
-                <w:color w:val="000000"/>
-                <w:sz w:val="20"/>
-                <w:szCs w:val="20"/>
-              </w:rPr>
-              <w:t>pull_request → develop</w:t>
+            <w:proofErr w:type="spellStart"/>
+            <w:r>
+              <w:rPr>
+                <w:color w:val="000000"/>
+                <w:sz w:val="20"/>
+                <w:szCs w:val="20"/>
+              </w:rPr>
+              <w:t>pull_request</w:t>
+            </w:r>
+            <w:proofErr w:type="spellEnd"/>
+            <w:r>
+              <w:rPr>
+                <w:color w:val="000000"/>
+                <w:sz w:val="20"/>
+                <w:szCs w:val="20"/>
+              </w:rPr>
+              <w:t xml:space="preserve"> → develop</w:t>
             </w:r>
           </w:p>
         </w:tc>
@@ -3518,7 +3960,25 @@
                 <w:sz w:val="20"/>
                 <w:szCs w:val="20"/>
               </w:rPr>
-              <w:t>-latest, :dev-&lt;sha&gt;), Push to Docker Hub.</w:t>
+              <w:t>-latest</w:t>
+            </w:r>
+            <w:proofErr w:type="gramStart"/>
+            <w:r>
+              <w:rPr>
+                <w:color w:val="000000"/>
+                <w:sz w:val="20"/>
+                <w:szCs w:val="20"/>
+              </w:rPr>
+              <w:t>, :dev</w:t>
+            </w:r>
+            <w:proofErr w:type="gramEnd"/>
+            <w:r>
+              <w:rPr>
+                <w:color w:val="000000"/>
+                <w:sz w:val="20"/>
+                <w:szCs w:val="20"/>
+              </w:rPr>
+              <w:t>-&lt;sha&gt;), Push to Docker Hub.</w:t>
             </w:r>
           </w:p>
         </w:tc>
@@ -3585,8 +4045,42 @@
                 <w:sz w:val="20"/>
                 <w:szCs w:val="20"/>
               </w:rPr>
-              <w:t>.github/workflows/cd-dev.yml</w:t>
-            </w:r>
+              <w:t>.</w:t>
+            </w:r>
+            <w:proofErr w:type="spellStart"/>
+            <w:r>
+              <w:rPr>
+                <w:b/>
+                <w:bCs/>
+                <w:color w:val="000000"/>
+                <w:sz w:val="20"/>
+                <w:szCs w:val="20"/>
+              </w:rPr>
+              <w:t>github</w:t>
+            </w:r>
+            <w:proofErr w:type="spellEnd"/>
+            <w:r>
+              <w:rPr>
+                <w:b/>
+                <w:bCs/>
+                <w:color w:val="000000"/>
+                <w:sz w:val="20"/>
+                <w:szCs w:val="20"/>
+              </w:rPr>
+              <w:t>/workflows/cd-</w:t>
+            </w:r>
+            <w:proofErr w:type="spellStart"/>
+            <w:r>
+              <w:rPr>
+                <w:b/>
+                <w:bCs/>
+                <w:color w:val="000000"/>
+                <w:sz w:val="20"/>
+                <w:szCs w:val="20"/>
+              </w:rPr>
+              <w:t>dev.yml</w:t>
+            </w:r>
+            <w:proofErr w:type="spellEnd"/>
           </w:p>
         </w:tc>
         <w:tc>
@@ -3739,8 +4233,42 @@
                 <w:sz w:val="20"/>
                 <w:szCs w:val="20"/>
               </w:rPr>
-              <w:t>.github/workflows/ci-staging.yml</w:t>
-            </w:r>
+              <w:t>.</w:t>
+            </w:r>
+            <w:proofErr w:type="spellStart"/>
+            <w:r>
+              <w:rPr>
+                <w:b/>
+                <w:bCs/>
+                <w:color w:val="000000"/>
+                <w:sz w:val="20"/>
+                <w:szCs w:val="20"/>
+              </w:rPr>
+              <w:t>github</w:t>
+            </w:r>
+            <w:proofErr w:type="spellEnd"/>
+            <w:r>
+              <w:rPr>
+                <w:b/>
+                <w:bCs/>
+                <w:color w:val="000000"/>
+                <w:sz w:val="20"/>
+                <w:szCs w:val="20"/>
+              </w:rPr>
+              <w:t>/workflows/ci-</w:t>
+            </w:r>
+            <w:proofErr w:type="spellStart"/>
+            <w:r>
+              <w:rPr>
+                <w:b/>
+                <w:bCs/>
+                <w:color w:val="000000"/>
+                <w:sz w:val="20"/>
+                <w:szCs w:val="20"/>
+              </w:rPr>
+              <w:t>staging.yml</w:t>
+            </w:r>
+            <w:proofErr w:type="spellEnd"/>
           </w:p>
         </w:tc>
         <w:tc>
@@ -3791,13 +4319,23 @@
             <w:vAlign w:val="center"/>
           </w:tcPr>
           <w:p>
-            <w:r>
-              <w:rPr>
-                <w:color w:val="000000"/>
-                <w:sz w:val="20"/>
-                <w:szCs w:val="20"/>
-              </w:rPr>
-              <w:t>pull_request → staging</w:t>
+            <w:proofErr w:type="spellStart"/>
+            <w:r>
+              <w:rPr>
+                <w:color w:val="000000"/>
+                <w:sz w:val="20"/>
+                <w:szCs w:val="20"/>
+              </w:rPr>
+              <w:t>pull_request</w:t>
+            </w:r>
+            <w:proofErr w:type="spellEnd"/>
+            <w:r>
+              <w:rPr>
+                <w:color w:val="000000"/>
+                <w:sz w:val="20"/>
+                <w:szCs w:val="20"/>
+              </w:rPr>
+              <w:t xml:space="preserve"> → staging</w:t>
             </w:r>
           </w:p>
         </w:tc>
@@ -3844,7 +4382,25 @@
                 <w:sz w:val="20"/>
                 <w:szCs w:val="20"/>
               </w:rPr>
-              <w:t>-latest, :staging-&lt;sha&gt;), Push to Docker Hub.</w:t>
+              <w:t>-latest</w:t>
+            </w:r>
+            <w:proofErr w:type="gramStart"/>
+            <w:r>
+              <w:rPr>
+                <w:color w:val="000000"/>
+                <w:sz w:val="20"/>
+                <w:szCs w:val="20"/>
+              </w:rPr>
+              <w:t>, :staging</w:t>
+            </w:r>
+            <w:proofErr w:type="gramEnd"/>
+            <w:r>
+              <w:rPr>
+                <w:color w:val="000000"/>
+                <w:sz w:val="20"/>
+                <w:szCs w:val="20"/>
+              </w:rPr>
+              <w:t>-&lt;sha&gt;), Push to Docker Hub.</w:t>
             </w:r>
           </w:p>
         </w:tc>
@@ -3911,8 +4467,42 @@
                 <w:sz w:val="20"/>
                 <w:szCs w:val="20"/>
               </w:rPr>
-              <w:t>.github/workflows/cd-staging.yml</w:t>
-            </w:r>
+              <w:t>.</w:t>
+            </w:r>
+            <w:proofErr w:type="spellStart"/>
+            <w:r>
+              <w:rPr>
+                <w:b/>
+                <w:bCs/>
+                <w:color w:val="000000"/>
+                <w:sz w:val="20"/>
+                <w:szCs w:val="20"/>
+              </w:rPr>
+              <w:t>github</w:t>
+            </w:r>
+            <w:proofErr w:type="spellEnd"/>
+            <w:r>
+              <w:rPr>
+                <w:b/>
+                <w:bCs/>
+                <w:color w:val="000000"/>
+                <w:sz w:val="20"/>
+                <w:szCs w:val="20"/>
+              </w:rPr>
+              <w:t>/workflows/cd-</w:t>
+            </w:r>
+            <w:proofErr w:type="spellStart"/>
+            <w:r>
+              <w:rPr>
+                <w:b/>
+                <w:bCs/>
+                <w:color w:val="000000"/>
+                <w:sz w:val="20"/>
+                <w:szCs w:val="20"/>
+              </w:rPr>
+              <w:t>staging.yml</w:t>
+            </w:r>
+            <w:proofErr w:type="spellEnd"/>
           </w:p>
         </w:tc>
         <w:tc>
@@ -4065,8 +4655,42 @@
                 <w:sz w:val="20"/>
                 <w:szCs w:val="20"/>
               </w:rPr>
-              <w:t>.github/workflows/ci-prod.yml</w:t>
-            </w:r>
+              <w:t>.</w:t>
+            </w:r>
+            <w:proofErr w:type="spellStart"/>
+            <w:r>
+              <w:rPr>
+                <w:b/>
+                <w:bCs/>
+                <w:color w:val="000000"/>
+                <w:sz w:val="20"/>
+                <w:szCs w:val="20"/>
+              </w:rPr>
+              <w:t>github</w:t>
+            </w:r>
+            <w:proofErr w:type="spellEnd"/>
+            <w:r>
+              <w:rPr>
+                <w:b/>
+                <w:bCs/>
+                <w:color w:val="000000"/>
+                <w:sz w:val="20"/>
+                <w:szCs w:val="20"/>
+              </w:rPr>
+              <w:t>/workflows/ci-</w:t>
+            </w:r>
+            <w:proofErr w:type="spellStart"/>
+            <w:r>
+              <w:rPr>
+                <w:b/>
+                <w:bCs/>
+                <w:color w:val="000000"/>
+                <w:sz w:val="20"/>
+                <w:szCs w:val="20"/>
+              </w:rPr>
+              <w:t>prod.yml</w:t>
+            </w:r>
+            <w:proofErr w:type="spellEnd"/>
           </w:p>
         </w:tc>
         <w:tc>
@@ -4117,13 +4741,23 @@
             <w:vAlign w:val="center"/>
           </w:tcPr>
           <w:p>
-            <w:r>
-              <w:rPr>
-                <w:color w:val="000000"/>
-                <w:sz w:val="20"/>
-                <w:szCs w:val="20"/>
-              </w:rPr>
-              <w:t>pull_request → main</w:t>
+            <w:proofErr w:type="spellStart"/>
+            <w:r>
+              <w:rPr>
+                <w:color w:val="000000"/>
+                <w:sz w:val="20"/>
+                <w:szCs w:val="20"/>
+              </w:rPr>
+              <w:t>pull_request</w:t>
+            </w:r>
+            <w:proofErr w:type="spellEnd"/>
+            <w:r>
+              <w:rPr>
+                <w:color w:val="000000"/>
+                <w:sz w:val="20"/>
+                <w:szCs w:val="20"/>
+              </w:rPr>
+              <w:t xml:space="preserve"> → main</w:t>
             </w:r>
           </w:p>
         </w:tc>
@@ -4170,7 +4804,25 @@
                 <w:sz w:val="20"/>
                 <w:szCs w:val="20"/>
               </w:rPr>
-              <w:t>-latest, :prod-&lt;sha&gt;), Push to Docker Hub.</w:t>
+              <w:t>-latest</w:t>
+            </w:r>
+            <w:proofErr w:type="gramStart"/>
+            <w:r>
+              <w:rPr>
+                <w:color w:val="000000"/>
+                <w:sz w:val="20"/>
+                <w:szCs w:val="20"/>
+              </w:rPr>
+              <w:t>, :prod</w:t>
+            </w:r>
+            <w:proofErr w:type="gramEnd"/>
+            <w:r>
+              <w:rPr>
+                <w:color w:val="000000"/>
+                <w:sz w:val="20"/>
+                <w:szCs w:val="20"/>
+              </w:rPr>
+              <w:t>-&lt;sha&gt;), Push to Docker Hub.</w:t>
             </w:r>
           </w:p>
         </w:tc>
@@ -4237,8 +4889,42 @@
                 <w:sz w:val="20"/>
                 <w:szCs w:val="20"/>
               </w:rPr>
-              <w:t>.github/workflows/cd-prod.yml</w:t>
-            </w:r>
+              <w:t>.</w:t>
+            </w:r>
+            <w:proofErr w:type="spellStart"/>
+            <w:r>
+              <w:rPr>
+                <w:b/>
+                <w:bCs/>
+                <w:color w:val="000000"/>
+                <w:sz w:val="20"/>
+                <w:szCs w:val="20"/>
+              </w:rPr>
+              <w:t>github</w:t>
+            </w:r>
+            <w:proofErr w:type="spellEnd"/>
+            <w:r>
+              <w:rPr>
+                <w:b/>
+                <w:bCs/>
+                <w:color w:val="000000"/>
+                <w:sz w:val="20"/>
+                <w:szCs w:val="20"/>
+              </w:rPr>
+              <w:t>/workflows/cd-</w:t>
+            </w:r>
+            <w:proofErr w:type="spellStart"/>
+            <w:r>
+              <w:rPr>
+                <w:b/>
+                <w:bCs/>
+                <w:color w:val="000000"/>
+                <w:sz w:val="20"/>
+                <w:szCs w:val="20"/>
+              </w:rPr>
+              <w:t>prod.yml</w:t>
+            </w:r>
+            <w:proofErr w:type="spellEnd"/>
           </w:p>
         </w:tc>
         <w:tc>
@@ -4347,7 +5033,21 @@
         <w:rPr>
           <w:color w:val="000000"/>
         </w:rPr>
-        <w:t>Each team member independently follows the complete GitFlow for their assigned page and workflow file:</w:t>
+        <w:t xml:space="preserve">Each team member independently follows the complete </w:t>
+      </w:r>
+      <w:proofErr w:type="spellStart"/>
+      <w:r>
+        <w:rPr>
+          <w:color w:val="000000"/>
+        </w:rPr>
+        <w:t>GitFlow</w:t>
+      </w:r>
+      <w:proofErr w:type="spellEnd"/>
+      <w:r>
+        <w:rPr>
+          <w:color w:val="000000"/>
+        </w:rPr>
+        <w:t xml:space="preserve"> for their assigned page and workflow file:</w:t>
       </w:r>
     </w:p>
     <w:p>
@@ -4380,9 +5080,9 @@
           <w:sz w:val="20"/>
           <w:szCs w:val="20"/>
         </w:rPr>
-        <w:t>feature/&lt;github-username&gt;/&lt;page-name&gt;</w:t>
-      </w:r>
-      <w:proofErr w:type="gramStart"/>
+        <w:t>feature/&lt;</w:t>
+      </w:r>
+      <w:proofErr w:type="spellStart"/>
       <w:r>
         <w:rPr>
           <w:rFonts w:ascii="Courier New" w:eastAsia="Courier New" w:hAnsi="Courier New" w:cs="Courier New"/>
@@ -4390,9 +5090,9 @@
           <w:sz w:val="20"/>
           <w:szCs w:val="20"/>
         </w:rPr>
-        <w:t xml:space="preserve">   (</w:t>
-      </w:r>
-      <w:proofErr w:type="gramEnd"/>
+        <w:t>github</w:t>
+      </w:r>
+      <w:proofErr w:type="spellEnd"/>
       <w:r>
         <w:rPr>
           <w:rFonts w:ascii="Courier New" w:eastAsia="Courier New" w:hAnsi="Courier New" w:cs="Courier New"/>
@@ -4400,7 +5100,47 @@
           <w:sz w:val="20"/>
           <w:szCs w:val="20"/>
         </w:rPr>
-        <w:t>e.g., feature/sara-malik/lahore)</w:t>
+        <w:t>-username&gt;/&lt;page-name&gt;</w:t>
+      </w:r>
+      <w:proofErr w:type="gramStart"/>
+      <w:r>
+        <w:rPr>
+          <w:rFonts w:ascii="Courier New" w:eastAsia="Courier New" w:hAnsi="Courier New" w:cs="Courier New"/>
+          <w:color w:val="C7254E"/>
+          <w:sz w:val="20"/>
+          <w:szCs w:val="20"/>
+        </w:rPr>
+        <w:t xml:space="preserve">   (</w:t>
+      </w:r>
+      <w:proofErr w:type="gramEnd"/>
+      <w:r>
+        <w:rPr>
+          <w:rFonts w:ascii="Courier New" w:eastAsia="Courier New" w:hAnsi="Courier New" w:cs="Courier New"/>
+          <w:color w:val="C7254E"/>
+          <w:sz w:val="20"/>
+          <w:szCs w:val="20"/>
+        </w:rPr>
+        <w:t>e.g., feature/sara-malik/</w:t>
+      </w:r>
+      <w:proofErr w:type="spellStart"/>
+      <w:r>
+        <w:rPr>
+          <w:rFonts w:ascii="Courier New" w:eastAsia="Courier New" w:hAnsi="Courier New" w:cs="Courier New"/>
+          <w:color w:val="C7254E"/>
+          <w:sz w:val="20"/>
+          <w:szCs w:val="20"/>
+        </w:rPr>
+        <w:t>lahore</w:t>
+      </w:r>
+      <w:proofErr w:type="spellEnd"/>
+      <w:r>
+        <w:rPr>
+          <w:rFonts w:ascii="Courier New" w:eastAsia="Courier New" w:hAnsi="Courier New" w:cs="Courier New"/>
+          <w:color w:val="C7254E"/>
+          <w:sz w:val="20"/>
+          <w:szCs w:val="20"/>
+        </w:rPr>
+        <w:t>)</w:t>
       </w:r>
     </w:p>
     <w:p>
@@ -4439,8 +5179,16 @@
         <w:rPr>
           <w:color w:val="000000"/>
         </w:rPr>
-        <w:t>in .github</w:t>
-      </w:r>
+        <w:t>in .</w:t>
+      </w:r>
+      <w:proofErr w:type="spellStart"/>
+      <w:r>
+        <w:rPr>
+          <w:color w:val="000000"/>
+        </w:rPr>
+        <w:t>github</w:t>
+      </w:r>
+      <w:proofErr w:type="spellEnd"/>
       <w:proofErr w:type="gramEnd"/>
       <w:r>
         <w:rPr>
@@ -4478,7 +5226,21 @@
         <w:rPr>
           <w:color w:val="000000"/>
         </w:rPr>
-        <w:t>Open a Pull Request (PR) targeting the develop branch. The CI workflow for the development environment (ci-dev.yml) fires automatically. Verify all steps pass.</w:t>
+        <w:t>Open a Pull Request (PR) targeting the develop branch. The CI workflow for the development environment (ci-</w:t>
+      </w:r>
+      <w:proofErr w:type="spellStart"/>
+      <w:r>
+        <w:rPr>
+          <w:color w:val="000000"/>
+        </w:rPr>
+        <w:t>dev.yml</w:t>
+      </w:r>
+      <w:proofErr w:type="spellEnd"/>
+      <w:r>
+        <w:rPr>
+          <w:color w:val="000000"/>
+        </w:rPr>
+        <w:t>) fires automatically. Verify all steps pass.</w:t>
       </w:r>
     </w:p>
     <w:p>
@@ -4494,7 +5256,21 @@
         <w:rPr>
           <w:color w:val="000000"/>
         </w:rPr>
-        <w:t>Request a review from the Team Lead. Once CI passes and the PR is approved, the Team Lead merges it. The merge triggers the CD pipeline (cd-dev.yml) and deploys the updated site to the Render development service.</w:t>
+        <w:t>Request a review from the Team Lead. Once CI passes and the PR is approved, the Team Lead merges it. The merge triggers the CD pipeline (cd-</w:t>
+      </w:r>
+      <w:proofErr w:type="spellStart"/>
+      <w:r>
+        <w:rPr>
+          <w:color w:val="000000"/>
+        </w:rPr>
+        <w:t>dev.yml</w:t>
+      </w:r>
+      <w:proofErr w:type="spellEnd"/>
+      <w:r>
+        <w:rPr>
+          <w:color w:val="000000"/>
+        </w:rPr>
+        <w:t>) and deploys the updated site to the Render development service.</w:t>
       </w:r>
     </w:p>
     <w:p/>
@@ -4520,9 +5296,10 @@
           <w:sz w:val="19"/>
           <w:szCs w:val="19"/>
         </w:rPr>
-        <w:t xml:space="preserve">Feature Branch → PR to develop → ci-dev.yml builds &amp; </w:t>
-      </w:r>
-      <w:proofErr w:type="gramStart"/>
+        <w:lastRenderedPageBreak/>
+        <w:t>Feature Branch → PR to develop → ci-</w:t>
+      </w:r>
+      <w:proofErr w:type="spellStart"/>
       <w:r>
         <w:rPr>
           <w:rFonts w:ascii="Courier New" w:eastAsia="Courier New" w:hAnsi="Courier New" w:cs="Courier New"/>
@@ -4530,9 +5307,9 @@
           <w:sz w:val="19"/>
           <w:szCs w:val="19"/>
         </w:rPr>
-        <w:t>pushes :dev</w:t>
-      </w:r>
-      <w:proofErr w:type="gramEnd"/>
+        <w:t>dev.yml</w:t>
+      </w:r>
+      <w:proofErr w:type="spellEnd"/>
       <w:r>
         <w:rPr>
           <w:rFonts w:ascii="Courier New" w:eastAsia="Courier New" w:hAnsi="Courier New" w:cs="Courier New"/>
@@ -4540,7 +5317,87 @@
           <w:sz w:val="19"/>
           <w:szCs w:val="19"/>
         </w:rPr>
-        <w:t>-latest → PR merged → push on develop → cd-dev.yml deploys to pakvista-dev on Render → Live PakVista Development updated.</w:t>
+        <w:t xml:space="preserve"> builds &amp; </w:t>
+      </w:r>
+      <w:proofErr w:type="gramStart"/>
+      <w:r>
+        <w:rPr>
+          <w:rFonts w:ascii="Courier New" w:eastAsia="Courier New" w:hAnsi="Courier New" w:cs="Courier New"/>
+          <w:color w:val="1F3864"/>
+          <w:sz w:val="19"/>
+          <w:szCs w:val="19"/>
+        </w:rPr>
+        <w:t>pushes :dev</w:t>
+      </w:r>
+      <w:proofErr w:type="gramEnd"/>
+      <w:r>
+        <w:rPr>
+          <w:rFonts w:ascii="Courier New" w:eastAsia="Courier New" w:hAnsi="Courier New" w:cs="Courier New"/>
+          <w:color w:val="1F3864"/>
+          <w:sz w:val="19"/>
+          <w:szCs w:val="19"/>
+        </w:rPr>
+        <w:t>-latest → PR merged → push on develop → cd-</w:t>
+      </w:r>
+      <w:proofErr w:type="spellStart"/>
+      <w:r>
+        <w:rPr>
+          <w:rFonts w:ascii="Courier New" w:eastAsia="Courier New" w:hAnsi="Courier New" w:cs="Courier New"/>
+          <w:color w:val="1F3864"/>
+          <w:sz w:val="19"/>
+          <w:szCs w:val="19"/>
+        </w:rPr>
+        <w:t>dev.yml</w:t>
+      </w:r>
+      <w:proofErr w:type="spellEnd"/>
+      <w:r>
+        <w:rPr>
+          <w:rFonts w:ascii="Courier New" w:eastAsia="Courier New" w:hAnsi="Courier New" w:cs="Courier New"/>
+          <w:color w:val="1F3864"/>
+          <w:sz w:val="19"/>
+          <w:szCs w:val="19"/>
+        </w:rPr>
+        <w:t xml:space="preserve"> deploys to </w:t>
+      </w:r>
+      <w:proofErr w:type="spellStart"/>
+      <w:r>
+        <w:rPr>
+          <w:rFonts w:ascii="Courier New" w:eastAsia="Courier New" w:hAnsi="Courier New" w:cs="Courier New"/>
+          <w:color w:val="1F3864"/>
+          <w:sz w:val="19"/>
+          <w:szCs w:val="19"/>
+        </w:rPr>
+        <w:t>pakvista</w:t>
+      </w:r>
+      <w:proofErr w:type="spellEnd"/>
+      <w:r>
+        <w:rPr>
+          <w:rFonts w:ascii="Courier New" w:eastAsia="Courier New" w:hAnsi="Courier New" w:cs="Courier New"/>
+          <w:color w:val="1F3864"/>
+          <w:sz w:val="19"/>
+          <w:szCs w:val="19"/>
+        </w:rPr>
+        <w:t xml:space="preserve">-dev on Render → Live </w:t>
+      </w:r>
+      <w:proofErr w:type="spellStart"/>
+      <w:r>
+        <w:rPr>
+          <w:rFonts w:ascii="Courier New" w:eastAsia="Courier New" w:hAnsi="Courier New" w:cs="Courier New"/>
+          <w:color w:val="1F3864"/>
+          <w:sz w:val="19"/>
+          <w:szCs w:val="19"/>
+        </w:rPr>
+        <w:t>PakVista</w:t>
+      </w:r>
+      <w:proofErr w:type="spellEnd"/>
+      <w:r>
+        <w:rPr>
+          <w:rFonts w:ascii="Courier New" w:eastAsia="Courier New" w:hAnsi="Courier New" w:cs="Courier New"/>
+          <w:color w:val="1F3864"/>
+          <w:sz w:val="19"/>
+          <w:szCs w:val="19"/>
+        </w:rPr>
+        <w:t xml:space="preserve"> Development updated.</w:t>
       </w:r>
     </w:p>
     <w:p/>
@@ -4596,7 +5453,21 @@
         <w:rPr>
           <w:color w:val="000000"/>
         </w:rPr>
-        <w:t>Create a new public GitHub repository named pakvista-cicd (or a name agreed by the team). Do NOT clone or fork any existing repository.</w:t>
+        <w:t xml:space="preserve">Create a new public GitHub repository named </w:t>
+      </w:r>
+      <w:proofErr w:type="spellStart"/>
+      <w:r>
+        <w:rPr>
+          <w:color w:val="000000"/>
+        </w:rPr>
+        <w:t>pakvista-cicd</w:t>
+      </w:r>
+      <w:proofErr w:type="spellEnd"/>
+      <w:r>
+        <w:rPr>
+          <w:color w:val="000000"/>
+        </w:rPr>
+        <w:t xml:space="preserve"> (or a name agreed by the team). Do NOT clone or fork any existing repository.</w:t>
       </w:r>
     </w:p>
     <w:p>
@@ -4612,21 +5483,7 @@
         <w:rPr>
           <w:color w:val="000000"/>
         </w:rPr>
-        <w:t xml:space="preserve">Create the develop, staging, and main branches. Set </w:t>
-      </w:r>
-      <w:proofErr w:type="gramStart"/>
-      <w:r>
-        <w:rPr>
-          <w:color w:val="000000"/>
-        </w:rPr>
-        <w:t>develop</w:t>
-      </w:r>
-      <w:proofErr w:type="gramEnd"/>
-      <w:r>
-        <w:rPr>
-          <w:color w:val="000000"/>
-        </w:rPr>
-        <w:t xml:space="preserve"> as the default working branch. The promotion flow is: develop → staging → main.</w:t>
+        <w:t>Create the develop, staging, and main branches. Set develop as the default working branch. The promotion flow is: develop → staging → main.</w:t>
       </w:r>
     </w:p>
     <w:p>
@@ -4914,15 +5771,27 @@
             <w:vAlign w:val="center"/>
           </w:tcPr>
           <w:p>
-            <w:r>
-              <w:rPr>
-                <w:b/>
-                <w:bCs/>
-                <w:color w:val="000000"/>
-                <w:sz w:val="20"/>
-                <w:szCs w:val="20"/>
-              </w:rPr>
-              <w:t>pakvista-dev</w:t>
+            <w:proofErr w:type="spellStart"/>
+            <w:r>
+              <w:rPr>
+                <w:b/>
+                <w:bCs/>
+                <w:color w:val="000000"/>
+                <w:sz w:val="20"/>
+                <w:szCs w:val="20"/>
+              </w:rPr>
+              <w:t>pakvista</w:t>
+            </w:r>
+            <w:proofErr w:type="spellEnd"/>
+            <w:r>
+              <w:rPr>
+                <w:b/>
+                <w:bCs/>
+                <w:color w:val="000000"/>
+                <w:sz w:val="20"/>
+                <w:szCs w:val="20"/>
+              </w:rPr>
+              <w:t>-dev</w:t>
             </w:r>
           </w:p>
         </w:tc>
@@ -5044,15 +5913,27 @@
             <w:vAlign w:val="center"/>
           </w:tcPr>
           <w:p>
-            <w:r>
-              <w:rPr>
-                <w:b/>
-                <w:bCs/>
-                <w:color w:val="000000"/>
-                <w:sz w:val="20"/>
-                <w:szCs w:val="20"/>
-              </w:rPr>
-              <w:t>pakvista-staging</w:t>
+            <w:proofErr w:type="spellStart"/>
+            <w:r>
+              <w:rPr>
+                <w:b/>
+                <w:bCs/>
+                <w:color w:val="000000"/>
+                <w:sz w:val="20"/>
+                <w:szCs w:val="20"/>
+              </w:rPr>
+              <w:t>pakvista</w:t>
+            </w:r>
+            <w:proofErr w:type="spellEnd"/>
+            <w:r>
+              <w:rPr>
+                <w:b/>
+                <w:bCs/>
+                <w:color w:val="000000"/>
+                <w:sz w:val="20"/>
+                <w:szCs w:val="20"/>
+              </w:rPr>
+              <w:t>-staging</w:t>
             </w:r>
           </w:p>
         </w:tc>
@@ -5174,15 +6055,27 @@
             <w:vAlign w:val="center"/>
           </w:tcPr>
           <w:p>
-            <w:r>
-              <w:rPr>
-                <w:b/>
-                <w:bCs/>
-                <w:color w:val="000000"/>
-                <w:sz w:val="20"/>
-                <w:szCs w:val="20"/>
-              </w:rPr>
-              <w:t>pakvista-prod</w:t>
+            <w:proofErr w:type="spellStart"/>
+            <w:r>
+              <w:rPr>
+                <w:b/>
+                <w:bCs/>
+                <w:color w:val="000000"/>
+                <w:sz w:val="20"/>
+                <w:szCs w:val="20"/>
+              </w:rPr>
+              <w:t>pakvista</w:t>
+            </w:r>
+            <w:proofErr w:type="spellEnd"/>
+            <w:r>
+              <w:rPr>
+                <w:b/>
+                <w:bCs/>
+                <w:color w:val="000000"/>
+                <w:sz w:val="20"/>
+                <w:szCs w:val="20"/>
+              </w:rPr>
+              <w:t>-prod</w:t>
             </w:r>
           </w:p>
         </w:tc>
@@ -5453,13 +6346,23 @@
             <w:vAlign w:val="center"/>
           </w:tcPr>
           <w:p>
-            <w:r>
-              <w:rPr>
-                <w:color w:val="000000"/>
-                <w:sz w:val="20"/>
-                <w:szCs w:val="20"/>
-              </w:rPr>
-              <w:t>PakVista Home / Welcome page – created by Member 1 (Team Lead)</w:t>
+            <w:proofErr w:type="spellStart"/>
+            <w:r>
+              <w:rPr>
+                <w:color w:val="000000"/>
+                <w:sz w:val="20"/>
+                <w:szCs w:val="20"/>
+              </w:rPr>
+              <w:t>PakVista</w:t>
+            </w:r>
+            <w:proofErr w:type="spellEnd"/>
+            <w:r>
+              <w:rPr>
+                <w:color w:val="000000"/>
+                <w:sz w:val="20"/>
+                <w:szCs w:val="20"/>
+              </w:rPr>
+              <w:t xml:space="preserve"> Home / Welcome page – created by Member 1 (Team Lead)</w:t>
             </w:r>
           </w:p>
         </w:tc>
@@ -5795,6 +6698,7 @@
             <w:vAlign w:val="center"/>
           </w:tcPr>
           <w:p>
+            <w:proofErr w:type="spellStart"/>
             <w:r>
               <w:rPr>
                 <w:b/>
@@ -5805,6 +6709,7 @@
               </w:rPr>
               <w:t>Dockerfile</w:t>
             </w:r>
+            <w:proofErr w:type="spellEnd"/>
           </w:p>
         </w:tc>
         <w:tc>
@@ -5832,8 +6737,45 @@
                 <w:sz w:val="20"/>
                 <w:szCs w:val="20"/>
               </w:rPr>
-              <w:t>Multi-stage Dockerfile to containerise the application (</w:t>
-            </w:r>
+              <w:t xml:space="preserve">Multi-stage </w:t>
+            </w:r>
+            <w:proofErr w:type="spellStart"/>
+            <w:r>
+              <w:rPr>
+                <w:color w:val="000000"/>
+                <w:sz w:val="20"/>
+                <w:szCs w:val="20"/>
+              </w:rPr>
+              <w:t>Dockerfile</w:t>
+            </w:r>
+            <w:proofErr w:type="spellEnd"/>
+            <w:r>
+              <w:rPr>
+                <w:color w:val="000000"/>
+                <w:sz w:val="20"/>
+                <w:szCs w:val="20"/>
+              </w:rPr>
+              <w:t xml:space="preserve"> to </w:t>
+            </w:r>
+            <w:proofErr w:type="spellStart"/>
+            <w:r>
+              <w:rPr>
+                <w:color w:val="000000"/>
+                <w:sz w:val="20"/>
+                <w:szCs w:val="20"/>
+              </w:rPr>
+              <w:t>containerise</w:t>
+            </w:r>
+            <w:proofErr w:type="spellEnd"/>
+            <w:r>
+              <w:rPr>
+                <w:color w:val="000000"/>
+                <w:sz w:val="20"/>
+                <w:szCs w:val="20"/>
+              </w:rPr>
+              <w:t xml:space="preserve"> the application (</w:t>
+            </w:r>
+            <w:proofErr w:type="spellStart"/>
             <w:proofErr w:type="gramStart"/>
             <w:r>
               <w:rPr>
@@ -5850,7 +6792,16 @@
                 <w:sz w:val="20"/>
                 <w:szCs w:val="20"/>
               </w:rPr>
-              <w:t>-based)</w:t>
+              <w:t>-based</w:t>
+            </w:r>
+            <w:proofErr w:type="spellEnd"/>
+            <w:r>
+              <w:rPr>
+                <w:color w:val="000000"/>
+                <w:sz w:val="20"/>
+                <w:szCs w:val="20"/>
+              </w:rPr>
+              <w:t>)</w:t>
             </w:r>
           </w:p>
         </w:tc>
@@ -5883,8 +6834,42 @@
                 <w:sz w:val="20"/>
                 <w:szCs w:val="20"/>
               </w:rPr>
-              <w:t>.github/workflows/ci-dev.yml</w:t>
-            </w:r>
+              <w:t>.</w:t>
+            </w:r>
+            <w:proofErr w:type="spellStart"/>
+            <w:r>
+              <w:rPr>
+                <w:b/>
+                <w:bCs/>
+                <w:color w:val="000000"/>
+                <w:sz w:val="20"/>
+                <w:szCs w:val="20"/>
+              </w:rPr>
+              <w:t>github</w:t>
+            </w:r>
+            <w:proofErr w:type="spellEnd"/>
+            <w:r>
+              <w:rPr>
+                <w:b/>
+                <w:bCs/>
+                <w:color w:val="000000"/>
+                <w:sz w:val="20"/>
+                <w:szCs w:val="20"/>
+              </w:rPr>
+              <w:t>/workflows/ci-</w:t>
+            </w:r>
+            <w:proofErr w:type="spellStart"/>
+            <w:r>
+              <w:rPr>
+                <w:b/>
+                <w:bCs/>
+                <w:color w:val="000000"/>
+                <w:sz w:val="20"/>
+                <w:szCs w:val="20"/>
+              </w:rPr>
+              <w:t>dev.yml</w:t>
+            </w:r>
+            <w:proofErr w:type="spellEnd"/>
           </w:p>
         </w:tc>
         <w:tc>
@@ -5912,18 +6897,26 @@
                 <w:sz w:val="20"/>
                 <w:szCs w:val="20"/>
               </w:rPr>
-              <w:t xml:space="preserve">CI workflow for Development – triggered on pull_request targeting </w:t>
-            </w:r>
-            <w:proofErr w:type="gramStart"/>
-            <w:r>
-              <w:rPr>
-                <w:color w:val="000000"/>
-                <w:sz w:val="20"/>
-                <w:szCs w:val="20"/>
-              </w:rPr>
-              <w:t>develop</w:t>
-            </w:r>
-            <w:proofErr w:type="gramEnd"/>
+              <w:t xml:space="preserve">CI workflow for Development – triggered on </w:t>
+            </w:r>
+            <w:proofErr w:type="spellStart"/>
+            <w:r>
+              <w:rPr>
+                <w:color w:val="000000"/>
+                <w:sz w:val="20"/>
+                <w:szCs w:val="20"/>
+              </w:rPr>
+              <w:t>pull_request</w:t>
+            </w:r>
+            <w:proofErr w:type="spellEnd"/>
+            <w:r>
+              <w:rPr>
+                <w:color w:val="000000"/>
+                <w:sz w:val="20"/>
+                <w:szCs w:val="20"/>
+              </w:rPr>
+              <w:t xml:space="preserve"> targeting develop</w:t>
+            </w:r>
           </w:p>
         </w:tc>
       </w:tr>
@@ -5955,8 +6948,42 @@
                 <w:sz w:val="20"/>
                 <w:szCs w:val="20"/>
               </w:rPr>
-              <w:t>.github/workflows/cd-dev.yml</w:t>
-            </w:r>
+              <w:t>.</w:t>
+            </w:r>
+            <w:proofErr w:type="spellStart"/>
+            <w:r>
+              <w:rPr>
+                <w:b/>
+                <w:bCs/>
+                <w:color w:val="000000"/>
+                <w:sz w:val="20"/>
+                <w:szCs w:val="20"/>
+              </w:rPr>
+              <w:t>github</w:t>
+            </w:r>
+            <w:proofErr w:type="spellEnd"/>
+            <w:r>
+              <w:rPr>
+                <w:b/>
+                <w:bCs/>
+                <w:color w:val="000000"/>
+                <w:sz w:val="20"/>
+                <w:szCs w:val="20"/>
+              </w:rPr>
+              <w:t>/workflows/cd-</w:t>
+            </w:r>
+            <w:proofErr w:type="spellStart"/>
+            <w:r>
+              <w:rPr>
+                <w:b/>
+                <w:bCs/>
+                <w:color w:val="000000"/>
+                <w:sz w:val="20"/>
+                <w:szCs w:val="20"/>
+              </w:rPr>
+              <w:t>dev.yml</w:t>
+            </w:r>
+            <w:proofErr w:type="spellEnd"/>
           </w:p>
         </w:tc>
         <w:tc>
@@ -6017,8 +7044,42 @@
                 <w:sz w:val="20"/>
                 <w:szCs w:val="20"/>
               </w:rPr>
-              <w:t>.github/workflows/ci-staging.yml</w:t>
-            </w:r>
+              <w:t>.</w:t>
+            </w:r>
+            <w:proofErr w:type="spellStart"/>
+            <w:r>
+              <w:rPr>
+                <w:b/>
+                <w:bCs/>
+                <w:color w:val="000000"/>
+                <w:sz w:val="20"/>
+                <w:szCs w:val="20"/>
+              </w:rPr>
+              <w:t>github</w:t>
+            </w:r>
+            <w:proofErr w:type="spellEnd"/>
+            <w:r>
+              <w:rPr>
+                <w:b/>
+                <w:bCs/>
+                <w:color w:val="000000"/>
+                <w:sz w:val="20"/>
+                <w:szCs w:val="20"/>
+              </w:rPr>
+              <w:t>/workflows/ci-</w:t>
+            </w:r>
+            <w:proofErr w:type="spellStart"/>
+            <w:r>
+              <w:rPr>
+                <w:b/>
+                <w:bCs/>
+                <w:color w:val="000000"/>
+                <w:sz w:val="20"/>
+                <w:szCs w:val="20"/>
+              </w:rPr>
+              <w:t>staging.yml</w:t>
+            </w:r>
+            <w:proofErr w:type="spellEnd"/>
           </w:p>
         </w:tc>
         <w:tc>
@@ -6046,7 +7107,25 @@
                 <w:sz w:val="20"/>
                 <w:szCs w:val="20"/>
               </w:rPr>
-              <w:t>CI workflow for Staging – triggered on pull_request targeting staging</w:t>
+              <w:t xml:space="preserve">CI workflow for Staging – triggered on </w:t>
+            </w:r>
+            <w:proofErr w:type="spellStart"/>
+            <w:r>
+              <w:rPr>
+                <w:color w:val="000000"/>
+                <w:sz w:val="20"/>
+                <w:szCs w:val="20"/>
+              </w:rPr>
+              <w:t>pull_request</w:t>
+            </w:r>
+            <w:proofErr w:type="spellEnd"/>
+            <w:r>
+              <w:rPr>
+                <w:color w:val="000000"/>
+                <w:sz w:val="20"/>
+                <w:szCs w:val="20"/>
+              </w:rPr>
+              <w:t xml:space="preserve"> targeting staging</w:t>
             </w:r>
           </w:p>
         </w:tc>
@@ -6079,8 +7158,42 @@
                 <w:sz w:val="20"/>
                 <w:szCs w:val="20"/>
               </w:rPr>
-              <w:t>.github/workflows/cd-staging.yml</w:t>
-            </w:r>
+              <w:t>.</w:t>
+            </w:r>
+            <w:proofErr w:type="spellStart"/>
+            <w:r>
+              <w:rPr>
+                <w:b/>
+                <w:bCs/>
+                <w:color w:val="000000"/>
+                <w:sz w:val="20"/>
+                <w:szCs w:val="20"/>
+              </w:rPr>
+              <w:t>github</w:t>
+            </w:r>
+            <w:proofErr w:type="spellEnd"/>
+            <w:r>
+              <w:rPr>
+                <w:b/>
+                <w:bCs/>
+                <w:color w:val="000000"/>
+                <w:sz w:val="20"/>
+                <w:szCs w:val="20"/>
+              </w:rPr>
+              <w:t>/workflows/cd-</w:t>
+            </w:r>
+            <w:proofErr w:type="spellStart"/>
+            <w:r>
+              <w:rPr>
+                <w:b/>
+                <w:bCs/>
+                <w:color w:val="000000"/>
+                <w:sz w:val="20"/>
+                <w:szCs w:val="20"/>
+              </w:rPr>
+              <w:t>staging.yml</w:t>
+            </w:r>
+            <w:proofErr w:type="spellEnd"/>
           </w:p>
         </w:tc>
         <w:tc>
@@ -6141,8 +7254,42 @@
                 <w:sz w:val="20"/>
                 <w:szCs w:val="20"/>
               </w:rPr>
-              <w:t>.github/workflows/ci-prod.yml</w:t>
-            </w:r>
+              <w:t>.</w:t>
+            </w:r>
+            <w:proofErr w:type="spellStart"/>
+            <w:r>
+              <w:rPr>
+                <w:b/>
+                <w:bCs/>
+                <w:color w:val="000000"/>
+                <w:sz w:val="20"/>
+                <w:szCs w:val="20"/>
+              </w:rPr>
+              <w:t>github</w:t>
+            </w:r>
+            <w:proofErr w:type="spellEnd"/>
+            <w:r>
+              <w:rPr>
+                <w:b/>
+                <w:bCs/>
+                <w:color w:val="000000"/>
+                <w:sz w:val="20"/>
+                <w:szCs w:val="20"/>
+              </w:rPr>
+              <w:t>/workflows/ci-</w:t>
+            </w:r>
+            <w:proofErr w:type="spellStart"/>
+            <w:r>
+              <w:rPr>
+                <w:b/>
+                <w:bCs/>
+                <w:color w:val="000000"/>
+                <w:sz w:val="20"/>
+                <w:szCs w:val="20"/>
+              </w:rPr>
+              <w:t>prod.yml</w:t>
+            </w:r>
+            <w:proofErr w:type="spellEnd"/>
           </w:p>
         </w:tc>
         <w:tc>
@@ -6170,7 +7317,25 @@
                 <w:sz w:val="20"/>
                 <w:szCs w:val="20"/>
               </w:rPr>
-              <w:t>CI workflow for Production – triggered on pull_request targeting main</w:t>
+              <w:t xml:space="preserve">CI workflow for Production – triggered on </w:t>
+            </w:r>
+            <w:proofErr w:type="spellStart"/>
+            <w:r>
+              <w:rPr>
+                <w:color w:val="000000"/>
+                <w:sz w:val="20"/>
+                <w:szCs w:val="20"/>
+              </w:rPr>
+              <w:t>pull_request</w:t>
+            </w:r>
+            <w:proofErr w:type="spellEnd"/>
+            <w:r>
+              <w:rPr>
+                <w:color w:val="000000"/>
+                <w:sz w:val="20"/>
+                <w:szCs w:val="20"/>
+              </w:rPr>
+              <w:t xml:space="preserve"> targeting main</w:t>
             </w:r>
           </w:p>
         </w:tc>
@@ -6203,8 +7368,42 @@
                 <w:sz w:val="20"/>
                 <w:szCs w:val="20"/>
               </w:rPr>
-              <w:t>.github/workflows/cd-prod.yml</w:t>
-            </w:r>
+              <w:t>.</w:t>
+            </w:r>
+            <w:proofErr w:type="spellStart"/>
+            <w:r>
+              <w:rPr>
+                <w:b/>
+                <w:bCs/>
+                <w:color w:val="000000"/>
+                <w:sz w:val="20"/>
+                <w:szCs w:val="20"/>
+              </w:rPr>
+              <w:t>github</w:t>
+            </w:r>
+            <w:proofErr w:type="spellEnd"/>
+            <w:r>
+              <w:rPr>
+                <w:b/>
+                <w:bCs/>
+                <w:color w:val="000000"/>
+                <w:sz w:val="20"/>
+                <w:szCs w:val="20"/>
+              </w:rPr>
+              <w:t>/workflows/cd-</w:t>
+            </w:r>
+            <w:proofErr w:type="spellStart"/>
+            <w:r>
+              <w:rPr>
+                <w:b/>
+                <w:bCs/>
+                <w:color w:val="000000"/>
+                <w:sz w:val="20"/>
+                <w:szCs w:val="20"/>
+              </w:rPr>
+              <w:t>prod.yml</w:t>
+            </w:r>
+            <w:proofErr w:type="spellEnd"/>
           </w:p>
         </w:tc>
         <w:tc>
@@ -6832,7 +8031,25 @@
                 <w:sz w:val="20"/>
                 <w:szCs w:val="20"/>
               </w:rPr>
-              <w:t>Deploy-hook webhook URL from the pakvista-dev Render service. Added inside the 'development' environment secrets.</w:t>
+              <w:t xml:space="preserve">Deploy-hook webhook URL from the </w:t>
+            </w:r>
+            <w:proofErr w:type="spellStart"/>
+            <w:r>
+              <w:rPr>
+                <w:color w:val="000000"/>
+                <w:sz w:val="20"/>
+                <w:szCs w:val="20"/>
+              </w:rPr>
+              <w:t>pakvista</w:t>
+            </w:r>
+            <w:proofErr w:type="spellEnd"/>
+            <w:r>
+              <w:rPr>
+                <w:color w:val="000000"/>
+                <w:sz w:val="20"/>
+                <w:szCs w:val="20"/>
+              </w:rPr>
+              <w:t>-dev Render service. Added inside the 'development' environment secrets.</w:t>
             </w:r>
           </w:p>
         </w:tc>
@@ -6925,7 +8142,25 @@
                 <w:sz w:val="20"/>
                 <w:szCs w:val="20"/>
               </w:rPr>
-              <w:t>Deploy-hook webhook URL from the pakvista-staging Render service. Added inside the 'staging' environment secrets.</w:t>
+              <w:t xml:space="preserve">Deploy-hook webhook URL from the </w:t>
+            </w:r>
+            <w:proofErr w:type="spellStart"/>
+            <w:r>
+              <w:rPr>
+                <w:color w:val="000000"/>
+                <w:sz w:val="20"/>
+                <w:szCs w:val="20"/>
+              </w:rPr>
+              <w:t>pakvista</w:t>
+            </w:r>
+            <w:proofErr w:type="spellEnd"/>
+            <w:r>
+              <w:rPr>
+                <w:color w:val="000000"/>
+                <w:sz w:val="20"/>
+                <w:szCs w:val="20"/>
+              </w:rPr>
+              <w:t>-staging Render service. Added inside the 'staging' environment secrets.</w:t>
             </w:r>
           </w:p>
         </w:tc>
@@ -7018,7 +8253,25 @@
                 <w:sz w:val="20"/>
                 <w:szCs w:val="20"/>
               </w:rPr>
-              <w:t>Deploy-hook webhook URL from the pakvista-prod Render service. Added inside the 'production' environment secrets.</w:t>
+              <w:t xml:space="preserve">Deploy-hook webhook URL from the </w:t>
+            </w:r>
+            <w:proofErr w:type="spellStart"/>
+            <w:r>
+              <w:rPr>
+                <w:color w:val="000000"/>
+                <w:sz w:val="20"/>
+                <w:szCs w:val="20"/>
+              </w:rPr>
+              <w:t>pakvista</w:t>
+            </w:r>
+            <w:proofErr w:type="spellEnd"/>
+            <w:r>
+              <w:rPr>
+                <w:color w:val="000000"/>
+                <w:sz w:val="20"/>
+                <w:szCs w:val="20"/>
+              </w:rPr>
+              <w:t>-prod Render service. Added inside the 'production' environment secrets.</w:t>
             </w:r>
           </w:p>
         </w:tc>
@@ -7264,8 +8517,20 @@
                 <w:sz w:val="20"/>
                 <w:szCs w:val="20"/>
               </w:rPr>
-              <w:t>ci-dev.yml</w:t>
-            </w:r>
+              <w:t>ci-</w:t>
+            </w:r>
+            <w:proofErr w:type="spellStart"/>
+            <w:r>
+              <w:rPr>
+                <w:b/>
+                <w:bCs/>
+                <w:color w:val="000000"/>
+                <w:sz w:val="20"/>
+                <w:szCs w:val="20"/>
+              </w:rPr>
+              <w:t>dev.yml</w:t>
+            </w:r>
+            <w:proofErr w:type="spellEnd"/>
           </w:p>
         </w:tc>
         <w:tc>
@@ -7287,6 +8552,7 @@
             <w:vAlign w:val="center"/>
           </w:tcPr>
           <w:p>
+            <w:proofErr w:type="spellStart"/>
             <w:r>
               <w:rPr>
                 <w:color w:val="000000"/>
@@ -7295,6 +8561,7 @@
               </w:rPr>
               <w:t>pull_request</w:t>
             </w:r>
+            <w:proofErr w:type="spellEnd"/>
           </w:p>
         </w:tc>
         <w:tc>
@@ -7361,7 +8628,25 @@
                 <w:sz w:val="20"/>
                 <w:szCs w:val="20"/>
               </w:rPr>
-              <w:t>-latest  and  :dev-&lt;sha&gt;</w:t>
+              <w:t>-</w:t>
+            </w:r>
+            <w:proofErr w:type="gramStart"/>
+            <w:r>
+              <w:rPr>
+                <w:color w:val="000000"/>
+                <w:sz w:val="20"/>
+                <w:szCs w:val="20"/>
+              </w:rPr>
+              <w:t>latest  and  :dev</w:t>
+            </w:r>
+            <w:proofErr w:type="gramEnd"/>
+            <w:r>
+              <w:rPr>
+                <w:color w:val="000000"/>
+                <w:sz w:val="20"/>
+                <w:szCs w:val="20"/>
+              </w:rPr>
+              <w:t>-&lt;sha&gt;</w:t>
             </w:r>
           </w:p>
         </w:tc>
@@ -7394,8 +8679,20 @@
                 <w:sz w:val="20"/>
                 <w:szCs w:val="20"/>
               </w:rPr>
-              <w:t>ci-staging.yml</w:t>
-            </w:r>
+              <w:t>ci-</w:t>
+            </w:r>
+            <w:proofErr w:type="spellStart"/>
+            <w:r>
+              <w:rPr>
+                <w:b/>
+                <w:bCs/>
+                <w:color w:val="000000"/>
+                <w:sz w:val="20"/>
+                <w:szCs w:val="20"/>
+              </w:rPr>
+              <w:t>staging.yml</w:t>
+            </w:r>
+            <w:proofErr w:type="spellEnd"/>
           </w:p>
         </w:tc>
         <w:tc>
@@ -7417,6 +8714,7 @@
             <w:vAlign w:val="center"/>
           </w:tcPr>
           <w:p>
+            <w:proofErr w:type="spellStart"/>
             <w:r>
               <w:rPr>
                 <w:color w:val="000000"/>
@@ -7425,6 +8723,7 @@
               </w:rPr>
               <w:t>pull_request</w:t>
             </w:r>
+            <w:proofErr w:type="spellEnd"/>
           </w:p>
         </w:tc>
         <w:tc>
@@ -7491,7 +8790,25 @@
                 <w:sz w:val="20"/>
                 <w:szCs w:val="20"/>
               </w:rPr>
-              <w:t>-latest  and  :staging-&lt;sha&gt;</w:t>
+              <w:t>-</w:t>
+            </w:r>
+            <w:proofErr w:type="gramStart"/>
+            <w:r>
+              <w:rPr>
+                <w:color w:val="000000"/>
+                <w:sz w:val="20"/>
+                <w:szCs w:val="20"/>
+              </w:rPr>
+              <w:t>latest  and  :staging</w:t>
+            </w:r>
+            <w:proofErr w:type="gramEnd"/>
+            <w:r>
+              <w:rPr>
+                <w:color w:val="000000"/>
+                <w:sz w:val="20"/>
+                <w:szCs w:val="20"/>
+              </w:rPr>
+              <w:t>-&lt;sha&gt;</w:t>
             </w:r>
           </w:p>
         </w:tc>
@@ -7524,8 +8841,20 @@
                 <w:sz w:val="20"/>
                 <w:szCs w:val="20"/>
               </w:rPr>
-              <w:t>ci-prod.yml</w:t>
-            </w:r>
+              <w:t>ci-</w:t>
+            </w:r>
+            <w:proofErr w:type="spellStart"/>
+            <w:r>
+              <w:rPr>
+                <w:b/>
+                <w:bCs/>
+                <w:color w:val="000000"/>
+                <w:sz w:val="20"/>
+                <w:szCs w:val="20"/>
+              </w:rPr>
+              <w:t>prod.yml</w:t>
+            </w:r>
+            <w:proofErr w:type="spellEnd"/>
           </w:p>
         </w:tc>
         <w:tc>
@@ -7547,6 +8876,7 @@
             <w:vAlign w:val="center"/>
           </w:tcPr>
           <w:p>
+            <w:proofErr w:type="spellStart"/>
             <w:r>
               <w:rPr>
                 <w:color w:val="000000"/>
@@ -7555,6 +8885,7 @@
               </w:rPr>
               <w:t>pull_request</w:t>
             </w:r>
+            <w:proofErr w:type="spellEnd"/>
           </w:p>
         </w:tc>
         <w:tc>
@@ -7621,7 +8952,25 @@
                 <w:sz w:val="20"/>
                 <w:szCs w:val="20"/>
               </w:rPr>
-              <w:t>-latest  and  :prod-&lt;sha&gt;</w:t>
+              <w:t>-</w:t>
+            </w:r>
+            <w:proofErr w:type="gramStart"/>
+            <w:r>
+              <w:rPr>
+                <w:color w:val="000000"/>
+                <w:sz w:val="20"/>
+                <w:szCs w:val="20"/>
+              </w:rPr>
+              <w:t>latest  and  :prod</w:t>
+            </w:r>
+            <w:proofErr w:type="gramEnd"/>
+            <w:r>
+              <w:rPr>
+                <w:color w:val="000000"/>
+                <w:sz w:val="20"/>
+                <w:szCs w:val="20"/>
+              </w:rPr>
+              <w:t>-&lt;sha&gt;</w:t>
             </w:r>
           </w:p>
         </w:tc>
@@ -7708,7 +9057,23 @@
     </w:p>
     <w:p>
       <w:r>
-        <w:t>Lint HTML with HTMLHint, CSS with Stylelint and Build with Parcel.</w:t>
+        <w:t xml:space="preserve">Lint HTML with </w:t>
+      </w:r>
+      <w:proofErr w:type="spellStart"/>
+      <w:r>
+        <w:t>HTMLHint</w:t>
+      </w:r>
+      <w:proofErr w:type="spellEnd"/>
+      <w:r>
+        <w:t xml:space="preserve">, CSS with </w:t>
+      </w:r>
+      <w:proofErr w:type="spellStart"/>
+      <w:r>
+        <w:t>Stylelint</w:t>
+      </w:r>
+      <w:proofErr w:type="spellEnd"/>
+      <w:r>
+        <w:t xml:space="preserve"> and Build with Parcel.</w:t>
       </w:r>
     </w:p>
     <w:p/>
@@ -7773,7 +9138,21 @@
         <w:rPr>
           <w:color w:val="000000"/>
         </w:rPr>
-        <w:t>Build the Docker image from the Dockerfile in the project root using docker/build-push-action@v5 with push: false.</w:t>
+        <w:t xml:space="preserve">Build the Docker image from the </w:t>
+      </w:r>
+      <w:proofErr w:type="spellStart"/>
+      <w:r>
+        <w:rPr>
+          <w:color w:val="000000"/>
+        </w:rPr>
+        <w:t>Dockerfile</w:t>
+      </w:r>
+      <w:proofErr w:type="spellEnd"/>
+      <w:r>
+        <w:rPr>
+          <w:color w:val="000000"/>
+        </w:rPr>
+        <w:t xml:space="preserve"> in the project root using docker/build-push-action@v5 with push: false.</w:t>
       </w:r>
     </w:p>
     <w:p>
@@ -7884,7 +9263,21 @@
         <w:rPr>
           <w:color w:val="000000"/>
         </w:rPr>
-        <w:t>The workflow must exit with a non-zero code if any step fails, preventing a broken image from being available for deployment. This is the default behaviour of GitHub Actions (fail-fast).</w:t>
+        <w:t xml:space="preserve">The workflow must exit with a non-zero code if any step fails, preventing a broken image from being available for deployment. This is the default </w:t>
+      </w:r>
+      <w:proofErr w:type="spellStart"/>
+      <w:r>
+        <w:rPr>
+          <w:color w:val="000000"/>
+        </w:rPr>
+        <w:t>behaviour</w:t>
+      </w:r>
+      <w:proofErr w:type="spellEnd"/>
+      <w:r>
+        <w:rPr>
+          <w:color w:val="000000"/>
+        </w:rPr>
+        <w:t xml:space="preserve"> of GitHub Actions (fail-fast).</w:t>
       </w:r>
     </w:p>
     <w:p>
@@ -8150,8 +9543,20 @@
                 <w:sz w:val="20"/>
                 <w:szCs w:val="20"/>
               </w:rPr>
-              <w:t>cd-dev.yml</w:t>
-            </w:r>
+              <w:t>cd-</w:t>
+            </w:r>
+            <w:proofErr w:type="spellStart"/>
+            <w:r>
+              <w:rPr>
+                <w:b/>
+                <w:bCs/>
+                <w:color w:val="000000"/>
+                <w:sz w:val="20"/>
+                <w:szCs w:val="20"/>
+              </w:rPr>
+              <w:t>dev.yml</w:t>
+            </w:r>
+            <w:proofErr w:type="spellEnd"/>
           </w:p>
         </w:tc>
         <w:tc>
@@ -8270,8 +9675,20 @@
                 <w:sz w:val="20"/>
                 <w:szCs w:val="20"/>
               </w:rPr>
-              <w:t>cd-staging.yml</w:t>
-            </w:r>
+              <w:t>cd-</w:t>
+            </w:r>
+            <w:proofErr w:type="spellStart"/>
+            <w:r>
+              <w:rPr>
+                <w:b/>
+                <w:bCs/>
+                <w:color w:val="000000"/>
+                <w:sz w:val="20"/>
+                <w:szCs w:val="20"/>
+              </w:rPr>
+              <w:t>staging.yml</w:t>
+            </w:r>
+            <w:proofErr w:type="spellEnd"/>
           </w:p>
         </w:tc>
         <w:tc>
@@ -8390,8 +9807,20 @@
                 <w:sz w:val="20"/>
                 <w:szCs w:val="20"/>
               </w:rPr>
-              <w:t>cd-prod.yml</w:t>
-            </w:r>
+              <w:t>cd-</w:t>
+            </w:r>
+            <w:proofErr w:type="spellStart"/>
+            <w:r>
+              <w:rPr>
+                <w:b/>
+                <w:bCs/>
+                <w:color w:val="000000"/>
+                <w:sz w:val="20"/>
+                <w:szCs w:val="20"/>
+              </w:rPr>
+              <w:t>prod.yml</w:t>
+            </w:r>
+            <w:proofErr w:type="spellEnd"/>
           </w:p>
         </w:tc>
         <w:tc>
@@ -8635,9 +10064,9 @@
           <w:sz w:val="20"/>
           <w:szCs w:val="20"/>
         </w:rPr>
-        <w:t>{{ secrets</w:t>
-      </w:r>
-      <w:proofErr w:type="gramEnd"/>
+        <w:t xml:space="preserve">{{ </w:t>
+      </w:r>
+      <w:proofErr w:type="spellStart"/>
       <w:r>
         <w:rPr>
           <w:rFonts w:ascii="Courier New" w:eastAsia="Courier New" w:hAnsi="Courier New" w:cs="Courier New"/>
@@ -8645,14 +10074,9 @@
           <w:sz w:val="20"/>
           <w:szCs w:val="20"/>
         </w:rPr>
-        <w:t>.RENDER_DEPLOY_HOOK_DEV_URL }}    # cd-dev.yml</w:t>
-      </w:r>
-    </w:p>
-    <w:p>
-      <w:pPr>
-        <w:spacing w:before="40" w:after="40"/>
-        <w:ind w:left="720"/>
-      </w:pPr>
+        <w:t>secrets</w:t>
+      </w:r>
+      <w:proofErr w:type="gramEnd"/>
       <w:r>
         <w:rPr>
           <w:rFonts w:ascii="Courier New" w:eastAsia="Courier New" w:hAnsi="Courier New" w:cs="Courier New"/>
@@ -8660,7 +10084,7 @@
           <w:sz w:val="20"/>
           <w:szCs w:val="20"/>
         </w:rPr>
-        <w:t>curl -X POST $</w:t>
+        <w:t>.RENDER_DEPLOY_HOOK_DEV_</w:t>
       </w:r>
       <w:proofErr w:type="gramStart"/>
       <w:r>
@@ -8670,9 +10094,9 @@
           <w:sz w:val="20"/>
           <w:szCs w:val="20"/>
         </w:rPr>
-        <w:t>{{ secrets</w:t>
-      </w:r>
-      <w:proofErr w:type="gramEnd"/>
+        <w:t>URL</w:t>
+      </w:r>
+      <w:proofErr w:type="spellEnd"/>
       <w:r>
         <w:rPr>
           <w:rFonts w:ascii="Courier New" w:eastAsia="Courier New" w:hAnsi="Courier New" w:cs="Courier New"/>
@@ -8680,14 +10104,9 @@
           <w:sz w:val="20"/>
           <w:szCs w:val="20"/>
         </w:rPr>
-        <w:t>.RENDER_DEPLOY_HOOK_STAGING_URL }} # cd-staging.yml</w:t>
-      </w:r>
-    </w:p>
-    <w:p>
-      <w:pPr>
-        <w:spacing w:before="40" w:after="40"/>
-        <w:ind w:left="720"/>
-      </w:pPr>
+        <w:t xml:space="preserve"> }</w:t>
+      </w:r>
+      <w:proofErr w:type="gramEnd"/>
       <w:r>
         <w:rPr>
           <w:rFonts w:ascii="Courier New" w:eastAsia="Courier New" w:hAnsi="Courier New" w:cs="Courier New"/>
@@ -8695,9 +10114,9 @@
           <w:sz w:val="20"/>
           <w:szCs w:val="20"/>
         </w:rPr>
-        <w:t>curl -X POST $</w:t>
-      </w:r>
-      <w:proofErr w:type="gramStart"/>
+        <w:t>}    # cd-</w:t>
+      </w:r>
+      <w:proofErr w:type="spellStart"/>
       <w:r>
         <w:rPr>
           <w:rFonts w:ascii="Courier New" w:eastAsia="Courier New" w:hAnsi="Courier New" w:cs="Courier New"/>
@@ -8705,9 +10124,15 @@
           <w:sz w:val="20"/>
           <w:szCs w:val="20"/>
         </w:rPr>
-        <w:t>{{ secrets</w:t>
-      </w:r>
-      <w:proofErr w:type="gramEnd"/>
+        <w:t>dev.yml</w:t>
+      </w:r>
+      <w:proofErr w:type="spellEnd"/>
+    </w:p>
+    <w:p>
+      <w:pPr>
+        <w:spacing w:before="40" w:after="40"/>
+        <w:ind w:left="720"/>
+      </w:pPr>
       <w:r>
         <w:rPr>
           <w:rFonts w:ascii="Courier New" w:eastAsia="Courier New" w:hAnsi="Courier New" w:cs="Courier New"/>
@@ -8715,8 +10140,165 @@
           <w:sz w:val="20"/>
           <w:szCs w:val="20"/>
         </w:rPr>
-        <w:t>.RENDER_DEPLOY_HOOK_PROD_URL }}    # cd-prod.yml</w:t>
-      </w:r>
+        <w:t>curl -X POST $</w:t>
+      </w:r>
+      <w:proofErr w:type="gramStart"/>
+      <w:r>
+        <w:rPr>
+          <w:rFonts w:ascii="Courier New" w:eastAsia="Courier New" w:hAnsi="Courier New" w:cs="Courier New"/>
+          <w:color w:val="C7254E"/>
+          <w:sz w:val="20"/>
+          <w:szCs w:val="20"/>
+        </w:rPr>
+        <w:t xml:space="preserve">{{ </w:t>
+      </w:r>
+      <w:proofErr w:type="spellStart"/>
+      <w:r>
+        <w:rPr>
+          <w:rFonts w:ascii="Courier New" w:eastAsia="Courier New" w:hAnsi="Courier New" w:cs="Courier New"/>
+          <w:color w:val="C7254E"/>
+          <w:sz w:val="20"/>
+          <w:szCs w:val="20"/>
+        </w:rPr>
+        <w:t>secrets</w:t>
+      </w:r>
+      <w:proofErr w:type="gramEnd"/>
+      <w:r>
+        <w:rPr>
+          <w:rFonts w:ascii="Courier New" w:eastAsia="Courier New" w:hAnsi="Courier New" w:cs="Courier New"/>
+          <w:color w:val="C7254E"/>
+          <w:sz w:val="20"/>
+          <w:szCs w:val="20"/>
+        </w:rPr>
+        <w:t>.RENDER_DEPLOY_HOOK_STAGING_</w:t>
+      </w:r>
+      <w:proofErr w:type="gramStart"/>
+      <w:r>
+        <w:rPr>
+          <w:rFonts w:ascii="Courier New" w:eastAsia="Courier New" w:hAnsi="Courier New" w:cs="Courier New"/>
+          <w:color w:val="C7254E"/>
+          <w:sz w:val="20"/>
+          <w:szCs w:val="20"/>
+        </w:rPr>
+        <w:t>URL</w:t>
+      </w:r>
+      <w:proofErr w:type="spellEnd"/>
+      <w:r>
+        <w:rPr>
+          <w:rFonts w:ascii="Courier New" w:eastAsia="Courier New" w:hAnsi="Courier New" w:cs="Courier New"/>
+          <w:color w:val="C7254E"/>
+          <w:sz w:val="20"/>
+          <w:szCs w:val="20"/>
+        </w:rPr>
+        <w:t xml:space="preserve"> }</w:t>
+      </w:r>
+      <w:proofErr w:type="gramEnd"/>
+      <w:r>
+        <w:rPr>
+          <w:rFonts w:ascii="Courier New" w:eastAsia="Courier New" w:hAnsi="Courier New" w:cs="Courier New"/>
+          <w:color w:val="C7254E"/>
+          <w:sz w:val="20"/>
+          <w:szCs w:val="20"/>
+        </w:rPr>
+        <w:t>} # cd-</w:t>
+      </w:r>
+      <w:proofErr w:type="spellStart"/>
+      <w:r>
+        <w:rPr>
+          <w:rFonts w:ascii="Courier New" w:eastAsia="Courier New" w:hAnsi="Courier New" w:cs="Courier New"/>
+          <w:color w:val="C7254E"/>
+          <w:sz w:val="20"/>
+          <w:szCs w:val="20"/>
+        </w:rPr>
+        <w:t>staging.yml</w:t>
+      </w:r>
+      <w:proofErr w:type="spellEnd"/>
+    </w:p>
+    <w:p>
+      <w:pPr>
+        <w:spacing w:before="40" w:after="40"/>
+        <w:ind w:left="720"/>
+      </w:pPr>
+      <w:r>
+        <w:rPr>
+          <w:rFonts w:ascii="Courier New" w:eastAsia="Courier New" w:hAnsi="Courier New" w:cs="Courier New"/>
+          <w:color w:val="C7254E"/>
+          <w:sz w:val="20"/>
+          <w:szCs w:val="20"/>
+        </w:rPr>
+        <w:t>curl -X POST $</w:t>
+      </w:r>
+      <w:proofErr w:type="gramStart"/>
+      <w:r>
+        <w:rPr>
+          <w:rFonts w:ascii="Courier New" w:eastAsia="Courier New" w:hAnsi="Courier New" w:cs="Courier New"/>
+          <w:color w:val="C7254E"/>
+          <w:sz w:val="20"/>
+          <w:szCs w:val="20"/>
+        </w:rPr>
+        <w:t xml:space="preserve">{{ </w:t>
+      </w:r>
+      <w:proofErr w:type="spellStart"/>
+      <w:r>
+        <w:rPr>
+          <w:rFonts w:ascii="Courier New" w:eastAsia="Courier New" w:hAnsi="Courier New" w:cs="Courier New"/>
+          <w:color w:val="C7254E"/>
+          <w:sz w:val="20"/>
+          <w:szCs w:val="20"/>
+        </w:rPr>
+        <w:t>secrets</w:t>
+      </w:r>
+      <w:proofErr w:type="gramEnd"/>
+      <w:r>
+        <w:rPr>
+          <w:rFonts w:ascii="Courier New" w:eastAsia="Courier New" w:hAnsi="Courier New" w:cs="Courier New"/>
+          <w:color w:val="C7254E"/>
+          <w:sz w:val="20"/>
+          <w:szCs w:val="20"/>
+        </w:rPr>
+        <w:t>.RENDER_DEPLOY_HOOK_PROD_</w:t>
+      </w:r>
+      <w:proofErr w:type="gramStart"/>
+      <w:r>
+        <w:rPr>
+          <w:rFonts w:ascii="Courier New" w:eastAsia="Courier New" w:hAnsi="Courier New" w:cs="Courier New"/>
+          <w:color w:val="C7254E"/>
+          <w:sz w:val="20"/>
+          <w:szCs w:val="20"/>
+        </w:rPr>
+        <w:t>URL</w:t>
+      </w:r>
+      <w:proofErr w:type="spellEnd"/>
+      <w:r>
+        <w:rPr>
+          <w:rFonts w:ascii="Courier New" w:eastAsia="Courier New" w:hAnsi="Courier New" w:cs="Courier New"/>
+          <w:color w:val="C7254E"/>
+          <w:sz w:val="20"/>
+          <w:szCs w:val="20"/>
+        </w:rPr>
+        <w:t xml:space="preserve"> }</w:t>
+      </w:r>
+      <w:proofErr w:type="gramEnd"/>
+      <w:r>
+        <w:rPr>
+          <w:rFonts w:ascii="Courier New" w:eastAsia="Courier New" w:hAnsi="Courier New" w:cs="Courier New"/>
+          <w:color w:val="C7254E"/>
+          <w:sz w:val="20"/>
+          <w:szCs w:val="20"/>
+        </w:rPr>
+        <w:t>}    # cd-</w:t>
+      </w:r>
+      <w:proofErr w:type="spellStart"/>
+      <w:r>
+        <w:rPr>
+          <w:rFonts w:ascii="Courier New" w:eastAsia="Courier New" w:hAnsi="Courier New" w:cs="Courier New"/>
+          <w:color w:val="C7254E"/>
+          <w:sz w:val="20"/>
+          <w:szCs w:val="20"/>
+        </w:rPr>
+        <w:t>prod.yml</w:t>
+      </w:r>
+      <w:proofErr w:type="spellEnd"/>
     </w:p>
     <w:p>
       <w:pPr>
@@ -8833,7 +10415,21 @@
         <w:rPr>
           <w:color w:val="000000"/>
         </w:rPr>
-        <w:t>The workflow must be triggered only on push events to the specified branch (no workflow_dispatch or schedule triggers are required, though they may be added as extras).</w:t>
+        <w:t xml:space="preserve">The workflow must be triggered only on push events to the specified branch (no </w:t>
+      </w:r>
+      <w:proofErr w:type="spellStart"/>
+      <w:r>
+        <w:rPr>
+          <w:color w:val="000000"/>
+        </w:rPr>
+        <w:t>workflow_dispatch</w:t>
+      </w:r>
+      <w:proofErr w:type="spellEnd"/>
+      <w:r>
+        <w:rPr>
+          <w:color w:val="000000"/>
+        </w:rPr>
+        <w:t xml:space="preserve"> or schedule triggers are required, though they may be added as extras).</w:t>
       </w:r>
     </w:p>
     <w:p/>
@@ -8859,7 +10455,21 @@
         <w:rPr>
           <w:color w:val="000000"/>
         </w:rPr>
-        <w:t>The Team Lead must create the Dockerfile in the repository root. The following requirements must be met:</w:t>
+        <w:t xml:space="preserve">The Team Lead must create the </w:t>
+      </w:r>
+      <w:proofErr w:type="spellStart"/>
+      <w:r>
+        <w:rPr>
+          <w:color w:val="000000"/>
+        </w:rPr>
+        <w:t>Dockerfile</w:t>
+      </w:r>
+      <w:proofErr w:type="spellEnd"/>
+      <w:r>
+        <w:rPr>
+          <w:color w:val="000000"/>
+        </w:rPr>
+        <w:t xml:space="preserve"> in the repository root. The following requirements must be met:</w:t>
       </w:r>
     </w:p>
     <w:p/>
@@ -8878,6 +10488,7 @@
         </w:rPr>
         <w:t xml:space="preserve">Base image: </w:t>
       </w:r>
+      <w:proofErr w:type="spellStart"/>
       <w:proofErr w:type="gramStart"/>
       <w:r>
         <w:rPr>
@@ -8885,6 +10496,7 @@
         </w:rPr>
         <w:t>nginx:alpine</w:t>
       </w:r>
+      <w:proofErr w:type="spellEnd"/>
       <w:proofErr w:type="gramEnd"/>
       <w:r>
         <w:rPr>
@@ -8906,7 +10518,21 @@
         <w:rPr>
           <w:color w:val="000000"/>
         </w:rPr>
-        <w:t>The COPY instruction must copy all HTML pages and style.css from the project root into /usr/share/nginx/html/.</w:t>
+        <w:t>The COPY instruction must copy all HTML pages and style.css from the project root into /</w:t>
+      </w:r>
+      <w:proofErr w:type="spellStart"/>
+      <w:r>
+        <w:rPr>
+          <w:color w:val="000000"/>
+        </w:rPr>
+        <w:t>usr</w:t>
+      </w:r>
+      <w:proofErr w:type="spellEnd"/>
+      <w:r>
+        <w:rPr>
+          <w:color w:val="000000"/>
+        </w:rPr>
+        <w:t>/share/nginx/html/.</w:t>
       </w:r>
     </w:p>
     <w:p>
@@ -8954,7 +10580,21 @@
         <w:rPr>
           <w:color w:val="000000"/>
         </w:rPr>
-        <w:t>The Dockerfile must be placed in the repository root (not in a subdirectory).</w:t>
+        <w:t xml:space="preserve">The </w:t>
+      </w:r>
+      <w:proofErr w:type="spellStart"/>
+      <w:r>
+        <w:rPr>
+          <w:color w:val="000000"/>
+        </w:rPr>
+        <w:t>Dockerfile</w:t>
+      </w:r>
+      <w:proofErr w:type="spellEnd"/>
+      <w:r>
+        <w:rPr>
+          <w:color w:val="000000"/>
+        </w:rPr>
+        <w:t xml:space="preserve"> must be placed in the repository root (not in a subdirectory).</w:t>
       </w:r>
     </w:p>
     <w:p/>
@@ -8966,7 +10606,21 @@
         <w:rPr>
           <w:color w:val="000000"/>
         </w:rPr>
-        <w:t>Example minimal Dockerfile:</w:t>
+        <w:t xml:space="preserve">Example minimal </w:t>
+      </w:r>
+      <w:proofErr w:type="spellStart"/>
+      <w:r>
+        <w:rPr>
+          <w:color w:val="000000"/>
+        </w:rPr>
+        <w:t>Dockerfile</w:t>
+      </w:r>
+      <w:proofErr w:type="spellEnd"/>
+      <w:r>
+        <w:rPr>
+          <w:color w:val="000000"/>
+        </w:rPr>
+        <w:t>:</w:t>
       </w:r>
     </w:p>
     <w:p>
@@ -8983,6 +10637,7 @@
         </w:rPr>
         <w:t xml:space="preserve">FROM </w:t>
       </w:r>
+      <w:proofErr w:type="spellStart"/>
       <w:proofErr w:type="gramStart"/>
       <w:r>
         <w:rPr>
@@ -8993,6 +10648,7 @@
         </w:rPr>
         <w:t>nginx:alpine</w:t>
       </w:r>
+      <w:proofErr w:type="spellEnd"/>
       <w:proofErr w:type="gramEnd"/>
     </w:p>
     <w:p>
@@ -9007,14 +10663,9 @@
           <w:sz w:val="20"/>
           <w:szCs w:val="20"/>
         </w:rPr>
-        <w:t>COPY *.html /usr/share/nginx/html/</w:t>
-      </w:r>
-    </w:p>
-    <w:p>
-      <w:pPr>
-        <w:spacing w:before="40" w:after="40"/>
-        <w:ind w:left="720"/>
-      </w:pPr>
+        <w:t>COPY *.html /</w:t>
+      </w:r>
+      <w:proofErr w:type="spellStart"/>
       <w:r>
         <w:rPr>
           <w:rFonts w:ascii="Courier New" w:eastAsia="Courier New" w:hAnsi="Courier New" w:cs="Courier New"/>
@@ -9022,7 +10673,52 @@
           <w:sz w:val="20"/>
           <w:szCs w:val="20"/>
         </w:rPr>
-        <w:t>COPY style.css /usr/share/nginx/html/</w:t>
+        <w:t>usr</w:t>
+      </w:r>
+      <w:proofErr w:type="spellEnd"/>
+      <w:r>
+        <w:rPr>
+          <w:rFonts w:ascii="Courier New" w:eastAsia="Courier New" w:hAnsi="Courier New" w:cs="Courier New"/>
+          <w:color w:val="C7254E"/>
+          <w:sz w:val="20"/>
+          <w:szCs w:val="20"/>
+        </w:rPr>
+        <w:t>/share/nginx/html/</w:t>
+      </w:r>
+    </w:p>
+    <w:p>
+      <w:pPr>
+        <w:spacing w:before="40" w:after="40"/>
+        <w:ind w:left="720"/>
+      </w:pPr>
+      <w:r>
+        <w:rPr>
+          <w:rFonts w:ascii="Courier New" w:eastAsia="Courier New" w:hAnsi="Courier New" w:cs="Courier New"/>
+          <w:color w:val="C7254E"/>
+          <w:sz w:val="20"/>
+          <w:szCs w:val="20"/>
+        </w:rPr>
+        <w:t>COPY style.css /</w:t>
+      </w:r>
+      <w:proofErr w:type="spellStart"/>
+      <w:r>
+        <w:rPr>
+          <w:rFonts w:ascii="Courier New" w:eastAsia="Courier New" w:hAnsi="Courier New" w:cs="Courier New"/>
+          <w:color w:val="C7254E"/>
+          <w:sz w:val="20"/>
+          <w:szCs w:val="20"/>
+        </w:rPr>
+        <w:t>usr</w:t>
+      </w:r>
+      <w:proofErr w:type="spellEnd"/>
+      <w:r>
+        <w:rPr>
+          <w:rFonts w:ascii="Courier New" w:eastAsia="Courier New" w:hAnsi="Courier New" w:cs="Courier New"/>
+          <w:color w:val="C7254E"/>
+          <w:sz w:val="20"/>
+          <w:szCs w:val="20"/>
+        </w:rPr>
+        <w:t>/share/nginx/html/</w:t>
       </w:r>
     </w:p>
     <w:p>
@@ -9053,7 +10749,29 @@
           <w:sz w:val="20"/>
           <w:szCs w:val="20"/>
         </w:rPr>
-        <w:t>Reference – Docker Official nginx Image: https://hub.docker.com/_/nginx | Dockerfile Reference: https://docs.docker.com/reference/dockerfile/</w:t>
+        <w:t xml:space="preserve">Reference – Docker Official nginx Image: https://hub.docker.com/_/nginx | </w:t>
+      </w:r>
+      <w:proofErr w:type="spellStart"/>
+      <w:r>
+        <w:rPr>
+          <w:i/>
+          <w:iCs/>
+          <w:color w:val="595959"/>
+          <w:sz w:val="20"/>
+          <w:szCs w:val="20"/>
+        </w:rPr>
+        <w:t>Dockerfile</w:t>
+      </w:r>
+      <w:proofErr w:type="spellEnd"/>
+      <w:r>
+        <w:rPr>
+          <w:i/>
+          <w:iCs/>
+          <w:color w:val="595959"/>
+          <w:sz w:val="20"/>
+          <w:szCs w:val="20"/>
+        </w:rPr>
+        <w:t xml:space="preserve"> Reference: https://docs.docker.com/reference/dockerfile/</w:t>
       </w:r>
     </w:p>
     <w:p/>
@@ -9122,7 +10840,35 @@
         <w:rPr>
           <w:color w:val="000000"/>
         </w:rPr>
-        <w:t>All pages must link to the shared style.css using: &lt;link rel="stylesheet" href="style.css"&gt;</w:t>
+        <w:t xml:space="preserve">All pages must link to the shared style.css using: &lt;link </w:t>
+      </w:r>
+      <w:proofErr w:type="spellStart"/>
+      <w:r>
+        <w:rPr>
+          <w:color w:val="000000"/>
+        </w:rPr>
+        <w:t>rel</w:t>
+      </w:r>
+      <w:proofErr w:type="spellEnd"/>
+      <w:r>
+        <w:rPr>
+          <w:color w:val="000000"/>
+        </w:rPr>
+        <w:t xml:space="preserve">="stylesheet" </w:t>
+      </w:r>
+      <w:proofErr w:type="spellStart"/>
+      <w:r>
+        <w:rPr>
+          <w:color w:val="000000"/>
+        </w:rPr>
+        <w:t>href</w:t>
+      </w:r>
+      <w:proofErr w:type="spellEnd"/>
+      <w:r>
+        <w:rPr>
+          <w:color w:val="000000"/>
+        </w:rPr>
+        <w:t>="style.css"&gt;</w:t>
       </w:r>
     </w:p>
     <w:p>
@@ -9170,7 +10916,35 @@
         <w:rPr>
           <w:color w:val="000000"/>
         </w:rPr>
-        <w:t>No JavaScript: &lt;script&gt; tags, inline event handlers (onclick, onsubmit, etc.), and external .js file links are strictly prohibited.</w:t>
+        <w:t xml:space="preserve">No JavaScript: &lt;script&gt; tags, inline event handlers (onclick, </w:t>
+      </w:r>
+      <w:proofErr w:type="spellStart"/>
+      <w:r>
+        <w:rPr>
+          <w:color w:val="000000"/>
+        </w:rPr>
+        <w:t>onsubmit</w:t>
+      </w:r>
+      <w:proofErr w:type="spellEnd"/>
+      <w:r>
+        <w:rPr>
+          <w:color w:val="000000"/>
+        </w:rPr>
+        <w:t>, etc.), and external .</w:t>
+      </w:r>
+      <w:proofErr w:type="spellStart"/>
+      <w:r>
+        <w:rPr>
+          <w:color w:val="000000"/>
+        </w:rPr>
+        <w:t>js</w:t>
+      </w:r>
+      <w:proofErr w:type="spellEnd"/>
+      <w:r>
+        <w:rPr>
+          <w:color w:val="000000"/>
+        </w:rPr>
+        <w:t xml:space="preserve"> file links are strictly prohibited.</w:t>
       </w:r>
     </w:p>
     <w:p>
@@ -9186,7 +10960,35 @@
         <w:rPr>
           <w:color w:val="000000"/>
         </w:rPr>
-        <w:t>All images must use HTML &lt;figure&gt; and &lt;figcaption&gt; elements with descriptive alt attributes. Actual image files are optional; a styled empty &lt;div class="img-placeholder"&gt; with a descriptive label inside is acceptable.</w:t>
+        <w:t>All images must use HTML &lt;figure&gt; and &lt;</w:t>
+      </w:r>
+      <w:proofErr w:type="spellStart"/>
+      <w:r>
+        <w:rPr>
+          <w:color w:val="000000"/>
+        </w:rPr>
+        <w:t>figcaption</w:t>
+      </w:r>
+      <w:proofErr w:type="spellEnd"/>
+      <w:r>
+        <w:rPr>
+          <w:color w:val="000000"/>
+        </w:rPr>
+        <w:t>&gt; elements with descriptive alt attributes. Actual image files are optional; a styled empty &lt;div class="</w:t>
+      </w:r>
+      <w:proofErr w:type="spellStart"/>
+      <w:r>
+        <w:rPr>
+          <w:color w:val="000000"/>
+        </w:rPr>
+        <w:t>img</w:t>
+      </w:r>
+      <w:proofErr w:type="spellEnd"/>
+      <w:r>
+        <w:rPr>
+          <w:color w:val="000000"/>
+        </w:rPr>
+        <w:t>-placeholder"&gt; with a descriptive label inside is acceptable.</w:t>
       </w:r>
     </w:p>
     <w:p>
@@ -9256,7 +11058,21 @@
         <w:rPr>
           <w:color w:val="000000"/>
         </w:rPr>
-        <w:t xml:space="preserve">Define a consistent colour palette using CSS custom properties (CSS variables) </w:t>
+        <w:t xml:space="preserve">Define a consistent </w:t>
+      </w:r>
+      <w:proofErr w:type="spellStart"/>
+      <w:r>
+        <w:rPr>
+          <w:color w:val="000000"/>
+        </w:rPr>
+        <w:t>colour</w:t>
+      </w:r>
+      <w:proofErr w:type="spellEnd"/>
+      <w:r>
+        <w:rPr>
+          <w:color w:val="000000"/>
+        </w:rPr>
+        <w:t xml:space="preserve"> palette using CSS custom properties (CSS variables) </w:t>
       </w:r>
       <w:proofErr w:type="gramStart"/>
       <w:r>
@@ -9286,7 +11102,21 @@
         <w:rPr>
           <w:color w:val="000000"/>
         </w:rPr>
-        <w:t>Provide base styles for: body, h1–h3, p, a, nav, ul/li, table, th, td, footer.</w:t>
+        <w:t xml:space="preserve">Provide base styles for: body, h1–h3, p, a, nav, ul/li, table, </w:t>
+      </w:r>
+      <w:proofErr w:type="spellStart"/>
+      <w:r>
+        <w:rPr>
+          <w:color w:val="000000"/>
+        </w:rPr>
+        <w:t>th</w:t>
+      </w:r>
+      <w:proofErr w:type="spellEnd"/>
+      <w:r>
+        <w:rPr>
+          <w:color w:val="000000"/>
+        </w:rPr>
+        <w:t>, td, footer.</w:t>
       </w:r>
     </w:p>
     <w:p>
@@ -9318,7 +11148,35 @@
         <w:rPr>
           <w:color w:val="000000"/>
         </w:rPr>
-        <w:t>Provide a .img-placeholder class that renders an empty box (e.g., 200px × 150px, with a border and background colour) as a stand-in for actual images.</w:t>
+        <w:t>Provide a .</w:t>
+      </w:r>
+      <w:proofErr w:type="spellStart"/>
+      <w:r>
+        <w:rPr>
+          <w:color w:val="000000"/>
+        </w:rPr>
+        <w:t>img</w:t>
+      </w:r>
+      <w:proofErr w:type="spellEnd"/>
+      <w:r>
+        <w:rPr>
+          <w:color w:val="000000"/>
+        </w:rPr>
+        <w:t xml:space="preserve">-placeholder class that renders an empty box (e.g., 200px × 150px, with a border and background </w:t>
+      </w:r>
+      <w:proofErr w:type="spellStart"/>
+      <w:r>
+        <w:rPr>
+          <w:color w:val="000000"/>
+        </w:rPr>
+        <w:t>colour</w:t>
+      </w:r>
+      <w:proofErr w:type="spellEnd"/>
+      <w:r>
+        <w:rPr>
+          <w:color w:val="000000"/>
+        </w:rPr>
+        <w:t>) as a stand-in for actual images.</w:t>
       </w:r>
     </w:p>
     <w:p>
@@ -9585,8 +11443,20 @@
                 <w:sz w:val="20"/>
                 <w:szCs w:val="20"/>
               </w:rPr>
-              <w:t>ci-dev.yml</w:t>
-            </w:r>
+              <w:t>ci-</w:t>
+            </w:r>
+            <w:proofErr w:type="spellStart"/>
+            <w:r>
+              <w:rPr>
+                <w:b/>
+                <w:bCs/>
+                <w:color w:val="000000"/>
+                <w:sz w:val="20"/>
+                <w:szCs w:val="20"/>
+              </w:rPr>
+              <w:t>dev.yml</w:t>
+            </w:r>
+            <w:proofErr w:type="spellEnd"/>
           </w:p>
         </w:tc>
         <w:tc>
@@ -9608,13 +11478,23 @@
             <w:vAlign w:val="center"/>
           </w:tcPr>
           <w:p>
-            <w:r>
-              <w:rPr>
-                <w:color w:val="000000"/>
-                <w:sz w:val="20"/>
-                <w:szCs w:val="20"/>
-              </w:rPr>
-              <w:t>pull_request → develop</w:t>
+            <w:proofErr w:type="spellStart"/>
+            <w:r>
+              <w:rPr>
+                <w:color w:val="000000"/>
+                <w:sz w:val="20"/>
+                <w:szCs w:val="20"/>
+              </w:rPr>
+              <w:t>pull_request</w:t>
+            </w:r>
+            <w:proofErr w:type="spellEnd"/>
+            <w:r>
+              <w:rPr>
+                <w:color w:val="000000"/>
+                <w:sz w:val="20"/>
+                <w:szCs w:val="20"/>
+              </w:rPr>
+              <w:t xml:space="preserve"> → develop</w:t>
             </w:r>
           </w:p>
         </w:tc>
@@ -9690,7 +11570,25 @@
                 <w:sz w:val="20"/>
                 <w:szCs w:val="20"/>
               </w:rPr>
-              <w:t>-latest, :dev-&lt;sha&gt;) → Push to Docker Hub</w:t>
+              <w:t>-latest</w:t>
+            </w:r>
+            <w:proofErr w:type="gramStart"/>
+            <w:r>
+              <w:rPr>
+                <w:color w:val="000000"/>
+                <w:sz w:val="20"/>
+                <w:szCs w:val="20"/>
+              </w:rPr>
+              <w:t>, :dev</w:t>
+            </w:r>
+            <w:proofErr w:type="gramEnd"/>
+            <w:r>
+              <w:rPr>
+                <w:color w:val="000000"/>
+                <w:sz w:val="20"/>
+                <w:szCs w:val="20"/>
+              </w:rPr>
+              <w:t>-&lt;sha&gt;) → Push to Docker Hub</w:t>
             </w:r>
           </w:p>
         </w:tc>
@@ -9723,8 +11621,20 @@
                 <w:sz w:val="20"/>
                 <w:szCs w:val="20"/>
               </w:rPr>
-              <w:t>cd-dev.yml</w:t>
-            </w:r>
+              <w:t>cd-</w:t>
+            </w:r>
+            <w:proofErr w:type="spellStart"/>
+            <w:r>
+              <w:rPr>
+                <w:b/>
+                <w:bCs/>
+                <w:color w:val="000000"/>
+                <w:sz w:val="20"/>
+                <w:szCs w:val="20"/>
+              </w:rPr>
+              <w:t>dev.yml</w:t>
+            </w:r>
+            <w:proofErr w:type="spellEnd"/>
           </w:p>
         </w:tc>
         <w:tc>
@@ -9843,8 +11753,20 @@
                 <w:sz w:val="20"/>
                 <w:szCs w:val="20"/>
               </w:rPr>
-              <w:t>ci-staging.yml</w:t>
-            </w:r>
+              <w:t>ci-</w:t>
+            </w:r>
+            <w:proofErr w:type="spellStart"/>
+            <w:r>
+              <w:rPr>
+                <w:b/>
+                <w:bCs/>
+                <w:color w:val="000000"/>
+                <w:sz w:val="20"/>
+                <w:szCs w:val="20"/>
+              </w:rPr>
+              <w:t>staging.yml</w:t>
+            </w:r>
+            <w:proofErr w:type="spellEnd"/>
           </w:p>
         </w:tc>
         <w:tc>
@@ -9866,13 +11788,23 @@
             <w:vAlign w:val="center"/>
           </w:tcPr>
           <w:p>
-            <w:r>
-              <w:rPr>
-                <w:color w:val="000000"/>
-                <w:sz w:val="20"/>
-                <w:szCs w:val="20"/>
-              </w:rPr>
-              <w:t>pull_request → staging</w:t>
+            <w:proofErr w:type="spellStart"/>
+            <w:r>
+              <w:rPr>
+                <w:color w:val="000000"/>
+                <w:sz w:val="20"/>
+                <w:szCs w:val="20"/>
+              </w:rPr>
+              <w:t>pull_request</w:t>
+            </w:r>
+            <w:proofErr w:type="spellEnd"/>
+            <w:r>
+              <w:rPr>
+                <w:color w:val="000000"/>
+                <w:sz w:val="20"/>
+                <w:szCs w:val="20"/>
+              </w:rPr>
+              <w:t xml:space="preserve"> → staging</w:t>
             </w:r>
           </w:p>
         </w:tc>
@@ -9948,7 +11880,25 @@
                 <w:sz w:val="20"/>
                 <w:szCs w:val="20"/>
               </w:rPr>
-              <w:t>-latest, :staging-&lt;sha&gt;) → Push to Docker Hub</w:t>
+              <w:t>-latest</w:t>
+            </w:r>
+            <w:proofErr w:type="gramStart"/>
+            <w:r>
+              <w:rPr>
+                <w:color w:val="000000"/>
+                <w:sz w:val="20"/>
+                <w:szCs w:val="20"/>
+              </w:rPr>
+              <w:t>, :staging</w:t>
+            </w:r>
+            <w:proofErr w:type="gramEnd"/>
+            <w:r>
+              <w:rPr>
+                <w:color w:val="000000"/>
+                <w:sz w:val="20"/>
+                <w:szCs w:val="20"/>
+              </w:rPr>
+              <w:t>-&lt;sha&gt;) → Push to Docker Hub</w:t>
             </w:r>
           </w:p>
         </w:tc>
@@ -9981,8 +11931,20 @@
                 <w:sz w:val="20"/>
                 <w:szCs w:val="20"/>
               </w:rPr>
-              <w:t>cd-staging.yml</w:t>
-            </w:r>
+              <w:t>cd-</w:t>
+            </w:r>
+            <w:proofErr w:type="spellStart"/>
+            <w:r>
+              <w:rPr>
+                <w:b/>
+                <w:bCs/>
+                <w:color w:val="000000"/>
+                <w:sz w:val="20"/>
+                <w:szCs w:val="20"/>
+              </w:rPr>
+              <w:t>staging.yml</w:t>
+            </w:r>
+            <w:proofErr w:type="spellEnd"/>
           </w:p>
         </w:tc>
         <w:tc>
@@ -10101,8 +12063,20 @@
                 <w:sz w:val="20"/>
                 <w:szCs w:val="20"/>
               </w:rPr>
-              <w:t>ci-prod.yml</w:t>
-            </w:r>
+              <w:t>ci-</w:t>
+            </w:r>
+            <w:proofErr w:type="spellStart"/>
+            <w:r>
+              <w:rPr>
+                <w:b/>
+                <w:bCs/>
+                <w:color w:val="000000"/>
+                <w:sz w:val="20"/>
+                <w:szCs w:val="20"/>
+              </w:rPr>
+              <w:t>prod.yml</w:t>
+            </w:r>
+            <w:proofErr w:type="spellEnd"/>
           </w:p>
         </w:tc>
         <w:tc>
@@ -10124,13 +12098,23 @@
             <w:vAlign w:val="center"/>
           </w:tcPr>
           <w:p>
-            <w:r>
-              <w:rPr>
-                <w:color w:val="000000"/>
-                <w:sz w:val="20"/>
-                <w:szCs w:val="20"/>
-              </w:rPr>
-              <w:t>pull_request → main</w:t>
+            <w:proofErr w:type="spellStart"/>
+            <w:r>
+              <w:rPr>
+                <w:color w:val="000000"/>
+                <w:sz w:val="20"/>
+                <w:szCs w:val="20"/>
+              </w:rPr>
+              <w:t>pull_request</w:t>
+            </w:r>
+            <w:proofErr w:type="spellEnd"/>
+            <w:r>
+              <w:rPr>
+                <w:color w:val="000000"/>
+                <w:sz w:val="20"/>
+                <w:szCs w:val="20"/>
+              </w:rPr>
+              <w:t xml:space="preserve"> → main</w:t>
             </w:r>
           </w:p>
         </w:tc>
@@ -10206,7 +12190,25 @@
                 <w:sz w:val="20"/>
                 <w:szCs w:val="20"/>
               </w:rPr>
-              <w:t>-latest, :prod-&lt;sha&gt;) → Push to Docker Hub</w:t>
+              <w:t>-latest</w:t>
+            </w:r>
+            <w:proofErr w:type="gramStart"/>
+            <w:r>
+              <w:rPr>
+                <w:color w:val="000000"/>
+                <w:sz w:val="20"/>
+                <w:szCs w:val="20"/>
+              </w:rPr>
+              <w:t>, :prod</w:t>
+            </w:r>
+            <w:proofErr w:type="gramEnd"/>
+            <w:r>
+              <w:rPr>
+                <w:color w:val="000000"/>
+                <w:sz w:val="20"/>
+                <w:szCs w:val="20"/>
+              </w:rPr>
+              <w:t>-&lt;sha&gt;) → Push to Docker Hub</w:t>
             </w:r>
           </w:p>
         </w:tc>
@@ -10239,8 +12241,20 @@
                 <w:sz w:val="20"/>
                 <w:szCs w:val="20"/>
               </w:rPr>
-              <w:t>cd-prod.yml</w:t>
-            </w:r>
+              <w:t>cd-</w:t>
+            </w:r>
+            <w:proofErr w:type="spellStart"/>
+            <w:r>
+              <w:rPr>
+                <w:b/>
+                <w:bCs/>
+                <w:color w:val="000000"/>
+                <w:sz w:val="20"/>
+                <w:szCs w:val="20"/>
+              </w:rPr>
+              <w:t>prod.yml</w:t>
+            </w:r>
+            <w:proofErr w:type="spellEnd"/>
           </w:p>
         </w:tc>
         <w:tc>
@@ -10379,7 +12393,21 @@
         <w:rPr>
           <w:color w:val="000000"/>
         </w:rPr>
-        <w:t>Create a new GitHub repository from scratch (pakvista-cicd or team-agreed name). Do NOT reuse any previous repository.</w:t>
+        <w:t>Create a new GitHub repository from scratch (</w:t>
+      </w:r>
+      <w:proofErr w:type="spellStart"/>
+      <w:r>
+        <w:rPr>
+          <w:color w:val="000000"/>
+        </w:rPr>
+        <w:t>pakvista-cicd</w:t>
+      </w:r>
+      <w:proofErr w:type="spellEnd"/>
+      <w:r>
+        <w:rPr>
+          <w:color w:val="000000"/>
+        </w:rPr>
+        <w:t xml:space="preserve"> or team-agreed name). Do NOT reuse any previous repository.</w:t>
       </w:r>
     </w:p>
     <w:p>
@@ -10395,21 +12423,7 @@
         <w:rPr>
           <w:color w:val="000000"/>
         </w:rPr>
-        <w:t xml:space="preserve">Establish the branching strategy: create develop, staging, and main branches. Set </w:t>
-      </w:r>
-      <w:proofErr w:type="gramStart"/>
-      <w:r>
-        <w:rPr>
-          <w:color w:val="000000"/>
-        </w:rPr>
-        <w:t>develop</w:t>
-      </w:r>
-      <w:proofErr w:type="gramEnd"/>
-      <w:r>
-        <w:rPr>
-          <w:color w:val="000000"/>
-        </w:rPr>
-        <w:t xml:space="preserve"> as default.</w:t>
+        <w:t>Establish the branching strategy: create develop, staging, and main branches. Set develop as default.</w:t>
       </w:r>
     </w:p>
     <w:p>
@@ -10457,7 +12471,49 @@
         <w:rPr>
           <w:color w:val="000000"/>
         </w:rPr>
-        <w:t>Create three Render Web Services (pakvista-dev, pakvista-staging, pakvista-prod) each connected to the TL's Docker Hub image. Copy each deploy hook URL and store it in the correct GitHub Environment secret.</w:t>
+        <w:t>Create three Render Web Services (</w:t>
+      </w:r>
+      <w:proofErr w:type="spellStart"/>
+      <w:r>
+        <w:rPr>
+          <w:color w:val="000000"/>
+        </w:rPr>
+        <w:t>pakvista</w:t>
+      </w:r>
+      <w:proofErr w:type="spellEnd"/>
+      <w:r>
+        <w:rPr>
+          <w:color w:val="000000"/>
+        </w:rPr>
+        <w:t xml:space="preserve">-dev, </w:t>
+      </w:r>
+      <w:proofErr w:type="spellStart"/>
+      <w:r>
+        <w:rPr>
+          <w:color w:val="000000"/>
+        </w:rPr>
+        <w:t>pakvista</w:t>
+      </w:r>
+      <w:proofErr w:type="spellEnd"/>
+      <w:r>
+        <w:rPr>
+          <w:color w:val="000000"/>
+        </w:rPr>
+        <w:t xml:space="preserve">-staging, </w:t>
+      </w:r>
+      <w:proofErr w:type="spellStart"/>
+      <w:r>
+        <w:rPr>
+          <w:color w:val="000000"/>
+        </w:rPr>
+        <w:t>pakvista</w:t>
+      </w:r>
+      <w:proofErr w:type="spellEnd"/>
+      <w:r>
+        <w:rPr>
+          <w:color w:val="000000"/>
+        </w:rPr>
+        <w:t>-prod) each connected to the TL's Docker Hub image. Copy each deploy hook URL and store it in the correct GitHub Environment secret.</w:t>
       </w:r>
     </w:p>
     <w:p>
@@ -10489,7 +12545,21 @@
         <w:rPr>
           <w:color w:val="000000"/>
         </w:rPr>
-        <w:t>Set up the initial repository structure: commit style.css, the Dockerfile, and a skeleton index.html (Home / Welcome page).</w:t>
+        <w:t xml:space="preserve">Set up the initial repository structure: commit style.css, the </w:t>
+      </w:r>
+      <w:proofErr w:type="spellStart"/>
+      <w:r>
+        <w:rPr>
+          <w:color w:val="000000"/>
+        </w:rPr>
+        <w:t>Dockerfile</w:t>
+      </w:r>
+      <w:proofErr w:type="spellEnd"/>
+      <w:r>
+        <w:rPr>
+          <w:color w:val="000000"/>
+        </w:rPr>
+        <w:t>, and a skeleton index.html (Home / Welcome page).</w:t>
       </w:r>
     </w:p>
     <w:p>
@@ -10582,7 +12652,21 @@
         <w:rPr>
           <w:color w:val="000000"/>
         </w:rPr>
-        <w:t>Create a personal feature branch from develop using the convention: feature/&lt;github-username&gt;/&lt;page-name&gt;.</w:t>
+        <w:t>Create a personal feature branch from develop using the convention: feature/&lt;</w:t>
+      </w:r>
+      <w:proofErr w:type="spellStart"/>
+      <w:r>
+        <w:rPr>
+          <w:color w:val="000000"/>
+        </w:rPr>
+        <w:t>github</w:t>
+      </w:r>
+      <w:proofErr w:type="spellEnd"/>
+      <w:r>
+        <w:rPr>
+          <w:color w:val="000000"/>
+        </w:rPr>
+        <w:t>-username&gt;/&lt;page-name&gt;.</w:t>
       </w:r>
     </w:p>
     <w:p>
@@ -10621,8 +12705,16 @@
         <w:rPr>
           <w:color w:val="000000"/>
         </w:rPr>
-        <w:t>in .github</w:t>
-      </w:r>
+        <w:t>in .</w:t>
+      </w:r>
+      <w:proofErr w:type="spellStart"/>
+      <w:r>
+        <w:rPr>
+          <w:color w:val="000000"/>
+        </w:rPr>
+        <w:t>github</w:t>
+      </w:r>
+      <w:proofErr w:type="spellEnd"/>
       <w:proofErr w:type="gramEnd"/>
       <w:r>
         <w:rPr>
@@ -10660,7 +12752,21 @@
         <w:rPr>
           <w:color w:val="000000"/>
         </w:rPr>
-        <w:t>Open a Pull Request targeting the develop branch with a meaningful PR description. Verify the CI workflow (ci-dev.yml) fires and all steps pass.</w:t>
+        <w:t>Open a Pull Request targeting the develop branch with a meaningful PR description. Verify the CI workflow (ci-</w:t>
+      </w:r>
+      <w:proofErr w:type="spellStart"/>
+      <w:r>
+        <w:rPr>
+          <w:color w:val="000000"/>
+        </w:rPr>
+        <w:t>dev.yml</w:t>
+      </w:r>
+      <w:proofErr w:type="spellEnd"/>
+      <w:r>
+        <w:rPr>
+          <w:color w:val="000000"/>
+        </w:rPr>
+        <w:t>) fires and all steps pass.</w:t>
       </w:r>
     </w:p>
     <w:p>
@@ -10676,7 +12782,21 @@
         <w:rPr>
           <w:color w:val="000000"/>
         </w:rPr>
-        <w:t>After the Team Lead reviews and approves the PR, confirm the PR is merged and the CD workflow (cd-dev.yml) fires automatically.</w:t>
+        <w:t>After the Team Lead reviews and approves the PR, confirm the PR is merged and the CD workflow (cd-</w:t>
+      </w:r>
+      <w:proofErr w:type="spellStart"/>
+      <w:r>
+        <w:rPr>
+          <w:color w:val="000000"/>
+        </w:rPr>
+        <w:t>dev.yml</w:t>
+      </w:r>
+      <w:proofErr w:type="spellEnd"/>
+      <w:r>
+        <w:rPr>
+          <w:color w:val="000000"/>
+        </w:rPr>
+        <w:t>) fires automatically.</w:t>
       </w:r>
     </w:p>
     <w:p>
@@ -10692,7 +12812,21 @@
         <w:rPr>
           <w:color w:val="000000"/>
         </w:rPr>
-        <w:t>Verify the live PakVista Development site on Render reflects the newly added page.</w:t>
+        <w:t xml:space="preserve">Verify the live </w:t>
+      </w:r>
+      <w:proofErr w:type="spellStart"/>
+      <w:r>
+        <w:rPr>
+          <w:color w:val="000000"/>
+        </w:rPr>
+        <w:t>PakVista</w:t>
+      </w:r>
+      <w:proofErr w:type="spellEnd"/>
+      <w:r>
+        <w:rPr>
+          <w:color w:val="000000"/>
+        </w:rPr>
+        <w:t xml:space="preserve"> Development site on Render reflects the newly added page.</w:t>
       </w:r>
     </w:p>
     <w:p>
@@ -11020,7 +13154,25 @@
                 <w:sz w:val="20"/>
                 <w:szCs w:val="20"/>
               </w:rPr>
-              <w:t>Create a new GitHub repository from scratch (pakvista-cicd or team-agreed name). Do NOT reuse any previous assignment repository.</w:t>
+              <w:t>Create a new GitHub repository from scratch (</w:t>
+            </w:r>
+            <w:proofErr w:type="spellStart"/>
+            <w:r>
+              <w:rPr>
+                <w:color w:val="000000"/>
+                <w:sz w:val="20"/>
+                <w:szCs w:val="20"/>
+              </w:rPr>
+              <w:t>pakvista-cicd</w:t>
+            </w:r>
+            <w:proofErr w:type="spellEnd"/>
+            <w:r>
+              <w:rPr>
+                <w:color w:val="000000"/>
+                <w:sz w:val="20"/>
+                <w:szCs w:val="20"/>
+              </w:rPr>
+              <w:t xml:space="preserve"> or team-agreed name). Do NOT reuse any previous assignment repository.</w:t>
             </w:r>
           </w:p>
         </w:tc>
@@ -11928,25 +14080,7 @@
                 <w:sz w:val="20"/>
                 <w:szCs w:val="20"/>
               </w:rPr>
-              <w:t xml:space="preserve">Each member opens a PR targeting </w:t>
-            </w:r>
-            <w:proofErr w:type="gramStart"/>
-            <w:r>
-              <w:rPr>
-                <w:color w:val="000000"/>
-                <w:sz w:val="20"/>
-                <w:szCs w:val="20"/>
-              </w:rPr>
-              <w:t>develop</w:t>
-            </w:r>
-            <w:proofErr w:type="gramEnd"/>
-            <w:r>
-              <w:rPr>
-                <w:color w:val="000000"/>
-                <w:sz w:val="20"/>
-                <w:szCs w:val="20"/>
-              </w:rPr>
-              <w:t xml:space="preserve"> with a meaningful description; CI passes before merge. </w:t>
+              <w:t xml:space="preserve">Each member opens a PR targeting develop with a meaningful description; CI passes before merge. </w:t>
             </w:r>
           </w:p>
         </w:tc>
@@ -12109,7 +14243,43 @@
                 <w:sz w:val="20"/>
                 <w:szCs w:val="20"/>
               </w:rPr>
-              <w:t xml:space="preserve">ci-dev.yml: correct pull_request trigger targeting </w:t>
+              <w:t>ci-</w:t>
+            </w:r>
+            <w:proofErr w:type="spellStart"/>
+            <w:r>
+              <w:rPr>
+                <w:color w:val="000000"/>
+                <w:sz w:val="20"/>
+                <w:szCs w:val="20"/>
+              </w:rPr>
+              <w:t>dev.yml</w:t>
+            </w:r>
+            <w:proofErr w:type="spellEnd"/>
+            <w:r>
+              <w:rPr>
+                <w:color w:val="000000"/>
+                <w:sz w:val="20"/>
+                <w:szCs w:val="20"/>
+              </w:rPr>
+              <w:t xml:space="preserve">: correct </w:t>
+            </w:r>
+            <w:proofErr w:type="spellStart"/>
+            <w:r>
+              <w:rPr>
+                <w:color w:val="000000"/>
+                <w:sz w:val="20"/>
+                <w:szCs w:val="20"/>
+              </w:rPr>
+              <w:t>pull_request</w:t>
+            </w:r>
+            <w:proofErr w:type="spellEnd"/>
+            <w:r>
+              <w:rPr>
+                <w:color w:val="000000"/>
+                <w:sz w:val="20"/>
+                <w:szCs w:val="20"/>
+              </w:rPr>
+              <w:t xml:space="preserve"> trigger targeting </w:t>
             </w:r>
             <w:proofErr w:type="gramStart"/>
             <w:r>
@@ -12224,7 +14394,43 @@
                 <w:sz w:val="20"/>
                 <w:szCs w:val="20"/>
               </w:rPr>
-              <w:t xml:space="preserve">ci-staging.yml: correct pull_request trigger targeting staging, environment-specific image tags </w:t>
+              <w:t>ci-</w:t>
+            </w:r>
+            <w:proofErr w:type="spellStart"/>
+            <w:r>
+              <w:rPr>
+                <w:color w:val="000000"/>
+                <w:sz w:val="20"/>
+                <w:szCs w:val="20"/>
+              </w:rPr>
+              <w:t>staging.yml</w:t>
+            </w:r>
+            <w:proofErr w:type="spellEnd"/>
+            <w:r>
+              <w:rPr>
+                <w:color w:val="000000"/>
+                <w:sz w:val="20"/>
+                <w:szCs w:val="20"/>
+              </w:rPr>
+              <w:t xml:space="preserve">: correct </w:t>
+            </w:r>
+            <w:proofErr w:type="spellStart"/>
+            <w:r>
+              <w:rPr>
+                <w:color w:val="000000"/>
+                <w:sz w:val="20"/>
+                <w:szCs w:val="20"/>
+              </w:rPr>
+              <w:t>pull_request</w:t>
+            </w:r>
+            <w:proofErr w:type="spellEnd"/>
+            <w:r>
+              <w:rPr>
+                <w:color w:val="000000"/>
+                <w:sz w:val="20"/>
+                <w:szCs w:val="20"/>
+              </w:rPr>
+              <w:t xml:space="preserve"> trigger targeting staging, environment-specific image tags </w:t>
             </w:r>
             <w:proofErr w:type="gramStart"/>
             <w:r>
@@ -12242,7 +14448,25 @@
                 <w:sz w:val="20"/>
                 <w:szCs w:val="20"/>
               </w:rPr>
-              <w:t>-latest, :staging-&lt;sha&gt;), push to Docker Hub succeeds.</w:t>
+              <w:t>-latest</w:t>
+            </w:r>
+            <w:proofErr w:type="gramStart"/>
+            <w:r>
+              <w:rPr>
+                <w:color w:val="000000"/>
+                <w:sz w:val="20"/>
+                <w:szCs w:val="20"/>
+              </w:rPr>
+              <w:t>, :staging</w:t>
+            </w:r>
+            <w:proofErr w:type="gramEnd"/>
+            <w:r>
+              <w:rPr>
+                <w:color w:val="000000"/>
+                <w:sz w:val="20"/>
+                <w:szCs w:val="20"/>
+              </w:rPr>
+              <w:t>-&lt;sha&gt;), push to Docker Hub succeeds.</w:t>
             </w:r>
           </w:p>
         </w:tc>
@@ -12339,7 +14563,43 @@
                 <w:sz w:val="20"/>
                 <w:szCs w:val="20"/>
               </w:rPr>
-              <w:t xml:space="preserve">ci-prod.yml: correct pull_request trigger targeting main, environment-specific image tags </w:t>
+              <w:t>ci-</w:t>
+            </w:r>
+            <w:proofErr w:type="spellStart"/>
+            <w:r>
+              <w:rPr>
+                <w:color w:val="000000"/>
+                <w:sz w:val="20"/>
+                <w:szCs w:val="20"/>
+              </w:rPr>
+              <w:t>prod.yml</w:t>
+            </w:r>
+            <w:proofErr w:type="spellEnd"/>
+            <w:r>
+              <w:rPr>
+                <w:color w:val="000000"/>
+                <w:sz w:val="20"/>
+                <w:szCs w:val="20"/>
+              </w:rPr>
+              <w:t xml:space="preserve">: correct </w:t>
+            </w:r>
+            <w:proofErr w:type="spellStart"/>
+            <w:r>
+              <w:rPr>
+                <w:color w:val="000000"/>
+                <w:sz w:val="20"/>
+                <w:szCs w:val="20"/>
+              </w:rPr>
+              <w:t>pull_request</w:t>
+            </w:r>
+            <w:proofErr w:type="spellEnd"/>
+            <w:r>
+              <w:rPr>
+                <w:color w:val="000000"/>
+                <w:sz w:val="20"/>
+                <w:szCs w:val="20"/>
+              </w:rPr>
+              <w:t xml:space="preserve"> trigger targeting main, environment-specific image tags </w:t>
             </w:r>
             <w:proofErr w:type="gramStart"/>
             <w:r>
@@ -12357,7 +14617,25 @@
                 <w:sz w:val="20"/>
                 <w:szCs w:val="20"/>
               </w:rPr>
-              <w:t>-latest, :prod-&lt;sha&gt;), push to Docker Hub succeeds.</w:t>
+              <w:t>-latest</w:t>
+            </w:r>
+            <w:proofErr w:type="gramStart"/>
+            <w:r>
+              <w:rPr>
+                <w:color w:val="000000"/>
+                <w:sz w:val="20"/>
+                <w:szCs w:val="20"/>
+              </w:rPr>
+              <w:t>, :prod</w:t>
+            </w:r>
+            <w:proofErr w:type="gramEnd"/>
+            <w:r>
+              <w:rPr>
+                <w:color w:val="000000"/>
+                <w:sz w:val="20"/>
+                <w:szCs w:val="20"/>
+              </w:rPr>
+              <w:t>-&lt;sha&gt;), push to Docker Hub succeeds.</w:t>
             </w:r>
           </w:p>
         </w:tc>
@@ -12520,7 +14798,25 @@
                 <w:sz w:val="20"/>
                 <w:szCs w:val="20"/>
               </w:rPr>
-              <w:t>cd-dev.yml: correct push trigger on develop, declares environment: development, curl POST to RENDER_DEPLOY_HOOK_DEV_URL, echo confirmation.</w:t>
+              <w:t>cd-</w:t>
+            </w:r>
+            <w:proofErr w:type="spellStart"/>
+            <w:r>
+              <w:rPr>
+                <w:color w:val="000000"/>
+                <w:sz w:val="20"/>
+                <w:szCs w:val="20"/>
+              </w:rPr>
+              <w:t>dev.yml</w:t>
+            </w:r>
+            <w:proofErr w:type="spellEnd"/>
+            <w:r>
+              <w:rPr>
+                <w:color w:val="000000"/>
+                <w:sz w:val="20"/>
+                <w:szCs w:val="20"/>
+              </w:rPr>
+              <w:t>: correct push trigger on develop, declares environment: development, curl POST to RENDER_DEPLOY_HOOK_DEV_URL, echo confirmation.</w:t>
             </w:r>
           </w:p>
         </w:tc>
@@ -12618,7 +14914,25 @@
                 <w:sz w:val="20"/>
                 <w:szCs w:val="20"/>
               </w:rPr>
-              <w:t>cd-staging.yml: correct push trigger on staging, declares environment: staging, curl POST to RENDER_DEPLOY_HOOK_STAGING_URL, echo confirmation.</w:t>
+              <w:t>cd-</w:t>
+            </w:r>
+            <w:proofErr w:type="spellStart"/>
+            <w:r>
+              <w:rPr>
+                <w:color w:val="000000"/>
+                <w:sz w:val="20"/>
+                <w:szCs w:val="20"/>
+              </w:rPr>
+              <w:t>staging.yml</w:t>
+            </w:r>
+            <w:proofErr w:type="spellEnd"/>
+            <w:r>
+              <w:rPr>
+                <w:color w:val="000000"/>
+                <w:sz w:val="20"/>
+                <w:szCs w:val="20"/>
+              </w:rPr>
+              <w:t>: correct push trigger on staging, declares environment: staging, curl POST to RENDER_DEPLOY_HOOK_STAGING_URL, echo confirmation.</w:t>
             </w:r>
           </w:p>
         </w:tc>
@@ -12715,7 +15029,43 @@
                 <w:sz w:val="20"/>
                 <w:szCs w:val="20"/>
               </w:rPr>
-              <w:t>cd-prod.yml: correct push trigger on main, declares environment: production, curl POST to RENDER_DEPLOY_HOOK_PROD_URL, echo confirmation. Live production PakVista on Render displays all five pages.</w:t>
+              <w:t>cd-</w:t>
+            </w:r>
+            <w:proofErr w:type="spellStart"/>
+            <w:r>
+              <w:rPr>
+                <w:color w:val="000000"/>
+                <w:sz w:val="20"/>
+                <w:szCs w:val="20"/>
+              </w:rPr>
+              <w:t>prod.yml</w:t>
+            </w:r>
+            <w:proofErr w:type="spellEnd"/>
+            <w:r>
+              <w:rPr>
+                <w:color w:val="000000"/>
+                <w:sz w:val="20"/>
+                <w:szCs w:val="20"/>
+              </w:rPr>
+              <w:t xml:space="preserve">: correct push trigger on main, declares environment: production, curl POST to RENDER_DEPLOY_HOOK_PROD_URL, echo confirmation. Live production </w:t>
+            </w:r>
+            <w:proofErr w:type="spellStart"/>
+            <w:r>
+              <w:rPr>
+                <w:color w:val="000000"/>
+                <w:sz w:val="20"/>
+                <w:szCs w:val="20"/>
+              </w:rPr>
+              <w:t>PakVista</w:t>
+            </w:r>
+            <w:proofErr w:type="spellEnd"/>
+            <w:r>
+              <w:rPr>
+                <w:color w:val="000000"/>
+                <w:sz w:val="20"/>
+                <w:szCs w:val="20"/>
+              </w:rPr>
+              <w:t xml:space="preserve"> on Render displays all five pages.</w:t>
             </w:r>
           </w:p>
         </w:tc>
@@ -13186,7 +15536,21 @@
         <w:rPr>
           <w:color w:val="000000"/>
         </w:rPr>
-        <w:t>Screenshot 2: Each member's CI workflow run (ci-dev.yml) triggered by their individual PR – all steps green. One screenshot per member or a combined view showing all members' runs.</w:t>
+        <w:t>Screenshot 2: Each member's CI workflow run (ci-</w:t>
+      </w:r>
+      <w:proofErr w:type="spellStart"/>
+      <w:r>
+        <w:rPr>
+          <w:color w:val="000000"/>
+        </w:rPr>
+        <w:t>dev.yml</w:t>
+      </w:r>
+      <w:proofErr w:type="spellEnd"/>
+      <w:r>
+        <w:rPr>
+          <w:color w:val="000000"/>
+        </w:rPr>
+        <w:t>) triggered by their individual PR – all steps green. One screenshot per member or a combined view showing all members' runs.</w:t>
       </w:r>
     </w:p>
     <w:p>
@@ -13218,7 +15582,49 @@
         <w:rPr>
           <w:color w:val="000000"/>
         </w:rPr>
-        <w:t>Screenshot 4: All three CD workflow runs (cd-dev.yml, cd-staging.yml, cd-prod.yml) – deploy step completed and confirmation echo visible.</w:t>
+        <w:t>Screenshot 4: All three CD workflow runs (cd-</w:t>
+      </w:r>
+      <w:proofErr w:type="spellStart"/>
+      <w:r>
+        <w:rPr>
+          <w:color w:val="000000"/>
+        </w:rPr>
+        <w:t>dev.yml</w:t>
+      </w:r>
+      <w:proofErr w:type="spellEnd"/>
+      <w:r>
+        <w:rPr>
+          <w:color w:val="000000"/>
+        </w:rPr>
+        <w:t>, cd-</w:t>
+      </w:r>
+      <w:proofErr w:type="spellStart"/>
+      <w:r>
+        <w:rPr>
+          <w:color w:val="000000"/>
+        </w:rPr>
+        <w:t>staging.yml</w:t>
+      </w:r>
+      <w:proofErr w:type="spellEnd"/>
+      <w:r>
+        <w:rPr>
+          <w:color w:val="000000"/>
+        </w:rPr>
+        <w:t>, cd-</w:t>
+      </w:r>
+      <w:proofErr w:type="spellStart"/>
+      <w:r>
+        <w:rPr>
+          <w:color w:val="000000"/>
+        </w:rPr>
+        <w:t>prod.yml</w:t>
+      </w:r>
+      <w:proofErr w:type="spellEnd"/>
+      <w:r>
+        <w:rPr>
+          <w:color w:val="000000"/>
+        </w:rPr>
+        <w:t>) – deploy step completed and confirmation echo visible.</w:t>
       </w:r>
     </w:p>
     <w:p>
@@ -13234,7 +15640,21 @@
         <w:rPr>
           <w:color w:val="000000"/>
         </w:rPr>
-        <w:t>Screenshot 5: Live PakVista site on each of the three Render services showing all five pages are accessible (three screenshots total, one per environment).</w:t>
+        <w:t xml:space="preserve">Screenshot 5: Live </w:t>
+      </w:r>
+      <w:proofErr w:type="spellStart"/>
+      <w:r>
+        <w:rPr>
+          <w:color w:val="000000"/>
+        </w:rPr>
+        <w:t>PakVista</w:t>
+      </w:r>
+      <w:proofErr w:type="spellEnd"/>
+      <w:r>
+        <w:rPr>
+          <w:color w:val="000000"/>
+        </w:rPr>
+        <w:t xml:space="preserve"> site on each of the three Render services showing all five pages are accessible (three screenshots total, one per environment).</w:t>
       </w:r>
     </w:p>
     <w:p>
@@ -13661,7 +16081,29 @@
                 <w:sz w:val="20"/>
                 <w:szCs w:val="20"/>
               </w:rPr>
-              <w:t>Live PakVista – Development Render Service (all 5 pages accessible)</w:t>
+              <w:t xml:space="preserve">Live </w:t>
+            </w:r>
+            <w:proofErr w:type="spellStart"/>
+            <w:r>
+              <w:rPr>
+                <w:b/>
+                <w:bCs/>
+                <w:color w:val="000000"/>
+                <w:sz w:val="20"/>
+                <w:szCs w:val="20"/>
+              </w:rPr>
+              <w:t>PakVista</w:t>
+            </w:r>
+            <w:proofErr w:type="spellEnd"/>
+            <w:r>
+              <w:rPr>
+                <w:b/>
+                <w:bCs/>
+                <w:color w:val="000000"/>
+                <w:sz w:val="20"/>
+                <w:szCs w:val="20"/>
+              </w:rPr>
+              <w:t xml:space="preserve"> – Development Render Service (all 5 pages accessible)</w:t>
             </w:r>
           </w:p>
         </w:tc>
@@ -13724,7 +16166,29 @@
                 <w:sz w:val="20"/>
                 <w:szCs w:val="20"/>
               </w:rPr>
-              <w:t>Live PakVista – Staging Render Service (all 5 pages accessible)</w:t>
+              <w:t xml:space="preserve">Live </w:t>
+            </w:r>
+            <w:proofErr w:type="spellStart"/>
+            <w:r>
+              <w:rPr>
+                <w:b/>
+                <w:bCs/>
+                <w:color w:val="000000"/>
+                <w:sz w:val="20"/>
+                <w:szCs w:val="20"/>
+              </w:rPr>
+              <w:t>PakVista</w:t>
+            </w:r>
+            <w:proofErr w:type="spellEnd"/>
+            <w:r>
+              <w:rPr>
+                <w:b/>
+                <w:bCs/>
+                <w:color w:val="000000"/>
+                <w:sz w:val="20"/>
+                <w:szCs w:val="20"/>
+              </w:rPr>
+              <w:t xml:space="preserve"> – Staging Render Service (all 5 pages accessible)</w:t>
             </w:r>
           </w:p>
         </w:tc>
@@ -13788,7 +16252,29 @@
                 <w:szCs w:val="20"/>
               </w:rPr>
               <w:lastRenderedPageBreak/>
-              <w:t>Live PakVista – Production Render Service (all 5 pages accessible)</w:t>
+              <w:t xml:space="preserve">Live </w:t>
+            </w:r>
+            <w:proofErr w:type="spellStart"/>
+            <w:r>
+              <w:rPr>
+                <w:b/>
+                <w:bCs/>
+                <w:color w:val="000000"/>
+                <w:sz w:val="20"/>
+                <w:szCs w:val="20"/>
+              </w:rPr>
+              <w:t>PakVista</w:t>
+            </w:r>
+            <w:proofErr w:type="spellEnd"/>
+            <w:r>
+              <w:rPr>
+                <w:b/>
+                <w:bCs/>
+                <w:color w:val="000000"/>
+                <w:sz w:val="20"/>
+                <w:szCs w:val="20"/>
+              </w:rPr>
+              <w:t xml:space="preserve"> – Production Render Service (all 5 pages accessible)</w:t>
             </w:r>
           </w:p>
         </w:tc>
@@ -14080,7 +16566,25 @@
           <w:sz w:val="24"/>
           <w:szCs w:val="24"/>
         </w:rPr>
-        <w:t>In this project, I created karachi.html and cd-staging.yml workflow file. I learned how Git branching works and how to create a Pull Request on GitHub. I faced an authentication issue initially but resolved it by getting collaborator access. Overall, this project helped me understand CI/CD pipelines practically.</w:t>
+        <w:t>In this project, I created karachi.html and cd-</w:t>
+      </w:r>
+      <w:proofErr w:type="spellStart"/>
+      <w:r>
+        <w:rPr>
+          <w:rFonts w:eastAsia="SimSun"/>
+          <w:sz w:val="24"/>
+          <w:szCs w:val="24"/>
+        </w:rPr>
+        <w:t>staging.yml</w:t>
+      </w:r>
+      <w:proofErr w:type="spellEnd"/>
+      <w:r>
+        <w:rPr>
+          <w:rFonts w:eastAsia="SimSun"/>
+          <w:sz w:val="24"/>
+          <w:szCs w:val="24"/>
+        </w:rPr>
+        <w:t xml:space="preserve"> workflow file. I learned how Git branching works and how to create a Pull Request on GitHub. I faced an authentication issue initially but resolved it by getting collaborator access. Overall, this project helped me understand CI/CD pipelines practically.</w:t>
       </w:r>
     </w:p>
     <w:p>
@@ -14097,40 +16601,33 @@
       </w:r>
     </w:p>
     <w:p>
-      <w:pPr>
-        <w:pBdr>
-          <w:bottom w:val="single" w:sz="2" w:space="1" w:color="CCCCCC"/>
-        </w:pBdr>
-        <w:spacing w:before="160" w:after="40"/>
-      </w:pPr>
       <w:r>
         <w:rPr>
           <w:i/>
           <w:iCs/>
           <w:color w:val="595959"/>
         </w:rPr>
-        <w:t>[Write your 4–</w:t>
-      </w:r>
-      <w:proofErr w:type="gramStart"/>
+        <w:t>In this project my part was swat.html page and ci-</w:t>
+      </w:r>
+      <w:proofErr w:type="spellStart"/>
       <w:r>
         <w:rPr>
           <w:i/>
           <w:iCs/>
           <w:color w:val="595959"/>
         </w:rPr>
-        <w:t>5 line</w:t>
-      </w:r>
-      <w:proofErr w:type="gramEnd"/>
+        <w:t>dev.yml</w:t>
+      </w:r>
+      <w:proofErr w:type="spellEnd"/>
       <w:r>
         <w:rPr>
           <w:i/>
           <w:iCs/>
           <w:color w:val="595959"/>
         </w:rPr>
-        <w:t xml:space="preserve"> reflection here]</w:t>
-      </w:r>
-    </w:p>
-    <w:p/>
+        <w:t>. By doing my part I learned about the CI pipeline and how automatically we can build images just by defining a workflow file only once.</w:t>
+      </w:r>
+    </w:p>
     <w:p>
       <w:r>
         <w:br w:type="page"/>
@@ -14153,7 +16650,21 @@
         <w:rPr>
           <w:color w:val="000000"/>
         </w:rPr>
-        <w:t>All technical work must align with the official documentation listed below. Students are expected to consult these resources while building their workflow files, Dockerfile, and HTML pages.</w:t>
+        <w:t xml:space="preserve">All technical work must align with the official documentation listed below. Students are expected to consult these resources while building their workflow files, </w:t>
+      </w:r>
+      <w:proofErr w:type="spellStart"/>
+      <w:r>
+        <w:rPr>
+          <w:color w:val="000000"/>
+        </w:rPr>
+        <w:t>Dockerfile</w:t>
+      </w:r>
+      <w:proofErr w:type="spellEnd"/>
+      <w:r>
+        <w:rPr>
+          <w:color w:val="000000"/>
+        </w:rPr>
+        <w:t>, and HTML pages.</w:t>
       </w:r>
     </w:p>
     <w:p/>
@@ -14400,7 +16911,29 @@
                 <w:sz w:val="20"/>
                 <w:szCs w:val="20"/>
               </w:rPr>
-              <w:t>GitHub Actions – Contexts (github.sha, secrets, etc.)</w:t>
+              <w:t>GitHub Actions – Contexts (</w:t>
+            </w:r>
+            <w:proofErr w:type="spellStart"/>
+            <w:r>
+              <w:rPr>
+                <w:b/>
+                <w:bCs/>
+                <w:color w:val="000000"/>
+                <w:sz w:val="20"/>
+                <w:szCs w:val="20"/>
+              </w:rPr>
+              <w:t>github.sha</w:t>
+            </w:r>
+            <w:proofErr w:type="spellEnd"/>
+            <w:r>
+              <w:rPr>
+                <w:b/>
+                <w:bCs/>
+                <w:color w:val="000000"/>
+                <w:sz w:val="20"/>
+                <w:szCs w:val="20"/>
+              </w:rPr>
+              <w:t>, secrets, etc.)</w:t>
             </w:r>
           </w:p>
         </w:tc>
@@ -15012,15 +17545,27 @@
             <w:vAlign w:val="center"/>
           </w:tcPr>
           <w:p>
-            <w:r>
-              <w:rPr>
-                <w:b/>
-                <w:bCs/>
-                <w:color w:val="000000"/>
-                <w:sz w:val="20"/>
-                <w:szCs w:val="20"/>
-              </w:rPr>
-              <w:t>Dockerfile Reference</w:t>
+            <w:proofErr w:type="spellStart"/>
+            <w:r>
+              <w:rPr>
+                <w:b/>
+                <w:bCs/>
+                <w:color w:val="000000"/>
+                <w:sz w:val="20"/>
+                <w:szCs w:val="20"/>
+              </w:rPr>
+              <w:t>Dockerfile</w:t>
+            </w:r>
+            <w:proofErr w:type="spellEnd"/>
+            <w:r>
+              <w:rPr>
+                <w:b/>
+                <w:bCs/>
+                <w:color w:val="000000"/>
+                <w:sz w:val="20"/>
+                <w:szCs w:val="20"/>
+              </w:rPr>
+              <w:t xml:space="preserve"> Reference</w:t>
             </w:r>
           </w:p>
         </w:tc>
@@ -15442,7 +17987,7 @@
 </file>
 
 <file path=word/endnotes.xml><?xml version="1.0" encoding="utf-8"?>
-<w:endnotes xmlns:wpc="http://schemas.microsoft.com/office/word/2010/wordprocessingCanvas" xmlns:cx="http://schemas.microsoft.com/office/drawing/2014/chartex" xmlns:cx1="http://schemas.microsoft.com/office/drawing/2015/9/8/chartex" xmlns:cx2="http://schemas.microsoft.com/office/drawing/2015/10/21/chartex" xmlns:cx3="http://schemas.microsoft.com/office/drawing/2016/5/9/chartex" xmlns:cx4="http://schemas.microsoft.com/office/drawing/2016/5/10/chartex" xmlns:cx5="http://schemas.microsoft.com/office/drawing/2016/5/11/chartex" xmlns:cx6="http://schemas.microsoft.com/office/drawing/2016/5/12/chartex" xmlns:cx7="http://schemas.microsoft.com/office/drawing/2016/5/13/chartex" xmlns:cx8="http://schemas.microsoft.com/office/drawing/2016/5/14/chartex" xmlns:mc="http://schemas.openxmlformats.org/markup-compatibility/2006" xmlns:aink="http://schemas.microsoft.com/office/drawing/2016/ink" xmlns:am3d="http://schemas.microsoft.com/office/drawing/2017/model3d" xmlns:o="urn:schemas-microsoft-com:office:office" xmlns:oel="http://schemas.microsoft.com/office/2019/extlst" xmlns:r="http://schemas.openxmlformats.org/officeDocument/2006/relationships" xmlns:m="http://schemas.openxmlformats.org/officeDocument/2006/math" xmlns:v="urn:schemas-microsoft-com:vml" xmlns:wp14="http://schemas.microsoft.com/office/word/2010/wordprocessingDrawing" xmlns:wp="http://schemas.openxmlformats.org/drawingml/2006/wordprocessingDrawing" xmlns:w10="urn:schemas-microsoft-com:office:word" xmlns:w="http://schemas.openxmlformats.org/wordprocessingml/2006/main" xmlns:w14="http://schemas.microsoft.com/office/word/2010/wordml" xmlns:w15="http://schemas.microsoft.com/office/word/2012/wordml" xmlns:w16cex="http://schemas.microsoft.com/office/word/2018/wordml/cex" xmlns:w16cid="http://schemas.microsoft.com/office/word/2016/wordml/cid" xmlns:w16="http://schemas.microsoft.com/office/word/2018/wordml" xmlns:w16sdtdh="http://schemas.microsoft.com/office/word/2020/wordml/sdtdatahash" xmlns:w16se="http://schemas.microsoft.com/office/word/2015/wordml/symex" xmlns:wpg="http://schemas.microsoft.com/office/word/2010/wordprocessingGroup" xmlns:wpi="http://schemas.microsoft.com/office/word/2010/wordprocessingInk" xmlns:wne="http://schemas.microsoft.com/office/word/2006/wordml" xmlns:wps="http://schemas.microsoft.com/office/word/2010/wordprocessingShape" mc:Ignorable="w14 w15 w16se w16cid w16 w16cex w16sdtdh wp14">
+<w:endnotes xmlns:wpc="http://schemas.microsoft.com/office/word/2010/wordprocessingCanvas" xmlns:cx="http://schemas.microsoft.com/office/drawing/2014/chartex" xmlns:cx1="http://schemas.microsoft.com/office/drawing/2015/9/8/chartex" xmlns:cx2="http://schemas.microsoft.com/office/drawing/2015/10/21/chartex" xmlns:cx3="http://schemas.microsoft.com/office/drawing/2016/5/9/chartex" xmlns:cx4="http://schemas.microsoft.com/office/drawing/2016/5/10/chartex" xmlns:cx5="http://schemas.microsoft.com/office/drawing/2016/5/11/chartex" xmlns:cx6="http://schemas.microsoft.com/office/drawing/2016/5/12/chartex" xmlns:cx7="http://schemas.microsoft.com/office/drawing/2016/5/13/chartex" xmlns:cx8="http://schemas.microsoft.com/office/drawing/2016/5/14/chartex" xmlns:mc="http://schemas.openxmlformats.org/markup-compatibility/2006" xmlns:aink="http://schemas.microsoft.com/office/drawing/2016/ink" xmlns:am3d="http://schemas.microsoft.com/office/drawing/2017/model3d" xmlns:o="urn:schemas-microsoft-com:office:office" xmlns:oel="http://schemas.microsoft.com/office/2019/extlst" xmlns:r="http://schemas.openxmlformats.org/officeDocument/2006/relationships" xmlns:m="http://schemas.openxmlformats.org/officeDocument/2006/math" xmlns:v="urn:schemas-microsoft-com:vml" xmlns:wp14="http://schemas.microsoft.com/office/word/2010/wordprocessingDrawing" xmlns:wp="http://schemas.openxmlformats.org/drawingml/2006/wordprocessingDrawing" xmlns:w10="urn:schemas-microsoft-com:office:word" xmlns:w="http://schemas.openxmlformats.org/wordprocessingml/2006/main" xmlns:w14="http://schemas.microsoft.com/office/word/2010/wordml" xmlns:w15="http://schemas.microsoft.com/office/word/2012/wordml" xmlns:w16cex="http://schemas.microsoft.com/office/word/2018/wordml/cex" xmlns:w16cid="http://schemas.microsoft.com/office/word/2016/wordml/cid" xmlns:w16="http://schemas.microsoft.com/office/word/2018/wordml" xmlns:w16du="http://schemas.microsoft.com/office/word/2023/wordml/word16du" xmlns:w16sdtdh="http://schemas.microsoft.com/office/word/2020/wordml/sdtdatahash" xmlns:w16sdtfl="http://schemas.microsoft.com/office/word/2024/wordml/sdtformatlock" xmlns:w16se="http://schemas.microsoft.com/office/word/2015/wordml/symex" xmlns:wpg="http://schemas.microsoft.com/office/word/2010/wordprocessingGroup" xmlns:wpi="http://schemas.microsoft.com/office/word/2010/wordprocessingInk" xmlns:wne="http://schemas.microsoft.com/office/word/2006/wordml" xmlns:wps="http://schemas.microsoft.com/office/word/2010/wordprocessingShape" mc:Ignorable="w14 w15 w16se w16cid w16 w16cex w16sdtdh w16sdtfl w16du wp14">
   <w:endnote w:type="separator" w:id="-1">
     <w:p>
       <w:r>
@@ -15461,7 +18006,7 @@
 </file>
 
 <file path=word/footer1.xml><?xml version="1.0" encoding="utf-8"?>
-<w:ftr xmlns:wpc="http://schemas.microsoft.com/office/word/2010/wordprocessingCanvas" xmlns:cx="http://schemas.microsoft.com/office/drawing/2014/chartex" xmlns:cx1="http://schemas.microsoft.com/office/drawing/2015/9/8/chartex" xmlns:cx2="http://schemas.microsoft.com/office/drawing/2015/10/21/chartex" xmlns:cx3="http://schemas.microsoft.com/office/drawing/2016/5/9/chartex" xmlns:cx4="http://schemas.microsoft.com/office/drawing/2016/5/10/chartex" xmlns:cx5="http://schemas.microsoft.com/office/drawing/2016/5/11/chartex" xmlns:cx6="http://schemas.microsoft.com/office/drawing/2016/5/12/chartex" xmlns:cx7="http://schemas.microsoft.com/office/drawing/2016/5/13/chartex" xmlns:cx8="http://schemas.microsoft.com/office/drawing/2016/5/14/chartex" xmlns:mc="http://schemas.openxmlformats.org/markup-compatibility/2006" xmlns:aink="http://schemas.microsoft.com/office/drawing/2016/ink" xmlns:am3d="http://schemas.microsoft.com/office/drawing/2017/model3d" xmlns:o="urn:schemas-microsoft-com:office:office" xmlns:oel="http://schemas.microsoft.com/office/2019/extlst" xmlns:r="http://schemas.openxmlformats.org/officeDocument/2006/relationships" xmlns:m="http://schemas.openxmlformats.org/officeDocument/2006/math" xmlns:v="urn:schemas-microsoft-com:vml" xmlns:wp14="http://schemas.microsoft.com/office/word/2010/wordprocessingDrawing" xmlns:wp="http://schemas.openxmlformats.org/drawingml/2006/wordprocessingDrawing" xmlns:w10="urn:schemas-microsoft-com:office:word" xmlns:w="http://schemas.openxmlformats.org/wordprocessingml/2006/main" xmlns:w14="http://schemas.microsoft.com/office/word/2010/wordml" xmlns:w15="http://schemas.microsoft.com/office/word/2012/wordml" xmlns:w16cex="http://schemas.microsoft.com/office/word/2018/wordml/cex" xmlns:w16cid="http://schemas.microsoft.com/office/word/2016/wordml/cid" xmlns:w16="http://schemas.microsoft.com/office/word/2018/wordml" xmlns:w16sdtdh="http://schemas.microsoft.com/office/word/2020/wordml/sdtdatahash" xmlns:w16se="http://schemas.microsoft.com/office/word/2015/wordml/symex" xmlns:wpg="http://schemas.microsoft.com/office/word/2010/wordprocessingGroup" xmlns:wpi="http://schemas.microsoft.com/office/word/2010/wordprocessingInk" xmlns:wne="http://schemas.microsoft.com/office/word/2006/wordml" xmlns:wps="http://schemas.microsoft.com/office/word/2010/wordprocessingShape" mc:Ignorable="w14 w15 w16se w16cid w16 w16cex w16sdtdh wp14">
+<w:ftr xmlns:wpc="http://schemas.microsoft.com/office/word/2010/wordprocessingCanvas" xmlns:cx="http://schemas.microsoft.com/office/drawing/2014/chartex" xmlns:cx1="http://schemas.microsoft.com/office/drawing/2015/9/8/chartex" xmlns:cx2="http://schemas.microsoft.com/office/drawing/2015/10/21/chartex" xmlns:cx3="http://schemas.microsoft.com/office/drawing/2016/5/9/chartex" xmlns:cx4="http://schemas.microsoft.com/office/drawing/2016/5/10/chartex" xmlns:cx5="http://schemas.microsoft.com/office/drawing/2016/5/11/chartex" xmlns:cx6="http://schemas.microsoft.com/office/drawing/2016/5/12/chartex" xmlns:cx7="http://schemas.microsoft.com/office/drawing/2016/5/13/chartex" xmlns:cx8="http://schemas.microsoft.com/office/drawing/2016/5/14/chartex" xmlns:mc="http://schemas.openxmlformats.org/markup-compatibility/2006" xmlns:aink="http://schemas.microsoft.com/office/drawing/2016/ink" xmlns:am3d="http://schemas.microsoft.com/office/drawing/2017/model3d" xmlns:o="urn:schemas-microsoft-com:office:office" xmlns:oel="http://schemas.microsoft.com/office/2019/extlst" xmlns:r="http://schemas.openxmlformats.org/officeDocument/2006/relationships" xmlns:m="http://schemas.openxmlformats.org/officeDocument/2006/math" xmlns:v="urn:schemas-microsoft-com:vml" xmlns:wp14="http://schemas.microsoft.com/office/word/2010/wordprocessingDrawing" xmlns:wp="http://schemas.openxmlformats.org/drawingml/2006/wordprocessingDrawing" xmlns:w10="urn:schemas-microsoft-com:office:word" xmlns:w="http://schemas.openxmlformats.org/wordprocessingml/2006/main" xmlns:w14="http://schemas.microsoft.com/office/word/2010/wordml" xmlns:w15="http://schemas.microsoft.com/office/word/2012/wordml" xmlns:w16cex="http://schemas.microsoft.com/office/word/2018/wordml/cex" xmlns:w16cid="http://schemas.microsoft.com/office/word/2016/wordml/cid" xmlns:w16="http://schemas.microsoft.com/office/word/2018/wordml" xmlns:w16du="http://schemas.microsoft.com/office/word/2023/wordml/word16du" xmlns:w16sdtdh="http://schemas.microsoft.com/office/word/2020/wordml/sdtdatahash" xmlns:w16sdtfl="http://schemas.microsoft.com/office/word/2024/wordml/sdtformatlock" xmlns:w16se="http://schemas.microsoft.com/office/word/2015/wordml/symex" xmlns:wpg="http://schemas.microsoft.com/office/word/2010/wordprocessingGroup" xmlns:wpi="http://schemas.microsoft.com/office/word/2010/wordprocessingInk" xmlns:wne="http://schemas.microsoft.com/office/word/2006/wordml" xmlns:wps="http://schemas.microsoft.com/office/word/2010/wordprocessingShape" mc:Ignorable="w14 w15 w16se w16cid w16 w16cex w16sdtdh w16sdtfl w16du wp14">
   <w:p>
     <w:pPr>
       <w:pBdr>
@@ -15599,7 +18144,7 @@
 </file>
 
 <file path=word/footnotes.xml><?xml version="1.0" encoding="utf-8"?>
-<w:footnotes xmlns:wpc="http://schemas.microsoft.com/office/word/2010/wordprocessingCanvas" xmlns:cx="http://schemas.microsoft.com/office/drawing/2014/chartex" xmlns:cx1="http://schemas.microsoft.com/office/drawing/2015/9/8/chartex" xmlns:cx2="http://schemas.microsoft.com/office/drawing/2015/10/21/chartex" xmlns:cx3="http://schemas.microsoft.com/office/drawing/2016/5/9/chartex" xmlns:cx4="http://schemas.microsoft.com/office/drawing/2016/5/10/chartex" xmlns:cx5="http://schemas.microsoft.com/office/drawing/2016/5/11/chartex" xmlns:cx6="http://schemas.microsoft.com/office/drawing/2016/5/12/chartex" xmlns:cx7="http://schemas.microsoft.com/office/drawing/2016/5/13/chartex" xmlns:cx8="http://schemas.microsoft.com/office/drawing/2016/5/14/chartex" xmlns:mc="http://schemas.openxmlformats.org/markup-compatibility/2006" xmlns:aink="http://schemas.microsoft.com/office/drawing/2016/ink" xmlns:am3d="http://schemas.microsoft.com/office/drawing/2017/model3d" xmlns:o="urn:schemas-microsoft-com:office:office" xmlns:oel="http://schemas.microsoft.com/office/2019/extlst" xmlns:r="http://schemas.openxmlformats.org/officeDocument/2006/relationships" xmlns:m="http://schemas.openxmlformats.org/officeDocument/2006/math" xmlns:v="urn:schemas-microsoft-com:vml" xmlns:wp14="http://schemas.microsoft.com/office/word/2010/wordprocessingDrawing" xmlns:wp="http://schemas.openxmlformats.org/drawingml/2006/wordprocessingDrawing" xmlns:w10="urn:schemas-microsoft-com:office:word" xmlns:w="http://schemas.openxmlformats.org/wordprocessingml/2006/main" xmlns:w14="http://schemas.microsoft.com/office/word/2010/wordml" xmlns:w15="http://schemas.microsoft.com/office/word/2012/wordml" xmlns:w16cex="http://schemas.microsoft.com/office/word/2018/wordml/cex" xmlns:w16cid="http://schemas.microsoft.com/office/word/2016/wordml/cid" xmlns:w16="http://schemas.microsoft.com/office/word/2018/wordml" xmlns:w16sdtdh="http://schemas.microsoft.com/office/word/2020/wordml/sdtdatahash" xmlns:w16se="http://schemas.microsoft.com/office/word/2015/wordml/symex" xmlns:wpg="http://schemas.microsoft.com/office/word/2010/wordprocessingGroup" xmlns:wpi="http://schemas.microsoft.com/office/word/2010/wordprocessingInk" xmlns:wne="http://schemas.microsoft.com/office/word/2006/wordml" xmlns:wps="http://schemas.microsoft.com/office/word/2010/wordprocessingShape" mc:Ignorable="w14 w15 w16se w16cid w16 w16cex w16sdtdh wp14">
+<w:footnotes xmlns:wpc="http://schemas.microsoft.com/office/word/2010/wordprocessingCanvas" xmlns:cx="http://schemas.microsoft.com/office/drawing/2014/chartex" xmlns:cx1="http://schemas.microsoft.com/office/drawing/2015/9/8/chartex" xmlns:cx2="http://schemas.microsoft.com/office/drawing/2015/10/21/chartex" xmlns:cx3="http://schemas.microsoft.com/office/drawing/2016/5/9/chartex" xmlns:cx4="http://schemas.microsoft.com/office/drawing/2016/5/10/chartex" xmlns:cx5="http://schemas.microsoft.com/office/drawing/2016/5/11/chartex" xmlns:cx6="http://schemas.microsoft.com/office/drawing/2016/5/12/chartex" xmlns:cx7="http://schemas.microsoft.com/office/drawing/2016/5/13/chartex" xmlns:cx8="http://schemas.microsoft.com/office/drawing/2016/5/14/chartex" xmlns:mc="http://schemas.openxmlformats.org/markup-compatibility/2006" xmlns:aink="http://schemas.microsoft.com/office/drawing/2016/ink" xmlns:am3d="http://schemas.microsoft.com/office/drawing/2017/model3d" xmlns:o="urn:schemas-microsoft-com:office:office" xmlns:oel="http://schemas.microsoft.com/office/2019/extlst" xmlns:r="http://schemas.openxmlformats.org/officeDocument/2006/relationships" xmlns:m="http://schemas.openxmlformats.org/officeDocument/2006/math" xmlns:v="urn:schemas-microsoft-com:vml" xmlns:wp14="http://schemas.microsoft.com/office/word/2010/wordprocessingDrawing" xmlns:wp="http://schemas.openxmlformats.org/drawingml/2006/wordprocessingDrawing" xmlns:w10="urn:schemas-microsoft-com:office:word" xmlns:w="http://schemas.openxmlformats.org/wordprocessingml/2006/main" xmlns:w14="http://schemas.microsoft.com/office/word/2010/wordml" xmlns:w15="http://schemas.microsoft.com/office/word/2012/wordml" xmlns:w16cex="http://schemas.microsoft.com/office/word/2018/wordml/cex" xmlns:w16cid="http://schemas.microsoft.com/office/word/2016/wordml/cid" xmlns:w16="http://schemas.microsoft.com/office/word/2018/wordml" xmlns:w16du="http://schemas.microsoft.com/office/word/2023/wordml/word16du" xmlns:w16sdtdh="http://schemas.microsoft.com/office/word/2020/wordml/sdtdatahash" xmlns:w16sdtfl="http://schemas.microsoft.com/office/word/2024/wordml/sdtformatlock" xmlns:w16se="http://schemas.microsoft.com/office/word/2015/wordml/symex" xmlns:wpg="http://schemas.microsoft.com/office/word/2010/wordprocessingGroup" xmlns:wpi="http://schemas.microsoft.com/office/word/2010/wordprocessingInk" xmlns:wne="http://schemas.microsoft.com/office/word/2006/wordml" xmlns:wps="http://schemas.microsoft.com/office/word/2010/wordprocessingShape" mc:Ignorable="w14 w15 w16se w16cid w16 w16cex w16sdtdh w16sdtfl w16du wp14">
   <w:footnote w:type="separator" w:id="-1">
     <w:p>
       <w:r>
@@ -15618,7 +18163,7 @@
 </file>
 
 <file path=word/header1.xml><?xml version="1.0" encoding="utf-8"?>
-<w:hdr xmlns:wpc="http://schemas.microsoft.com/office/word/2010/wordprocessingCanvas" xmlns:cx="http://schemas.microsoft.com/office/drawing/2014/chartex" xmlns:cx1="http://schemas.microsoft.com/office/drawing/2015/9/8/chartex" xmlns:cx2="http://schemas.microsoft.com/office/drawing/2015/10/21/chartex" xmlns:cx3="http://schemas.microsoft.com/office/drawing/2016/5/9/chartex" xmlns:cx4="http://schemas.microsoft.com/office/drawing/2016/5/10/chartex" xmlns:cx5="http://schemas.microsoft.com/office/drawing/2016/5/11/chartex" xmlns:cx6="http://schemas.microsoft.com/office/drawing/2016/5/12/chartex" xmlns:cx7="http://schemas.microsoft.com/office/drawing/2016/5/13/chartex" xmlns:cx8="http://schemas.microsoft.com/office/drawing/2016/5/14/chartex" xmlns:mc="http://schemas.openxmlformats.org/markup-compatibility/2006" xmlns:aink="http://schemas.microsoft.com/office/drawing/2016/ink" xmlns:am3d="http://schemas.microsoft.com/office/drawing/2017/model3d" xmlns:o="urn:schemas-microsoft-com:office:office" xmlns:oel="http://schemas.microsoft.com/office/2019/extlst" xmlns:r="http://schemas.openxmlformats.org/officeDocument/2006/relationships" xmlns:m="http://schemas.openxmlformats.org/officeDocument/2006/math" xmlns:v="urn:schemas-microsoft-com:vml" xmlns:wp14="http://schemas.microsoft.com/office/word/2010/wordprocessingDrawing" xmlns:wp="http://schemas.openxmlformats.org/drawingml/2006/wordprocessingDrawing" xmlns:w10="urn:schemas-microsoft-com:office:word" xmlns:w="http://schemas.openxmlformats.org/wordprocessingml/2006/main" xmlns:w14="http://schemas.microsoft.com/office/word/2010/wordml" xmlns:w15="http://schemas.microsoft.com/office/word/2012/wordml" xmlns:w16cex="http://schemas.microsoft.com/office/word/2018/wordml/cex" xmlns:w16cid="http://schemas.microsoft.com/office/word/2016/wordml/cid" xmlns:w16="http://schemas.microsoft.com/office/word/2018/wordml" xmlns:w16sdtdh="http://schemas.microsoft.com/office/word/2020/wordml/sdtdatahash" xmlns:w16se="http://schemas.microsoft.com/office/word/2015/wordml/symex" xmlns:wpg="http://schemas.microsoft.com/office/word/2010/wordprocessingGroup" xmlns:wpi="http://schemas.microsoft.com/office/word/2010/wordprocessingInk" xmlns:wne="http://schemas.microsoft.com/office/word/2006/wordml" xmlns:wps="http://schemas.microsoft.com/office/word/2010/wordprocessingShape" mc:Ignorable="w14 w15 w16se w16cid w16 w16cex w16sdtdh wp14">
+<w:hdr xmlns:wpc="http://schemas.microsoft.com/office/word/2010/wordprocessingCanvas" xmlns:cx="http://schemas.microsoft.com/office/drawing/2014/chartex" xmlns:cx1="http://schemas.microsoft.com/office/drawing/2015/9/8/chartex" xmlns:cx2="http://schemas.microsoft.com/office/drawing/2015/10/21/chartex" xmlns:cx3="http://schemas.microsoft.com/office/drawing/2016/5/9/chartex" xmlns:cx4="http://schemas.microsoft.com/office/drawing/2016/5/10/chartex" xmlns:cx5="http://schemas.microsoft.com/office/drawing/2016/5/11/chartex" xmlns:cx6="http://schemas.microsoft.com/office/drawing/2016/5/12/chartex" xmlns:cx7="http://schemas.microsoft.com/office/drawing/2016/5/13/chartex" xmlns:cx8="http://schemas.microsoft.com/office/drawing/2016/5/14/chartex" xmlns:mc="http://schemas.openxmlformats.org/markup-compatibility/2006" xmlns:aink="http://schemas.microsoft.com/office/drawing/2016/ink" xmlns:am3d="http://schemas.microsoft.com/office/drawing/2017/model3d" xmlns:o="urn:schemas-microsoft-com:office:office" xmlns:oel="http://schemas.microsoft.com/office/2019/extlst" xmlns:r="http://schemas.openxmlformats.org/officeDocument/2006/relationships" xmlns:m="http://schemas.openxmlformats.org/officeDocument/2006/math" xmlns:v="urn:schemas-microsoft-com:vml" xmlns:wp14="http://schemas.microsoft.com/office/word/2010/wordprocessingDrawing" xmlns:wp="http://schemas.openxmlformats.org/drawingml/2006/wordprocessingDrawing" xmlns:w10="urn:schemas-microsoft-com:office:word" xmlns:w="http://schemas.openxmlformats.org/wordprocessingml/2006/main" xmlns:w14="http://schemas.microsoft.com/office/word/2010/wordml" xmlns:w15="http://schemas.microsoft.com/office/word/2012/wordml" xmlns:w16cex="http://schemas.microsoft.com/office/word/2018/wordml/cex" xmlns:w16cid="http://schemas.microsoft.com/office/word/2016/wordml/cid" xmlns:w16="http://schemas.microsoft.com/office/word/2018/wordml" xmlns:w16du="http://schemas.microsoft.com/office/word/2023/wordml/word16du" xmlns:w16sdtdh="http://schemas.microsoft.com/office/word/2020/wordml/sdtdatahash" xmlns:w16sdtfl="http://schemas.microsoft.com/office/word/2024/wordml/sdtformatlock" xmlns:w16se="http://schemas.microsoft.com/office/word/2015/wordml/symex" xmlns:wpg="http://schemas.microsoft.com/office/word/2010/wordprocessingGroup" xmlns:wpi="http://schemas.microsoft.com/office/word/2010/wordprocessingInk" xmlns:wne="http://schemas.microsoft.com/office/word/2006/wordml" xmlns:wps="http://schemas.microsoft.com/office/word/2010/wordprocessingShape" mc:Ignorable="w14 w15 w16se w16cid w16 w16cex w16sdtdh w16sdtfl w16du wp14">
   <w:p>
     <w:pPr>
       <w:pBdr>
@@ -15652,7 +18197,7 @@
 </file>
 
 <file path=word/numbering.xml><?xml version="1.0" encoding="utf-8"?>
-<w:numbering xmlns:wpc="http://schemas.microsoft.com/office/word/2010/wordprocessingCanvas" xmlns:cx="http://schemas.microsoft.com/office/drawing/2014/chartex" xmlns:cx1="http://schemas.microsoft.com/office/drawing/2015/9/8/chartex" xmlns:cx2="http://schemas.microsoft.com/office/drawing/2015/10/21/chartex" xmlns:cx3="http://schemas.microsoft.com/office/drawing/2016/5/9/chartex" xmlns:cx4="http://schemas.microsoft.com/office/drawing/2016/5/10/chartex" xmlns:cx5="http://schemas.microsoft.com/office/drawing/2016/5/11/chartex" xmlns:cx6="http://schemas.microsoft.com/office/drawing/2016/5/12/chartex" xmlns:cx7="http://schemas.microsoft.com/office/drawing/2016/5/13/chartex" xmlns:cx8="http://schemas.microsoft.com/office/drawing/2016/5/14/chartex" xmlns:mc="http://schemas.openxmlformats.org/markup-compatibility/2006" xmlns:aink="http://schemas.microsoft.com/office/drawing/2016/ink" xmlns:am3d="http://schemas.microsoft.com/office/drawing/2017/model3d" xmlns:o="urn:schemas-microsoft-com:office:office" xmlns:oel="http://schemas.microsoft.com/office/2019/extlst" xmlns:r="http://schemas.openxmlformats.org/officeDocument/2006/relationships" xmlns:m="http://schemas.openxmlformats.org/officeDocument/2006/math" xmlns:v="urn:schemas-microsoft-com:vml" xmlns:wp14="http://schemas.microsoft.com/office/word/2010/wordprocessingDrawing" xmlns:wp="http://schemas.openxmlformats.org/drawingml/2006/wordprocessingDrawing" xmlns:w10="urn:schemas-microsoft-com:office:word" xmlns:w="http://schemas.openxmlformats.org/wordprocessingml/2006/main" xmlns:w14="http://schemas.microsoft.com/office/word/2010/wordml" xmlns:w15="http://schemas.microsoft.com/office/word/2012/wordml" xmlns:w16cex="http://schemas.microsoft.com/office/word/2018/wordml/cex" xmlns:w16cid="http://schemas.microsoft.com/office/word/2016/wordml/cid" xmlns:w16="http://schemas.microsoft.com/office/word/2018/wordml" xmlns:w16sdtdh="http://schemas.microsoft.com/office/word/2020/wordml/sdtdatahash" xmlns:w16se="http://schemas.microsoft.com/office/word/2015/wordml/symex" xmlns:wpg="http://schemas.microsoft.com/office/word/2010/wordprocessingGroup" xmlns:wpi="http://schemas.microsoft.com/office/word/2010/wordprocessingInk" xmlns:wne="http://schemas.microsoft.com/office/word/2006/wordml" xmlns:wps="http://schemas.microsoft.com/office/word/2010/wordprocessingShape" mc:Ignorable="w14 w15 w16se w16cid w16 w16cex w16sdtdh wp14">
+<w:numbering xmlns:wpc="http://schemas.microsoft.com/office/word/2010/wordprocessingCanvas" xmlns:cx="http://schemas.microsoft.com/office/drawing/2014/chartex" xmlns:cx1="http://schemas.microsoft.com/office/drawing/2015/9/8/chartex" xmlns:cx2="http://schemas.microsoft.com/office/drawing/2015/10/21/chartex" xmlns:cx3="http://schemas.microsoft.com/office/drawing/2016/5/9/chartex" xmlns:cx4="http://schemas.microsoft.com/office/drawing/2016/5/10/chartex" xmlns:cx5="http://schemas.microsoft.com/office/drawing/2016/5/11/chartex" xmlns:cx6="http://schemas.microsoft.com/office/drawing/2016/5/12/chartex" xmlns:cx7="http://schemas.microsoft.com/office/drawing/2016/5/13/chartex" xmlns:cx8="http://schemas.microsoft.com/office/drawing/2016/5/14/chartex" xmlns:mc="http://schemas.openxmlformats.org/markup-compatibility/2006" xmlns:aink="http://schemas.microsoft.com/office/drawing/2016/ink" xmlns:am3d="http://schemas.microsoft.com/office/drawing/2017/model3d" xmlns:o="urn:schemas-microsoft-com:office:office" xmlns:oel="http://schemas.microsoft.com/office/2019/extlst" xmlns:r="http://schemas.openxmlformats.org/officeDocument/2006/relationships" xmlns:m="http://schemas.openxmlformats.org/officeDocument/2006/math" xmlns:v="urn:schemas-microsoft-com:vml" xmlns:wp14="http://schemas.microsoft.com/office/word/2010/wordprocessingDrawing" xmlns:wp="http://schemas.openxmlformats.org/drawingml/2006/wordprocessingDrawing" xmlns:w10="urn:schemas-microsoft-com:office:word" xmlns:w="http://schemas.openxmlformats.org/wordprocessingml/2006/main" xmlns:w14="http://schemas.microsoft.com/office/word/2010/wordml" xmlns:w15="http://schemas.microsoft.com/office/word/2012/wordml" xmlns:w16cex="http://schemas.microsoft.com/office/word/2018/wordml/cex" xmlns:w16cid="http://schemas.microsoft.com/office/word/2016/wordml/cid" xmlns:w16="http://schemas.microsoft.com/office/word/2018/wordml" xmlns:w16du="http://schemas.microsoft.com/office/word/2023/wordml/word16du" xmlns:w16sdtdh="http://schemas.microsoft.com/office/word/2020/wordml/sdtdatahash" xmlns:w16sdtfl="http://schemas.microsoft.com/office/word/2024/wordml/sdtformatlock" xmlns:w16se="http://schemas.microsoft.com/office/word/2015/wordml/symex" xmlns:wpg="http://schemas.microsoft.com/office/word/2010/wordprocessingGroup" xmlns:wpi="http://schemas.microsoft.com/office/word/2010/wordprocessingInk" xmlns:wne="http://schemas.microsoft.com/office/word/2006/wordml" xmlns:wps="http://schemas.microsoft.com/office/word/2010/wordprocessingShape" mc:Ignorable="w14 w15 w16se w16cid w16 w16cex w16sdtdh w16sdtfl w16du wp14">
   <w:abstractNum w:abstractNumId="0" w15:restartNumberingAfterBreak="0">
     <w:nsid w:val="0C5F5D60"/>
     <w:multiLevelType w:val="multilevel"/>
@@ -16025,7 +18570,7 @@
 </file>
 
 <file path=word/styles.xml><?xml version="1.0" encoding="utf-8"?>
-<w:styles xmlns:mc="http://schemas.openxmlformats.org/markup-compatibility/2006" xmlns:r="http://schemas.openxmlformats.org/officeDocument/2006/relationships" xmlns:w="http://schemas.openxmlformats.org/wordprocessingml/2006/main" xmlns:w14="http://schemas.microsoft.com/office/word/2010/wordml" xmlns:w15="http://schemas.microsoft.com/office/word/2012/wordml" xmlns:w16cex="http://schemas.microsoft.com/office/word/2018/wordml/cex" xmlns:w16cid="http://schemas.microsoft.com/office/word/2016/wordml/cid" xmlns:w16="http://schemas.microsoft.com/office/word/2018/wordml" xmlns:w16sdtdh="http://schemas.microsoft.com/office/word/2020/wordml/sdtdatahash" xmlns:w16se="http://schemas.microsoft.com/office/word/2015/wordml/symex" mc:Ignorable="w14 w15 w16se w16cid w16 w16cex w16sdtdh">
+<w:styles xmlns:mc="http://schemas.openxmlformats.org/markup-compatibility/2006" xmlns:r="http://schemas.openxmlformats.org/officeDocument/2006/relationships" xmlns:w="http://schemas.openxmlformats.org/wordprocessingml/2006/main" xmlns:w14="http://schemas.microsoft.com/office/word/2010/wordml" xmlns:w15="http://schemas.microsoft.com/office/word/2012/wordml" xmlns:w16cex="http://schemas.microsoft.com/office/word/2018/wordml/cex" xmlns:w16cid="http://schemas.microsoft.com/office/word/2016/wordml/cid" xmlns:w16="http://schemas.microsoft.com/office/word/2018/wordml" xmlns:w16du="http://schemas.microsoft.com/office/word/2023/wordml/word16du" xmlns:w16sdtdh="http://schemas.microsoft.com/office/word/2020/wordml/sdtdatahash" xmlns:w16sdtfl="http://schemas.microsoft.com/office/word/2024/wordml/sdtformatlock" xmlns:w16se="http://schemas.microsoft.com/office/word/2015/wordml/symex" mc:Ignorable="w14 w15 w16se w16cid w16 w16cex w16sdtdh w16sdtfl w16du">
   <w:docDefaults>
     <w:rPrDefault>
       <w:rPr>

</xml_diff>

<commit_message>
corrected my name in the .docx
</commit_message>
<xml_diff>
--- a/TermProject_Spring2026.docx
+++ b/TermProject_Spring2026.docx
@@ -16597,7 +16597,15 @@
           <w:bCs/>
           <w:color w:val="2E75B6"/>
         </w:rPr>
-        <w:t>Member 5: [Student Name] – Reflection</w:t>
+        <w:t xml:space="preserve">Member 5: </w:t>
+      </w:r>
+      <w:r>
+        <w:rPr>
+          <w:b/>
+          <w:bCs/>
+          <w:color w:val="2E75B6"/>
+        </w:rPr>
+        <w:t>Owais Murtaza</w:t>
       </w:r>
     </w:p>
     <w:p>

</xml_diff>

<commit_message>
Added hunza.html, Added ci-staging.yml
</commit_message>
<xml_diff>
--- a/TermProject_Spring2026.docx
+++ b/TermProject_Spring2026.docx
@@ -1,6 +1,6 @@
 
 <file path=word/document.xml><?xml version="1.0" encoding="utf-8"?>
-<w:document xmlns:wpc="http://schemas.microsoft.com/office/word/2010/wordprocessingCanvas" xmlns:cx="http://schemas.microsoft.com/office/drawing/2014/chartex" xmlns:cx1="http://schemas.microsoft.com/office/drawing/2015/9/8/chartex" xmlns:cx2="http://schemas.microsoft.com/office/drawing/2015/10/21/chartex" xmlns:cx3="http://schemas.microsoft.com/office/drawing/2016/5/9/chartex" xmlns:cx4="http://schemas.microsoft.com/office/drawing/2016/5/10/chartex" xmlns:cx5="http://schemas.microsoft.com/office/drawing/2016/5/11/chartex" xmlns:cx6="http://schemas.microsoft.com/office/drawing/2016/5/12/chartex" xmlns:cx7="http://schemas.microsoft.com/office/drawing/2016/5/13/chartex" xmlns:cx8="http://schemas.microsoft.com/office/drawing/2016/5/14/chartex" xmlns:mc="http://schemas.openxmlformats.org/markup-compatibility/2006" xmlns:aink="http://schemas.microsoft.com/office/drawing/2016/ink" xmlns:am3d="http://schemas.microsoft.com/office/drawing/2017/model3d" xmlns:o="urn:schemas-microsoft-com:office:office" xmlns:oel="http://schemas.microsoft.com/office/2019/extlst" xmlns:r="http://schemas.openxmlformats.org/officeDocument/2006/relationships" xmlns:m="http://schemas.openxmlformats.org/officeDocument/2006/math" xmlns:v="urn:schemas-microsoft-com:vml" xmlns:wp14="http://schemas.microsoft.com/office/word/2010/wordprocessingDrawing" xmlns:wp="http://schemas.openxmlformats.org/drawingml/2006/wordprocessingDrawing" xmlns:w10="urn:schemas-microsoft-com:office:word" xmlns:w="http://schemas.openxmlformats.org/wordprocessingml/2006/main" xmlns:w14="http://schemas.microsoft.com/office/word/2010/wordml" xmlns:w15="http://schemas.microsoft.com/office/word/2012/wordml" xmlns:w16cex="http://schemas.microsoft.com/office/word/2018/wordml/cex" xmlns:w16cid="http://schemas.microsoft.com/office/word/2016/wordml/cid" xmlns:w16="http://schemas.microsoft.com/office/word/2018/wordml" xmlns:w16du="http://schemas.microsoft.com/office/word/2023/wordml/word16du" xmlns:w16sdtdh="http://schemas.microsoft.com/office/word/2020/wordml/sdtdatahash" xmlns:w16sdtfl="http://schemas.microsoft.com/office/word/2024/wordml/sdtformatlock" xmlns:w16se="http://schemas.microsoft.com/office/word/2015/wordml/symex" xmlns:wpg="http://schemas.microsoft.com/office/word/2010/wordprocessingGroup" xmlns:wpi="http://schemas.microsoft.com/office/word/2010/wordprocessingInk" xmlns:wne="http://schemas.microsoft.com/office/word/2006/wordml" xmlns:wps="http://schemas.microsoft.com/office/word/2010/wordprocessingShape" mc:Ignorable="w14 w15 w16se w16cid w16 w16cex w16sdtdh w16sdtfl w16du wp14">
+<w:document xmlns:wpc="http://schemas.microsoft.com/office/word/2010/wordprocessingCanvas" xmlns:cx="http://schemas.microsoft.com/office/drawing/2014/chartex" xmlns:cx1="http://schemas.microsoft.com/office/drawing/2015/9/8/chartex" xmlns:cx2="http://schemas.microsoft.com/office/drawing/2015/10/21/chartex" xmlns:cx3="http://schemas.microsoft.com/office/drawing/2016/5/9/chartex" xmlns:cx4="http://schemas.microsoft.com/office/drawing/2016/5/10/chartex" xmlns:cx5="http://schemas.microsoft.com/office/drawing/2016/5/11/chartex" xmlns:cx6="http://schemas.microsoft.com/office/drawing/2016/5/12/chartex" xmlns:cx7="http://schemas.microsoft.com/office/drawing/2016/5/13/chartex" xmlns:cx8="http://schemas.microsoft.com/office/drawing/2016/5/14/chartex" xmlns:mc="http://schemas.openxmlformats.org/markup-compatibility/2006" xmlns:aink="http://schemas.microsoft.com/office/drawing/2016/ink" xmlns:am3d="http://schemas.microsoft.com/office/drawing/2017/model3d" xmlns:o="urn:schemas-microsoft-com:office:office" xmlns:oel="http://schemas.microsoft.com/office/2019/extlst" xmlns:r="http://schemas.openxmlformats.org/officeDocument/2006/relationships" xmlns:m="http://schemas.openxmlformats.org/officeDocument/2006/math" xmlns:v="urn:schemas-microsoft-com:vml" xmlns:wp14="http://schemas.microsoft.com/office/word/2010/wordprocessingDrawing" xmlns:wp="http://schemas.openxmlformats.org/drawingml/2006/wordprocessingDrawing" xmlns:w10="urn:schemas-microsoft-com:office:word" xmlns:w="http://schemas.openxmlformats.org/wordprocessingml/2006/main" xmlns:w14="http://schemas.microsoft.com/office/word/2010/wordml" xmlns:w15="http://schemas.microsoft.com/office/word/2012/wordml" xmlns:w16cex="http://schemas.microsoft.com/office/word/2018/wordml/cex" xmlns:w16cid="http://schemas.microsoft.com/office/word/2016/wordml/cid" xmlns:w16="http://schemas.microsoft.com/office/word/2018/wordml" xmlns:w16sdtdh="http://schemas.microsoft.com/office/word/2020/wordml/sdtdatahash" xmlns:w16se="http://schemas.microsoft.com/office/word/2015/wordml/symex" xmlns:wpg="http://schemas.microsoft.com/office/word/2010/wordprocessingGroup" xmlns:wpi="http://schemas.microsoft.com/office/word/2010/wordprocessingInk" xmlns:wne="http://schemas.microsoft.com/office/word/2006/wordml" xmlns:wps="http://schemas.microsoft.com/office/word/2010/wordprocessingShape" mc:Ignorable="w14 w15 w16se w16cid w16 w16cex w16sdtdh wp14">
   <w:body>
     <w:p>
       <w:pPr>
@@ -1248,7 +1248,11 @@
             </w:tcMar>
             <w:vAlign w:val="center"/>
           </w:tcPr>
-          <w:p/>
+          <w:p>
+            <w:r>
+              <w:t>3</w:t>
+            </w:r>
+          </w:p>
         </w:tc>
         <w:tc>
           <w:tcPr>
@@ -1268,7 +1272,11 @@
             </w:tcMar>
             <w:vAlign w:val="center"/>
           </w:tcPr>
-          <w:p/>
+          <w:p>
+            <w:r>
+              <w:t>Sana Nadeem</w:t>
+            </w:r>
+          </w:p>
         </w:tc>
         <w:tc>
           <w:tcPr>
@@ -1288,7 +1296,11 @@
             </w:tcMar>
             <w:vAlign w:val="center"/>
           </w:tcPr>
-          <w:p/>
+          <w:p>
+            <w:r>
+              <w:t>sana05022</w:t>
+            </w:r>
+          </w:p>
         </w:tc>
         <w:tc>
           <w:tcPr>
@@ -1308,7 +1320,11 @@
             </w:tcMar>
             <w:vAlign w:val="center"/>
           </w:tcPr>
-          <w:p/>
+          <w:p>
+            <w:r>
+              <w:t>Member</w:t>
+            </w:r>
+          </w:p>
         </w:tc>
         <w:tc>
           <w:tcPr>
@@ -1328,7 +1344,16 @@
             </w:tcMar>
             <w:vAlign w:val="center"/>
           </w:tcPr>
-          <w:p/>
+          <w:p>
+            <w:r>
+              <w:t>ci-</w:t>
+            </w:r>
+            <w:proofErr w:type="spellStart"/>
+            <w:r>
+              <w:t>staging.yml</w:t>
+            </w:r>
+            <w:proofErr w:type="spellEnd"/>
+          </w:p>
         </w:tc>
         <w:tc>
           <w:tcPr>
@@ -1348,7 +1373,15 @@
             </w:tcMar>
             <w:vAlign w:val="center"/>
           </w:tcPr>
-          <w:p/>
+          <w:p>
+            <w:proofErr w:type="spellStart"/>
+            <w:proofErr w:type="gramStart"/>
+            <w:r>
+              <w:t>Hunza,html</w:t>
+            </w:r>
+            <w:proofErr w:type="spellEnd"/>
+            <w:proofErr w:type="gramEnd"/>
+          </w:p>
         </w:tc>
         <w:tc>
           <w:tcPr>
@@ -1368,7 +1401,16 @@
             </w:tcMar>
             <w:vAlign w:val="center"/>
           </w:tcPr>
-          <w:p/>
+          <w:p>
+            <w:r>
+              <w:t>Feature/sana/</w:t>
+            </w:r>
+            <w:proofErr w:type="spellStart"/>
+            <w:r>
+              <w:t>hunza_develop</w:t>
+            </w:r>
+            <w:proofErr w:type="spellEnd"/>
+          </w:p>
         </w:tc>
         <w:tc>
           <w:tcPr>
@@ -1388,7 +1430,11 @@
             </w:tcMar>
             <w:vAlign w:val="center"/>
           </w:tcPr>
-          <w:p/>
+          <w:p>
+            <w:r>
+              <w:t>Y</w:t>
+            </w:r>
+          </w:p>
         </w:tc>
       </w:tr>
       <w:tr>
@@ -1953,7 +1999,11 @@
       </w:r>
       <w:proofErr w:type="spellEnd"/>
       <w:r>
-        <w:t xml:space="preserve"> – a static informational website about Pakistan's top five tourist destinations. The site consists of five HTML pages, each dedicated to one destination, plus a shared stylesheet that enforces a consistent visual identity. The website must be built using </w:t>
+        <w:t xml:space="preserve"> – a static informational website about Pakistan's top five tourist destinations. The site consists of five HTML pages, each dedicated to one destination, plus </w:t>
+      </w:r>
+      <w:r>
+        <w:lastRenderedPageBreak/>
+        <w:t xml:space="preserve">a shared stylesheet that enforces a consistent visual identity. The website must be built using </w:t>
       </w:r>
       <w:r>
         <w:rPr>
@@ -2233,25 +2283,7 @@
                 <w:sz w:val="20"/>
                 <w:szCs w:val="20"/>
               </w:rPr>
-              <w:t xml:space="preserve">-latest </w:t>
-            </w:r>
-            <w:proofErr w:type="gramStart"/>
-            <w:r>
-              <w:rPr>
-                <w:color w:val="000000"/>
-                <w:sz w:val="20"/>
-                <w:szCs w:val="20"/>
-              </w:rPr>
-              <w:t>/ :dev</w:t>
-            </w:r>
-            <w:proofErr w:type="gramEnd"/>
-            <w:r>
-              <w:rPr>
-                <w:color w:val="000000"/>
-                <w:sz w:val="20"/>
-                <w:szCs w:val="20"/>
-              </w:rPr>
-              <w:t>-&lt;sha&gt;</w:t>
+              <w:t>-latest / :dev-&lt;sha&gt;</w:t>
             </w:r>
           </w:p>
         </w:tc>
@@ -2391,25 +2423,7 @@
                 <w:sz w:val="20"/>
                 <w:szCs w:val="20"/>
               </w:rPr>
-              <w:t xml:space="preserve">-latest </w:t>
-            </w:r>
-            <w:proofErr w:type="gramStart"/>
-            <w:r>
-              <w:rPr>
-                <w:color w:val="000000"/>
-                <w:sz w:val="20"/>
-                <w:szCs w:val="20"/>
-              </w:rPr>
-              <w:t>/ :staging</w:t>
-            </w:r>
-            <w:proofErr w:type="gramEnd"/>
-            <w:r>
-              <w:rPr>
-                <w:color w:val="000000"/>
-                <w:sz w:val="20"/>
-                <w:szCs w:val="20"/>
-              </w:rPr>
-              <w:t>-&lt;sha&gt;</w:t>
+              <w:t>-latest / :staging-&lt;sha&gt;</w:t>
             </w:r>
           </w:p>
         </w:tc>
@@ -2549,25 +2563,7 @@
                 <w:sz w:val="20"/>
                 <w:szCs w:val="20"/>
               </w:rPr>
-              <w:t xml:space="preserve">-latest </w:t>
-            </w:r>
-            <w:proofErr w:type="gramStart"/>
-            <w:r>
-              <w:rPr>
-                <w:color w:val="000000"/>
-                <w:sz w:val="20"/>
-                <w:szCs w:val="20"/>
-              </w:rPr>
-              <w:t>/ :prod</w:t>
-            </w:r>
-            <w:proofErr w:type="gramEnd"/>
-            <w:r>
-              <w:rPr>
-                <w:color w:val="000000"/>
-                <w:sz w:val="20"/>
-                <w:szCs w:val="20"/>
-              </w:rPr>
-              <w:t>-&lt;sha&gt;</w:t>
+              <w:t>-latest / :prod-&lt;sha&gt;</w:t>
             </w:r>
           </w:p>
         </w:tc>
@@ -3549,6 +3545,7 @@
         <w:rPr>
           <w:color w:val="000000"/>
         </w:rPr>
+        <w:lastRenderedPageBreak/>
         <w:t>Each team member must author exactly one workflow file. The Team Lead authors the remaining workflow files as part of the repository setup.</w:t>
       </w:r>
     </w:p>
@@ -3960,25 +3957,7 @@
                 <w:sz w:val="20"/>
                 <w:szCs w:val="20"/>
               </w:rPr>
-              <w:t>-latest</w:t>
-            </w:r>
-            <w:proofErr w:type="gramStart"/>
-            <w:r>
-              <w:rPr>
-                <w:color w:val="000000"/>
-                <w:sz w:val="20"/>
-                <w:szCs w:val="20"/>
-              </w:rPr>
-              <w:t>, :dev</w:t>
-            </w:r>
-            <w:proofErr w:type="gramEnd"/>
-            <w:r>
-              <w:rPr>
-                <w:color w:val="000000"/>
-                <w:sz w:val="20"/>
-                <w:szCs w:val="20"/>
-              </w:rPr>
-              <w:t>-&lt;sha&gt;), Push to Docker Hub.</w:t>
+              <w:t>-latest, :dev-&lt;sha&gt;), Push to Docker Hub.</w:t>
             </w:r>
           </w:p>
         </w:tc>
@@ -4382,25 +4361,7 @@
                 <w:sz w:val="20"/>
                 <w:szCs w:val="20"/>
               </w:rPr>
-              <w:t>-latest</w:t>
-            </w:r>
-            <w:proofErr w:type="gramStart"/>
-            <w:r>
-              <w:rPr>
-                <w:color w:val="000000"/>
-                <w:sz w:val="20"/>
-                <w:szCs w:val="20"/>
-              </w:rPr>
-              <w:t>, :staging</w:t>
-            </w:r>
-            <w:proofErr w:type="gramEnd"/>
-            <w:r>
-              <w:rPr>
-                <w:color w:val="000000"/>
-                <w:sz w:val="20"/>
-                <w:szCs w:val="20"/>
-              </w:rPr>
-              <w:t>-&lt;sha&gt;), Push to Docker Hub.</w:t>
+              <w:t>-latest, :staging-&lt;sha&gt;), Push to Docker Hub.</w:t>
             </w:r>
           </w:p>
         </w:tc>
@@ -4804,25 +4765,7 @@
                 <w:sz w:val="20"/>
                 <w:szCs w:val="20"/>
               </w:rPr>
-              <w:t>-latest</w:t>
-            </w:r>
-            <w:proofErr w:type="gramStart"/>
-            <w:r>
-              <w:rPr>
-                <w:color w:val="000000"/>
-                <w:sz w:val="20"/>
-                <w:szCs w:val="20"/>
-              </w:rPr>
-              <w:t>, :prod</w:t>
-            </w:r>
-            <w:proofErr w:type="gramEnd"/>
-            <w:r>
-              <w:rPr>
-                <w:color w:val="000000"/>
-                <w:sz w:val="20"/>
-                <w:szCs w:val="20"/>
-              </w:rPr>
-              <w:t>-&lt;sha&gt;), Push to Docker Hub.</w:t>
+              <w:t>-latest, :prod-&lt;sha&gt;), Push to Docker Hub.</w:t>
             </w:r>
           </w:p>
         </w:tc>
@@ -8628,25 +8571,7 @@
                 <w:sz w:val="20"/>
                 <w:szCs w:val="20"/>
               </w:rPr>
-              <w:t>-</w:t>
-            </w:r>
-            <w:proofErr w:type="gramStart"/>
-            <w:r>
-              <w:rPr>
-                <w:color w:val="000000"/>
-                <w:sz w:val="20"/>
-                <w:szCs w:val="20"/>
-              </w:rPr>
-              <w:t>latest  and  :dev</w:t>
-            </w:r>
-            <w:proofErr w:type="gramEnd"/>
-            <w:r>
-              <w:rPr>
-                <w:color w:val="000000"/>
-                <w:sz w:val="20"/>
-                <w:szCs w:val="20"/>
-              </w:rPr>
-              <w:t>-&lt;sha&gt;</w:t>
+              <w:t>-latest  and  :dev-&lt;sha&gt;</w:t>
             </w:r>
           </w:p>
         </w:tc>
@@ -8790,25 +8715,7 @@
                 <w:sz w:val="20"/>
                 <w:szCs w:val="20"/>
               </w:rPr>
-              <w:t>-</w:t>
-            </w:r>
-            <w:proofErr w:type="gramStart"/>
-            <w:r>
-              <w:rPr>
-                <w:color w:val="000000"/>
-                <w:sz w:val="20"/>
-                <w:szCs w:val="20"/>
-              </w:rPr>
-              <w:t>latest  and  :staging</w:t>
-            </w:r>
-            <w:proofErr w:type="gramEnd"/>
-            <w:r>
-              <w:rPr>
-                <w:color w:val="000000"/>
-                <w:sz w:val="20"/>
-                <w:szCs w:val="20"/>
-              </w:rPr>
-              <w:t>-&lt;sha&gt;</w:t>
+              <w:t>-latest  and  :staging-&lt;sha&gt;</w:t>
             </w:r>
           </w:p>
         </w:tc>
@@ -8952,25 +8859,7 @@
                 <w:sz w:val="20"/>
                 <w:szCs w:val="20"/>
               </w:rPr>
-              <w:t>-</w:t>
-            </w:r>
-            <w:proofErr w:type="gramStart"/>
-            <w:r>
-              <w:rPr>
-                <w:color w:val="000000"/>
-                <w:sz w:val="20"/>
-                <w:szCs w:val="20"/>
-              </w:rPr>
-              <w:t>latest  and  :prod</w:t>
-            </w:r>
-            <w:proofErr w:type="gramEnd"/>
-            <w:r>
-              <w:rPr>
-                <w:color w:val="000000"/>
-                <w:sz w:val="20"/>
-                <w:szCs w:val="20"/>
-              </w:rPr>
-              <w:t>-&lt;sha&gt;</w:t>
+              <w:t>-latest  and  :prod-&lt;sha&gt;</w:t>
             </w:r>
           </w:p>
         </w:tc>
@@ -10084,9 +9973,9 @@
           <w:sz w:val="20"/>
           <w:szCs w:val="20"/>
         </w:rPr>
-        <w:t>.RENDER_DEPLOY_HOOK_DEV_</w:t>
-      </w:r>
-      <w:proofErr w:type="gramStart"/>
+        <w:t>.RENDER_DEPLOY_HOOK_DEV_URL</w:t>
+      </w:r>
+      <w:proofErr w:type="spellEnd"/>
       <w:r>
         <w:rPr>
           <w:rFonts w:ascii="Courier New" w:eastAsia="Courier New" w:hAnsi="Courier New" w:cs="Courier New"/>
@@ -10094,9 +9983,9 @@
           <w:sz w:val="20"/>
           <w:szCs w:val="20"/>
         </w:rPr>
-        <w:t>URL</w:t>
-      </w:r>
-      <w:proofErr w:type="spellEnd"/>
+        <w:t xml:space="preserve"> }}    # cd-</w:t>
+      </w:r>
+      <w:proofErr w:type="spellStart"/>
       <w:r>
         <w:rPr>
           <w:rFonts w:ascii="Courier New" w:eastAsia="Courier New" w:hAnsi="Courier New" w:cs="Courier New"/>
@@ -10104,9 +9993,15 @@
           <w:sz w:val="20"/>
           <w:szCs w:val="20"/>
         </w:rPr>
-        <w:t xml:space="preserve"> }</w:t>
-      </w:r>
-      <w:proofErr w:type="gramEnd"/>
+        <w:t>dev.yml</w:t>
+      </w:r>
+      <w:proofErr w:type="spellEnd"/>
+    </w:p>
+    <w:p>
+      <w:pPr>
+        <w:spacing w:before="40" w:after="40"/>
+        <w:ind w:left="720"/>
+      </w:pPr>
       <w:r>
         <w:rPr>
           <w:rFonts w:ascii="Courier New" w:eastAsia="Courier New" w:hAnsi="Courier New" w:cs="Courier New"/>
@@ -10114,9 +10009,9 @@
           <w:sz w:val="20"/>
           <w:szCs w:val="20"/>
         </w:rPr>
-        <w:t>}    # cd-</w:t>
-      </w:r>
-      <w:proofErr w:type="spellStart"/>
+        <w:t>curl -X POST $</w:t>
+      </w:r>
+      <w:proofErr w:type="gramStart"/>
       <w:r>
         <w:rPr>
           <w:rFonts w:ascii="Courier New" w:eastAsia="Courier New" w:hAnsi="Courier New" w:cs="Courier New"/>
@@ -10124,15 +10019,9 @@
           <w:sz w:val="20"/>
           <w:szCs w:val="20"/>
         </w:rPr>
-        <w:t>dev.yml</w:t>
-      </w:r>
-      <w:proofErr w:type="spellEnd"/>
-    </w:p>
-    <w:p>
-      <w:pPr>
-        <w:spacing w:before="40" w:after="40"/>
-        <w:ind w:left="720"/>
-      </w:pPr>
+        <w:t xml:space="preserve">{{ </w:t>
+      </w:r>
+      <w:proofErr w:type="spellStart"/>
       <w:r>
         <w:rPr>
           <w:rFonts w:ascii="Courier New" w:eastAsia="Courier New" w:hAnsi="Courier New" w:cs="Courier New"/>
@@ -10140,9 +10029,9 @@
           <w:sz w:val="20"/>
           <w:szCs w:val="20"/>
         </w:rPr>
-        <w:t>curl -X POST $</w:t>
-      </w:r>
-      <w:proofErr w:type="gramStart"/>
+        <w:t>secrets</w:t>
+      </w:r>
+      <w:proofErr w:type="gramEnd"/>
       <w:r>
         <w:rPr>
           <w:rFonts w:ascii="Courier New" w:eastAsia="Courier New" w:hAnsi="Courier New" w:cs="Courier New"/>
@@ -10150,9 +10039,9 @@
           <w:sz w:val="20"/>
           <w:szCs w:val="20"/>
         </w:rPr>
-        <w:t xml:space="preserve">{{ </w:t>
-      </w:r>
-      <w:proofErr w:type="spellStart"/>
+        <w:t>.RENDER_DEPLOY_HOOK_STAGING_URL</w:t>
+      </w:r>
+      <w:proofErr w:type="spellEnd"/>
       <w:r>
         <w:rPr>
           <w:rFonts w:ascii="Courier New" w:eastAsia="Courier New" w:hAnsi="Courier New" w:cs="Courier New"/>
@@ -10160,9 +10049,9 @@
           <w:sz w:val="20"/>
           <w:szCs w:val="20"/>
         </w:rPr>
-        <w:t>secrets</w:t>
-      </w:r>
-      <w:proofErr w:type="gramEnd"/>
+        <w:t xml:space="preserve"> }} # cd-</w:t>
+      </w:r>
+      <w:proofErr w:type="spellStart"/>
       <w:r>
         <w:rPr>
           <w:rFonts w:ascii="Courier New" w:eastAsia="Courier New" w:hAnsi="Courier New" w:cs="Courier New"/>
@@ -10170,9 +10059,15 @@
           <w:sz w:val="20"/>
           <w:szCs w:val="20"/>
         </w:rPr>
-        <w:t>.RENDER_DEPLOY_HOOK_STAGING_</w:t>
-      </w:r>
-      <w:proofErr w:type="gramStart"/>
+        <w:t>staging.yml</w:t>
+      </w:r>
+      <w:proofErr w:type="spellEnd"/>
+    </w:p>
+    <w:p>
+      <w:pPr>
+        <w:spacing w:before="40" w:after="40"/>
+        <w:ind w:left="720"/>
+      </w:pPr>
       <w:r>
         <w:rPr>
           <w:rFonts w:ascii="Courier New" w:eastAsia="Courier New" w:hAnsi="Courier New" w:cs="Courier New"/>
@@ -10180,9 +10075,9 @@
           <w:sz w:val="20"/>
           <w:szCs w:val="20"/>
         </w:rPr>
-        <w:t>URL</w:t>
-      </w:r>
-      <w:proofErr w:type="spellEnd"/>
+        <w:t>curl -X POST $</w:t>
+      </w:r>
+      <w:proofErr w:type="gramStart"/>
       <w:r>
         <w:rPr>
           <w:rFonts w:ascii="Courier New" w:eastAsia="Courier New" w:hAnsi="Courier New" w:cs="Courier New"/>
@@ -10190,9 +10085,9 @@
           <w:sz w:val="20"/>
           <w:szCs w:val="20"/>
         </w:rPr>
-        <w:t xml:space="preserve"> }</w:t>
-      </w:r>
-      <w:proofErr w:type="gramEnd"/>
+        <w:t xml:space="preserve">{{ </w:t>
+      </w:r>
+      <w:proofErr w:type="spellStart"/>
       <w:r>
         <w:rPr>
           <w:rFonts w:ascii="Courier New" w:eastAsia="Courier New" w:hAnsi="Courier New" w:cs="Courier New"/>
@@ -10200,9 +10095,9 @@
           <w:sz w:val="20"/>
           <w:szCs w:val="20"/>
         </w:rPr>
-        <w:t>} # cd-</w:t>
-      </w:r>
-      <w:proofErr w:type="spellStart"/>
+        <w:t>secrets</w:t>
+      </w:r>
+      <w:proofErr w:type="gramEnd"/>
       <w:r>
         <w:rPr>
           <w:rFonts w:ascii="Courier New" w:eastAsia="Courier New" w:hAnsi="Courier New" w:cs="Courier New"/>
@@ -10210,15 +10105,9 @@
           <w:sz w:val="20"/>
           <w:szCs w:val="20"/>
         </w:rPr>
-        <w:t>staging.yml</w:t>
+        <w:t>.RENDER_DEPLOY_HOOK_PROD_URL</w:t>
       </w:r>
       <w:proofErr w:type="spellEnd"/>
-    </w:p>
-    <w:p>
-      <w:pPr>
-        <w:spacing w:before="40" w:after="40"/>
-        <w:ind w:left="720"/>
-      </w:pPr>
       <w:r>
         <w:rPr>
           <w:rFonts w:ascii="Courier New" w:eastAsia="Courier New" w:hAnsi="Courier New" w:cs="Courier New"/>
@@ -10226,67 +10115,7 @@
           <w:sz w:val="20"/>
           <w:szCs w:val="20"/>
         </w:rPr>
-        <w:t>curl -X POST $</w:t>
-      </w:r>
-      <w:proofErr w:type="gramStart"/>
-      <w:r>
-        <w:rPr>
-          <w:rFonts w:ascii="Courier New" w:eastAsia="Courier New" w:hAnsi="Courier New" w:cs="Courier New"/>
-          <w:color w:val="C7254E"/>
-          <w:sz w:val="20"/>
-          <w:szCs w:val="20"/>
-        </w:rPr>
-        <w:t xml:space="preserve">{{ </w:t>
-      </w:r>
-      <w:proofErr w:type="spellStart"/>
-      <w:r>
-        <w:rPr>
-          <w:rFonts w:ascii="Courier New" w:eastAsia="Courier New" w:hAnsi="Courier New" w:cs="Courier New"/>
-          <w:color w:val="C7254E"/>
-          <w:sz w:val="20"/>
-          <w:szCs w:val="20"/>
-        </w:rPr>
-        <w:t>secrets</w:t>
-      </w:r>
-      <w:proofErr w:type="gramEnd"/>
-      <w:r>
-        <w:rPr>
-          <w:rFonts w:ascii="Courier New" w:eastAsia="Courier New" w:hAnsi="Courier New" w:cs="Courier New"/>
-          <w:color w:val="C7254E"/>
-          <w:sz w:val="20"/>
-          <w:szCs w:val="20"/>
-        </w:rPr>
-        <w:t>.RENDER_DEPLOY_HOOK_PROD_</w:t>
-      </w:r>
-      <w:proofErr w:type="gramStart"/>
-      <w:r>
-        <w:rPr>
-          <w:rFonts w:ascii="Courier New" w:eastAsia="Courier New" w:hAnsi="Courier New" w:cs="Courier New"/>
-          <w:color w:val="C7254E"/>
-          <w:sz w:val="20"/>
-          <w:szCs w:val="20"/>
-        </w:rPr>
-        <w:t>URL</w:t>
-      </w:r>
-      <w:proofErr w:type="spellEnd"/>
-      <w:r>
-        <w:rPr>
-          <w:rFonts w:ascii="Courier New" w:eastAsia="Courier New" w:hAnsi="Courier New" w:cs="Courier New"/>
-          <w:color w:val="C7254E"/>
-          <w:sz w:val="20"/>
-          <w:szCs w:val="20"/>
-        </w:rPr>
-        <w:t xml:space="preserve"> }</w:t>
-      </w:r>
-      <w:proofErr w:type="gramEnd"/>
-      <w:r>
-        <w:rPr>
-          <w:rFonts w:ascii="Courier New" w:eastAsia="Courier New" w:hAnsi="Courier New" w:cs="Courier New"/>
-          <w:color w:val="C7254E"/>
-          <w:sz w:val="20"/>
-          <w:szCs w:val="20"/>
-        </w:rPr>
-        <w:t>}    # cd-</w:t>
+        <w:t xml:space="preserve"> }}    # cd-</w:t>
       </w:r>
       <w:proofErr w:type="spellStart"/>
       <w:r>
@@ -11102,7 +10931,21 @@
         <w:rPr>
           <w:color w:val="000000"/>
         </w:rPr>
-        <w:t xml:space="preserve">Provide base styles for: body, h1–h3, p, a, nav, ul/li, table, </w:t>
+        <w:t xml:space="preserve">Provide base styles for: body, h1–h3, p, a, nav, </w:t>
+      </w:r>
+      <w:proofErr w:type="spellStart"/>
+      <w:r>
+        <w:rPr>
+          <w:color w:val="000000"/>
+        </w:rPr>
+        <w:t>ul</w:t>
+      </w:r>
+      <w:proofErr w:type="spellEnd"/>
+      <w:r>
+        <w:rPr>
+          <w:color w:val="000000"/>
+        </w:rPr>
+        <w:t xml:space="preserve">/li, table, </w:t>
       </w:r>
       <w:proofErr w:type="spellStart"/>
       <w:r>
@@ -11570,25 +11413,7 @@
                 <w:sz w:val="20"/>
                 <w:szCs w:val="20"/>
               </w:rPr>
-              <w:t>-latest</w:t>
-            </w:r>
-            <w:proofErr w:type="gramStart"/>
-            <w:r>
-              <w:rPr>
-                <w:color w:val="000000"/>
-                <w:sz w:val="20"/>
-                <w:szCs w:val="20"/>
-              </w:rPr>
-              <w:t>, :dev</w:t>
-            </w:r>
-            <w:proofErr w:type="gramEnd"/>
-            <w:r>
-              <w:rPr>
-                <w:color w:val="000000"/>
-                <w:sz w:val="20"/>
-                <w:szCs w:val="20"/>
-              </w:rPr>
-              <w:t>-&lt;sha&gt;) → Push to Docker Hub</w:t>
+              <w:t>-latest, :dev-&lt;sha&gt;) → Push to Docker Hub</w:t>
             </w:r>
           </w:p>
         </w:tc>
@@ -11880,25 +11705,7 @@
                 <w:sz w:val="20"/>
                 <w:szCs w:val="20"/>
               </w:rPr>
-              <w:t>-latest</w:t>
-            </w:r>
-            <w:proofErr w:type="gramStart"/>
-            <w:r>
-              <w:rPr>
-                <w:color w:val="000000"/>
-                <w:sz w:val="20"/>
-                <w:szCs w:val="20"/>
-              </w:rPr>
-              <w:t>, :staging</w:t>
-            </w:r>
-            <w:proofErr w:type="gramEnd"/>
-            <w:r>
-              <w:rPr>
-                <w:color w:val="000000"/>
-                <w:sz w:val="20"/>
-                <w:szCs w:val="20"/>
-              </w:rPr>
-              <w:t>-&lt;sha&gt;) → Push to Docker Hub</w:t>
+              <w:t>-latest, :staging-&lt;sha&gt;) → Push to Docker Hub</w:t>
             </w:r>
           </w:p>
         </w:tc>
@@ -12190,25 +11997,7 @@
                 <w:sz w:val="20"/>
                 <w:szCs w:val="20"/>
               </w:rPr>
-              <w:t>-latest</w:t>
-            </w:r>
-            <w:proofErr w:type="gramStart"/>
-            <w:r>
-              <w:rPr>
-                <w:color w:val="000000"/>
-                <w:sz w:val="20"/>
-                <w:szCs w:val="20"/>
-              </w:rPr>
-              <w:t>, :prod</w:t>
-            </w:r>
-            <w:proofErr w:type="gramEnd"/>
-            <w:r>
-              <w:rPr>
-                <w:color w:val="000000"/>
-                <w:sz w:val="20"/>
-                <w:szCs w:val="20"/>
-              </w:rPr>
-              <w:t>-&lt;sha&gt;) → Push to Docker Hub</w:t>
+              <w:t>-latest, :prod-&lt;sha&gt;) → Push to Docker Hub</w:t>
             </w:r>
           </w:p>
         </w:tc>
@@ -14448,25 +14237,7 @@
                 <w:sz w:val="20"/>
                 <w:szCs w:val="20"/>
               </w:rPr>
-              <w:t>-latest</w:t>
-            </w:r>
-            <w:proofErr w:type="gramStart"/>
-            <w:r>
-              <w:rPr>
-                <w:color w:val="000000"/>
-                <w:sz w:val="20"/>
-                <w:szCs w:val="20"/>
-              </w:rPr>
-              <w:t>, :staging</w:t>
-            </w:r>
-            <w:proofErr w:type="gramEnd"/>
-            <w:r>
-              <w:rPr>
-                <w:color w:val="000000"/>
-                <w:sz w:val="20"/>
-                <w:szCs w:val="20"/>
-              </w:rPr>
-              <w:t>-&lt;sha&gt;), push to Docker Hub succeeds.</w:t>
+              <w:t>-latest, :staging-&lt;sha&gt;), push to Docker Hub succeeds.</w:t>
             </w:r>
           </w:p>
         </w:tc>
@@ -14617,25 +14388,7 @@
                 <w:sz w:val="20"/>
                 <w:szCs w:val="20"/>
               </w:rPr>
-              <w:t>-latest</w:t>
-            </w:r>
-            <w:proofErr w:type="gramStart"/>
-            <w:r>
-              <w:rPr>
-                <w:color w:val="000000"/>
-                <w:sz w:val="20"/>
-                <w:szCs w:val="20"/>
-              </w:rPr>
-              <w:t>, :prod</w:t>
-            </w:r>
-            <w:proofErr w:type="gramEnd"/>
-            <w:r>
-              <w:rPr>
-                <w:color w:val="000000"/>
-                <w:sz w:val="20"/>
-                <w:szCs w:val="20"/>
-              </w:rPr>
-              <w:t>-&lt;sha&gt;), push to Docker Hub succeeds.</w:t>
+              <w:t>-latest, :prod-&lt;sha&gt;), push to Docker Hub succeeds.</w:t>
             </w:r>
           </w:p>
         </w:tc>
@@ -16500,44 +16253,22 @@
           <w:bCs/>
           <w:color w:val="2E75B6"/>
         </w:rPr>
-        <w:t>Member 3: [Student Name] – Reflection</w:t>
-      </w:r>
-    </w:p>
-    <w:p>
-      <w:pPr>
-        <w:pBdr>
-          <w:bottom w:val="single" w:sz="2" w:space="1" w:color="CCCCCC"/>
-        </w:pBdr>
-        <w:spacing w:before="160" w:after="40"/>
-      </w:pPr>
-      <w:r>
-        <w:rPr>
-          <w:i/>
-          <w:iCs/>
-          <w:color w:val="595959"/>
-        </w:rPr>
-        <w:t>[Write your 4–</w:t>
-      </w:r>
-      <w:proofErr w:type="gramStart"/>
-      <w:r>
-        <w:rPr>
-          <w:i/>
-          <w:iCs/>
-          <w:color w:val="595959"/>
-        </w:rPr>
-        <w:t>5 line</w:t>
-      </w:r>
-      <w:proofErr w:type="gramEnd"/>
-      <w:r>
-        <w:rPr>
-          <w:i/>
-          <w:iCs/>
-          <w:color w:val="595959"/>
-        </w:rPr>
-        <w:t xml:space="preserve"> reflection here]</w:t>
-      </w:r>
-    </w:p>
-    <w:p/>
+        <w:t xml:space="preserve">Member 3: </w:t>
+      </w:r>
+      <w:r>
+        <w:rPr>
+          <w:b/>
+          <w:bCs/>
+          <w:color w:val="2E75B6"/>
+        </w:rPr>
+        <w:t>Sana Nadeem</w:t>
+      </w:r>
+    </w:p>
+    <w:p>
+      <w:r>
+        <w:t>In this project, I learned how to set up a continuous integration pipeline using GitHub Actions and handle Docker images for staging deployment. As a beginner, troubleshooting Git commands and branch management was challenging, but it successfully taught me how automated linting ensures code quality before a merge.</w:t>
+      </w:r>
+    </w:p>
     <w:p>
       <w:pPr>
         <w:spacing w:before="100" w:after="40"/>
@@ -17987,7 +17718,7 @@
 </file>
 
 <file path=word/endnotes.xml><?xml version="1.0" encoding="utf-8"?>
-<w:endnotes xmlns:wpc="http://schemas.microsoft.com/office/word/2010/wordprocessingCanvas" xmlns:cx="http://schemas.microsoft.com/office/drawing/2014/chartex" xmlns:cx1="http://schemas.microsoft.com/office/drawing/2015/9/8/chartex" xmlns:cx2="http://schemas.microsoft.com/office/drawing/2015/10/21/chartex" xmlns:cx3="http://schemas.microsoft.com/office/drawing/2016/5/9/chartex" xmlns:cx4="http://schemas.microsoft.com/office/drawing/2016/5/10/chartex" xmlns:cx5="http://schemas.microsoft.com/office/drawing/2016/5/11/chartex" xmlns:cx6="http://schemas.microsoft.com/office/drawing/2016/5/12/chartex" xmlns:cx7="http://schemas.microsoft.com/office/drawing/2016/5/13/chartex" xmlns:cx8="http://schemas.microsoft.com/office/drawing/2016/5/14/chartex" xmlns:mc="http://schemas.openxmlformats.org/markup-compatibility/2006" xmlns:aink="http://schemas.microsoft.com/office/drawing/2016/ink" xmlns:am3d="http://schemas.microsoft.com/office/drawing/2017/model3d" xmlns:o="urn:schemas-microsoft-com:office:office" xmlns:oel="http://schemas.microsoft.com/office/2019/extlst" xmlns:r="http://schemas.openxmlformats.org/officeDocument/2006/relationships" xmlns:m="http://schemas.openxmlformats.org/officeDocument/2006/math" xmlns:v="urn:schemas-microsoft-com:vml" xmlns:wp14="http://schemas.microsoft.com/office/word/2010/wordprocessingDrawing" xmlns:wp="http://schemas.openxmlformats.org/drawingml/2006/wordprocessingDrawing" xmlns:w10="urn:schemas-microsoft-com:office:word" xmlns:w="http://schemas.openxmlformats.org/wordprocessingml/2006/main" xmlns:w14="http://schemas.microsoft.com/office/word/2010/wordml" xmlns:w15="http://schemas.microsoft.com/office/word/2012/wordml" xmlns:w16cex="http://schemas.microsoft.com/office/word/2018/wordml/cex" xmlns:w16cid="http://schemas.microsoft.com/office/word/2016/wordml/cid" xmlns:w16="http://schemas.microsoft.com/office/word/2018/wordml" xmlns:w16du="http://schemas.microsoft.com/office/word/2023/wordml/word16du" xmlns:w16sdtdh="http://schemas.microsoft.com/office/word/2020/wordml/sdtdatahash" xmlns:w16sdtfl="http://schemas.microsoft.com/office/word/2024/wordml/sdtformatlock" xmlns:w16se="http://schemas.microsoft.com/office/word/2015/wordml/symex" xmlns:wpg="http://schemas.microsoft.com/office/word/2010/wordprocessingGroup" xmlns:wpi="http://schemas.microsoft.com/office/word/2010/wordprocessingInk" xmlns:wne="http://schemas.microsoft.com/office/word/2006/wordml" xmlns:wps="http://schemas.microsoft.com/office/word/2010/wordprocessingShape" mc:Ignorable="w14 w15 w16se w16cid w16 w16cex w16sdtdh w16sdtfl w16du wp14">
+<w:endnotes xmlns:wpc="http://schemas.microsoft.com/office/word/2010/wordprocessingCanvas" xmlns:cx="http://schemas.microsoft.com/office/drawing/2014/chartex" xmlns:cx1="http://schemas.microsoft.com/office/drawing/2015/9/8/chartex" xmlns:cx2="http://schemas.microsoft.com/office/drawing/2015/10/21/chartex" xmlns:cx3="http://schemas.microsoft.com/office/drawing/2016/5/9/chartex" xmlns:cx4="http://schemas.microsoft.com/office/drawing/2016/5/10/chartex" xmlns:cx5="http://schemas.microsoft.com/office/drawing/2016/5/11/chartex" xmlns:cx6="http://schemas.microsoft.com/office/drawing/2016/5/12/chartex" xmlns:cx7="http://schemas.microsoft.com/office/drawing/2016/5/13/chartex" xmlns:cx8="http://schemas.microsoft.com/office/drawing/2016/5/14/chartex" xmlns:mc="http://schemas.openxmlformats.org/markup-compatibility/2006" xmlns:aink="http://schemas.microsoft.com/office/drawing/2016/ink" xmlns:am3d="http://schemas.microsoft.com/office/drawing/2017/model3d" xmlns:o="urn:schemas-microsoft-com:office:office" xmlns:oel="http://schemas.microsoft.com/office/2019/extlst" xmlns:r="http://schemas.openxmlformats.org/officeDocument/2006/relationships" xmlns:m="http://schemas.openxmlformats.org/officeDocument/2006/math" xmlns:v="urn:schemas-microsoft-com:vml" xmlns:wp14="http://schemas.microsoft.com/office/word/2010/wordprocessingDrawing" xmlns:wp="http://schemas.openxmlformats.org/drawingml/2006/wordprocessingDrawing" xmlns:w10="urn:schemas-microsoft-com:office:word" xmlns:w="http://schemas.openxmlformats.org/wordprocessingml/2006/main" xmlns:w14="http://schemas.microsoft.com/office/word/2010/wordml" xmlns:w15="http://schemas.microsoft.com/office/word/2012/wordml" xmlns:w16cex="http://schemas.microsoft.com/office/word/2018/wordml/cex" xmlns:w16cid="http://schemas.microsoft.com/office/word/2016/wordml/cid" xmlns:w16="http://schemas.microsoft.com/office/word/2018/wordml" xmlns:w16sdtdh="http://schemas.microsoft.com/office/word/2020/wordml/sdtdatahash" xmlns:w16se="http://schemas.microsoft.com/office/word/2015/wordml/symex" xmlns:wpg="http://schemas.microsoft.com/office/word/2010/wordprocessingGroup" xmlns:wpi="http://schemas.microsoft.com/office/word/2010/wordprocessingInk" xmlns:wne="http://schemas.microsoft.com/office/word/2006/wordml" xmlns:wps="http://schemas.microsoft.com/office/word/2010/wordprocessingShape" mc:Ignorable="w14 w15 w16se w16cid w16 w16cex w16sdtdh wp14">
   <w:endnote w:type="separator" w:id="-1">
     <w:p>
       <w:r>
@@ -18006,7 +17737,7 @@
 </file>
 
 <file path=word/footer1.xml><?xml version="1.0" encoding="utf-8"?>
-<w:ftr xmlns:wpc="http://schemas.microsoft.com/office/word/2010/wordprocessingCanvas" xmlns:cx="http://schemas.microsoft.com/office/drawing/2014/chartex" xmlns:cx1="http://schemas.microsoft.com/office/drawing/2015/9/8/chartex" xmlns:cx2="http://schemas.microsoft.com/office/drawing/2015/10/21/chartex" xmlns:cx3="http://schemas.microsoft.com/office/drawing/2016/5/9/chartex" xmlns:cx4="http://schemas.microsoft.com/office/drawing/2016/5/10/chartex" xmlns:cx5="http://schemas.microsoft.com/office/drawing/2016/5/11/chartex" xmlns:cx6="http://schemas.microsoft.com/office/drawing/2016/5/12/chartex" xmlns:cx7="http://schemas.microsoft.com/office/drawing/2016/5/13/chartex" xmlns:cx8="http://schemas.microsoft.com/office/drawing/2016/5/14/chartex" xmlns:mc="http://schemas.openxmlformats.org/markup-compatibility/2006" xmlns:aink="http://schemas.microsoft.com/office/drawing/2016/ink" xmlns:am3d="http://schemas.microsoft.com/office/drawing/2017/model3d" xmlns:o="urn:schemas-microsoft-com:office:office" xmlns:oel="http://schemas.microsoft.com/office/2019/extlst" xmlns:r="http://schemas.openxmlformats.org/officeDocument/2006/relationships" xmlns:m="http://schemas.openxmlformats.org/officeDocument/2006/math" xmlns:v="urn:schemas-microsoft-com:vml" xmlns:wp14="http://schemas.microsoft.com/office/word/2010/wordprocessingDrawing" xmlns:wp="http://schemas.openxmlformats.org/drawingml/2006/wordprocessingDrawing" xmlns:w10="urn:schemas-microsoft-com:office:word" xmlns:w="http://schemas.openxmlformats.org/wordprocessingml/2006/main" xmlns:w14="http://schemas.microsoft.com/office/word/2010/wordml" xmlns:w15="http://schemas.microsoft.com/office/word/2012/wordml" xmlns:w16cex="http://schemas.microsoft.com/office/word/2018/wordml/cex" xmlns:w16cid="http://schemas.microsoft.com/office/word/2016/wordml/cid" xmlns:w16="http://schemas.microsoft.com/office/word/2018/wordml" xmlns:w16du="http://schemas.microsoft.com/office/word/2023/wordml/word16du" xmlns:w16sdtdh="http://schemas.microsoft.com/office/word/2020/wordml/sdtdatahash" xmlns:w16sdtfl="http://schemas.microsoft.com/office/word/2024/wordml/sdtformatlock" xmlns:w16se="http://schemas.microsoft.com/office/word/2015/wordml/symex" xmlns:wpg="http://schemas.microsoft.com/office/word/2010/wordprocessingGroup" xmlns:wpi="http://schemas.microsoft.com/office/word/2010/wordprocessingInk" xmlns:wne="http://schemas.microsoft.com/office/word/2006/wordml" xmlns:wps="http://schemas.microsoft.com/office/word/2010/wordprocessingShape" mc:Ignorable="w14 w15 w16se w16cid w16 w16cex w16sdtdh w16sdtfl w16du wp14">
+<w:ftr xmlns:wpc="http://schemas.microsoft.com/office/word/2010/wordprocessingCanvas" xmlns:cx="http://schemas.microsoft.com/office/drawing/2014/chartex" xmlns:cx1="http://schemas.microsoft.com/office/drawing/2015/9/8/chartex" xmlns:cx2="http://schemas.microsoft.com/office/drawing/2015/10/21/chartex" xmlns:cx3="http://schemas.microsoft.com/office/drawing/2016/5/9/chartex" xmlns:cx4="http://schemas.microsoft.com/office/drawing/2016/5/10/chartex" xmlns:cx5="http://schemas.microsoft.com/office/drawing/2016/5/11/chartex" xmlns:cx6="http://schemas.microsoft.com/office/drawing/2016/5/12/chartex" xmlns:cx7="http://schemas.microsoft.com/office/drawing/2016/5/13/chartex" xmlns:cx8="http://schemas.microsoft.com/office/drawing/2016/5/14/chartex" xmlns:mc="http://schemas.openxmlformats.org/markup-compatibility/2006" xmlns:aink="http://schemas.microsoft.com/office/drawing/2016/ink" xmlns:am3d="http://schemas.microsoft.com/office/drawing/2017/model3d" xmlns:o="urn:schemas-microsoft-com:office:office" xmlns:oel="http://schemas.microsoft.com/office/2019/extlst" xmlns:r="http://schemas.openxmlformats.org/officeDocument/2006/relationships" xmlns:m="http://schemas.openxmlformats.org/officeDocument/2006/math" xmlns:v="urn:schemas-microsoft-com:vml" xmlns:wp14="http://schemas.microsoft.com/office/word/2010/wordprocessingDrawing" xmlns:wp="http://schemas.openxmlformats.org/drawingml/2006/wordprocessingDrawing" xmlns:w10="urn:schemas-microsoft-com:office:word" xmlns:w="http://schemas.openxmlformats.org/wordprocessingml/2006/main" xmlns:w14="http://schemas.microsoft.com/office/word/2010/wordml" xmlns:w15="http://schemas.microsoft.com/office/word/2012/wordml" xmlns:w16cex="http://schemas.microsoft.com/office/word/2018/wordml/cex" xmlns:w16cid="http://schemas.microsoft.com/office/word/2016/wordml/cid" xmlns:w16="http://schemas.microsoft.com/office/word/2018/wordml" xmlns:w16sdtdh="http://schemas.microsoft.com/office/word/2020/wordml/sdtdatahash" xmlns:w16se="http://schemas.microsoft.com/office/word/2015/wordml/symex" xmlns:wpg="http://schemas.microsoft.com/office/word/2010/wordprocessingGroup" xmlns:wpi="http://schemas.microsoft.com/office/word/2010/wordprocessingInk" xmlns:wne="http://schemas.microsoft.com/office/word/2006/wordml" xmlns:wps="http://schemas.microsoft.com/office/word/2010/wordprocessingShape" mc:Ignorable="w14 w15 w16se w16cid w16 w16cex w16sdtdh wp14">
   <w:p>
     <w:pPr>
       <w:pBdr>
@@ -18144,7 +17875,7 @@
 </file>
 
 <file path=word/footnotes.xml><?xml version="1.0" encoding="utf-8"?>
-<w:footnotes xmlns:wpc="http://schemas.microsoft.com/office/word/2010/wordprocessingCanvas" xmlns:cx="http://schemas.microsoft.com/office/drawing/2014/chartex" xmlns:cx1="http://schemas.microsoft.com/office/drawing/2015/9/8/chartex" xmlns:cx2="http://schemas.microsoft.com/office/drawing/2015/10/21/chartex" xmlns:cx3="http://schemas.microsoft.com/office/drawing/2016/5/9/chartex" xmlns:cx4="http://schemas.microsoft.com/office/drawing/2016/5/10/chartex" xmlns:cx5="http://schemas.microsoft.com/office/drawing/2016/5/11/chartex" xmlns:cx6="http://schemas.microsoft.com/office/drawing/2016/5/12/chartex" xmlns:cx7="http://schemas.microsoft.com/office/drawing/2016/5/13/chartex" xmlns:cx8="http://schemas.microsoft.com/office/drawing/2016/5/14/chartex" xmlns:mc="http://schemas.openxmlformats.org/markup-compatibility/2006" xmlns:aink="http://schemas.microsoft.com/office/drawing/2016/ink" xmlns:am3d="http://schemas.microsoft.com/office/drawing/2017/model3d" xmlns:o="urn:schemas-microsoft-com:office:office" xmlns:oel="http://schemas.microsoft.com/office/2019/extlst" xmlns:r="http://schemas.openxmlformats.org/officeDocument/2006/relationships" xmlns:m="http://schemas.openxmlformats.org/officeDocument/2006/math" xmlns:v="urn:schemas-microsoft-com:vml" xmlns:wp14="http://schemas.microsoft.com/office/word/2010/wordprocessingDrawing" xmlns:wp="http://schemas.openxmlformats.org/drawingml/2006/wordprocessingDrawing" xmlns:w10="urn:schemas-microsoft-com:office:word" xmlns:w="http://schemas.openxmlformats.org/wordprocessingml/2006/main" xmlns:w14="http://schemas.microsoft.com/office/word/2010/wordml" xmlns:w15="http://schemas.microsoft.com/office/word/2012/wordml" xmlns:w16cex="http://schemas.microsoft.com/office/word/2018/wordml/cex" xmlns:w16cid="http://schemas.microsoft.com/office/word/2016/wordml/cid" xmlns:w16="http://schemas.microsoft.com/office/word/2018/wordml" xmlns:w16du="http://schemas.microsoft.com/office/word/2023/wordml/word16du" xmlns:w16sdtdh="http://schemas.microsoft.com/office/word/2020/wordml/sdtdatahash" xmlns:w16sdtfl="http://schemas.microsoft.com/office/word/2024/wordml/sdtformatlock" xmlns:w16se="http://schemas.microsoft.com/office/word/2015/wordml/symex" xmlns:wpg="http://schemas.microsoft.com/office/word/2010/wordprocessingGroup" xmlns:wpi="http://schemas.microsoft.com/office/word/2010/wordprocessingInk" xmlns:wne="http://schemas.microsoft.com/office/word/2006/wordml" xmlns:wps="http://schemas.microsoft.com/office/word/2010/wordprocessingShape" mc:Ignorable="w14 w15 w16se w16cid w16 w16cex w16sdtdh w16sdtfl w16du wp14">
+<w:footnotes xmlns:wpc="http://schemas.microsoft.com/office/word/2010/wordprocessingCanvas" xmlns:cx="http://schemas.microsoft.com/office/drawing/2014/chartex" xmlns:cx1="http://schemas.microsoft.com/office/drawing/2015/9/8/chartex" xmlns:cx2="http://schemas.microsoft.com/office/drawing/2015/10/21/chartex" xmlns:cx3="http://schemas.microsoft.com/office/drawing/2016/5/9/chartex" xmlns:cx4="http://schemas.microsoft.com/office/drawing/2016/5/10/chartex" xmlns:cx5="http://schemas.microsoft.com/office/drawing/2016/5/11/chartex" xmlns:cx6="http://schemas.microsoft.com/office/drawing/2016/5/12/chartex" xmlns:cx7="http://schemas.microsoft.com/office/drawing/2016/5/13/chartex" xmlns:cx8="http://schemas.microsoft.com/office/drawing/2016/5/14/chartex" xmlns:mc="http://schemas.openxmlformats.org/markup-compatibility/2006" xmlns:aink="http://schemas.microsoft.com/office/drawing/2016/ink" xmlns:am3d="http://schemas.microsoft.com/office/drawing/2017/model3d" xmlns:o="urn:schemas-microsoft-com:office:office" xmlns:oel="http://schemas.microsoft.com/office/2019/extlst" xmlns:r="http://schemas.openxmlformats.org/officeDocument/2006/relationships" xmlns:m="http://schemas.openxmlformats.org/officeDocument/2006/math" xmlns:v="urn:schemas-microsoft-com:vml" xmlns:wp14="http://schemas.microsoft.com/office/word/2010/wordprocessingDrawing" xmlns:wp="http://schemas.openxmlformats.org/drawingml/2006/wordprocessingDrawing" xmlns:w10="urn:schemas-microsoft-com:office:word" xmlns:w="http://schemas.openxmlformats.org/wordprocessingml/2006/main" xmlns:w14="http://schemas.microsoft.com/office/word/2010/wordml" xmlns:w15="http://schemas.microsoft.com/office/word/2012/wordml" xmlns:w16cex="http://schemas.microsoft.com/office/word/2018/wordml/cex" xmlns:w16cid="http://schemas.microsoft.com/office/word/2016/wordml/cid" xmlns:w16="http://schemas.microsoft.com/office/word/2018/wordml" xmlns:w16sdtdh="http://schemas.microsoft.com/office/word/2020/wordml/sdtdatahash" xmlns:w16se="http://schemas.microsoft.com/office/word/2015/wordml/symex" xmlns:wpg="http://schemas.microsoft.com/office/word/2010/wordprocessingGroup" xmlns:wpi="http://schemas.microsoft.com/office/word/2010/wordprocessingInk" xmlns:wne="http://schemas.microsoft.com/office/word/2006/wordml" xmlns:wps="http://schemas.microsoft.com/office/word/2010/wordprocessingShape" mc:Ignorable="w14 w15 w16se w16cid w16 w16cex w16sdtdh wp14">
   <w:footnote w:type="separator" w:id="-1">
     <w:p>
       <w:r>
@@ -18163,7 +17894,7 @@
 </file>
 
 <file path=word/header1.xml><?xml version="1.0" encoding="utf-8"?>
-<w:hdr xmlns:wpc="http://schemas.microsoft.com/office/word/2010/wordprocessingCanvas" xmlns:cx="http://schemas.microsoft.com/office/drawing/2014/chartex" xmlns:cx1="http://schemas.microsoft.com/office/drawing/2015/9/8/chartex" xmlns:cx2="http://schemas.microsoft.com/office/drawing/2015/10/21/chartex" xmlns:cx3="http://schemas.microsoft.com/office/drawing/2016/5/9/chartex" xmlns:cx4="http://schemas.microsoft.com/office/drawing/2016/5/10/chartex" xmlns:cx5="http://schemas.microsoft.com/office/drawing/2016/5/11/chartex" xmlns:cx6="http://schemas.microsoft.com/office/drawing/2016/5/12/chartex" xmlns:cx7="http://schemas.microsoft.com/office/drawing/2016/5/13/chartex" xmlns:cx8="http://schemas.microsoft.com/office/drawing/2016/5/14/chartex" xmlns:mc="http://schemas.openxmlformats.org/markup-compatibility/2006" xmlns:aink="http://schemas.microsoft.com/office/drawing/2016/ink" xmlns:am3d="http://schemas.microsoft.com/office/drawing/2017/model3d" xmlns:o="urn:schemas-microsoft-com:office:office" xmlns:oel="http://schemas.microsoft.com/office/2019/extlst" xmlns:r="http://schemas.openxmlformats.org/officeDocument/2006/relationships" xmlns:m="http://schemas.openxmlformats.org/officeDocument/2006/math" xmlns:v="urn:schemas-microsoft-com:vml" xmlns:wp14="http://schemas.microsoft.com/office/word/2010/wordprocessingDrawing" xmlns:wp="http://schemas.openxmlformats.org/drawingml/2006/wordprocessingDrawing" xmlns:w10="urn:schemas-microsoft-com:office:word" xmlns:w="http://schemas.openxmlformats.org/wordprocessingml/2006/main" xmlns:w14="http://schemas.microsoft.com/office/word/2010/wordml" xmlns:w15="http://schemas.microsoft.com/office/word/2012/wordml" xmlns:w16cex="http://schemas.microsoft.com/office/word/2018/wordml/cex" xmlns:w16cid="http://schemas.microsoft.com/office/word/2016/wordml/cid" xmlns:w16="http://schemas.microsoft.com/office/word/2018/wordml" xmlns:w16du="http://schemas.microsoft.com/office/word/2023/wordml/word16du" xmlns:w16sdtdh="http://schemas.microsoft.com/office/word/2020/wordml/sdtdatahash" xmlns:w16sdtfl="http://schemas.microsoft.com/office/word/2024/wordml/sdtformatlock" xmlns:w16se="http://schemas.microsoft.com/office/word/2015/wordml/symex" xmlns:wpg="http://schemas.microsoft.com/office/word/2010/wordprocessingGroup" xmlns:wpi="http://schemas.microsoft.com/office/word/2010/wordprocessingInk" xmlns:wne="http://schemas.microsoft.com/office/word/2006/wordml" xmlns:wps="http://schemas.microsoft.com/office/word/2010/wordprocessingShape" mc:Ignorable="w14 w15 w16se w16cid w16 w16cex w16sdtdh w16sdtfl w16du wp14">
+<w:hdr xmlns:wpc="http://schemas.microsoft.com/office/word/2010/wordprocessingCanvas" xmlns:cx="http://schemas.microsoft.com/office/drawing/2014/chartex" xmlns:cx1="http://schemas.microsoft.com/office/drawing/2015/9/8/chartex" xmlns:cx2="http://schemas.microsoft.com/office/drawing/2015/10/21/chartex" xmlns:cx3="http://schemas.microsoft.com/office/drawing/2016/5/9/chartex" xmlns:cx4="http://schemas.microsoft.com/office/drawing/2016/5/10/chartex" xmlns:cx5="http://schemas.microsoft.com/office/drawing/2016/5/11/chartex" xmlns:cx6="http://schemas.microsoft.com/office/drawing/2016/5/12/chartex" xmlns:cx7="http://schemas.microsoft.com/office/drawing/2016/5/13/chartex" xmlns:cx8="http://schemas.microsoft.com/office/drawing/2016/5/14/chartex" xmlns:mc="http://schemas.openxmlformats.org/markup-compatibility/2006" xmlns:aink="http://schemas.microsoft.com/office/drawing/2016/ink" xmlns:am3d="http://schemas.microsoft.com/office/drawing/2017/model3d" xmlns:o="urn:schemas-microsoft-com:office:office" xmlns:oel="http://schemas.microsoft.com/office/2019/extlst" xmlns:r="http://schemas.openxmlformats.org/officeDocument/2006/relationships" xmlns:m="http://schemas.openxmlformats.org/officeDocument/2006/math" xmlns:v="urn:schemas-microsoft-com:vml" xmlns:wp14="http://schemas.microsoft.com/office/word/2010/wordprocessingDrawing" xmlns:wp="http://schemas.openxmlformats.org/drawingml/2006/wordprocessingDrawing" xmlns:w10="urn:schemas-microsoft-com:office:word" xmlns:w="http://schemas.openxmlformats.org/wordprocessingml/2006/main" xmlns:w14="http://schemas.microsoft.com/office/word/2010/wordml" xmlns:w15="http://schemas.microsoft.com/office/word/2012/wordml" xmlns:w16cex="http://schemas.microsoft.com/office/word/2018/wordml/cex" xmlns:w16cid="http://schemas.microsoft.com/office/word/2016/wordml/cid" xmlns:w16="http://schemas.microsoft.com/office/word/2018/wordml" xmlns:w16sdtdh="http://schemas.microsoft.com/office/word/2020/wordml/sdtdatahash" xmlns:w16se="http://schemas.microsoft.com/office/word/2015/wordml/symex" xmlns:wpg="http://schemas.microsoft.com/office/word/2010/wordprocessingGroup" xmlns:wpi="http://schemas.microsoft.com/office/word/2010/wordprocessingInk" xmlns:wne="http://schemas.microsoft.com/office/word/2006/wordml" xmlns:wps="http://schemas.microsoft.com/office/word/2010/wordprocessingShape" mc:Ignorable="w14 w15 w16se w16cid w16 w16cex w16sdtdh wp14">
   <w:p>
     <w:pPr>
       <w:pBdr>
@@ -18197,7 +17928,7 @@
 </file>
 
 <file path=word/numbering.xml><?xml version="1.0" encoding="utf-8"?>
-<w:numbering xmlns:wpc="http://schemas.microsoft.com/office/word/2010/wordprocessingCanvas" xmlns:cx="http://schemas.microsoft.com/office/drawing/2014/chartex" xmlns:cx1="http://schemas.microsoft.com/office/drawing/2015/9/8/chartex" xmlns:cx2="http://schemas.microsoft.com/office/drawing/2015/10/21/chartex" xmlns:cx3="http://schemas.microsoft.com/office/drawing/2016/5/9/chartex" xmlns:cx4="http://schemas.microsoft.com/office/drawing/2016/5/10/chartex" xmlns:cx5="http://schemas.microsoft.com/office/drawing/2016/5/11/chartex" xmlns:cx6="http://schemas.microsoft.com/office/drawing/2016/5/12/chartex" xmlns:cx7="http://schemas.microsoft.com/office/drawing/2016/5/13/chartex" xmlns:cx8="http://schemas.microsoft.com/office/drawing/2016/5/14/chartex" xmlns:mc="http://schemas.openxmlformats.org/markup-compatibility/2006" xmlns:aink="http://schemas.microsoft.com/office/drawing/2016/ink" xmlns:am3d="http://schemas.microsoft.com/office/drawing/2017/model3d" xmlns:o="urn:schemas-microsoft-com:office:office" xmlns:oel="http://schemas.microsoft.com/office/2019/extlst" xmlns:r="http://schemas.openxmlformats.org/officeDocument/2006/relationships" xmlns:m="http://schemas.openxmlformats.org/officeDocument/2006/math" xmlns:v="urn:schemas-microsoft-com:vml" xmlns:wp14="http://schemas.microsoft.com/office/word/2010/wordprocessingDrawing" xmlns:wp="http://schemas.openxmlformats.org/drawingml/2006/wordprocessingDrawing" xmlns:w10="urn:schemas-microsoft-com:office:word" xmlns:w="http://schemas.openxmlformats.org/wordprocessingml/2006/main" xmlns:w14="http://schemas.microsoft.com/office/word/2010/wordml" xmlns:w15="http://schemas.microsoft.com/office/word/2012/wordml" xmlns:w16cex="http://schemas.microsoft.com/office/word/2018/wordml/cex" xmlns:w16cid="http://schemas.microsoft.com/office/word/2016/wordml/cid" xmlns:w16="http://schemas.microsoft.com/office/word/2018/wordml" xmlns:w16du="http://schemas.microsoft.com/office/word/2023/wordml/word16du" xmlns:w16sdtdh="http://schemas.microsoft.com/office/word/2020/wordml/sdtdatahash" xmlns:w16sdtfl="http://schemas.microsoft.com/office/word/2024/wordml/sdtformatlock" xmlns:w16se="http://schemas.microsoft.com/office/word/2015/wordml/symex" xmlns:wpg="http://schemas.microsoft.com/office/word/2010/wordprocessingGroup" xmlns:wpi="http://schemas.microsoft.com/office/word/2010/wordprocessingInk" xmlns:wne="http://schemas.microsoft.com/office/word/2006/wordml" xmlns:wps="http://schemas.microsoft.com/office/word/2010/wordprocessingShape" mc:Ignorable="w14 w15 w16se w16cid w16 w16cex w16sdtdh w16sdtfl w16du wp14">
+<w:numbering xmlns:wpc="http://schemas.microsoft.com/office/word/2010/wordprocessingCanvas" xmlns:cx="http://schemas.microsoft.com/office/drawing/2014/chartex" xmlns:cx1="http://schemas.microsoft.com/office/drawing/2015/9/8/chartex" xmlns:cx2="http://schemas.microsoft.com/office/drawing/2015/10/21/chartex" xmlns:cx3="http://schemas.microsoft.com/office/drawing/2016/5/9/chartex" xmlns:cx4="http://schemas.microsoft.com/office/drawing/2016/5/10/chartex" xmlns:cx5="http://schemas.microsoft.com/office/drawing/2016/5/11/chartex" xmlns:cx6="http://schemas.microsoft.com/office/drawing/2016/5/12/chartex" xmlns:cx7="http://schemas.microsoft.com/office/drawing/2016/5/13/chartex" xmlns:cx8="http://schemas.microsoft.com/office/drawing/2016/5/14/chartex" xmlns:mc="http://schemas.openxmlformats.org/markup-compatibility/2006" xmlns:aink="http://schemas.microsoft.com/office/drawing/2016/ink" xmlns:am3d="http://schemas.microsoft.com/office/drawing/2017/model3d" xmlns:o="urn:schemas-microsoft-com:office:office" xmlns:oel="http://schemas.microsoft.com/office/2019/extlst" xmlns:r="http://schemas.openxmlformats.org/officeDocument/2006/relationships" xmlns:m="http://schemas.openxmlformats.org/officeDocument/2006/math" xmlns:v="urn:schemas-microsoft-com:vml" xmlns:wp14="http://schemas.microsoft.com/office/word/2010/wordprocessingDrawing" xmlns:wp="http://schemas.openxmlformats.org/drawingml/2006/wordprocessingDrawing" xmlns:w10="urn:schemas-microsoft-com:office:word" xmlns:w="http://schemas.openxmlformats.org/wordprocessingml/2006/main" xmlns:w14="http://schemas.microsoft.com/office/word/2010/wordml" xmlns:w15="http://schemas.microsoft.com/office/word/2012/wordml" xmlns:w16cex="http://schemas.microsoft.com/office/word/2018/wordml/cex" xmlns:w16cid="http://schemas.microsoft.com/office/word/2016/wordml/cid" xmlns:w16="http://schemas.microsoft.com/office/word/2018/wordml" xmlns:w16sdtdh="http://schemas.microsoft.com/office/word/2020/wordml/sdtdatahash" xmlns:w16se="http://schemas.microsoft.com/office/word/2015/wordml/symex" xmlns:wpg="http://schemas.microsoft.com/office/word/2010/wordprocessingGroup" xmlns:wpi="http://schemas.microsoft.com/office/word/2010/wordprocessingInk" xmlns:wne="http://schemas.microsoft.com/office/word/2006/wordml" xmlns:wps="http://schemas.microsoft.com/office/word/2010/wordprocessingShape" mc:Ignorable="w14 w15 w16se w16cid w16 w16cex w16sdtdh wp14">
   <w:abstractNum w:abstractNumId="0" w15:restartNumberingAfterBreak="0">
     <w:nsid w:val="0C5F5D60"/>
     <w:multiLevelType w:val="multilevel"/>
@@ -18570,7 +18301,7 @@
 </file>
 
 <file path=word/styles.xml><?xml version="1.0" encoding="utf-8"?>
-<w:styles xmlns:mc="http://schemas.openxmlformats.org/markup-compatibility/2006" xmlns:r="http://schemas.openxmlformats.org/officeDocument/2006/relationships" xmlns:w="http://schemas.openxmlformats.org/wordprocessingml/2006/main" xmlns:w14="http://schemas.microsoft.com/office/word/2010/wordml" xmlns:w15="http://schemas.microsoft.com/office/word/2012/wordml" xmlns:w16cex="http://schemas.microsoft.com/office/word/2018/wordml/cex" xmlns:w16cid="http://schemas.microsoft.com/office/word/2016/wordml/cid" xmlns:w16="http://schemas.microsoft.com/office/word/2018/wordml" xmlns:w16du="http://schemas.microsoft.com/office/word/2023/wordml/word16du" xmlns:w16sdtdh="http://schemas.microsoft.com/office/word/2020/wordml/sdtdatahash" xmlns:w16sdtfl="http://schemas.microsoft.com/office/word/2024/wordml/sdtformatlock" xmlns:w16se="http://schemas.microsoft.com/office/word/2015/wordml/symex" mc:Ignorable="w14 w15 w16se w16cid w16 w16cex w16sdtdh w16sdtfl w16du">
+<w:styles xmlns:mc="http://schemas.openxmlformats.org/markup-compatibility/2006" xmlns:r="http://schemas.openxmlformats.org/officeDocument/2006/relationships" xmlns:w="http://schemas.openxmlformats.org/wordprocessingml/2006/main" xmlns:w14="http://schemas.microsoft.com/office/word/2010/wordml" xmlns:w15="http://schemas.microsoft.com/office/word/2012/wordml" xmlns:w16cex="http://schemas.microsoft.com/office/word/2018/wordml/cex" xmlns:w16cid="http://schemas.microsoft.com/office/word/2016/wordml/cid" xmlns:w16="http://schemas.microsoft.com/office/word/2018/wordml" xmlns:w16sdtdh="http://schemas.microsoft.com/office/word/2020/wordml/sdtdatahash" xmlns:w16se="http://schemas.microsoft.com/office/word/2015/wordml/symex" mc:Ignorable="w14 w15 w16se w16cid w16 w16cex w16sdtdh">
   <w:docDefaults>
     <w:rPrDefault>
       <w:rPr>
@@ -19074,7 +18805,6 @@
   <w:style w:type="character" w:default="1" w:styleId="DefaultParagraphFont">
     <w:name w:val="Default Paragraph Font"/>
     <w:uiPriority w:val="1"/>
-    <w:semiHidden/>
     <w:unhideWhenUsed/>
   </w:style>
   <w:style w:type="table" w:default="1" w:styleId="TableNormal">

</xml_diff>

<commit_message>
Updated my name in reflections section
</commit_message>
<xml_diff>
--- a/TermProject_Spring2026.docx
+++ b/TermProject_Spring2026.docx
@@ -1,6 +1,6 @@
 
 <file path=word/document.xml><?xml version="1.0" encoding="utf-8"?>
-<w:document xmlns:wpc="http://schemas.microsoft.com/office/word/2010/wordprocessingCanvas" xmlns:cx="http://schemas.microsoft.com/office/drawing/2014/chartex" xmlns:cx1="http://schemas.microsoft.com/office/drawing/2015/9/8/chartex" xmlns:cx2="http://schemas.microsoft.com/office/drawing/2015/10/21/chartex" xmlns:cx3="http://schemas.microsoft.com/office/drawing/2016/5/9/chartex" xmlns:cx4="http://schemas.microsoft.com/office/drawing/2016/5/10/chartex" xmlns:cx5="http://schemas.microsoft.com/office/drawing/2016/5/11/chartex" xmlns:cx6="http://schemas.microsoft.com/office/drawing/2016/5/12/chartex" xmlns:cx7="http://schemas.microsoft.com/office/drawing/2016/5/13/chartex" xmlns:cx8="http://schemas.microsoft.com/office/drawing/2016/5/14/chartex" xmlns:mc="http://schemas.openxmlformats.org/markup-compatibility/2006" xmlns:aink="http://schemas.microsoft.com/office/drawing/2016/ink" xmlns:am3d="http://schemas.microsoft.com/office/drawing/2017/model3d" xmlns:o="urn:schemas-microsoft-com:office:office" xmlns:oel="http://schemas.microsoft.com/office/2019/extlst" xmlns:r="http://schemas.openxmlformats.org/officeDocument/2006/relationships" xmlns:m="http://schemas.openxmlformats.org/officeDocument/2006/math" xmlns:v="urn:schemas-microsoft-com:vml" xmlns:wp14="http://schemas.microsoft.com/office/word/2010/wordprocessingDrawing" xmlns:wp="http://schemas.openxmlformats.org/drawingml/2006/wordprocessingDrawing" xmlns:w10="urn:schemas-microsoft-com:office:word" xmlns:w="http://schemas.openxmlformats.org/wordprocessingml/2006/main" xmlns:w14="http://schemas.microsoft.com/office/word/2010/wordml" xmlns:w15="http://schemas.microsoft.com/office/word/2012/wordml" xmlns:w16cex="http://schemas.microsoft.com/office/word/2018/wordml/cex" xmlns:w16cid="http://schemas.microsoft.com/office/word/2016/wordml/cid" xmlns:w16="http://schemas.microsoft.com/office/word/2018/wordml" xmlns:w16sdtdh="http://schemas.microsoft.com/office/word/2020/wordml/sdtdatahash" xmlns:w16se="http://schemas.microsoft.com/office/word/2015/wordml/symex" xmlns:wpg="http://schemas.microsoft.com/office/word/2010/wordprocessingGroup" xmlns:wpi="http://schemas.microsoft.com/office/word/2010/wordprocessingInk" xmlns:wne="http://schemas.microsoft.com/office/word/2006/wordml" xmlns:wps="http://schemas.microsoft.com/office/word/2010/wordprocessingShape" mc:Ignorable="w14 w15 w16se w16cid w16 w16cex w16sdtdh wp14">
+<w:document xmlns:wpc="http://schemas.microsoft.com/office/word/2010/wordprocessingCanvas" xmlns:cx="http://schemas.microsoft.com/office/drawing/2014/chartex" xmlns:cx1="http://schemas.microsoft.com/office/drawing/2015/9/8/chartex" xmlns:cx2="http://schemas.microsoft.com/office/drawing/2015/10/21/chartex" xmlns:cx3="http://schemas.microsoft.com/office/drawing/2016/5/9/chartex" xmlns:cx4="http://schemas.microsoft.com/office/drawing/2016/5/10/chartex" xmlns:cx5="http://schemas.microsoft.com/office/drawing/2016/5/11/chartex" xmlns:cx6="http://schemas.microsoft.com/office/drawing/2016/5/12/chartex" xmlns:cx7="http://schemas.microsoft.com/office/drawing/2016/5/13/chartex" xmlns:cx8="http://schemas.microsoft.com/office/drawing/2016/5/14/chartex" xmlns:mc="http://schemas.openxmlformats.org/markup-compatibility/2006" xmlns:aink="http://schemas.microsoft.com/office/drawing/2016/ink" xmlns:am3d="http://schemas.microsoft.com/office/drawing/2017/model3d" xmlns:o="urn:schemas-microsoft-com:office:office" xmlns:oel="http://schemas.microsoft.com/office/2019/extlst" xmlns:r="http://schemas.openxmlformats.org/officeDocument/2006/relationships" xmlns:m="http://schemas.openxmlformats.org/officeDocument/2006/math" xmlns:v="urn:schemas-microsoft-com:vml" xmlns:wp14="http://schemas.microsoft.com/office/word/2010/wordprocessingDrawing" xmlns:wp="http://schemas.openxmlformats.org/drawingml/2006/wordprocessingDrawing" xmlns:w10="urn:schemas-microsoft-com:office:word" xmlns:w="http://schemas.openxmlformats.org/wordprocessingml/2006/main" xmlns:w14="http://schemas.microsoft.com/office/word/2010/wordml" xmlns:w15="http://schemas.microsoft.com/office/word/2012/wordml" xmlns:w16cex="http://schemas.microsoft.com/office/word/2018/wordml/cex" xmlns:w16cid="http://schemas.microsoft.com/office/word/2016/wordml/cid" xmlns:w16="http://schemas.microsoft.com/office/word/2018/wordml" xmlns:w16du="http://schemas.microsoft.com/office/word/2023/wordml/word16du" xmlns:w16sdtdh="http://schemas.microsoft.com/office/word/2020/wordml/sdtdatahash" xmlns:w16sdtfl="http://schemas.microsoft.com/office/word/2024/wordml/sdtformatlock" xmlns:w16se="http://schemas.microsoft.com/office/word/2015/wordml/symex" xmlns:wpg="http://schemas.microsoft.com/office/word/2010/wordprocessingGroup" xmlns:wpi="http://schemas.microsoft.com/office/word/2010/wordprocessingInk" xmlns:wne="http://schemas.microsoft.com/office/word/2006/wordml" xmlns:wps="http://schemas.microsoft.com/office/word/2010/wordprocessingShape" mc:Ignorable="w14 w15 w16se w16cid w16 w16cex w16sdtdh w16sdtfl w16du wp14">
   <w:body>
     <w:p>
       <w:pPr>
@@ -2283,7 +2283,25 @@
                 <w:sz w:val="20"/>
                 <w:szCs w:val="20"/>
               </w:rPr>
-              <w:t>-latest / :dev-&lt;sha&gt;</w:t>
+              <w:t xml:space="preserve">-latest </w:t>
+            </w:r>
+            <w:proofErr w:type="gramStart"/>
+            <w:r>
+              <w:rPr>
+                <w:color w:val="000000"/>
+                <w:sz w:val="20"/>
+                <w:szCs w:val="20"/>
+              </w:rPr>
+              <w:t>/ :dev</w:t>
+            </w:r>
+            <w:proofErr w:type="gramEnd"/>
+            <w:r>
+              <w:rPr>
+                <w:color w:val="000000"/>
+                <w:sz w:val="20"/>
+                <w:szCs w:val="20"/>
+              </w:rPr>
+              <w:t>-&lt;sha&gt;</w:t>
             </w:r>
           </w:p>
         </w:tc>
@@ -2423,7 +2441,25 @@
                 <w:sz w:val="20"/>
                 <w:szCs w:val="20"/>
               </w:rPr>
-              <w:t>-latest / :staging-&lt;sha&gt;</w:t>
+              <w:t xml:space="preserve">-latest </w:t>
+            </w:r>
+            <w:proofErr w:type="gramStart"/>
+            <w:r>
+              <w:rPr>
+                <w:color w:val="000000"/>
+                <w:sz w:val="20"/>
+                <w:szCs w:val="20"/>
+              </w:rPr>
+              <w:t>/ :staging</w:t>
+            </w:r>
+            <w:proofErr w:type="gramEnd"/>
+            <w:r>
+              <w:rPr>
+                <w:color w:val="000000"/>
+                <w:sz w:val="20"/>
+                <w:szCs w:val="20"/>
+              </w:rPr>
+              <w:t>-&lt;sha&gt;</w:t>
             </w:r>
           </w:p>
         </w:tc>
@@ -2563,7 +2599,25 @@
                 <w:sz w:val="20"/>
                 <w:szCs w:val="20"/>
               </w:rPr>
-              <w:t>-latest / :prod-&lt;sha&gt;</w:t>
+              <w:t xml:space="preserve">-latest </w:t>
+            </w:r>
+            <w:proofErr w:type="gramStart"/>
+            <w:r>
+              <w:rPr>
+                <w:color w:val="000000"/>
+                <w:sz w:val="20"/>
+                <w:szCs w:val="20"/>
+              </w:rPr>
+              <w:t>/ :prod</w:t>
+            </w:r>
+            <w:proofErr w:type="gramEnd"/>
+            <w:r>
+              <w:rPr>
+                <w:color w:val="000000"/>
+                <w:sz w:val="20"/>
+                <w:szCs w:val="20"/>
+              </w:rPr>
+              <w:t>-&lt;sha&gt;</w:t>
             </w:r>
           </w:p>
         </w:tc>
@@ -3957,7 +4011,25 @@
                 <w:sz w:val="20"/>
                 <w:szCs w:val="20"/>
               </w:rPr>
-              <w:t>-latest, :dev-&lt;sha&gt;), Push to Docker Hub.</w:t>
+              <w:t>-latest</w:t>
+            </w:r>
+            <w:proofErr w:type="gramStart"/>
+            <w:r>
+              <w:rPr>
+                <w:color w:val="000000"/>
+                <w:sz w:val="20"/>
+                <w:szCs w:val="20"/>
+              </w:rPr>
+              <w:t>, :dev</w:t>
+            </w:r>
+            <w:proofErr w:type="gramEnd"/>
+            <w:r>
+              <w:rPr>
+                <w:color w:val="000000"/>
+                <w:sz w:val="20"/>
+                <w:szCs w:val="20"/>
+              </w:rPr>
+              <w:t>-&lt;sha&gt;), Push to Docker Hub.</w:t>
             </w:r>
           </w:p>
         </w:tc>
@@ -4361,7 +4433,25 @@
                 <w:sz w:val="20"/>
                 <w:szCs w:val="20"/>
               </w:rPr>
-              <w:t>-latest, :staging-&lt;sha&gt;), Push to Docker Hub.</w:t>
+              <w:t>-latest</w:t>
+            </w:r>
+            <w:proofErr w:type="gramStart"/>
+            <w:r>
+              <w:rPr>
+                <w:color w:val="000000"/>
+                <w:sz w:val="20"/>
+                <w:szCs w:val="20"/>
+              </w:rPr>
+              <w:t>, :staging</w:t>
+            </w:r>
+            <w:proofErr w:type="gramEnd"/>
+            <w:r>
+              <w:rPr>
+                <w:color w:val="000000"/>
+                <w:sz w:val="20"/>
+                <w:szCs w:val="20"/>
+              </w:rPr>
+              <w:t>-&lt;sha&gt;), Push to Docker Hub.</w:t>
             </w:r>
           </w:p>
         </w:tc>
@@ -4765,7 +4855,25 @@
                 <w:sz w:val="20"/>
                 <w:szCs w:val="20"/>
               </w:rPr>
-              <w:t>-latest, :prod-&lt;sha&gt;), Push to Docker Hub.</w:t>
+              <w:t>-latest</w:t>
+            </w:r>
+            <w:proofErr w:type="gramStart"/>
+            <w:r>
+              <w:rPr>
+                <w:color w:val="000000"/>
+                <w:sz w:val="20"/>
+                <w:szCs w:val="20"/>
+              </w:rPr>
+              <w:t>, :prod</w:t>
+            </w:r>
+            <w:proofErr w:type="gramEnd"/>
+            <w:r>
+              <w:rPr>
+                <w:color w:val="000000"/>
+                <w:sz w:val="20"/>
+                <w:szCs w:val="20"/>
+              </w:rPr>
+              <w:t>-&lt;sha&gt;), Push to Docker Hub.</w:t>
             </w:r>
           </w:p>
         </w:tc>
@@ -8571,7 +8679,25 @@
                 <w:sz w:val="20"/>
                 <w:szCs w:val="20"/>
               </w:rPr>
-              <w:t>-latest  and  :dev-&lt;sha&gt;</w:t>
+              <w:t>-</w:t>
+            </w:r>
+            <w:proofErr w:type="gramStart"/>
+            <w:r>
+              <w:rPr>
+                <w:color w:val="000000"/>
+                <w:sz w:val="20"/>
+                <w:szCs w:val="20"/>
+              </w:rPr>
+              <w:t>latest  and  :dev</w:t>
+            </w:r>
+            <w:proofErr w:type="gramEnd"/>
+            <w:r>
+              <w:rPr>
+                <w:color w:val="000000"/>
+                <w:sz w:val="20"/>
+                <w:szCs w:val="20"/>
+              </w:rPr>
+              <w:t>-&lt;sha&gt;</w:t>
             </w:r>
           </w:p>
         </w:tc>
@@ -8715,7 +8841,25 @@
                 <w:sz w:val="20"/>
                 <w:szCs w:val="20"/>
               </w:rPr>
-              <w:t>-latest  and  :staging-&lt;sha&gt;</w:t>
+              <w:t>-</w:t>
+            </w:r>
+            <w:proofErr w:type="gramStart"/>
+            <w:r>
+              <w:rPr>
+                <w:color w:val="000000"/>
+                <w:sz w:val="20"/>
+                <w:szCs w:val="20"/>
+              </w:rPr>
+              <w:t>latest  and  :staging</w:t>
+            </w:r>
+            <w:proofErr w:type="gramEnd"/>
+            <w:r>
+              <w:rPr>
+                <w:color w:val="000000"/>
+                <w:sz w:val="20"/>
+                <w:szCs w:val="20"/>
+              </w:rPr>
+              <w:t>-&lt;sha&gt;</w:t>
             </w:r>
           </w:p>
         </w:tc>
@@ -8859,7 +9003,25 @@
                 <w:sz w:val="20"/>
                 <w:szCs w:val="20"/>
               </w:rPr>
-              <w:t>-latest  and  :prod-&lt;sha&gt;</w:t>
+              <w:t>-</w:t>
+            </w:r>
+            <w:proofErr w:type="gramStart"/>
+            <w:r>
+              <w:rPr>
+                <w:color w:val="000000"/>
+                <w:sz w:val="20"/>
+                <w:szCs w:val="20"/>
+              </w:rPr>
+              <w:t>latest  and  :prod</w:t>
+            </w:r>
+            <w:proofErr w:type="gramEnd"/>
+            <w:r>
+              <w:rPr>
+                <w:color w:val="000000"/>
+                <w:sz w:val="20"/>
+                <w:szCs w:val="20"/>
+              </w:rPr>
+              <w:t>-&lt;sha&gt;</w:t>
             </w:r>
           </w:p>
         </w:tc>
@@ -9973,9 +10135,9 @@
           <w:sz w:val="20"/>
           <w:szCs w:val="20"/>
         </w:rPr>
-        <w:t>.RENDER_DEPLOY_HOOK_DEV_URL</w:t>
-      </w:r>
-      <w:proofErr w:type="spellEnd"/>
+        <w:t>.RENDER_DEPLOY_HOOK_DEV_</w:t>
+      </w:r>
+      <w:proofErr w:type="gramStart"/>
       <w:r>
         <w:rPr>
           <w:rFonts w:ascii="Courier New" w:eastAsia="Courier New" w:hAnsi="Courier New" w:cs="Courier New"/>
@@ -9983,9 +10145,9 @@
           <w:sz w:val="20"/>
           <w:szCs w:val="20"/>
         </w:rPr>
-        <w:t xml:space="preserve"> }}    # cd-</w:t>
-      </w:r>
-      <w:proofErr w:type="spellStart"/>
+        <w:t>URL</w:t>
+      </w:r>
+      <w:proofErr w:type="spellEnd"/>
       <w:r>
         <w:rPr>
           <w:rFonts w:ascii="Courier New" w:eastAsia="Courier New" w:hAnsi="Courier New" w:cs="Courier New"/>
@@ -9993,15 +10155,9 @@
           <w:sz w:val="20"/>
           <w:szCs w:val="20"/>
         </w:rPr>
-        <w:t>dev.yml</w:t>
-      </w:r>
-      <w:proofErr w:type="spellEnd"/>
-    </w:p>
-    <w:p>
-      <w:pPr>
-        <w:spacing w:before="40" w:after="40"/>
-        <w:ind w:left="720"/>
-      </w:pPr>
+        <w:t xml:space="preserve"> }</w:t>
+      </w:r>
+      <w:proofErr w:type="gramEnd"/>
       <w:r>
         <w:rPr>
           <w:rFonts w:ascii="Courier New" w:eastAsia="Courier New" w:hAnsi="Courier New" w:cs="Courier New"/>
@@ -10009,9 +10165,9 @@
           <w:sz w:val="20"/>
           <w:szCs w:val="20"/>
         </w:rPr>
-        <w:t>curl -X POST $</w:t>
-      </w:r>
-      <w:proofErr w:type="gramStart"/>
+        <w:t>}    # cd-</w:t>
+      </w:r>
+      <w:proofErr w:type="spellStart"/>
       <w:r>
         <w:rPr>
           <w:rFonts w:ascii="Courier New" w:eastAsia="Courier New" w:hAnsi="Courier New" w:cs="Courier New"/>
@@ -10019,9 +10175,15 @@
           <w:sz w:val="20"/>
           <w:szCs w:val="20"/>
         </w:rPr>
-        <w:t xml:space="preserve">{{ </w:t>
-      </w:r>
-      <w:proofErr w:type="spellStart"/>
+        <w:t>dev.yml</w:t>
+      </w:r>
+      <w:proofErr w:type="spellEnd"/>
+    </w:p>
+    <w:p>
+      <w:pPr>
+        <w:spacing w:before="40" w:after="40"/>
+        <w:ind w:left="720"/>
+      </w:pPr>
       <w:r>
         <w:rPr>
           <w:rFonts w:ascii="Courier New" w:eastAsia="Courier New" w:hAnsi="Courier New" w:cs="Courier New"/>
@@ -10029,9 +10191,9 @@
           <w:sz w:val="20"/>
           <w:szCs w:val="20"/>
         </w:rPr>
-        <w:t>secrets</w:t>
-      </w:r>
-      <w:proofErr w:type="gramEnd"/>
+        <w:t>curl -X POST $</w:t>
+      </w:r>
+      <w:proofErr w:type="gramStart"/>
       <w:r>
         <w:rPr>
           <w:rFonts w:ascii="Courier New" w:eastAsia="Courier New" w:hAnsi="Courier New" w:cs="Courier New"/>
@@ -10039,9 +10201,9 @@
           <w:sz w:val="20"/>
           <w:szCs w:val="20"/>
         </w:rPr>
-        <w:t>.RENDER_DEPLOY_HOOK_STAGING_URL</w:t>
-      </w:r>
-      <w:proofErr w:type="spellEnd"/>
+        <w:t xml:space="preserve">{{ </w:t>
+      </w:r>
+      <w:proofErr w:type="spellStart"/>
       <w:r>
         <w:rPr>
           <w:rFonts w:ascii="Courier New" w:eastAsia="Courier New" w:hAnsi="Courier New" w:cs="Courier New"/>
@@ -10049,9 +10211,9 @@
           <w:sz w:val="20"/>
           <w:szCs w:val="20"/>
         </w:rPr>
-        <w:t xml:space="preserve"> }} # cd-</w:t>
-      </w:r>
-      <w:proofErr w:type="spellStart"/>
+        <w:t>secrets</w:t>
+      </w:r>
+      <w:proofErr w:type="gramEnd"/>
       <w:r>
         <w:rPr>
           <w:rFonts w:ascii="Courier New" w:eastAsia="Courier New" w:hAnsi="Courier New" w:cs="Courier New"/>
@@ -10059,15 +10221,9 @@
           <w:sz w:val="20"/>
           <w:szCs w:val="20"/>
         </w:rPr>
-        <w:t>staging.yml</w:t>
-      </w:r>
-      <w:proofErr w:type="spellEnd"/>
-    </w:p>
-    <w:p>
-      <w:pPr>
-        <w:spacing w:before="40" w:after="40"/>
-        <w:ind w:left="720"/>
-      </w:pPr>
+        <w:t>.RENDER_DEPLOY_HOOK_STAGING_</w:t>
+      </w:r>
+      <w:proofErr w:type="gramStart"/>
       <w:r>
         <w:rPr>
           <w:rFonts w:ascii="Courier New" w:eastAsia="Courier New" w:hAnsi="Courier New" w:cs="Courier New"/>
@@ -10075,9 +10231,9 @@
           <w:sz w:val="20"/>
           <w:szCs w:val="20"/>
         </w:rPr>
-        <w:t>curl -X POST $</w:t>
-      </w:r>
-      <w:proofErr w:type="gramStart"/>
+        <w:t>URL</w:t>
+      </w:r>
+      <w:proofErr w:type="spellEnd"/>
       <w:r>
         <w:rPr>
           <w:rFonts w:ascii="Courier New" w:eastAsia="Courier New" w:hAnsi="Courier New" w:cs="Courier New"/>
@@ -10085,9 +10241,9 @@
           <w:sz w:val="20"/>
           <w:szCs w:val="20"/>
         </w:rPr>
-        <w:t xml:space="preserve">{{ </w:t>
-      </w:r>
-      <w:proofErr w:type="spellStart"/>
+        <w:t xml:space="preserve"> }</w:t>
+      </w:r>
+      <w:proofErr w:type="gramEnd"/>
       <w:r>
         <w:rPr>
           <w:rFonts w:ascii="Courier New" w:eastAsia="Courier New" w:hAnsi="Courier New" w:cs="Courier New"/>
@@ -10095,9 +10251,9 @@
           <w:sz w:val="20"/>
           <w:szCs w:val="20"/>
         </w:rPr>
-        <w:t>secrets</w:t>
-      </w:r>
-      <w:proofErr w:type="gramEnd"/>
+        <w:t>} # cd-</w:t>
+      </w:r>
+      <w:proofErr w:type="spellStart"/>
       <w:r>
         <w:rPr>
           <w:rFonts w:ascii="Courier New" w:eastAsia="Courier New" w:hAnsi="Courier New" w:cs="Courier New"/>
@@ -10105,9 +10261,15 @@
           <w:sz w:val="20"/>
           <w:szCs w:val="20"/>
         </w:rPr>
-        <w:t>.RENDER_DEPLOY_HOOK_PROD_URL</w:t>
+        <w:t>staging.yml</w:t>
       </w:r>
       <w:proofErr w:type="spellEnd"/>
+    </w:p>
+    <w:p>
+      <w:pPr>
+        <w:spacing w:before="40" w:after="40"/>
+        <w:ind w:left="720"/>
+      </w:pPr>
       <w:r>
         <w:rPr>
           <w:rFonts w:ascii="Courier New" w:eastAsia="Courier New" w:hAnsi="Courier New" w:cs="Courier New"/>
@@ -10115,7 +10277,67 @@
           <w:sz w:val="20"/>
           <w:szCs w:val="20"/>
         </w:rPr>
-        <w:t xml:space="preserve"> }}    # cd-</w:t>
+        <w:t>curl -X POST $</w:t>
+      </w:r>
+      <w:proofErr w:type="gramStart"/>
+      <w:r>
+        <w:rPr>
+          <w:rFonts w:ascii="Courier New" w:eastAsia="Courier New" w:hAnsi="Courier New" w:cs="Courier New"/>
+          <w:color w:val="C7254E"/>
+          <w:sz w:val="20"/>
+          <w:szCs w:val="20"/>
+        </w:rPr>
+        <w:t xml:space="preserve">{{ </w:t>
+      </w:r>
+      <w:proofErr w:type="spellStart"/>
+      <w:r>
+        <w:rPr>
+          <w:rFonts w:ascii="Courier New" w:eastAsia="Courier New" w:hAnsi="Courier New" w:cs="Courier New"/>
+          <w:color w:val="C7254E"/>
+          <w:sz w:val="20"/>
+          <w:szCs w:val="20"/>
+        </w:rPr>
+        <w:t>secrets</w:t>
+      </w:r>
+      <w:proofErr w:type="gramEnd"/>
+      <w:r>
+        <w:rPr>
+          <w:rFonts w:ascii="Courier New" w:eastAsia="Courier New" w:hAnsi="Courier New" w:cs="Courier New"/>
+          <w:color w:val="C7254E"/>
+          <w:sz w:val="20"/>
+          <w:szCs w:val="20"/>
+        </w:rPr>
+        <w:t>.RENDER_DEPLOY_HOOK_PROD_</w:t>
+      </w:r>
+      <w:proofErr w:type="gramStart"/>
+      <w:r>
+        <w:rPr>
+          <w:rFonts w:ascii="Courier New" w:eastAsia="Courier New" w:hAnsi="Courier New" w:cs="Courier New"/>
+          <w:color w:val="C7254E"/>
+          <w:sz w:val="20"/>
+          <w:szCs w:val="20"/>
+        </w:rPr>
+        <w:t>URL</w:t>
+      </w:r>
+      <w:proofErr w:type="spellEnd"/>
+      <w:r>
+        <w:rPr>
+          <w:rFonts w:ascii="Courier New" w:eastAsia="Courier New" w:hAnsi="Courier New" w:cs="Courier New"/>
+          <w:color w:val="C7254E"/>
+          <w:sz w:val="20"/>
+          <w:szCs w:val="20"/>
+        </w:rPr>
+        <w:t xml:space="preserve"> }</w:t>
+      </w:r>
+      <w:proofErr w:type="gramEnd"/>
+      <w:r>
+        <w:rPr>
+          <w:rFonts w:ascii="Courier New" w:eastAsia="Courier New" w:hAnsi="Courier New" w:cs="Courier New"/>
+          <w:color w:val="C7254E"/>
+          <w:sz w:val="20"/>
+          <w:szCs w:val="20"/>
+        </w:rPr>
+        <w:t>}    # cd-</w:t>
       </w:r>
       <w:proofErr w:type="spellStart"/>
       <w:r>
@@ -10931,21 +11153,7 @@
         <w:rPr>
           <w:color w:val="000000"/>
         </w:rPr>
-        <w:t xml:space="preserve">Provide base styles for: body, h1–h3, p, a, nav, </w:t>
-      </w:r>
-      <w:proofErr w:type="spellStart"/>
-      <w:r>
-        <w:rPr>
-          <w:color w:val="000000"/>
-        </w:rPr>
-        <w:t>ul</w:t>
-      </w:r>
-      <w:proofErr w:type="spellEnd"/>
-      <w:r>
-        <w:rPr>
-          <w:color w:val="000000"/>
-        </w:rPr>
-        <w:t xml:space="preserve">/li, table, </w:t>
+        <w:t xml:space="preserve">Provide base styles for: body, h1–h3, p, a, nav, ul/li, table, </w:t>
       </w:r>
       <w:proofErr w:type="spellStart"/>
       <w:r>
@@ -11413,7 +11621,25 @@
                 <w:sz w:val="20"/>
                 <w:szCs w:val="20"/>
               </w:rPr>
-              <w:t>-latest, :dev-&lt;sha&gt;) → Push to Docker Hub</w:t>
+              <w:t>-latest</w:t>
+            </w:r>
+            <w:proofErr w:type="gramStart"/>
+            <w:r>
+              <w:rPr>
+                <w:color w:val="000000"/>
+                <w:sz w:val="20"/>
+                <w:szCs w:val="20"/>
+              </w:rPr>
+              <w:t>, :dev</w:t>
+            </w:r>
+            <w:proofErr w:type="gramEnd"/>
+            <w:r>
+              <w:rPr>
+                <w:color w:val="000000"/>
+                <w:sz w:val="20"/>
+                <w:szCs w:val="20"/>
+              </w:rPr>
+              <w:t>-&lt;sha&gt;) → Push to Docker Hub</w:t>
             </w:r>
           </w:p>
         </w:tc>
@@ -11705,7 +11931,25 @@
                 <w:sz w:val="20"/>
                 <w:szCs w:val="20"/>
               </w:rPr>
-              <w:t>-latest, :staging-&lt;sha&gt;) → Push to Docker Hub</w:t>
+              <w:t>-latest</w:t>
+            </w:r>
+            <w:proofErr w:type="gramStart"/>
+            <w:r>
+              <w:rPr>
+                <w:color w:val="000000"/>
+                <w:sz w:val="20"/>
+                <w:szCs w:val="20"/>
+              </w:rPr>
+              <w:t>, :staging</w:t>
+            </w:r>
+            <w:proofErr w:type="gramEnd"/>
+            <w:r>
+              <w:rPr>
+                <w:color w:val="000000"/>
+                <w:sz w:val="20"/>
+                <w:szCs w:val="20"/>
+              </w:rPr>
+              <w:t>-&lt;sha&gt;) → Push to Docker Hub</w:t>
             </w:r>
           </w:p>
         </w:tc>
@@ -11997,7 +12241,25 @@
                 <w:sz w:val="20"/>
                 <w:szCs w:val="20"/>
               </w:rPr>
-              <w:t>-latest, :prod-&lt;sha&gt;) → Push to Docker Hub</w:t>
+              <w:t>-latest</w:t>
+            </w:r>
+            <w:proofErr w:type="gramStart"/>
+            <w:r>
+              <w:rPr>
+                <w:color w:val="000000"/>
+                <w:sz w:val="20"/>
+                <w:szCs w:val="20"/>
+              </w:rPr>
+              <w:t>, :prod</w:t>
+            </w:r>
+            <w:proofErr w:type="gramEnd"/>
+            <w:r>
+              <w:rPr>
+                <w:color w:val="000000"/>
+                <w:sz w:val="20"/>
+                <w:szCs w:val="20"/>
+              </w:rPr>
+              <w:t>-&lt;sha&gt;) → Push to Docker Hub</w:t>
             </w:r>
           </w:p>
         </w:tc>
@@ -14237,7 +14499,25 @@
                 <w:sz w:val="20"/>
                 <w:szCs w:val="20"/>
               </w:rPr>
-              <w:t>-latest, :staging-&lt;sha&gt;), push to Docker Hub succeeds.</w:t>
+              <w:t>-latest</w:t>
+            </w:r>
+            <w:proofErr w:type="gramStart"/>
+            <w:r>
+              <w:rPr>
+                <w:color w:val="000000"/>
+                <w:sz w:val="20"/>
+                <w:szCs w:val="20"/>
+              </w:rPr>
+              <w:t>, :staging</w:t>
+            </w:r>
+            <w:proofErr w:type="gramEnd"/>
+            <w:r>
+              <w:rPr>
+                <w:color w:val="000000"/>
+                <w:sz w:val="20"/>
+                <w:szCs w:val="20"/>
+              </w:rPr>
+              <w:t>-&lt;sha&gt;), push to Docker Hub succeeds.</w:t>
             </w:r>
           </w:p>
         </w:tc>
@@ -14388,7 +14668,25 @@
                 <w:sz w:val="20"/>
                 <w:szCs w:val="20"/>
               </w:rPr>
-              <w:t>-latest, :prod-&lt;sha&gt;), push to Docker Hub succeeds.</w:t>
+              <w:t>-latest</w:t>
+            </w:r>
+            <w:proofErr w:type="gramStart"/>
+            <w:r>
+              <w:rPr>
+                <w:color w:val="000000"/>
+                <w:sz w:val="20"/>
+                <w:szCs w:val="20"/>
+              </w:rPr>
+              <w:t>, :prod</w:t>
+            </w:r>
+            <w:proofErr w:type="gramEnd"/>
+            <w:r>
+              <w:rPr>
+                <w:color w:val="000000"/>
+                <w:sz w:val="20"/>
+                <w:szCs w:val="20"/>
+              </w:rPr>
+              <w:t>-&lt;sha&gt;), push to Docker Hub succeeds.</w:t>
             </w:r>
           </w:p>
         </w:tc>
@@ -16328,7 +16626,15 @@
           <w:bCs/>
           <w:color w:val="2E75B6"/>
         </w:rPr>
-        <w:t>Member 5: [Student Name] – Reflection</w:t>
+        <w:t xml:space="preserve">Member 5: </w:t>
+      </w:r>
+      <w:r>
+        <w:rPr>
+          <w:b/>
+          <w:bCs/>
+          <w:color w:val="2E75B6"/>
+        </w:rPr>
+        <w:t>Owais Murtaza</w:t>
       </w:r>
     </w:p>
     <w:p>
@@ -17718,7 +18024,7 @@
 </file>
 
 <file path=word/endnotes.xml><?xml version="1.0" encoding="utf-8"?>
-<w:endnotes xmlns:wpc="http://schemas.microsoft.com/office/word/2010/wordprocessingCanvas" xmlns:cx="http://schemas.microsoft.com/office/drawing/2014/chartex" xmlns:cx1="http://schemas.microsoft.com/office/drawing/2015/9/8/chartex" xmlns:cx2="http://schemas.microsoft.com/office/drawing/2015/10/21/chartex" xmlns:cx3="http://schemas.microsoft.com/office/drawing/2016/5/9/chartex" xmlns:cx4="http://schemas.microsoft.com/office/drawing/2016/5/10/chartex" xmlns:cx5="http://schemas.microsoft.com/office/drawing/2016/5/11/chartex" xmlns:cx6="http://schemas.microsoft.com/office/drawing/2016/5/12/chartex" xmlns:cx7="http://schemas.microsoft.com/office/drawing/2016/5/13/chartex" xmlns:cx8="http://schemas.microsoft.com/office/drawing/2016/5/14/chartex" xmlns:mc="http://schemas.openxmlformats.org/markup-compatibility/2006" xmlns:aink="http://schemas.microsoft.com/office/drawing/2016/ink" xmlns:am3d="http://schemas.microsoft.com/office/drawing/2017/model3d" xmlns:o="urn:schemas-microsoft-com:office:office" xmlns:oel="http://schemas.microsoft.com/office/2019/extlst" xmlns:r="http://schemas.openxmlformats.org/officeDocument/2006/relationships" xmlns:m="http://schemas.openxmlformats.org/officeDocument/2006/math" xmlns:v="urn:schemas-microsoft-com:vml" xmlns:wp14="http://schemas.microsoft.com/office/word/2010/wordprocessingDrawing" xmlns:wp="http://schemas.openxmlformats.org/drawingml/2006/wordprocessingDrawing" xmlns:w10="urn:schemas-microsoft-com:office:word" xmlns:w="http://schemas.openxmlformats.org/wordprocessingml/2006/main" xmlns:w14="http://schemas.microsoft.com/office/word/2010/wordml" xmlns:w15="http://schemas.microsoft.com/office/word/2012/wordml" xmlns:w16cex="http://schemas.microsoft.com/office/word/2018/wordml/cex" xmlns:w16cid="http://schemas.microsoft.com/office/word/2016/wordml/cid" xmlns:w16="http://schemas.microsoft.com/office/word/2018/wordml" xmlns:w16sdtdh="http://schemas.microsoft.com/office/word/2020/wordml/sdtdatahash" xmlns:w16se="http://schemas.microsoft.com/office/word/2015/wordml/symex" xmlns:wpg="http://schemas.microsoft.com/office/word/2010/wordprocessingGroup" xmlns:wpi="http://schemas.microsoft.com/office/word/2010/wordprocessingInk" xmlns:wne="http://schemas.microsoft.com/office/word/2006/wordml" xmlns:wps="http://schemas.microsoft.com/office/word/2010/wordprocessingShape" mc:Ignorable="w14 w15 w16se w16cid w16 w16cex w16sdtdh wp14">
+<w:endnotes xmlns:wpc="http://schemas.microsoft.com/office/word/2010/wordprocessingCanvas" xmlns:cx="http://schemas.microsoft.com/office/drawing/2014/chartex" xmlns:cx1="http://schemas.microsoft.com/office/drawing/2015/9/8/chartex" xmlns:cx2="http://schemas.microsoft.com/office/drawing/2015/10/21/chartex" xmlns:cx3="http://schemas.microsoft.com/office/drawing/2016/5/9/chartex" xmlns:cx4="http://schemas.microsoft.com/office/drawing/2016/5/10/chartex" xmlns:cx5="http://schemas.microsoft.com/office/drawing/2016/5/11/chartex" xmlns:cx6="http://schemas.microsoft.com/office/drawing/2016/5/12/chartex" xmlns:cx7="http://schemas.microsoft.com/office/drawing/2016/5/13/chartex" xmlns:cx8="http://schemas.microsoft.com/office/drawing/2016/5/14/chartex" xmlns:mc="http://schemas.openxmlformats.org/markup-compatibility/2006" xmlns:aink="http://schemas.microsoft.com/office/drawing/2016/ink" xmlns:am3d="http://schemas.microsoft.com/office/drawing/2017/model3d" xmlns:o="urn:schemas-microsoft-com:office:office" xmlns:oel="http://schemas.microsoft.com/office/2019/extlst" xmlns:r="http://schemas.openxmlformats.org/officeDocument/2006/relationships" xmlns:m="http://schemas.openxmlformats.org/officeDocument/2006/math" xmlns:v="urn:schemas-microsoft-com:vml" xmlns:wp14="http://schemas.microsoft.com/office/word/2010/wordprocessingDrawing" xmlns:wp="http://schemas.openxmlformats.org/drawingml/2006/wordprocessingDrawing" xmlns:w10="urn:schemas-microsoft-com:office:word" xmlns:w="http://schemas.openxmlformats.org/wordprocessingml/2006/main" xmlns:w14="http://schemas.microsoft.com/office/word/2010/wordml" xmlns:w15="http://schemas.microsoft.com/office/word/2012/wordml" xmlns:w16cex="http://schemas.microsoft.com/office/word/2018/wordml/cex" xmlns:w16cid="http://schemas.microsoft.com/office/word/2016/wordml/cid" xmlns:w16="http://schemas.microsoft.com/office/word/2018/wordml" xmlns:w16du="http://schemas.microsoft.com/office/word/2023/wordml/word16du" xmlns:w16sdtdh="http://schemas.microsoft.com/office/word/2020/wordml/sdtdatahash" xmlns:w16sdtfl="http://schemas.microsoft.com/office/word/2024/wordml/sdtformatlock" xmlns:w16se="http://schemas.microsoft.com/office/word/2015/wordml/symex" xmlns:wpg="http://schemas.microsoft.com/office/word/2010/wordprocessingGroup" xmlns:wpi="http://schemas.microsoft.com/office/word/2010/wordprocessingInk" xmlns:wne="http://schemas.microsoft.com/office/word/2006/wordml" xmlns:wps="http://schemas.microsoft.com/office/word/2010/wordprocessingShape" mc:Ignorable="w14 w15 w16se w16cid w16 w16cex w16sdtdh w16sdtfl w16du wp14">
   <w:endnote w:type="separator" w:id="-1">
     <w:p>
       <w:r>
@@ -17737,7 +18043,7 @@
 </file>
 
 <file path=word/footer1.xml><?xml version="1.0" encoding="utf-8"?>
-<w:ftr xmlns:wpc="http://schemas.microsoft.com/office/word/2010/wordprocessingCanvas" xmlns:cx="http://schemas.microsoft.com/office/drawing/2014/chartex" xmlns:cx1="http://schemas.microsoft.com/office/drawing/2015/9/8/chartex" xmlns:cx2="http://schemas.microsoft.com/office/drawing/2015/10/21/chartex" xmlns:cx3="http://schemas.microsoft.com/office/drawing/2016/5/9/chartex" xmlns:cx4="http://schemas.microsoft.com/office/drawing/2016/5/10/chartex" xmlns:cx5="http://schemas.microsoft.com/office/drawing/2016/5/11/chartex" xmlns:cx6="http://schemas.microsoft.com/office/drawing/2016/5/12/chartex" xmlns:cx7="http://schemas.microsoft.com/office/drawing/2016/5/13/chartex" xmlns:cx8="http://schemas.microsoft.com/office/drawing/2016/5/14/chartex" xmlns:mc="http://schemas.openxmlformats.org/markup-compatibility/2006" xmlns:aink="http://schemas.microsoft.com/office/drawing/2016/ink" xmlns:am3d="http://schemas.microsoft.com/office/drawing/2017/model3d" xmlns:o="urn:schemas-microsoft-com:office:office" xmlns:oel="http://schemas.microsoft.com/office/2019/extlst" xmlns:r="http://schemas.openxmlformats.org/officeDocument/2006/relationships" xmlns:m="http://schemas.openxmlformats.org/officeDocument/2006/math" xmlns:v="urn:schemas-microsoft-com:vml" xmlns:wp14="http://schemas.microsoft.com/office/word/2010/wordprocessingDrawing" xmlns:wp="http://schemas.openxmlformats.org/drawingml/2006/wordprocessingDrawing" xmlns:w10="urn:schemas-microsoft-com:office:word" xmlns:w="http://schemas.openxmlformats.org/wordprocessingml/2006/main" xmlns:w14="http://schemas.microsoft.com/office/word/2010/wordml" xmlns:w15="http://schemas.microsoft.com/office/word/2012/wordml" xmlns:w16cex="http://schemas.microsoft.com/office/word/2018/wordml/cex" xmlns:w16cid="http://schemas.microsoft.com/office/word/2016/wordml/cid" xmlns:w16="http://schemas.microsoft.com/office/word/2018/wordml" xmlns:w16sdtdh="http://schemas.microsoft.com/office/word/2020/wordml/sdtdatahash" xmlns:w16se="http://schemas.microsoft.com/office/word/2015/wordml/symex" xmlns:wpg="http://schemas.microsoft.com/office/word/2010/wordprocessingGroup" xmlns:wpi="http://schemas.microsoft.com/office/word/2010/wordprocessingInk" xmlns:wne="http://schemas.microsoft.com/office/word/2006/wordml" xmlns:wps="http://schemas.microsoft.com/office/word/2010/wordprocessingShape" mc:Ignorable="w14 w15 w16se w16cid w16 w16cex w16sdtdh wp14">
+<w:ftr xmlns:wpc="http://schemas.microsoft.com/office/word/2010/wordprocessingCanvas" xmlns:cx="http://schemas.microsoft.com/office/drawing/2014/chartex" xmlns:cx1="http://schemas.microsoft.com/office/drawing/2015/9/8/chartex" xmlns:cx2="http://schemas.microsoft.com/office/drawing/2015/10/21/chartex" xmlns:cx3="http://schemas.microsoft.com/office/drawing/2016/5/9/chartex" xmlns:cx4="http://schemas.microsoft.com/office/drawing/2016/5/10/chartex" xmlns:cx5="http://schemas.microsoft.com/office/drawing/2016/5/11/chartex" xmlns:cx6="http://schemas.microsoft.com/office/drawing/2016/5/12/chartex" xmlns:cx7="http://schemas.microsoft.com/office/drawing/2016/5/13/chartex" xmlns:cx8="http://schemas.microsoft.com/office/drawing/2016/5/14/chartex" xmlns:mc="http://schemas.openxmlformats.org/markup-compatibility/2006" xmlns:aink="http://schemas.microsoft.com/office/drawing/2016/ink" xmlns:am3d="http://schemas.microsoft.com/office/drawing/2017/model3d" xmlns:o="urn:schemas-microsoft-com:office:office" xmlns:oel="http://schemas.microsoft.com/office/2019/extlst" xmlns:r="http://schemas.openxmlformats.org/officeDocument/2006/relationships" xmlns:m="http://schemas.openxmlformats.org/officeDocument/2006/math" xmlns:v="urn:schemas-microsoft-com:vml" xmlns:wp14="http://schemas.microsoft.com/office/word/2010/wordprocessingDrawing" xmlns:wp="http://schemas.openxmlformats.org/drawingml/2006/wordprocessingDrawing" xmlns:w10="urn:schemas-microsoft-com:office:word" xmlns:w="http://schemas.openxmlformats.org/wordprocessingml/2006/main" xmlns:w14="http://schemas.microsoft.com/office/word/2010/wordml" xmlns:w15="http://schemas.microsoft.com/office/word/2012/wordml" xmlns:w16cex="http://schemas.microsoft.com/office/word/2018/wordml/cex" xmlns:w16cid="http://schemas.microsoft.com/office/word/2016/wordml/cid" xmlns:w16="http://schemas.microsoft.com/office/word/2018/wordml" xmlns:w16du="http://schemas.microsoft.com/office/word/2023/wordml/word16du" xmlns:w16sdtdh="http://schemas.microsoft.com/office/word/2020/wordml/sdtdatahash" xmlns:w16sdtfl="http://schemas.microsoft.com/office/word/2024/wordml/sdtformatlock" xmlns:w16se="http://schemas.microsoft.com/office/word/2015/wordml/symex" xmlns:wpg="http://schemas.microsoft.com/office/word/2010/wordprocessingGroup" xmlns:wpi="http://schemas.microsoft.com/office/word/2010/wordprocessingInk" xmlns:wne="http://schemas.microsoft.com/office/word/2006/wordml" xmlns:wps="http://schemas.microsoft.com/office/word/2010/wordprocessingShape" mc:Ignorable="w14 w15 w16se w16cid w16 w16cex w16sdtdh w16sdtfl w16du wp14">
   <w:p>
     <w:pPr>
       <w:pBdr>
@@ -17875,7 +18181,7 @@
 </file>
 
 <file path=word/footnotes.xml><?xml version="1.0" encoding="utf-8"?>
-<w:footnotes xmlns:wpc="http://schemas.microsoft.com/office/word/2010/wordprocessingCanvas" xmlns:cx="http://schemas.microsoft.com/office/drawing/2014/chartex" xmlns:cx1="http://schemas.microsoft.com/office/drawing/2015/9/8/chartex" xmlns:cx2="http://schemas.microsoft.com/office/drawing/2015/10/21/chartex" xmlns:cx3="http://schemas.microsoft.com/office/drawing/2016/5/9/chartex" xmlns:cx4="http://schemas.microsoft.com/office/drawing/2016/5/10/chartex" xmlns:cx5="http://schemas.microsoft.com/office/drawing/2016/5/11/chartex" xmlns:cx6="http://schemas.microsoft.com/office/drawing/2016/5/12/chartex" xmlns:cx7="http://schemas.microsoft.com/office/drawing/2016/5/13/chartex" xmlns:cx8="http://schemas.microsoft.com/office/drawing/2016/5/14/chartex" xmlns:mc="http://schemas.openxmlformats.org/markup-compatibility/2006" xmlns:aink="http://schemas.microsoft.com/office/drawing/2016/ink" xmlns:am3d="http://schemas.microsoft.com/office/drawing/2017/model3d" xmlns:o="urn:schemas-microsoft-com:office:office" xmlns:oel="http://schemas.microsoft.com/office/2019/extlst" xmlns:r="http://schemas.openxmlformats.org/officeDocument/2006/relationships" xmlns:m="http://schemas.openxmlformats.org/officeDocument/2006/math" xmlns:v="urn:schemas-microsoft-com:vml" xmlns:wp14="http://schemas.microsoft.com/office/word/2010/wordprocessingDrawing" xmlns:wp="http://schemas.openxmlformats.org/drawingml/2006/wordprocessingDrawing" xmlns:w10="urn:schemas-microsoft-com:office:word" xmlns:w="http://schemas.openxmlformats.org/wordprocessingml/2006/main" xmlns:w14="http://schemas.microsoft.com/office/word/2010/wordml" xmlns:w15="http://schemas.microsoft.com/office/word/2012/wordml" xmlns:w16cex="http://schemas.microsoft.com/office/word/2018/wordml/cex" xmlns:w16cid="http://schemas.microsoft.com/office/word/2016/wordml/cid" xmlns:w16="http://schemas.microsoft.com/office/word/2018/wordml" xmlns:w16sdtdh="http://schemas.microsoft.com/office/word/2020/wordml/sdtdatahash" xmlns:w16se="http://schemas.microsoft.com/office/word/2015/wordml/symex" xmlns:wpg="http://schemas.microsoft.com/office/word/2010/wordprocessingGroup" xmlns:wpi="http://schemas.microsoft.com/office/word/2010/wordprocessingInk" xmlns:wne="http://schemas.microsoft.com/office/word/2006/wordml" xmlns:wps="http://schemas.microsoft.com/office/word/2010/wordprocessingShape" mc:Ignorable="w14 w15 w16se w16cid w16 w16cex w16sdtdh wp14">
+<w:footnotes xmlns:wpc="http://schemas.microsoft.com/office/word/2010/wordprocessingCanvas" xmlns:cx="http://schemas.microsoft.com/office/drawing/2014/chartex" xmlns:cx1="http://schemas.microsoft.com/office/drawing/2015/9/8/chartex" xmlns:cx2="http://schemas.microsoft.com/office/drawing/2015/10/21/chartex" xmlns:cx3="http://schemas.microsoft.com/office/drawing/2016/5/9/chartex" xmlns:cx4="http://schemas.microsoft.com/office/drawing/2016/5/10/chartex" xmlns:cx5="http://schemas.microsoft.com/office/drawing/2016/5/11/chartex" xmlns:cx6="http://schemas.microsoft.com/office/drawing/2016/5/12/chartex" xmlns:cx7="http://schemas.microsoft.com/office/drawing/2016/5/13/chartex" xmlns:cx8="http://schemas.microsoft.com/office/drawing/2016/5/14/chartex" xmlns:mc="http://schemas.openxmlformats.org/markup-compatibility/2006" xmlns:aink="http://schemas.microsoft.com/office/drawing/2016/ink" xmlns:am3d="http://schemas.microsoft.com/office/drawing/2017/model3d" xmlns:o="urn:schemas-microsoft-com:office:office" xmlns:oel="http://schemas.microsoft.com/office/2019/extlst" xmlns:r="http://schemas.openxmlformats.org/officeDocument/2006/relationships" xmlns:m="http://schemas.openxmlformats.org/officeDocument/2006/math" xmlns:v="urn:schemas-microsoft-com:vml" xmlns:wp14="http://schemas.microsoft.com/office/word/2010/wordprocessingDrawing" xmlns:wp="http://schemas.openxmlformats.org/drawingml/2006/wordprocessingDrawing" xmlns:w10="urn:schemas-microsoft-com:office:word" xmlns:w="http://schemas.openxmlformats.org/wordprocessingml/2006/main" xmlns:w14="http://schemas.microsoft.com/office/word/2010/wordml" xmlns:w15="http://schemas.microsoft.com/office/word/2012/wordml" xmlns:w16cex="http://schemas.microsoft.com/office/word/2018/wordml/cex" xmlns:w16cid="http://schemas.microsoft.com/office/word/2016/wordml/cid" xmlns:w16="http://schemas.microsoft.com/office/word/2018/wordml" xmlns:w16du="http://schemas.microsoft.com/office/word/2023/wordml/word16du" xmlns:w16sdtdh="http://schemas.microsoft.com/office/word/2020/wordml/sdtdatahash" xmlns:w16sdtfl="http://schemas.microsoft.com/office/word/2024/wordml/sdtformatlock" xmlns:w16se="http://schemas.microsoft.com/office/word/2015/wordml/symex" xmlns:wpg="http://schemas.microsoft.com/office/word/2010/wordprocessingGroup" xmlns:wpi="http://schemas.microsoft.com/office/word/2010/wordprocessingInk" xmlns:wne="http://schemas.microsoft.com/office/word/2006/wordml" xmlns:wps="http://schemas.microsoft.com/office/word/2010/wordprocessingShape" mc:Ignorable="w14 w15 w16se w16cid w16 w16cex w16sdtdh w16sdtfl w16du wp14">
   <w:footnote w:type="separator" w:id="-1">
     <w:p>
       <w:r>
@@ -17894,7 +18200,7 @@
 </file>
 
 <file path=word/header1.xml><?xml version="1.0" encoding="utf-8"?>
-<w:hdr xmlns:wpc="http://schemas.microsoft.com/office/word/2010/wordprocessingCanvas" xmlns:cx="http://schemas.microsoft.com/office/drawing/2014/chartex" xmlns:cx1="http://schemas.microsoft.com/office/drawing/2015/9/8/chartex" xmlns:cx2="http://schemas.microsoft.com/office/drawing/2015/10/21/chartex" xmlns:cx3="http://schemas.microsoft.com/office/drawing/2016/5/9/chartex" xmlns:cx4="http://schemas.microsoft.com/office/drawing/2016/5/10/chartex" xmlns:cx5="http://schemas.microsoft.com/office/drawing/2016/5/11/chartex" xmlns:cx6="http://schemas.microsoft.com/office/drawing/2016/5/12/chartex" xmlns:cx7="http://schemas.microsoft.com/office/drawing/2016/5/13/chartex" xmlns:cx8="http://schemas.microsoft.com/office/drawing/2016/5/14/chartex" xmlns:mc="http://schemas.openxmlformats.org/markup-compatibility/2006" xmlns:aink="http://schemas.microsoft.com/office/drawing/2016/ink" xmlns:am3d="http://schemas.microsoft.com/office/drawing/2017/model3d" xmlns:o="urn:schemas-microsoft-com:office:office" xmlns:oel="http://schemas.microsoft.com/office/2019/extlst" xmlns:r="http://schemas.openxmlformats.org/officeDocument/2006/relationships" xmlns:m="http://schemas.openxmlformats.org/officeDocument/2006/math" xmlns:v="urn:schemas-microsoft-com:vml" xmlns:wp14="http://schemas.microsoft.com/office/word/2010/wordprocessingDrawing" xmlns:wp="http://schemas.openxmlformats.org/drawingml/2006/wordprocessingDrawing" xmlns:w10="urn:schemas-microsoft-com:office:word" xmlns:w="http://schemas.openxmlformats.org/wordprocessingml/2006/main" xmlns:w14="http://schemas.microsoft.com/office/word/2010/wordml" xmlns:w15="http://schemas.microsoft.com/office/word/2012/wordml" xmlns:w16cex="http://schemas.microsoft.com/office/word/2018/wordml/cex" xmlns:w16cid="http://schemas.microsoft.com/office/word/2016/wordml/cid" xmlns:w16="http://schemas.microsoft.com/office/word/2018/wordml" xmlns:w16sdtdh="http://schemas.microsoft.com/office/word/2020/wordml/sdtdatahash" xmlns:w16se="http://schemas.microsoft.com/office/word/2015/wordml/symex" xmlns:wpg="http://schemas.microsoft.com/office/word/2010/wordprocessingGroup" xmlns:wpi="http://schemas.microsoft.com/office/word/2010/wordprocessingInk" xmlns:wne="http://schemas.microsoft.com/office/word/2006/wordml" xmlns:wps="http://schemas.microsoft.com/office/word/2010/wordprocessingShape" mc:Ignorable="w14 w15 w16se w16cid w16 w16cex w16sdtdh wp14">
+<w:hdr xmlns:wpc="http://schemas.microsoft.com/office/word/2010/wordprocessingCanvas" xmlns:cx="http://schemas.microsoft.com/office/drawing/2014/chartex" xmlns:cx1="http://schemas.microsoft.com/office/drawing/2015/9/8/chartex" xmlns:cx2="http://schemas.microsoft.com/office/drawing/2015/10/21/chartex" xmlns:cx3="http://schemas.microsoft.com/office/drawing/2016/5/9/chartex" xmlns:cx4="http://schemas.microsoft.com/office/drawing/2016/5/10/chartex" xmlns:cx5="http://schemas.microsoft.com/office/drawing/2016/5/11/chartex" xmlns:cx6="http://schemas.microsoft.com/office/drawing/2016/5/12/chartex" xmlns:cx7="http://schemas.microsoft.com/office/drawing/2016/5/13/chartex" xmlns:cx8="http://schemas.microsoft.com/office/drawing/2016/5/14/chartex" xmlns:mc="http://schemas.openxmlformats.org/markup-compatibility/2006" xmlns:aink="http://schemas.microsoft.com/office/drawing/2016/ink" xmlns:am3d="http://schemas.microsoft.com/office/drawing/2017/model3d" xmlns:o="urn:schemas-microsoft-com:office:office" xmlns:oel="http://schemas.microsoft.com/office/2019/extlst" xmlns:r="http://schemas.openxmlformats.org/officeDocument/2006/relationships" xmlns:m="http://schemas.openxmlformats.org/officeDocument/2006/math" xmlns:v="urn:schemas-microsoft-com:vml" xmlns:wp14="http://schemas.microsoft.com/office/word/2010/wordprocessingDrawing" xmlns:wp="http://schemas.openxmlformats.org/drawingml/2006/wordprocessingDrawing" xmlns:w10="urn:schemas-microsoft-com:office:word" xmlns:w="http://schemas.openxmlformats.org/wordprocessingml/2006/main" xmlns:w14="http://schemas.microsoft.com/office/word/2010/wordml" xmlns:w15="http://schemas.microsoft.com/office/word/2012/wordml" xmlns:w16cex="http://schemas.microsoft.com/office/word/2018/wordml/cex" xmlns:w16cid="http://schemas.microsoft.com/office/word/2016/wordml/cid" xmlns:w16="http://schemas.microsoft.com/office/word/2018/wordml" xmlns:w16du="http://schemas.microsoft.com/office/word/2023/wordml/word16du" xmlns:w16sdtdh="http://schemas.microsoft.com/office/word/2020/wordml/sdtdatahash" xmlns:w16sdtfl="http://schemas.microsoft.com/office/word/2024/wordml/sdtformatlock" xmlns:w16se="http://schemas.microsoft.com/office/word/2015/wordml/symex" xmlns:wpg="http://schemas.microsoft.com/office/word/2010/wordprocessingGroup" xmlns:wpi="http://schemas.microsoft.com/office/word/2010/wordprocessingInk" xmlns:wne="http://schemas.microsoft.com/office/word/2006/wordml" xmlns:wps="http://schemas.microsoft.com/office/word/2010/wordprocessingShape" mc:Ignorable="w14 w15 w16se w16cid w16 w16cex w16sdtdh w16sdtfl w16du wp14">
   <w:p>
     <w:pPr>
       <w:pBdr>
@@ -17928,7 +18234,7 @@
 </file>
 
 <file path=word/numbering.xml><?xml version="1.0" encoding="utf-8"?>
-<w:numbering xmlns:wpc="http://schemas.microsoft.com/office/word/2010/wordprocessingCanvas" xmlns:cx="http://schemas.microsoft.com/office/drawing/2014/chartex" xmlns:cx1="http://schemas.microsoft.com/office/drawing/2015/9/8/chartex" xmlns:cx2="http://schemas.microsoft.com/office/drawing/2015/10/21/chartex" xmlns:cx3="http://schemas.microsoft.com/office/drawing/2016/5/9/chartex" xmlns:cx4="http://schemas.microsoft.com/office/drawing/2016/5/10/chartex" xmlns:cx5="http://schemas.microsoft.com/office/drawing/2016/5/11/chartex" xmlns:cx6="http://schemas.microsoft.com/office/drawing/2016/5/12/chartex" xmlns:cx7="http://schemas.microsoft.com/office/drawing/2016/5/13/chartex" xmlns:cx8="http://schemas.microsoft.com/office/drawing/2016/5/14/chartex" xmlns:mc="http://schemas.openxmlformats.org/markup-compatibility/2006" xmlns:aink="http://schemas.microsoft.com/office/drawing/2016/ink" xmlns:am3d="http://schemas.microsoft.com/office/drawing/2017/model3d" xmlns:o="urn:schemas-microsoft-com:office:office" xmlns:oel="http://schemas.microsoft.com/office/2019/extlst" xmlns:r="http://schemas.openxmlformats.org/officeDocument/2006/relationships" xmlns:m="http://schemas.openxmlformats.org/officeDocument/2006/math" xmlns:v="urn:schemas-microsoft-com:vml" xmlns:wp14="http://schemas.microsoft.com/office/word/2010/wordprocessingDrawing" xmlns:wp="http://schemas.openxmlformats.org/drawingml/2006/wordprocessingDrawing" xmlns:w10="urn:schemas-microsoft-com:office:word" xmlns:w="http://schemas.openxmlformats.org/wordprocessingml/2006/main" xmlns:w14="http://schemas.microsoft.com/office/word/2010/wordml" xmlns:w15="http://schemas.microsoft.com/office/word/2012/wordml" xmlns:w16cex="http://schemas.microsoft.com/office/word/2018/wordml/cex" xmlns:w16cid="http://schemas.microsoft.com/office/word/2016/wordml/cid" xmlns:w16="http://schemas.microsoft.com/office/word/2018/wordml" xmlns:w16sdtdh="http://schemas.microsoft.com/office/word/2020/wordml/sdtdatahash" xmlns:w16se="http://schemas.microsoft.com/office/word/2015/wordml/symex" xmlns:wpg="http://schemas.microsoft.com/office/word/2010/wordprocessingGroup" xmlns:wpi="http://schemas.microsoft.com/office/word/2010/wordprocessingInk" xmlns:wne="http://schemas.microsoft.com/office/word/2006/wordml" xmlns:wps="http://schemas.microsoft.com/office/word/2010/wordprocessingShape" mc:Ignorable="w14 w15 w16se w16cid w16 w16cex w16sdtdh wp14">
+<w:numbering xmlns:wpc="http://schemas.microsoft.com/office/word/2010/wordprocessingCanvas" xmlns:cx="http://schemas.microsoft.com/office/drawing/2014/chartex" xmlns:cx1="http://schemas.microsoft.com/office/drawing/2015/9/8/chartex" xmlns:cx2="http://schemas.microsoft.com/office/drawing/2015/10/21/chartex" xmlns:cx3="http://schemas.microsoft.com/office/drawing/2016/5/9/chartex" xmlns:cx4="http://schemas.microsoft.com/office/drawing/2016/5/10/chartex" xmlns:cx5="http://schemas.microsoft.com/office/drawing/2016/5/11/chartex" xmlns:cx6="http://schemas.microsoft.com/office/drawing/2016/5/12/chartex" xmlns:cx7="http://schemas.microsoft.com/office/drawing/2016/5/13/chartex" xmlns:cx8="http://schemas.microsoft.com/office/drawing/2016/5/14/chartex" xmlns:mc="http://schemas.openxmlformats.org/markup-compatibility/2006" xmlns:aink="http://schemas.microsoft.com/office/drawing/2016/ink" xmlns:am3d="http://schemas.microsoft.com/office/drawing/2017/model3d" xmlns:o="urn:schemas-microsoft-com:office:office" xmlns:oel="http://schemas.microsoft.com/office/2019/extlst" xmlns:r="http://schemas.openxmlformats.org/officeDocument/2006/relationships" xmlns:m="http://schemas.openxmlformats.org/officeDocument/2006/math" xmlns:v="urn:schemas-microsoft-com:vml" xmlns:wp14="http://schemas.microsoft.com/office/word/2010/wordprocessingDrawing" xmlns:wp="http://schemas.openxmlformats.org/drawingml/2006/wordprocessingDrawing" xmlns:w10="urn:schemas-microsoft-com:office:word" xmlns:w="http://schemas.openxmlformats.org/wordprocessingml/2006/main" xmlns:w14="http://schemas.microsoft.com/office/word/2010/wordml" xmlns:w15="http://schemas.microsoft.com/office/word/2012/wordml" xmlns:w16cex="http://schemas.microsoft.com/office/word/2018/wordml/cex" xmlns:w16cid="http://schemas.microsoft.com/office/word/2016/wordml/cid" xmlns:w16="http://schemas.microsoft.com/office/word/2018/wordml" xmlns:w16du="http://schemas.microsoft.com/office/word/2023/wordml/word16du" xmlns:w16sdtdh="http://schemas.microsoft.com/office/word/2020/wordml/sdtdatahash" xmlns:w16sdtfl="http://schemas.microsoft.com/office/word/2024/wordml/sdtformatlock" xmlns:w16se="http://schemas.microsoft.com/office/word/2015/wordml/symex" xmlns:wpg="http://schemas.microsoft.com/office/word/2010/wordprocessingGroup" xmlns:wpi="http://schemas.microsoft.com/office/word/2010/wordprocessingInk" xmlns:wne="http://schemas.microsoft.com/office/word/2006/wordml" xmlns:wps="http://schemas.microsoft.com/office/word/2010/wordprocessingShape" mc:Ignorable="w14 w15 w16se w16cid w16 w16cex w16sdtdh w16sdtfl w16du wp14">
   <w:abstractNum w:abstractNumId="0" w15:restartNumberingAfterBreak="0">
     <w:nsid w:val="0C5F5D60"/>
     <w:multiLevelType w:val="multilevel"/>
@@ -18301,7 +18607,7 @@
 </file>
 
 <file path=word/styles.xml><?xml version="1.0" encoding="utf-8"?>
-<w:styles xmlns:mc="http://schemas.openxmlformats.org/markup-compatibility/2006" xmlns:r="http://schemas.openxmlformats.org/officeDocument/2006/relationships" xmlns:w="http://schemas.openxmlformats.org/wordprocessingml/2006/main" xmlns:w14="http://schemas.microsoft.com/office/word/2010/wordml" xmlns:w15="http://schemas.microsoft.com/office/word/2012/wordml" xmlns:w16cex="http://schemas.microsoft.com/office/word/2018/wordml/cex" xmlns:w16cid="http://schemas.microsoft.com/office/word/2016/wordml/cid" xmlns:w16="http://schemas.microsoft.com/office/word/2018/wordml" xmlns:w16sdtdh="http://schemas.microsoft.com/office/word/2020/wordml/sdtdatahash" xmlns:w16se="http://schemas.microsoft.com/office/word/2015/wordml/symex" mc:Ignorable="w14 w15 w16se w16cid w16 w16cex w16sdtdh">
+<w:styles xmlns:mc="http://schemas.openxmlformats.org/markup-compatibility/2006" xmlns:r="http://schemas.openxmlformats.org/officeDocument/2006/relationships" xmlns:w="http://schemas.openxmlformats.org/wordprocessingml/2006/main" xmlns:w14="http://schemas.microsoft.com/office/word/2010/wordml" xmlns:w15="http://schemas.microsoft.com/office/word/2012/wordml" xmlns:w16cex="http://schemas.microsoft.com/office/word/2018/wordml/cex" xmlns:w16cid="http://schemas.microsoft.com/office/word/2016/wordml/cid" xmlns:w16="http://schemas.microsoft.com/office/word/2018/wordml" xmlns:w16du="http://schemas.microsoft.com/office/word/2023/wordml/word16du" xmlns:w16sdtdh="http://schemas.microsoft.com/office/word/2020/wordml/sdtdatahash" xmlns:w16sdtfl="http://schemas.microsoft.com/office/word/2024/wordml/sdtformatlock" xmlns:w16se="http://schemas.microsoft.com/office/word/2015/wordml/symex" mc:Ignorable="w14 w15 w16se w16cid w16 w16cex w16sdtdh w16sdtfl w16du">
   <w:docDefaults>
     <w:rPrDefault>
       <w:rPr>
@@ -18805,6 +19111,7 @@
   <w:style w:type="character" w:default="1" w:styleId="DefaultParagraphFont">
     <w:name w:val="Default Paragraph Font"/>
     <w:uiPriority w:val="1"/>
+    <w:semiHidden/>
     <w:unhideWhenUsed/>
   </w:style>
   <w:style w:type="table" w:default="1" w:styleId="TableNormal">

</xml_diff>